<commit_message>
update JavaScript Assessment 2 and Working in ICT Assessment 2
</commit_message>
<xml_diff>
--- a/C#/Assessment2/Data_Driven_Programming_AT2of2_Part1of3.docx
+++ b/C#/Assessment2/Data_Driven_Programming_AT2of2_Part1of3.docx
@@ -1,6 +1,6 @@
 
 <file path=word/document.xml><?xml version="1.0" encoding="utf-8"?>
-<w:document xmlns:wpc="http://schemas.microsoft.com/office/word/2010/wordprocessingCanvas" xmlns:cx="http://schemas.microsoft.com/office/drawing/2014/chartex" xmlns:cx1="http://schemas.microsoft.com/office/drawing/2015/9/8/chartex" xmlns:cx2="http://schemas.microsoft.com/office/drawing/2015/10/21/chartex" xmlns:cx3="http://schemas.microsoft.com/office/drawing/2016/5/9/chartex" xmlns:cx4="http://schemas.microsoft.com/office/drawing/2016/5/10/chartex" xmlns:cx5="http://schemas.microsoft.com/office/drawing/2016/5/11/chartex" xmlns:cx6="http://schemas.microsoft.com/office/drawing/2016/5/12/chartex" xmlns:cx7="http://schemas.microsoft.com/office/drawing/2016/5/13/chartex" xmlns:cx8="http://schemas.microsoft.com/office/drawing/2016/5/14/chartex" xmlns:mc="http://schemas.openxmlformats.org/markup-compatibility/2006" xmlns:aink="http://schemas.microsoft.com/office/drawing/2016/ink" xmlns:am3d="http://schemas.microsoft.com/office/drawing/2017/model3d" xmlns:o="urn:schemas-microsoft-com:office:office" xmlns:r="http://schemas.openxmlformats.org/officeDocument/2006/relationships" xmlns:m="http://schemas.openxmlformats.org/officeDocument/2006/math" xmlns:v="urn:schemas-microsoft-com:vml" xmlns:wp14="http://schemas.microsoft.com/office/word/2010/wordprocessingDrawing" xmlns:wp="http://schemas.openxmlformats.org/drawingml/2006/wordprocessingDrawing" xmlns:w10="urn:schemas-microsoft-com:office:word" xmlns:w="http://schemas.openxmlformats.org/wordprocessingml/2006/main" xmlns:w14="http://schemas.microsoft.com/office/word/2010/wordml" xmlns:w15="http://schemas.microsoft.com/office/word/2012/wordml" xmlns:w16cid="http://schemas.microsoft.com/office/word/2016/wordml/cid" xmlns:w16se="http://schemas.microsoft.com/office/word/2015/wordml/symex" xmlns:wpg="http://schemas.microsoft.com/office/word/2010/wordprocessingGroup" xmlns:wpi="http://schemas.microsoft.com/office/word/2010/wordprocessingInk" xmlns:wne="http://schemas.microsoft.com/office/word/2006/wordml" xmlns:wps="http://schemas.microsoft.com/office/word/2010/wordprocessingShape" mc:Ignorable="w14 w15 w16se w16cid wp14">
+<w:document xmlns:wpc="http://schemas.microsoft.com/office/word/2010/wordprocessingCanvas" xmlns:cx="http://schemas.microsoft.com/office/drawing/2014/chartex" xmlns:cx1="http://schemas.microsoft.com/office/drawing/2015/9/8/chartex" xmlns:cx2="http://schemas.microsoft.com/office/drawing/2015/10/21/chartex" xmlns:cx3="http://schemas.microsoft.com/office/drawing/2016/5/9/chartex" xmlns:cx4="http://schemas.microsoft.com/office/drawing/2016/5/10/chartex" xmlns:cx5="http://schemas.microsoft.com/office/drawing/2016/5/11/chartex" xmlns:cx6="http://schemas.microsoft.com/office/drawing/2016/5/12/chartex" xmlns:cx7="http://schemas.microsoft.com/office/drawing/2016/5/13/chartex" xmlns:cx8="http://schemas.microsoft.com/office/drawing/2016/5/14/chartex" xmlns:mc="http://schemas.openxmlformats.org/markup-compatibility/2006" xmlns:aink="http://schemas.microsoft.com/office/drawing/2016/ink" xmlns:am3d="http://schemas.microsoft.com/office/drawing/2017/model3d" xmlns:o="urn:schemas-microsoft-com:office:office" xmlns:oel="http://schemas.microsoft.com/office/2019/extlst" xmlns:r="http://schemas.openxmlformats.org/officeDocument/2006/relationships" xmlns:m="http://schemas.openxmlformats.org/officeDocument/2006/math" xmlns:v="urn:schemas-microsoft-com:vml" xmlns:wp14="http://schemas.microsoft.com/office/word/2010/wordprocessingDrawing" xmlns:wp="http://schemas.openxmlformats.org/drawingml/2006/wordprocessingDrawing" xmlns:w10="urn:schemas-microsoft-com:office:word" xmlns:w="http://schemas.openxmlformats.org/wordprocessingml/2006/main" xmlns:w14="http://schemas.microsoft.com/office/word/2010/wordml" xmlns:w15="http://schemas.microsoft.com/office/word/2012/wordml" xmlns:w16cex="http://schemas.microsoft.com/office/word/2018/wordml/cex" xmlns:w16cid="http://schemas.microsoft.com/office/word/2016/wordml/cid" xmlns:w16="http://schemas.microsoft.com/office/word/2018/wordml" xmlns:w16du="http://schemas.microsoft.com/office/word/2023/wordml/word16du" xmlns:w16sdtdh="http://schemas.microsoft.com/office/word/2020/wordml/sdtdatahash" xmlns:w16sdtfl="http://schemas.microsoft.com/office/word/2024/wordml/sdtformatlock" xmlns:w16se="http://schemas.microsoft.com/office/word/2015/wordml/symex" xmlns:wpg="http://schemas.microsoft.com/office/word/2010/wordprocessingGroup" xmlns:wpi="http://schemas.microsoft.com/office/word/2010/wordprocessingInk" xmlns:wne="http://schemas.microsoft.com/office/word/2006/wordml" xmlns:wps="http://schemas.microsoft.com/office/word/2010/wordprocessingShape" mc:Ignorable="w14 w15 w16se w16cid w16 w16cex w16sdtdh w16sdtfl w16du wp14">
   <w:body>
     <w:p>
       <w:pPr>
@@ -166,8 +166,6 @@
               </w:rPr>
               <w:t xml:space="preserve">will be automatically called upon creating the object. </w:t>
             </w:r>
-            <w:bookmarkStart w:id="0" w:name="_GoBack"/>
-            <w:bookmarkEnd w:id="0"/>
           </w:p>
           <w:p>
             <w:pPr>
@@ -281,16 +279,234 @@
               </w:rPr>
               <w:t>Answer:</w:t>
             </w:r>
-          </w:p>
-          <w:p>
-            <w:pPr>
-              <w:spacing w:after="160" w:line="259" w:lineRule="auto"/>
-              <w:rPr>
-                <w:rFonts w:ascii="Calibri" w:eastAsia="DengXian" w:hAnsi="Calibri" w:cs="Arial"/>
-                <w:sz w:val="22"/>
-                <w:lang w:eastAsia="zh-CN"/>
-              </w:rPr>
-            </w:pPr>
+            <w:r>
+              <w:t xml:space="preserve"> </w:t>
+            </w:r>
+            <w:r>
+              <w:rPr>
+                <w:rFonts w:ascii="Calibri" w:eastAsia="DengXian" w:hAnsi="Calibri" w:cs="Arial"/>
+                <w:sz w:val="22"/>
+                <w:lang w:eastAsia="zh-CN"/>
+              </w:rPr>
+              <w:t>Object aggregation refers to a relationship where one object contains or is composed of another object.</w:t>
+            </w:r>
+          </w:p>
+          <w:p>
+            <w:pPr>
+              <w:spacing w:after="160" w:line="259" w:lineRule="auto"/>
+              <w:rPr>
+                <w:rFonts w:ascii="Calibri" w:eastAsia="DengXian" w:hAnsi="Calibri" w:cs="Arial"/>
+                <w:sz w:val="22"/>
+                <w:lang w:eastAsia="zh-CN"/>
+              </w:rPr>
+            </w:pPr>
+            <w:r>
+              <w:rPr>
+                <w:rFonts w:ascii="Calibri" w:eastAsia="DengXian" w:hAnsi="Calibri" w:cs="Arial"/>
+                <w:sz w:val="22"/>
+                <w:lang w:eastAsia="zh-CN"/>
+              </w:rPr>
+              <w:t>Example to explain:</w:t>
+            </w:r>
+          </w:p>
+          <w:p>
+            <w:pPr>
+              <w:spacing w:after="160" w:line="259" w:lineRule="auto"/>
+              <w:rPr>
+                <w:rFonts w:ascii="Calibri" w:eastAsia="DengXian" w:hAnsi="Calibri" w:cs="Arial"/>
+                <w:b/>
+                <w:bCs/>
+                <w:sz w:val="22"/>
+                <w:lang w:eastAsia="zh-CN"/>
+              </w:rPr>
+            </w:pPr>
+            <w:r>
+              <w:rPr>
+                <w:rFonts w:ascii="Calibri" w:eastAsia="DengXian" w:hAnsi="Calibri" w:cs="Arial"/>
+                <w:b/>
+                <w:bCs/>
+                <w:sz w:val="22"/>
+                <w:lang w:eastAsia="zh-CN"/>
+              </w:rPr>
+              <w:t xml:space="preserve">1. </w:t>
+            </w:r>
+            <w:r>
+              <w:rPr>
+                <w:rFonts w:ascii="Calibri" w:eastAsia="DengXian" w:hAnsi="Calibri" w:cs="Arial"/>
+                <w:b/>
+                <w:bCs/>
+                <w:sz w:val="22"/>
+                <w:lang w:eastAsia="zh-CN"/>
+              </w:rPr>
+              <w:t>Relationship the “is a” or “</w:t>
+            </w:r>
+            <w:r>
+              <w:rPr>
+                <w:rFonts w:ascii="Calibri" w:eastAsia="DengXian" w:hAnsi="Calibri" w:cs="Arial"/>
+                <w:b/>
+                <w:bCs/>
+                <w:sz w:val="22"/>
+                <w:lang w:eastAsia="zh-CN"/>
+              </w:rPr>
+              <w:t>part-of</w:t>
+            </w:r>
+            <w:r>
+              <w:rPr>
+                <w:rFonts w:ascii="Calibri" w:eastAsia="DengXian" w:hAnsi="Calibri" w:cs="Arial"/>
+                <w:b/>
+                <w:bCs/>
+                <w:sz w:val="22"/>
+                <w:lang w:eastAsia="zh-CN"/>
+              </w:rPr>
+              <w:t>”</w:t>
+            </w:r>
+          </w:p>
+          <w:p>
+            <w:pPr>
+              <w:spacing w:after="160" w:line="259" w:lineRule="auto"/>
+              <w:rPr>
+                <w:rFonts w:ascii="Calibri" w:eastAsia="DengXian" w:hAnsi="Calibri" w:cs="Arial"/>
+                <w:sz w:val="22"/>
+                <w:lang w:eastAsia="zh-CN"/>
+              </w:rPr>
+            </w:pPr>
+            <w:r>
+              <w:rPr>
+                <w:rFonts w:ascii="Calibri" w:eastAsia="DengXian" w:hAnsi="Calibri" w:cs="Arial"/>
+                <w:sz w:val="22"/>
+                <w:lang w:eastAsia="zh-CN"/>
+              </w:rPr>
+              <w:t>Ag</w:t>
+            </w:r>
+            <w:r>
+              <w:rPr>
+                <w:rFonts w:ascii="Calibri" w:eastAsia="DengXian" w:hAnsi="Calibri" w:cs="Arial"/>
+                <w:sz w:val="22"/>
+                <w:lang w:eastAsia="zh-CN"/>
+              </w:rPr>
+              <w:t>gregation: Classroom</w:t>
+            </w:r>
+            <w:r>
+              <w:rPr>
+                <w:rFonts w:ascii="Calibri" w:eastAsia="DengXian" w:hAnsi="Calibri" w:cs="Arial"/>
+                <w:sz w:val="22"/>
+                <w:lang w:eastAsia="zh-CN"/>
+              </w:rPr>
+              <w:t xml:space="preserve"> Object</w:t>
+            </w:r>
+            <w:r>
+              <w:rPr>
+                <w:rFonts w:ascii="Calibri" w:eastAsia="DengXian" w:hAnsi="Calibri" w:cs="Arial"/>
+                <w:sz w:val="22"/>
+                <w:lang w:eastAsia="zh-CN"/>
+              </w:rPr>
+              <w:t xml:space="preserve"> has a </w:t>
+            </w:r>
+            <w:proofErr w:type="gramStart"/>
+            <w:r>
+              <w:rPr>
+                <w:rFonts w:ascii="Calibri" w:eastAsia="DengXian" w:hAnsi="Calibri" w:cs="Arial"/>
+                <w:sz w:val="22"/>
+                <w:lang w:eastAsia="zh-CN"/>
+              </w:rPr>
+              <w:t>Student</w:t>
+            </w:r>
+            <w:proofErr w:type="gramEnd"/>
+            <w:r>
+              <w:rPr>
+                <w:rFonts w:ascii="Calibri" w:eastAsia="DengXian" w:hAnsi="Calibri" w:cs="Arial"/>
+                <w:sz w:val="22"/>
+                <w:lang w:eastAsia="zh-CN"/>
+              </w:rPr>
+              <w:t xml:space="preserve"> object</w:t>
+            </w:r>
+            <w:r>
+              <w:rPr>
+                <w:rFonts w:ascii="Calibri" w:eastAsia="DengXian" w:hAnsi="Calibri" w:cs="Arial"/>
+                <w:sz w:val="22"/>
+                <w:lang w:eastAsia="zh-CN"/>
+              </w:rPr>
+              <w:t xml:space="preserve"> and Teacher object</w:t>
+            </w:r>
+            <w:r>
+              <w:rPr>
+                <w:rFonts w:ascii="Calibri" w:eastAsia="DengXian" w:hAnsi="Calibri" w:cs="Arial"/>
+                <w:sz w:val="22"/>
+                <w:lang w:eastAsia="zh-CN"/>
+              </w:rPr>
+              <w:t>.</w:t>
+            </w:r>
+          </w:p>
+          <w:p>
+            <w:pPr>
+              <w:spacing w:after="160" w:line="259" w:lineRule="auto"/>
+              <w:jc w:val="center"/>
+              <w:rPr>
+                <w:rFonts w:ascii="Calibri" w:eastAsia="DengXian" w:hAnsi="Calibri" w:cs="Arial"/>
+                <w:sz w:val="22"/>
+                <w:lang w:eastAsia="zh-CN"/>
+              </w:rPr>
+            </w:pPr>
+            <w:r>
+              <w:rPr>
+                <w:rFonts w:ascii="Calibri" w:eastAsia="DengXian" w:hAnsi="Calibri" w:cs="Arial"/>
+                <w:noProof/>
+                <w:sz w:val="22"/>
+                <w:lang w:eastAsia="zh-CN"/>
+              </w:rPr>
+              <w:lastRenderedPageBreak/>
+              <w:drawing>
+                <wp:inline distT="0" distB="0" distL="0" distR="0" wp14:anchorId="719D2E6E" wp14:editId="2BC75081">
+                  <wp:extent cx="5376301" cy="7349319"/>
+                  <wp:effectExtent l="0" t="0" r="0" b="4445"/>
+                  <wp:docPr id="1945363187" name="Picture 6"/>
+                  <wp:cNvGraphicFramePr>
+                    <a:graphicFrameLocks xmlns:a="http://schemas.openxmlformats.org/drawingml/2006/main" noChangeAspect="1"/>
+                  </wp:cNvGraphicFramePr>
+                  <a:graphic xmlns:a="http://schemas.openxmlformats.org/drawingml/2006/main">
+                    <a:graphicData uri="http://schemas.openxmlformats.org/drawingml/2006/picture">
+                      <pic:pic xmlns:pic="http://schemas.openxmlformats.org/drawingml/2006/picture">
+                        <pic:nvPicPr>
+                          <pic:cNvPr id="0" name="Picture 2"/>
+                          <pic:cNvPicPr>
+                            <a:picLocks noChangeAspect="1" noChangeArrowheads="1"/>
+                          </pic:cNvPicPr>
+                        </pic:nvPicPr>
+                        <pic:blipFill rotWithShape="1">
+                          <a:blip r:embed="rId15" cstate="print">
+                            <a:extLst>
+                              <a:ext uri="{28A0092B-C50C-407E-A947-70E740481C1C}">
+                                <a14:useLocalDpi xmlns:a14="http://schemas.microsoft.com/office/drawing/2010/main" val="0"/>
+                              </a:ext>
+                            </a:extLst>
+                          </a:blip>
+                          <a:srcRect l="6981" t="5468" r="7079" b="5284"/>
+                          <a:stretch/>
+                        </pic:blipFill>
+                        <pic:spPr bwMode="auto">
+                          <a:xfrm>
+                            <a:off x="0" y="0"/>
+                            <a:ext cx="5376301" cy="7349319"/>
+                          </a:xfrm>
+                          <a:prstGeom prst="rect">
+                            <a:avLst/>
+                          </a:prstGeom>
+                          <a:noFill/>
+                          <a:ln>
+                            <a:noFill/>
+                          </a:ln>
+                          <a:extLst>
+                            <a:ext uri="{53640926-AAD7-44D8-BBD7-CCE9431645EC}">
+                              <a14:shadowObscured xmlns:a14="http://schemas.microsoft.com/office/drawing/2010/main"/>
+                            </a:ext>
+                          </a:extLst>
+                        </pic:spPr>
+                      </pic:pic>
+                    </a:graphicData>
+                  </a:graphic>
+                </wp:inline>
+              </w:drawing>
+            </w:r>
           </w:p>
         </w:tc>
       </w:tr>
@@ -321,6 +537,7 @@
                 <w:sz w:val="22"/>
                 <w:lang w:eastAsia="zh-CN"/>
               </w:rPr>
+              <w:lastRenderedPageBreak/>
               <w:t xml:space="preserve">3. </w:t>
             </w:r>
             <w:r>
@@ -386,7 +603,7 @@
                 </w:tcPr>
                 <w:p>
                   <w:pPr>
-                    <w:spacing w:after="160" w:line="259" w:lineRule="auto"/>
+                    <w:spacing w:after="120" w:line="259" w:lineRule="auto"/>
                     <w:rPr>
                       <w:rFonts w:ascii="Calibri" w:eastAsia="DengXian" w:hAnsi="Calibri" w:cs="Arial"/>
                       <w:b/>
@@ -419,13 +636,29 @@
                 </w:tcPr>
                 <w:p>
                   <w:pPr>
-                    <w:spacing w:after="160" w:line="259" w:lineRule="auto"/>
+                    <w:spacing w:after="120" w:line="259" w:lineRule="auto"/>
                     <w:rPr>
                       <w:rFonts w:ascii="Calibri" w:eastAsia="DengXian" w:hAnsi="Calibri" w:cs="Arial"/>
                       <w:sz w:val="22"/>
                       <w:lang w:eastAsia="zh-CN"/>
                     </w:rPr>
                   </w:pPr>
+                  <w:r>
+                    <w:rPr>
+                      <w:rFonts w:ascii="Calibri" w:eastAsia="DengXian" w:hAnsi="Calibri" w:cs="Arial"/>
+                      <w:sz w:val="22"/>
+                      <w:lang w:eastAsia="zh-CN"/>
+                    </w:rPr>
+                    <w:t xml:space="preserve">It is the default structure. </w:t>
+                  </w:r>
+                  <w:r>
+                    <w:rPr>
+                      <w:rFonts w:ascii="Calibri" w:eastAsia="DengXian" w:hAnsi="Calibri" w:cs="Arial"/>
+                      <w:sz w:val="22"/>
+                      <w:lang w:eastAsia="zh-CN"/>
+                    </w:rPr>
+                    <w:t>The program runs line by line, from top to bottom, in order.</w:t>
+                  </w:r>
                 </w:p>
               </w:tc>
             </w:tr>
@@ -442,7 +675,7 @@
                 </w:tcPr>
                 <w:p>
                   <w:pPr>
-                    <w:spacing w:after="160" w:line="259" w:lineRule="auto"/>
+                    <w:spacing w:after="120" w:line="259" w:lineRule="auto"/>
                     <w:rPr>
                       <w:rFonts w:ascii="Calibri" w:eastAsia="DengXian" w:hAnsi="Calibri" w:cs="Arial"/>
                       <w:b/>
@@ -475,13 +708,73 @@
                 </w:tcPr>
                 <w:p>
                   <w:pPr>
-                    <w:spacing w:after="160" w:line="259" w:lineRule="auto"/>
+                    <w:spacing w:after="120" w:line="259" w:lineRule="auto"/>
                     <w:rPr>
                       <w:rFonts w:ascii="Calibri" w:eastAsia="DengXian" w:hAnsi="Calibri" w:cs="Arial"/>
                       <w:sz w:val="22"/>
                       <w:lang w:eastAsia="zh-CN"/>
                     </w:rPr>
                   </w:pPr>
+                  <w:r>
+                    <w:rPr>
+                      <w:rFonts w:ascii="Calibri" w:eastAsia="DengXian" w:hAnsi="Calibri" w:cs="Arial"/>
+                      <w:sz w:val="22"/>
+                      <w:lang w:eastAsia="zh-CN"/>
+                    </w:rPr>
+                    <w:t>It allows the program to make a decision based on the condition</w:t>
+                  </w:r>
+                  <w:r>
+                    <w:rPr>
+                      <w:rFonts w:ascii="Calibri" w:eastAsia="DengXian" w:hAnsi="Calibri" w:cs="Arial"/>
+                      <w:sz w:val="22"/>
+                      <w:lang w:eastAsia="zh-CN"/>
+                    </w:rPr>
+                    <w:t>.</w:t>
+                  </w:r>
+                </w:p>
+                <w:p>
+                  <w:pPr>
+                    <w:spacing w:after="120" w:line="259" w:lineRule="auto"/>
+                    <w:rPr>
+                      <w:rFonts w:ascii="Calibri" w:eastAsia="DengXian" w:hAnsi="Calibri" w:cs="Arial"/>
+                      <w:sz w:val="22"/>
+                      <w:lang w:eastAsia="zh-CN"/>
+                    </w:rPr>
+                  </w:pPr>
+                  <w:r>
+                    <w:rPr>
+                      <w:rFonts w:ascii="Calibri" w:eastAsia="DengXian" w:hAnsi="Calibri" w:cs="Arial"/>
+                      <w:sz w:val="22"/>
+                      <w:lang w:eastAsia="zh-CN"/>
+                    </w:rPr>
+                    <w:t>“</w:t>
+                  </w:r>
+                  <w:proofErr w:type="gramStart"/>
+                  <w:r>
+                    <w:rPr>
+                      <w:rFonts w:ascii="Calibri" w:eastAsia="DengXian" w:hAnsi="Calibri" w:cs="Arial"/>
+                      <w:sz w:val="22"/>
+                      <w:lang w:eastAsia="zh-CN"/>
+                    </w:rPr>
+                    <w:t>if</w:t>
+                  </w:r>
+                  <w:proofErr w:type="gramEnd"/>
+                  <w:r>
+                    <w:rPr>
+                      <w:rFonts w:ascii="Calibri" w:eastAsia="DengXian" w:hAnsi="Calibri" w:cs="Arial"/>
+                      <w:sz w:val="22"/>
+                      <w:lang w:eastAsia="zh-CN"/>
+                    </w:rPr>
+                    <w:t>, else if, else, or switch</w:t>
+                  </w:r>
+                  <w:r>
+                    <w:rPr>
+                      <w:rFonts w:ascii="Calibri" w:eastAsia="DengXian" w:hAnsi="Calibri" w:cs="Arial"/>
+                      <w:sz w:val="22"/>
+                      <w:lang w:eastAsia="zh-CN"/>
+                    </w:rPr>
+                    <w:t>”</w:t>
+                  </w:r>
                 </w:p>
               </w:tc>
             </w:tr>
@@ -498,7 +791,7 @@
                 </w:tcPr>
                 <w:p>
                   <w:pPr>
-                    <w:spacing w:after="160" w:line="259" w:lineRule="auto"/>
+                    <w:spacing w:after="120" w:line="259" w:lineRule="auto"/>
                     <w:rPr>
                       <w:rFonts w:ascii="Calibri" w:eastAsia="DengXian" w:hAnsi="Calibri" w:cs="Arial"/>
                       <w:b/>
@@ -531,29 +824,110 @@
                 </w:tcPr>
                 <w:p>
                   <w:pPr>
-                    <w:spacing w:after="160" w:line="259" w:lineRule="auto"/>
+                    <w:spacing w:after="120" w:line="259" w:lineRule="auto"/>
                     <w:rPr>
                       <w:rFonts w:ascii="Calibri" w:eastAsia="DengXian" w:hAnsi="Calibri" w:cs="Arial"/>
                       <w:sz w:val="22"/>
                       <w:lang w:eastAsia="zh-CN"/>
                     </w:rPr>
                   </w:pPr>
+                  <w:r>
+                    <w:rPr>
+                      <w:rFonts w:ascii="Calibri" w:eastAsia="DengXian" w:hAnsi="Calibri" w:cs="Arial"/>
+                      <w:sz w:val="22"/>
+                      <w:lang w:eastAsia="zh-CN"/>
+                    </w:rPr>
+                    <w:t>It repeats actions while a condition is true.</w:t>
+                  </w:r>
+                </w:p>
+                <w:p>
+                  <w:pPr>
+                    <w:spacing w:after="120" w:line="259" w:lineRule="auto"/>
+                    <w:rPr>
+                      <w:rFonts w:ascii="Calibri" w:eastAsia="DengXian" w:hAnsi="Calibri" w:cs="Arial"/>
+                      <w:sz w:val="22"/>
+                      <w:lang w:eastAsia="zh-CN"/>
+                    </w:rPr>
+                  </w:pPr>
+                  <w:r>
+                    <w:rPr>
+                      <w:rFonts w:ascii="Calibri" w:eastAsia="DengXian" w:hAnsi="Calibri" w:cs="Arial"/>
+                      <w:sz w:val="22"/>
+                      <w:lang w:eastAsia="zh-CN"/>
+                    </w:rPr>
+                    <w:t>“</w:t>
+                  </w:r>
+                  <w:proofErr w:type="gramStart"/>
+                  <w:r>
+                    <w:rPr>
+                      <w:rFonts w:ascii="Calibri" w:eastAsia="DengXian" w:hAnsi="Calibri" w:cs="Arial"/>
+                      <w:sz w:val="22"/>
+                      <w:lang w:eastAsia="zh-CN"/>
+                    </w:rPr>
+                    <w:t>for</w:t>
+                  </w:r>
+                  <w:proofErr w:type="gramEnd"/>
+                  <w:r>
+                    <w:rPr>
+                      <w:rFonts w:ascii="Calibri" w:eastAsia="DengXian" w:hAnsi="Calibri" w:cs="Arial"/>
+                      <w:sz w:val="22"/>
+                      <w:lang w:eastAsia="zh-CN"/>
+                    </w:rPr>
+                    <w:t xml:space="preserve">, </w:t>
+                  </w:r>
+                  <w:proofErr w:type="gramStart"/>
+                  <w:r>
+                    <w:rPr>
+                      <w:rFonts w:ascii="Calibri" w:eastAsia="DengXian" w:hAnsi="Calibri" w:cs="Arial"/>
+                      <w:sz w:val="22"/>
+                      <w:lang w:eastAsia="zh-CN"/>
+                    </w:rPr>
+                    <w:t>while,</w:t>
+                  </w:r>
+                  <w:proofErr w:type="gramEnd"/>
+                  <w:r>
+                    <w:rPr>
+                      <w:rFonts w:ascii="Calibri" w:eastAsia="DengXian" w:hAnsi="Calibri" w:cs="Arial"/>
+                      <w:sz w:val="22"/>
+                      <w:lang w:eastAsia="zh-CN"/>
+                    </w:rPr>
+                    <w:t xml:space="preserve"> do...</w:t>
+                  </w:r>
+                  <w:proofErr w:type="gramStart"/>
+                  <w:r>
+                    <w:rPr>
+                      <w:rFonts w:ascii="Calibri" w:eastAsia="DengXian" w:hAnsi="Calibri" w:cs="Arial"/>
+                      <w:sz w:val="22"/>
+                      <w:lang w:eastAsia="zh-CN"/>
+                    </w:rPr>
+                    <w:t>while,</w:t>
+                  </w:r>
+                  <w:proofErr w:type="gramEnd"/>
+                  <w:r>
+                    <w:rPr>
+                      <w:rFonts w:ascii="Calibri" w:eastAsia="DengXian" w:hAnsi="Calibri" w:cs="Arial"/>
+                      <w:sz w:val="22"/>
+                      <w:lang w:eastAsia="zh-CN"/>
+                    </w:rPr>
+                    <w:t xml:space="preserve"> foreach</w:t>
+                  </w:r>
+                  <w:r>
+                    <w:rPr>
+                      <w:rFonts w:ascii="Calibri" w:eastAsia="DengXian" w:hAnsi="Calibri" w:cs="Arial"/>
+                      <w:sz w:val="22"/>
+                      <w:lang w:eastAsia="zh-CN"/>
+                    </w:rPr>
+                    <w:t>”</w:t>
+                  </w:r>
                 </w:p>
               </w:tc>
             </w:tr>
           </w:tbl>
           <w:p>
             <w:pPr>
-              <w:spacing w:after="160" w:line="259" w:lineRule="auto"/>
-              <w:rPr>
-                <w:rFonts w:ascii="Calibri" w:eastAsia="DengXian" w:hAnsi="Calibri" w:cs="Arial"/>
-                <w:sz w:val="22"/>
-                <w:lang w:eastAsia="zh-CN"/>
-              </w:rPr>
-            </w:pPr>
-          </w:p>
-          <w:p>
-            <w:pPr>
+              <w:tabs>
+                <w:tab w:val="left" w:pos="8769"/>
+              </w:tabs>
               <w:spacing w:after="160" w:line="259" w:lineRule="auto"/>
               <w:rPr>
                 <w:rFonts w:ascii="Calibri" w:eastAsia="DengXian" w:hAnsi="Calibri" w:cs="Arial"/>
@@ -576,7 +950,7 @@
           </w:tcPr>
           <w:p>
             <w:pPr>
-              <w:spacing w:after="160" w:line="259" w:lineRule="auto"/>
+              <w:spacing w:after="120" w:line="259" w:lineRule="auto"/>
               <w:rPr>
                 <w:rFonts w:ascii="Calibri" w:eastAsia="DengXian" w:hAnsi="Calibri" w:cs="Arial"/>
                 <w:sz w:val="22"/>
@@ -660,6 +1034,152 @@
                 <w:lang w:eastAsia="zh-CN"/>
               </w:rPr>
             </w:pPr>
+            <w:r>
+              <w:rPr>
+                <w:rFonts w:ascii="Calibri" w:eastAsia="DengXian" w:hAnsi="Calibri" w:cs="Arial"/>
+                <w:sz w:val="22"/>
+                <w:lang w:eastAsia="zh-CN"/>
+              </w:rPr>
+              <w:t xml:space="preserve">1. </w:t>
+            </w:r>
+            <w:r>
+              <w:rPr>
+                <w:rFonts w:ascii="Calibri" w:eastAsia="DengXian" w:hAnsi="Calibri" w:cs="Arial"/>
+                <w:sz w:val="22"/>
+                <w:lang w:eastAsia="zh-CN"/>
+              </w:rPr>
+              <w:t xml:space="preserve">A member field (an instance variable) </w:t>
+            </w:r>
+            <w:r>
+              <w:rPr>
+                <w:rFonts w:ascii="Calibri" w:eastAsia="DengXian" w:hAnsi="Calibri" w:cs="Arial"/>
+                <w:sz w:val="22"/>
+                <w:lang w:eastAsia="zh-CN"/>
+              </w:rPr>
+              <w:t xml:space="preserve">is a variable defined inside </w:t>
+            </w:r>
+            <w:r>
+              <w:rPr>
+                <w:rFonts w:ascii="Calibri" w:eastAsia="DengXian" w:hAnsi="Calibri" w:cs="Arial"/>
+                <w:sz w:val="22"/>
+                <w:lang w:eastAsia="zh-CN"/>
+              </w:rPr>
+              <w:t>a</w:t>
+            </w:r>
+            <w:r>
+              <w:rPr>
+                <w:rFonts w:ascii="Calibri" w:eastAsia="DengXian" w:hAnsi="Calibri" w:cs="Arial"/>
+                <w:sz w:val="22"/>
+                <w:lang w:eastAsia="zh-CN"/>
+              </w:rPr>
+              <w:t xml:space="preserve"> class but outside any method. It stores data or state for each object of the class.</w:t>
+            </w:r>
+          </w:p>
+          <w:p>
+            <w:pPr>
+              <w:spacing w:after="160" w:line="259" w:lineRule="auto"/>
+              <w:rPr>
+                <w:rFonts w:ascii="Calibri" w:eastAsia="DengXian" w:hAnsi="Calibri" w:cs="Arial"/>
+                <w:sz w:val="22"/>
+                <w:lang w:eastAsia="zh-CN"/>
+              </w:rPr>
+            </w:pPr>
+            <w:r>
+              <w:rPr>
+                <w:rFonts w:ascii="Calibri" w:eastAsia="DengXian" w:hAnsi="Calibri" w:cs="Arial"/>
+                <w:sz w:val="22"/>
+                <w:lang w:eastAsia="zh-CN"/>
+              </w:rPr>
+              <w:t xml:space="preserve">Ex: public int </w:t>
+            </w:r>
+            <w:proofErr w:type="gramStart"/>
+            <w:r>
+              <w:rPr>
+                <w:rFonts w:ascii="Calibri" w:eastAsia="DengXian" w:hAnsi="Calibri" w:cs="Arial"/>
+                <w:sz w:val="22"/>
+                <w:lang w:eastAsia="zh-CN"/>
+              </w:rPr>
+              <w:t>age;</w:t>
+            </w:r>
+            <w:proofErr w:type="gramEnd"/>
+          </w:p>
+          <w:p>
+            <w:pPr>
+              <w:spacing w:after="160" w:line="259" w:lineRule="auto"/>
+              <w:rPr>
+                <w:rFonts w:ascii="Calibri" w:eastAsia="DengXian" w:hAnsi="Calibri" w:cs="Arial"/>
+                <w:sz w:val="22"/>
+                <w:lang w:eastAsia="zh-CN"/>
+              </w:rPr>
+            </w:pPr>
+            <w:r>
+              <w:rPr>
+                <w:rFonts w:ascii="Calibri" w:eastAsia="DengXian" w:hAnsi="Calibri" w:cs="Arial"/>
+                <w:sz w:val="22"/>
+                <w:lang w:eastAsia="zh-CN"/>
+              </w:rPr>
+              <w:t xml:space="preserve">2. </w:t>
+            </w:r>
+            <w:r>
+              <w:rPr>
+                <w:rFonts w:ascii="Calibri" w:eastAsia="DengXian" w:hAnsi="Calibri" w:cs="Arial"/>
+                <w:sz w:val="22"/>
+                <w:lang w:eastAsia="zh-CN"/>
+              </w:rPr>
+              <w:t xml:space="preserve">A member method </w:t>
+            </w:r>
+            <w:r>
+              <w:rPr>
+                <w:rFonts w:ascii="Calibri" w:eastAsia="DengXian" w:hAnsi="Calibri" w:cs="Arial"/>
+                <w:sz w:val="22"/>
+                <w:lang w:eastAsia="zh-CN"/>
+              </w:rPr>
+              <w:t>(</w:t>
+            </w:r>
+            <w:r>
+              <w:rPr>
+                <w:rFonts w:ascii="Calibri" w:eastAsia="DengXian" w:hAnsi="Calibri" w:cs="Arial"/>
+                <w:sz w:val="22"/>
+                <w:lang w:eastAsia="zh-CN"/>
+              </w:rPr>
+              <w:t>an instance method) is a function defined inside a class. It performs the behaviour of an object in the class.</w:t>
+            </w:r>
+          </w:p>
+          <w:p>
+            <w:pPr>
+              <w:spacing w:after="160" w:line="259" w:lineRule="auto"/>
+              <w:rPr>
+                <w:rFonts w:ascii="Calibri" w:eastAsia="DengXian" w:hAnsi="Calibri" w:cs="Arial"/>
+                <w:sz w:val="22"/>
+                <w:lang w:eastAsia="zh-CN"/>
+              </w:rPr>
+            </w:pPr>
+            <w:r>
+              <w:rPr>
+                <w:rFonts w:ascii="Calibri" w:eastAsia="DengXian" w:hAnsi="Calibri" w:cs="Arial"/>
+                <w:sz w:val="22"/>
+                <w:lang w:eastAsia="zh-CN"/>
+              </w:rPr>
+              <w:t xml:space="preserve">Ex: public void </w:t>
+            </w:r>
+            <w:proofErr w:type="gramStart"/>
+            <w:r>
+              <w:rPr>
+                <w:rFonts w:ascii="Calibri" w:eastAsia="DengXian" w:hAnsi="Calibri" w:cs="Arial"/>
+                <w:sz w:val="22"/>
+                <w:lang w:eastAsia="zh-CN"/>
+              </w:rPr>
+              <w:t>Introduce(){</w:t>
+            </w:r>
+            <w:proofErr w:type="gramEnd"/>
+            <w:r>
+              <w:rPr>
+                <w:rFonts w:ascii="Calibri" w:eastAsia="DengXian" w:hAnsi="Calibri" w:cs="Arial"/>
+                <w:sz w:val="22"/>
+                <w:lang w:eastAsia="zh-CN"/>
+              </w:rPr>
+              <w:t>….}</w:t>
+            </w:r>
           </w:p>
         </w:tc>
       </w:tr>
@@ -747,7 +1267,6 @@
                 <w:sz w:val="22"/>
                 <w:lang w:eastAsia="zh-CN"/>
               </w:rPr>
-              <w:lastRenderedPageBreak/>
               <w:t>Answer:</w:t>
             </w:r>
           </w:p>
@@ -760,6 +1279,32 @@
                 <w:lang w:eastAsia="zh-CN"/>
               </w:rPr>
             </w:pPr>
+            <w:r>
+              <w:rPr>
+                <w:rFonts w:ascii="Calibri" w:eastAsia="DengXian" w:hAnsi="Calibri" w:cs="Arial"/>
+                <w:sz w:val="22"/>
+                <w:lang w:eastAsia="zh-CN"/>
+              </w:rPr>
+              <w:t>1. A static member field (a class variable) belongs to the class itself, not to any specific object. All objects share the same static field.</w:t>
+            </w:r>
+          </w:p>
+          <w:p>
+            <w:pPr>
+              <w:spacing w:after="160" w:line="259" w:lineRule="auto"/>
+              <w:rPr>
+                <w:rFonts w:ascii="Calibri" w:eastAsia="DengXian" w:hAnsi="Calibri" w:cs="Arial"/>
+                <w:sz w:val="22"/>
+                <w:lang w:eastAsia="zh-CN"/>
+              </w:rPr>
+            </w:pPr>
+            <w:r>
+              <w:rPr>
+                <w:rFonts w:ascii="Calibri" w:eastAsia="DengXian" w:hAnsi="Calibri" w:cs="Arial"/>
+                <w:sz w:val="22"/>
+                <w:lang w:eastAsia="zh-CN"/>
+              </w:rPr>
+              <w:t>2. A static member method (a class method) can be called without creating an object. It can only access other static members.</w:t>
+            </w:r>
           </w:p>
           <w:p>
             <w:pPr>
@@ -800,6 +1345,7 @@
                 <w:sz w:val="22"/>
                 <w:lang w:eastAsia="zh-CN"/>
               </w:rPr>
+              <w:lastRenderedPageBreak/>
               <w:t xml:space="preserve">6. </w:t>
             </w:r>
             <w:r>
@@ -827,18 +1373,20 @@
               <w:spacing w:after="160" w:line="259" w:lineRule="auto"/>
               <w:rPr>
                 <w:rFonts w:ascii="Calibri" w:eastAsia="DengXian" w:hAnsi="Calibri" w:cs="Arial"/>
-                <w:sz w:val="22"/>
-                <w:lang w:eastAsia="zh-CN"/>
-              </w:rPr>
-            </w:pPr>
-            <w:r>
-              <w:rPr>
-                <w:rFonts w:ascii="Calibri" w:eastAsia="DengXian" w:hAnsi="Calibri" w:cs="Arial"/>
                 <w:b/>
                 <w:bCs/>
                 <w:sz w:val="22"/>
                 <w:lang w:eastAsia="zh-CN"/>
               </w:rPr>
+            </w:pPr>
+            <w:r>
+              <w:rPr>
+                <w:rFonts w:ascii="Calibri" w:eastAsia="DengXian" w:hAnsi="Calibri" w:cs="Arial"/>
+                <w:b/>
+                <w:bCs/>
+                <w:sz w:val="22"/>
+                <w:lang w:eastAsia="zh-CN"/>
+              </w:rPr>
               <w:t>Answer:</w:t>
             </w:r>
           </w:p>
@@ -854,14 +1402,869 @@
             <w:r>
               <w:rPr>
                 <w:rFonts w:ascii="Calibri" w:eastAsia="DengXian" w:hAnsi="Calibri" w:cs="Arial"/>
-                <w:i/>
-                <w:iCs/>
-                <w:color w:val="A6A6A6"/>
-                <w:sz w:val="22"/>
-                <w:lang w:eastAsia="zh-CN"/>
-              </w:rPr>
-              <w:t>Test plan file name</w:t>
-            </w:r>
+                <w:sz w:val="22"/>
+                <w:lang w:eastAsia="zh-CN"/>
+              </w:rPr>
+              <w:t xml:space="preserve">1. </w:t>
+            </w:r>
+            <w:r>
+              <w:rPr>
+                <w:rFonts w:ascii="Calibri" w:eastAsia="DengXian" w:hAnsi="Calibri" w:cs="Arial"/>
+                <w:sz w:val="22"/>
+                <w:lang w:eastAsia="zh-CN"/>
+              </w:rPr>
+              <w:t>Debugging approaches are the general strategies or methods used by developers to identify, analyse, and fix errors</w:t>
+            </w:r>
+            <w:r>
+              <w:rPr>
+                <w:rFonts w:ascii="Calibri" w:eastAsia="DengXian" w:hAnsi="Calibri" w:cs="Arial"/>
+                <w:sz w:val="22"/>
+                <w:lang w:eastAsia="zh-CN"/>
+              </w:rPr>
+              <w:t xml:space="preserve"> </w:t>
+            </w:r>
+            <w:r>
+              <w:rPr>
+                <w:rFonts w:ascii="Calibri" w:eastAsia="DengXian" w:hAnsi="Calibri" w:cs="Arial"/>
+                <w:sz w:val="22"/>
+                <w:lang w:eastAsia="zh-CN"/>
+              </w:rPr>
+              <w:t>in a software program.</w:t>
+            </w:r>
+          </w:p>
+          <w:p>
+            <w:pPr>
+              <w:spacing w:after="160" w:line="259" w:lineRule="auto"/>
+              <w:rPr>
+                <w:rFonts w:ascii="Calibri" w:eastAsia="DengXian" w:hAnsi="Calibri" w:cs="Arial"/>
+                <w:sz w:val="22"/>
+                <w:lang w:eastAsia="zh-CN"/>
+              </w:rPr>
+            </w:pPr>
+            <w:r>
+              <w:rPr>
+                <w:rFonts w:ascii="Calibri" w:eastAsia="DengXian" w:hAnsi="Calibri" w:cs="Arial"/>
+                <w:sz w:val="22"/>
+                <w:lang w:eastAsia="zh-CN"/>
+              </w:rPr>
+              <w:t>Techniques of bugging:</w:t>
+            </w:r>
+          </w:p>
+          <w:p>
+            <w:pPr>
+              <w:pStyle w:val="ListParagraph"/>
+              <w:numPr>
+                <w:ilvl w:val="0"/>
+                <w:numId w:val="17"/>
+              </w:numPr>
+              <w:spacing w:after="160" w:line="259" w:lineRule="auto"/>
+              <w:rPr>
+                <w:rFonts w:ascii="Calibri" w:eastAsia="DengXian" w:hAnsi="Calibri" w:cs="Arial"/>
+                <w:sz w:val="22"/>
+                <w:lang w:eastAsia="zh-CN"/>
+              </w:rPr>
+            </w:pPr>
+            <w:r>
+              <w:rPr>
+                <w:rFonts w:ascii="Calibri" w:eastAsia="DengXian" w:hAnsi="Calibri" w:cs="Arial"/>
+                <w:sz w:val="22"/>
+                <w:lang w:eastAsia="zh-CN"/>
+              </w:rPr>
+              <w:t xml:space="preserve">Thorough Code Review: </w:t>
+            </w:r>
+            <w:r>
+              <w:rPr>
+                <w:rFonts w:ascii="Calibri" w:eastAsia="DengXian" w:hAnsi="Calibri" w:cs="Arial"/>
+                <w:sz w:val="22"/>
+                <w:lang w:eastAsia="zh-CN"/>
+              </w:rPr>
+              <w:t>R</w:t>
+            </w:r>
+            <w:r>
+              <w:rPr>
+                <w:rFonts w:ascii="Calibri" w:eastAsia="DengXian" w:hAnsi="Calibri" w:cs="Arial"/>
+                <w:sz w:val="22"/>
+                <w:lang w:eastAsia="zh-CN"/>
+              </w:rPr>
+              <w:t xml:space="preserve">ead the code to find syntax or logic errors. </w:t>
+            </w:r>
+          </w:p>
+          <w:p>
+            <w:pPr>
+              <w:pStyle w:val="ListParagraph"/>
+              <w:numPr>
+                <w:ilvl w:val="0"/>
+                <w:numId w:val="17"/>
+              </w:numPr>
+              <w:spacing w:after="160" w:line="259" w:lineRule="auto"/>
+              <w:rPr>
+                <w:rFonts w:ascii="Calibri" w:eastAsia="DengXian" w:hAnsi="Calibri" w:cs="Arial"/>
+                <w:sz w:val="22"/>
+                <w:lang w:eastAsia="zh-CN"/>
+              </w:rPr>
+            </w:pPr>
+            <w:r>
+              <w:rPr>
+                <w:rFonts w:ascii="Calibri" w:eastAsia="DengXian" w:hAnsi="Calibri" w:cs="Arial"/>
+                <w:sz w:val="22"/>
+                <w:lang w:eastAsia="zh-CN"/>
+              </w:rPr>
+              <w:t xml:space="preserve">Utilise Debugging Tools: </w:t>
+            </w:r>
+            <w:r>
+              <w:rPr>
+                <w:rFonts w:ascii="Calibri" w:eastAsia="DengXian" w:hAnsi="Calibri" w:cs="Arial"/>
+                <w:sz w:val="22"/>
+                <w:lang w:eastAsia="zh-CN"/>
+              </w:rPr>
+              <w:t xml:space="preserve">Use </w:t>
+            </w:r>
+            <w:r>
+              <w:rPr>
+                <w:rFonts w:ascii="Calibri" w:eastAsia="DengXian" w:hAnsi="Calibri" w:cs="Arial"/>
+                <w:sz w:val="22"/>
+                <w:lang w:eastAsia="zh-CN"/>
+              </w:rPr>
+              <w:t xml:space="preserve">breakpoints, step-by-step execution, and </w:t>
+            </w:r>
+            <w:r>
+              <w:rPr>
+                <w:rFonts w:ascii="Calibri" w:eastAsia="DengXian" w:hAnsi="Calibri" w:cs="Arial"/>
+                <w:sz w:val="22"/>
+                <w:lang w:eastAsia="zh-CN"/>
+              </w:rPr>
+              <w:t xml:space="preserve">variable </w:t>
+            </w:r>
+            <w:r>
+              <w:rPr>
+                <w:rFonts w:ascii="Calibri" w:eastAsia="DengXian" w:hAnsi="Calibri" w:cs="Arial"/>
+                <w:sz w:val="22"/>
+                <w:lang w:eastAsia="zh-CN"/>
+              </w:rPr>
+              <w:t>value</w:t>
+            </w:r>
+            <w:r>
+              <w:rPr>
+                <w:rFonts w:ascii="Calibri" w:eastAsia="DengXian" w:hAnsi="Calibri" w:cs="Arial"/>
+                <w:sz w:val="22"/>
+                <w:lang w:eastAsia="zh-CN"/>
+              </w:rPr>
+              <w:t xml:space="preserve"> </w:t>
+            </w:r>
+            <w:r>
+              <w:rPr>
+                <w:rFonts w:ascii="Calibri" w:eastAsia="DengXian" w:hAnsi="Calibri" w:cs="Arial"/>
+                <w:sz w:val="22"/>
+                <w:lang w:eastAsia="zh-CN"/>
+              </w:rPr>
+              <w:t xml:space="preserve">assess </w:t>
+            </w:r>
+            <w:r>
+              <w:rPr>
+                <w:rFonts w:ascii="Calibri" w:eastAsia="DengXian" w:hAnsi="Calibri" w:cs="Arial"/>
+                <w:sz w:val="22"/>
+                <w:lang w:eastAsia="zh-CN"/>
+              </w:rPr>
+              <w:t xml:space="preserve">in </w:t>
+            </w:r>
+            <w:r>
+              <w:rPr>
+                <w:rFonts w:ascii="Calibri" w:eastAsia="DengXian" w:hAnsi="Calibri" w:cs="Arial"/>
+                <w:sz w:val="22"/>
+                <w:lang w:eastAsia="zh-CN"/>
+              </w:rPr>
+              <w:t>IDE</w:t>
+            </w:r>
+            <w:r>
+              <w:rPr>
+                <w:rFonts w:ascii="Calibri" w:eastAsia="DengXian" w:hAnsi="Calibri" w:cs="Arial"/>
+                <w:sz w:val="22"/>
+                <w:lang w:eastAsia="zh-CN"/>
+              </w:rPr>
+              <w:t>.</w:t>
+            </w:r>
+          </w:p>
+          <w:p>
+            <w:pPr>
+              <w:pStyle w:val="ListParagraph"/>
+              <w:numPr>
+                <w:ilvl w:val="0"/>
+                <w:numId w:val="17"/>
+              </w:numPr>
+              <w:spacing w:after="160" w:line="259" w:lineRule="auto"/>
+              <w:rPr>
+                <w:rFonts w:ascii="Calibri" w:eastAsia="DengXian" w:hAnsi="Calibri" w:cs="Arial"/>
+                <w:sz w:val="22"/>
+                <w:lang w:eastAsia="zh-CN"/>
+              </w:rPr>
+            </w:pPr>
+            <w:r>
+              <w:rPr>
+                <w:rFonts w:ascii="Calibri" w:eastAsia="DengXian" w:hAnsi="Calibri" w:cs="Arial"/>
+                <w:sz w:val="22"/>
+                <w:lang w:eastAsia="zh-CN"/>
+              </w:rPr>
+              <w:t>Divide and Conquer: Split the code into smaller parts. Test each part to find where the problem happens.</w:t>
+            </w:r>
+          </w:p>
+          <w:p>
+            <w:pPr>
+              <w:pStyle w:val="ListParagraph"/>
+              <w:numPr>
+                <w:ilvl w:val="0"/>
+                <w:numId w:val="17"/>
+              </w:numPr>
+              <w:spacing w:after="160" w:line="259" w:lineRule="auto"/>
+              <w:rPr>
+                <w:rFonts w:ascii="Calibri" w:eastAsia="DengXian" w:hAnsi="Calibri" w:cs="Arial"/>
+                <w:sz w:val="22"/>
+                <w:lang w:eastAsia="zh-CN"/>
+              </w:rPr>
+            </w:pPr>
+            <w:r>
+              <w:rPr>
+                <w:rFonts w:ascii="Calibri" w:eastAsia="DengXian" w:hAnsi="Calibri" w:cs="Arial"/>
+                <w:sz w:val="22"/>
+                <w:lang w:eastAsia="zh-CN"/>
+              </w:rPr>
+              <w:t>Employ Print Statements</w:t>
+            </w:r>
+            <w:r>
+              <w:rPr>
+                <w:rFonts w:ascii="Calibri" w:eastAsia="DengXian" w:hAnsi="Calibri" w:cs="Arial"/>
+                <w:sz w:val="22"/>
+                <w:lang w:eastAsia="zh-CN"/>
+              </w:rPr>
+              <w:t xml:space="preserve">: </w:t>
+            </w:r>
+            <w:r>
+              <w:rPr>
+                <w:rFonts w:ascii="Calibri" w:eastAsia="DengXian" w:hAnsi="Calibri" w:cs="Arial"/>
+                <w:sz w:val="22"/>
+                <w:lang w:eastAsia="zh-CN"/>
+              </w:rPr>
+              <w:t>Print values of variables to see how your code runs and where it goes wrong.</w:t>
+            </w:r>
+          </w:p>
+          <w:p>
+            <w:pPr>
+              <w:pStyle w:val="ListParagraph"/>
+              <w:numPr>
+                <w:ilvl w:val="0"/>
+                <w:numId w:val="17"/>
+              </w:numPr>
+              <w:spacing w:after="160" w:line="259" w:lineRule="auto"/>
+              <w:rPr>
+                <w:rFonts w:ascii="Calibri" w:eastAsia="DengXian" w:hAnsi="Calibri" w:cs="Arial"/>
+                <w:sz w:val="22"/>
+                <w:lang w:eastAsia="zh-CN"/>
+              </w:rPr>
+            </w:pPr>
+            <w:r>
+              <w:rPr>
+                <w:rFonts w:ascii="Calibri" w:eastAsia="DengXian" w:hAnsi="Calibri" w:cs="Arial"/>
+                <w:sz w:val="22"/>
+                <w:lang w:eastAsia="zh-CN"/>
+              </w:rPr>
+              <w:t>Use Version Control Systems</w:t>
+            </w:r>
+            <w:r>
+              <w:rPr>
+                <w:rFonts w:ascii="Calibri" w:eastAsia="DengXian" w:hAnsi="Calibri" w:cs="Arial"/>
+                <w:sz w:val="22"/>
+                <w:lang w:eastAsia="zh-CN"/>
+              </w:rPr>
+              <w:t>:</w:t>
+            </w:r>
+            <w:r>
+              <w:rPr>
+                <w:rFonts w:ascii="Calibri" w:eastAsia="DengXian" w:hAnsi="Calibri" w:cs="Arial"/>
+                <w:sz w:val="22"/>
+                <w:lang w:eastAsia="zh-CN"/>
+              </w:rPr>
+              <w:t xml:space="preserve"> Tools like Git help track changes. You can find out when a bug was added.</w:t>
+            </w:r>
+          </w:p>
+          <w:p>
+            <w:pPr>
+              <w:pStyle w:val="ListParagraph"/>
+              <w:numPr>
+                <w:ilvl w:val="0"/>
+                <w:numId w:val="17"/>
+              </w:numPr>
+              <w:spacing w:after="160" w:line="259" w:lineRule="auto"/>
+              <w:rPr>
+                <w:rFonts w:ascii="Calibri" w:eastAsia="DengXian" w:hAnsi="Calibri" w:cs="Arial"/>
+                <w:sz w:val="22"/>
+                <w:lang w:eastAsia="zh-CN"/>
+              </w:rPr>
+            </w:pPr>
+            <w:r>
+              <w:rPr>
+                <w:rFonts w:ascii="Calibri" w:eastAsia="DengXian" w:hAnsi="Calibri" w:cs="Arial"/>
+                <w:sz w:val="22"/>
+                <w:lang w:eastAsia="zh-CN"/>
+              </w:rPr>
+              <w:t>Test Edge Cases</w:t>
+            </w:r>
+            <w:r>
+              <w:rPr>
+                <w:rFonts w:ascii="Calibri" w:eastAsia="DengXian" w:hAnsi="Calibri" w:cs="Arial"/>
+                <w:sz w:val="22"/>
+                <w:lang w:eastAsia="zh-CN"/>
+              </w:rPr>
+              <w:t>:</w:t>
+            </w:r>
+            <w:r>
+              <w:rPr>
+                <w:rFonts w:ascii="Calibri" w:eastAsia="DengXian" w:hAnsi="Calibri" w:cs="Arial"/>
+                <w:sz w:val="22"/>
+                <w:lang w:eastAsia="zh-CN"/>
+              </w:rPr>
+              <w:t xml:space="preserve"> Check unusual or extreme inputs. Bugs often hide in these cases.</w:t>
+            </w:r>
+          </w:p>
+          <w:p>
+            <w:pPr>
+              <w:pStyle w:val="ListParagraph"/>
+              <w:numPr>
+                <w:ilvl w:val="0"/>
+                <w:numId w:val="17"/>
+              </w:numPr>
+              <w:spacing w:after="160" w:line="259" w:lineRule="auto"/>
+              <w:rPr>
+                <w:rFonts w:ascii="Calibri" w:eastAsia="DengXian" w:hAnsi="Calibri" w:cs="Arial"/>
+                <w:sz w:val="22"/>
+                <w:lang w:eastAsia="zh-CN"/>
+              </w:rPr>
+            </w:pPr>
+            <w:r>
+              <w:rPr>
+                <w:rFonts w:ascii="Calibri" w:eastAsia="DengXian" w:hAnsi="Calibri" w:cs="Arial"/>
+                <w:sz w:val="22"/>
+                <w:lang w:eastAsia="zh-CN"/>
+              </w:rPr>
+              <w:t>Seek Help from Online Communities: Ask for help on sites like Stack Overflow. Many developers share their solutions.</w:t>
+            </w:r>
+          </w:p>
+          <w:p>
+            <w:pPr>
+              <w:pStyle w:val="ListParagraph"/>
+              <w:numPr>
+                <w:ilvl w:val="0"/>
+                <w:numId w:val="17"/>
+              </w:numPr>
+              <w:spacing w:after="160" w:line="259" w:lineRule="auto"/>
+              <w:rPr>
+                <w:rFonts w:ascii="Calibri" w:eastAsia="DengXian" w:hAnsi="Calibri" w:cs="Arial"/>
+                <w:sz w:val="22"/>
+                <w:lang w:eastAsia="zh-CN"/>
+              </w:rPr>
+            </w:pPr>
+            <w:r>
+              <w:rPr>
+                <w:rFonts w:ascii="Calibri" w:eastAsia="DengXian" w:hAnsi="Calibri" w:cs="Arial"/>
+                <w:sz w:val="22"/>
+                <w:lang w:eastAsia="zh-CN"/>
+              </w:rPr>
+              <w:t>Read Documentation</w:t>
+            </w:r>
+            <w:r>
+              <w:rPr>
+                <w:rFonts w:ascii="Calibri" w:eastAsia="DengXian" w:hAnsi="Calibri" w:cs="Arial"/>
+                <w:sz w:val="22"/>
+                <w:lang w:eastAsia="zh-CN"/>
+              </w:rPr>
+              <w:t xml:space="preserve"> </w:t>
+            </w:r>
+            <w:r>
+              <w:rPr>
+                <w:rFonts w:ascii="Calibri" w:eastAsia="DengXian" w:hAnsi="Calibri" w:cs="Arial"/>
+                <w:sz w:val="22"/>
+                <w:lang w:eastAsia="zh-CN"/>
+              </w:rPr>
+              <w:t>thoroughly</w:t>
+            </w:r>
+            <w:r>
+              <w:rPr>
+                <w:rFonts w:ascii="Calibri" w:eastAsia="DengXian" w:hAnsi="Calibri" w:cs="Arial"/>
+                <w:sz w:val="22"/>
+                <w:lang w:eastAsia="zh-CN"/>
+              </w:rPr>
+              <w:t xml:space="preserve">: </w:t>
+            </w:r>
+            <w:r>
+              <w:rPr>
+                <w:rFonts w:ascii="Calibri" w:eastAsia="DengXian" w:hAnsi="Calibri" w:cs="Arial"/>
+                <w:sz w:val="22"/>
+                <w:lang w:eastAsia="zh-CN"/>
+              </w:rPr>
+              <w:t xml:space="preserve">Knowledge about </w:t>
+            </w:r>
+            <w:r>
+              <w:rPr>
+                <w:rFonts w:ascii="Calibri" w:eastAsia="DengXian" w:hAnsi="Calibri" w:cs="Arial"/>
+                <w:sz w:val="22"/>
+                <w:lang w:eastAsia="zh-CN"/>
+              </w:rPr>
+              <w:t xml:space="preserve">libraries and languages work </w:t>
+            </w:r>
+            <w:r>
+              <w:rPr>
+                <w:rFonts w:ascii="Calibri" w:eastAsia="DengXian" w:hAnsi="Calibri" w:cs="Arial"/>
+                <w:sz w:val="22"/>
+                <w:lang w:eastAsia="zh-CN"/>
+              </w:rPr>
+              <w:t xml:space="preserve">which </w:t>
+            </w:r>
+            <w:r>
+              <w:rPr>
+                <w:rFonts w:ascii="Calibri" w:eastAsia="DengXian" w:hAnsi="Calibri" w:cs="Arial"/>
+                <w:sz w:val="22"/>
+                <w:lang w:eastAsia="zh-CN"/>
+              </w:rPr>
+              <w:t xml:space="preserve">can help you </w:t>
+            </w:r>
+            <w:r>
+              <w:rPr>
+                <w:rFonts w:ascii="Calibri" w:eastAsia="DengXian" w:hAnsi="Calibri" w:cs="Arial"/>
+                <w:sz w:val="22"/>
+                <w:lang w:eastAsia="zh-CN"/>
+              </w:rPr>
+              <w:t>identify</w:t>
+            </w:r>
+            <w:r>
+              <w:rPr>
+                <w:rFonts w:ascii="Calibri" w:eastAsia="DengXian" w:hAnsi="Calibri" w:cs="Arial"/>
+                <w:sz w:val="22"/>
+                <w:lang w:eastAsia="zh-CN"/>
+              </w:rPr>
+              <w:t xml:space="preserve"> </w:t>
+            </w:r>
+            <w:r>
+              <w:rPr>
+                <w:rFonts w:ascii="Calibri" w:eastAsia="DengXian" w:hAnsi="Calibri" w:cs="Arial"/>
+                <w:sz w:val="22"/>
+                <w:lang w:eastAsia="zh-CN"/>
+              </w:rPr>
+              <w:t>and</w:t>
+            </w:r>
+            <w:r>
+              <w:rPr>
+                <w:rFonts w:ascii="Calibri" w:eastAsia="DengXian" w:hAnsi="Calibri" w:cs="Arial"/>
+                <w:sz w:val="22"/>
+                <w:lang w:eastAsia="zh-CN"/>
+              </w:rPr>
+              <w:t xml:space="preserve"> fix bugs faster.</w:t>
+            </w:r>
+          </w:p>
+          <w:p>
+            <w:pPr>
+              <w:pStyle w:val="ListParagraph"/>
+              <w:numPr>
+                <w:ilvl w:val="0"/>
+                <w:numId w:val="17"/>
+              </w:numPr>
+              <w:spacing w:after="160" w:line="259" w:lineRule="auto"/>
+              <w:rPr>
+                <w:rFonts w:ascii="Calibri" w:eastAsia="DengXian" w:hAnsi="Calibri" w:cs="Arial"/>
+                <w:sz w:val="22"/>
+                <w:lang w:eastAsia="zh-CN"/>
+              </w:rPr>
+            </w:pPr>
+            <w:r>
+              <w:rPr>
+                <w:rFonts w:ascii="Calibri" w:eastAsia="DengXian" w:hAnsi="Calibri" w:cs="Arial"/>
+                <w:sz w:val="22"/>
+                <w:lang w:eastAsia="zh-CN"/>
+              </w:rPr>
+              <w:t>S</w:t>
+            </w:r>
+            <w:r>
+              <w:rPr>
+                <w:rFonts w:ascii="Calibri" w:eastAsia="DengXian" w:hAnsi="Calibri" w:cs="Arial"/>
+                <w:sz w:val="22"/>
+                <w:lang w:eastAsia="zh-CN"/>
+              </w:rPr>
+              <w:t>ystematic Approach</w:t>
+            </w:r>
+            <w:r>
+              <w:rPr>
+                <w:rFonts w:ascii="Calibri" w:eastAsia="DengXian" w:hAnsi="Calibri" w:cs="Arial"/>
+                <w:sz w:val="22"/>
+                <w:lang w:eastAsia="zh-CN"/>
+              </w:rPr>
+              <w:t>:</w:t>
+            </w:r>
+            <w:r>
+              <w:rPr>
+                <w:rFonts w:ascii="Calibri" w:eastAsia="DengXian" w:hAnsi="Calibri" w:cs="Arial"/>
+                <w:sz w:val="22"/>
+                <w:lang w:eastAsia="zh-CN"/>
+              </w:rPr>
+              <w:t xml:space="preserve"> </w:t>
+            </w:r>
+            <w:r>
+              <w:rPr>
+                <w:rFonts w:ascii="Calibri" w:eastAsia="DengXian" w:hAnsi="Calibri" w:cs="Arial"/>
+                <w:sz w:val="22"/>
+                <w:lang w:eastAsia="zh-CN"/>
+              </w:rPr>
+              <w:t xml:space="preserve">Understand clearly </w:t>
+            </w:r>
+            <w:r>
+              <w:rPr>
+                <w:rFonts w:ascii="Calibri" w:eastAsia="DengXian" w:hAnsi="Calibri" w:cs="Arial"/>
+                <w:sz w:val="22"/>
+                <w:lang w:eastAsia="zh-CN"/>
+              </w:rPr>
+              <w:t xml:space="preserve">what you test, what you find, and what works. </w:t>
+            </w:r>
+          </w:p>
+          <w:p>
+            <w:pPr>
+              <w:pStyle w:val="ListParagraph"/>
+              <w:numPr>
+                <w:ilvl w:val="0"/>
+                <w:numId w:val="17"/>
+              </w:numPr>
+              <w:spacing w:after="160" w:line="259" w:lineRule="auto"/>
+              <w:rPr>
+                <w:rFonts w:ascii="Calibri" w:eastAsia="DengXian" w:hAnsi="Calibri" w:cs="Arial"/>
+                <w:sz w:val="22"/>
+                <w:lang w:eastAsia="zh-CN"/>
+              </w:rPr>
+            </w:pPr>
+            <w:r>
+              <w:rPr>
+                <w:rFonts w:ascii="Calibri" w:eastAsia="DengXian" w:hAnsi="Calibri" w:cs="Arial"/>
+                <w:sz w:val="22"/>
+                <w:lang w:eastAsia="zh-CN"/>
+              </w:rPr>
+              <w:t>Be Patient and Persistent: Debugging is hard. Don’t give up. Take breaks and come back with a clear mind.</w:t>
+            </w:r>
+          </w:p>
+          <w:p>
+            <w:pPr>
+              <w:spacing w:after="160" w:line="259" w:lineRule="auto"/>
+              <w:rPr>
+                <w:rFonts w:ascii="Calibri" w:eastAsia="DengXian" w:hAnsi="Calibri" w:cs="Arial"/>
+                <w:sz w:val="22"/>
+                <w:lang w:eastAsia="zh-CN"/>
+              </w:rPr>
+            </w:pPr>
+            <w:r>
+              <w:rPr>
+                <w:rFonts w:ascii="Calibri" w:eastAsia="DengXian" w:hAnsi="Calibri" w:cs="Arial"/>
+                <w:sz w:val="22"/>
+                <w:lang w:eastAsia="zh-CN"/>
+              </w:rPr>
+              <w:t xml:space="preserve">2. </w:t>
+            </w:r>
+            <w:r>
+              <w:rPr>
+                <w:rFonts w:ascii="Calibri" w:eastAsia="DengXian" w:hAnsi="Calibri" w:cs="Arial"/>
+                <w:sz w:val="22"/>
+                <w:lang w:eastAsia="zh-CN"/>
+              </w:rPr>
+              <w:t>A test approach is the implementation of the test strategy in a software project that defines how testers will carry out software testing, along with throwing light on strategy and execution to carry out different tasks.</w:t>
+            </w:r>
+          </w:p>
+          <w:p>
+            <w:pPr>
+              <w:spacing w:after="160" w:line="259" w:lineRule="auto"/>
+              <w:rPr>
+                <w:rFonts w:ascii="Calibri" w:eastAsia="DengXian" w:hAnsi="Calibri" w:cs="Arial"/>
+                <w:sz w:val="22"/>
+                <w:lang w:eastAsia="zh-CN"/>
+              </w:rPr>
+            </w:pPr>
+            <w:r>
+              <w:rPr>
+                <w:rFonts w:ascii="Calibri" w:eastAsia="DengXian" w:hAnsi="Calibri" w:cs="Arial"/>
+                <w:sz w:val="22"/>
+                <w:lang w:eastAsia="zh-CN"/>
+              </w:rPr>
+              <w:t>Black-box Techniques:</w:t>
+            </w:r>
+          </w:p>
+          <w:p>
+            <w:pPr>
+              <w:pStyle w:val="ListParagraph"/>
+              <w:numPr>
+                <w:ilvl w:val="0"/>
+                <w:numId w:val="17"/>
+              </w:numPr>
+              <w:spacing w:after="160" w:line="259" w:lineRule="auto"/>
+              <w:rPr>
+                <w:rFonts w:ascii="Calibri" w:eastAsia="DengXian" w:hAnsi="Calibri" w:cs="Arial"/>
+                <w:sz w:val="22"/>
+                <w:lang w:eastAsia="zh-CN"/>
+              </w:rPr>
+            </w:pPr>
+            <w:r>
+              <w:rPr>
+                <w:rFonts w:ascii="Calibri" w:eastAsia="DengXian" w:hAnsi="Calibri" w:cs="Arial"/>
+                <w:sz w:val="22"/>
+                <w:lang w:eastAsia="zh-CN"/>
+              </w:rPr>
+              <w:t>Equivalence Partitioning: Divide inputs into groups that are expected to behave similarly.</w:t>
+            </w:r>
+          </w:p>
+          <w:p>
+            <w:pPr>
+              <w:pStyle w:val="ListParagraph"/>
+              <w:numPr>
+                <w:ilvl w:val="0"/>
+                <w:numId w:val="17"/>
+              </w:numPr>
+              <w:spacing w:after="160" w:line="259" w:lineRule="auto"/>
+              <w:rPr>
+                <w:rFonts w:ascii="Calibri" w:eastAsia="DengXian" w:hAnsi="Calibri" w:cs="Arial"/>
+                <w:sz w:val="22"/>
+                <w:lang w:eastAsia="zh-CN"/>
+              </w:rPr>
+            </w:pPr>
+            <w:r>
+              <w:rPr>
+                <w:rFonts w:ascii="Calibri" w:eastAsia="DengXian" w:hAnsi="Calibri" w:cs="Arial"/>
+                <w:sz w:val="22"/>
+                <w:lang w:eastAsia="zh-CN"/>
+              </w:rPr>
+              <w:t>Boundary Value Analysis (BVA): Test the edge values of input ranges where errors are likely.</w:t>
+            </w:r>
+          </w:p>
+          <w:p>
+            <w:pPr>
+              <w:pStyle w:val="ListParagraph"/>
+              <w:numPr>
+                <w:ilvl w:val="0"/>
+                <w:numId w:val="17"/>
+              </w:numPr>
+              <w:spacing w:after="160" w:line="259" w:lineRule="auto"/>
+              <w:rPr>
+                <w:rFonts w:ascii="Calibri" w:eastAsia="DengXian" w:hAnsi="Calibri" w:cs="Arial"/>
+                <w:sz w:val="22"/>
+                <w:lang w:eastAsia="zh-CN"/>
+              </w:rPr>
+            </w:pPr>
+            <w:r>
+              <w:rPr>
+                <w:rFonts w:ascii="Calibri" w:eastAsia="DengXian" w:hAnsi="Calibri" w:cs="Arial"/>
+                <w:sz w:val="22"/>
+                <w:lang w:eastAsia="zh-CN"/>
+              </w:rPr>
+              <w:t>Decision Table Testing: Use a table of conditions and outcomes to cover all decision combinations.</w:t>
+            </w:r>
+          </w:p>
+          <w:p>
+            <w:pPr>
+              <w:pStyle w:val="ListParagraph"/>
+              <w:numPr>
+                <w:ilvl w:val="0"/>
+                <w:numId w:val="17"/>
+              </w:numPr>
+              <w:spacing w:after="160" w:line="259" w:lineRule="auto"/>
+              <w:rPr>
+                <w:rFonts w:ascii="Calibri" w:eastAsia="DengXian" w:hAnsi="Calibri" w:cs="Arial"/>
+                <w:sz w:val="22"/>
+                <w:lang w:eastAsia="zh-CN"/>
+              </w:rPr>
+            </w:pPr>
+            <w:r>
+              <w:rPr>
+                <w:rFonts w:ascii="Calibri" w:eastAsia="DengXian" w:hAnsi="Calibri" w:cs="Arial"/>
+                <w:sz w:val="22"/>
+                <w:lang w:eastAsia="zh-CN"/>
+              </w:rPr>
+              <w:t>Use Case Testing: Design test cases based on real-world user interactions with the system.</w:t>
+            </w:r>
+          </w:p>
+          <w:p>
+            <w:pPr>
+              <w:spacing w:after="160" w:line="259" w:lineRule="auto"/>
+              <w:rPr>
+                <w:rFonts w:ascii="Calibri" w:eastAsia="DengXian" w:hAnsi="Calibri" w:cs="Arial"/>
+                <w:sz w:val="22"/>
+                <w:lang w:eastAsia="zh-CN"/>
+              </w:rPr>
+            </w:pPr>
+            <w:r>
+              <w:rPr>
+                <w:rFonts w:ascii="Calibri" w:eastAsia="DengXian" w:hAnsi="Calibri" w:cs="Arial"/>
+                <w:sz w:val="22"/>
+                <w:lang w:eastAsia="zh-CN"/>
+              </w:rPr>
+              <w:t>White-box Techniques:</w:t>
+            </w:r>
+          </w:p>
+          <w:p>
+            <w:pPr>
+              <w:pStyle w:val="ListParagraph"/>
+              <w:numPr>
+                <w:ilvl w:val="0"/>
+                <w:numId w:val="17"/>
+              </w:numPr>
+              <w:spacing w:after="160" w:line="259" w:lineRule="auto"/>
+              <w:rPr>
+                <w:rFonts w:ascii="Calibri" w:eastAsia="DengXian" w:hAnsi="Calibri" w:cs="Arial"/>
+                <w:sz w:val="22"/>
+                <w:lang w:eastAsia="zh-CN"/>
+              </w:rPr>
+            </w:pPr>
+            <w:r>
+              <w:rPr>
+                <w:rFonts w:ascii="Calibri" w:eastAsia="DengXian" w:hAnsi="Calibri" w:cs="Arial"/>
+                <w:sz w:val="22"/>
+                <w:lang w:eastAsia="zh-CN"/>
+              </w:rPr>
+              <w:t>Statement Coverage: Ensure every line of code is executed at least once.</w:t>
+            </w:r>
+          </w:p>
+          <w:p>
+            <w:pPr>
+              <w:pStyle w:val="ListParagraph"/>
+              <w:numPr>
+                <w:ilvl w:val="0"/>
+                <w:numId w:val="17"/>
+              </w:numPr>
+              <w:spacing w:after="160" w:line="259" w:lineRule="auto"/>
+              <w:rPr>
+                <w:rFonts w:ascii="Calibri" w:eastAsia="DengXian" w:hAnsi="Calibri" w:cs="Arial"/>
+                <w:sz w:val="22"/>
+                <w:lang w:eastAsia="zh-CN"/>
+              </w:rPr>
+            </w:pPr>
+            <w:r>
+              <w:rPr>
+                <w:rFonts w:ascii="Calibri" w:eastAsia="DengXian" w:hAnsi="Calibri" w:cs="Arial"/>
+                <w:sz w:val="22"/>
+                <w:lang w:eastAsia="zh-CN"/>
+              </w:rPr>
+              <w:t>Branch Coverage: Verify that all decision points (true/false paths) are tested.</w:t>
+            </w:r>
+          </w:p>
+          <w:p>
+            <w:pPr>
+              <w:pStyle w:val="ListParagraph"/>
+              <w:numPr>
+                <w:ilvl w:val="0"/>
+                <w:numId w:val="17"/>
+              </w:numPr>
+              <w:spacing w:after="160" w:line="259" w:lineRule="auto"/>
+              <w:rPr>
+                <w:rFonts w:ascii="Calibri" w:eastAsia="DengXian" w:hAnsi="Calibri" w:cs="Arial"/>
+                <w:sz w:val="22"/>
+                <w:lang w:eastAsia="zh-CN"/>
+              </w:rPr>
+            </w:pPr>
+            <w:r>
+              <w:rPr>
+                <w:rFonts w:ascii="Calibri" w:eastAsia="DengXian" w:hAnsi="Calibri" w:cs="Arial"/>
+                <w:sz w:val="22"/>
+                <w:lang w:eastAsia="zh-CN"/>
+              </w:rPr>
+              <w:t>Path Testing: Test every possible route through the program’s logic.</w:t>
+            </w:r>
+          </w:p>
+          <w:p>
+            <w:pPr>
+              <w:pStyle w:val="ListParagraph"/>
+              <w:numPr>
+                <w:ilvl w:val="0"/>
+                <w:numId w:val="17"/>
+              </w:numPr>
+              <w:spacing w:after="160" w:line="259" w:lineRule="auto"/>
+              <w:rPr>
+                <w:rFonts w:ascii="Calibri" w:eastAsia="DengXian" w:hAnsi="Calibri" w:cs="Arial"/>
+                <w:sz w:val="22"/>
+                <w:lang w:eastAsia="zh-CN"/>
+              </w:rPr>
+            </w:pPr>
+            <w:r>
+              <w:rPr>
+                <w:rFonts w:ascii="Calibri" w:eastAsia="DengXian" w:hAnsi="Calibri" w:cs="Arial"/>
+                <w:sz w:val="22"/>
+                <w:lang w:eastAsia="zh-CN"/>
+              </w:rPr>
+              <w:t>Loop Testing: Examine the execution of loops with various iteration scenarios.</w:t>
+            </w:r>
+          </w:p>
+          <w:p>
+            <w:pPr>
+              <w:spacing w:after="160" w:line="259" w:lineRule="auto"/>
+              <w:rPr>
+                <w:rFonts w:ascii="Calibri" w:eastAsia="DengXian" w:hAnsi="Calibri" w:cs="Arial"/>
+                <w:sz w:val="22"/>
+                <w:lang w:eastAsia="zh-CN"/>
+              </w:rPr>
+            </w:pPr>
+            <w:r>
+              <w:rPr>
+                <w:rFonts w:ascii="Calibri" w:eastAsia="DengXian" w:hAnsi="Calibri" w:cs="Arial"/>
+                <w:sz w:val="22"/>
+                <w:lang w:eastAsia="zh-CN"/>
+              </w:rPr>
+              <w:t>Experience-based Techniques:</w:t>
+            </w:r>
+          </w:p>
+          <w:p>
+            <w:pPr>
+              <w:pStyle w:val="ListParagraph"/>
+              <w:numPr>
+                <w:ilvl w:val="0"/>
+                <w:numId w:val="17"/>
+              </w:numPr>
+              <w:spacing w:after="160" w:line="259" w:lineRule="auto"/>
+              <w:rPr>
+                <w:rFonts w:ascii="Calibri" w:eastAsia="DengXian" w:hAnsi="Calibri" w:cs="Arial"/>
+                <w:sz w:val="22"/>
+                <w:lang w:eastAsia="zh-CN"/>
+              </w:rPr>
+            </w:pPr>
+            <w:r>
+              <w:rPr>
+                <w:rFonts w:ascii="Calibri" w:eastAsia="DengXian" w:hAnsi="Calibri" w:cs="Arial"/>
+                <w:sz w:val="22"/>
+                <w:lang w:eastAsia="zh-CN"/>
+              </w:rPr>
+              <w:t>Error Guessing: Predict error-prone areas based on past experience.</w:t>
+            </w:r>
+          </w:p>
+          <w:p>
+            <w:pPr>
+              <w:pStyle w:val="ListParagraph"/>
+              <w:numPr>
+                <w:ilvl w:val="0"/>
+                <w:numId w:val="17"/>
+              </w:numPr>
+              <w:spacing w:after="160" w:line="259" w:lineRule="auto"/>
+              <w:rPr>
+                <w:rFonts w:ascii="Calibri" w:eastAsia="DengXian" w:hAnsi="Calibri" w:cs="Arial"/>
+                <w:sz w:val="22"/>
+                <w:lang w:eastAsia="zh-CN"/>
+              </w:rPr>
+            </w:pPr>
+            <w:r>
+              <w:rPr>
+                <w:rFonts w:ascii="Calibri" w:eastAsia="DengXian" w:hAnsi="Calibri" w:cs="Arial"/>
+                <w:sz w:val="22"/>
+                <w:lang w:eastAsia="zh-CN"/>
+              </w:rPr>
+              <w:t>Exploratory Testing: Investigate the software without formal scripts to uncover unexpected defects.</w:t>
+            </w:r>
+          </w:p>
+          <w:p>
+            <w:pPr>
+              <w:pStyle w:val="ListParagraph"/>
+              <w:spacing w:after="160" w:line="259" w:lineRule="auto"/>
+              <w:ind w:left="720"/>
+              <w:rPr>
+                <w:rFonts w:ascii="Calibri" w:eastAsia="DengXian" w:hAnsi="Calibri" w:cs="Arial"/>
+                <w:sz w:val="22"/>
+                <w:lang w:eastAsia="zh-CN"/>
+              </w:rPr>
+            </w:pPr>
           </w:p>
         </w:tc>
       </w:tr>
@@ -892,6 +2295,7 @@
                 <w:sz w:val="22"/>
                 <w:lang w:eastAsia="zh-CN"/>
               </w:rPr>
+              <w:lastRenderedPageBreak/>
               <w:t xml:space="preserve">7. </w:t>
             </w:r>
             <w:r>
@@ -919,18 +2323,20 @@
               <w:spacing w:after="160" w:line="259" w:lineRule="auto"/>
               <w:rPr>
                 <w:rFonts w:ascii="Calibri" w:eastAsia="DengXian" w:hAnsi="Calibri" w:cs="Arial"/>
-                <w:sz w:val="22"/>
-                <w:lang w:eastAsia="zh-CN"/>
-              </w:rPr>
-            </w:pPr>
-            <w:r>
-              <w:rPr>
-                <w:rFonts w:ascii="Calibri" w:eastAsia="DengXian" w:hAnsi="Calibri" w:cs="Arial"/>
                 <w:b/>
                 <w:bCs/>
                 <w:sz w:val="22"/>
                 <w:lang w:eastAsia="zh-CN"/>
               </w:rPr>
+            </w:pPr>
+            <w:r>
+              <w:rPr>
+                <w:rFonts w:ascii="Calibri" w:eastAsia="DengXian" w:hAnsi="Calibri" w:cs="Arial"/>
+                <w:b/>
+                <w:bCs/>
+                <w:sz w:val="22"/>
+                <w:lang w:eastAsia="zh-CN"/>
+              </w:rPr>
               <w:t>Answer:</w:t>
             </w:r>
           </w:p>
@@ -943,6 +2349,536 @@
                 <w:lang w:eastAsia="zh-CN"/>
               </w:rPr>
             </w:pPr>
+            <w:r>
+              <w:rPr>
+                <w:rFonts w:ascii="Calibri" w:eastAsia="DengXian" w:hAnsi="Calibri" w:cs="Arial"/>
+                <w:sz w:val="22"/>
+                <w:lang w:eastAsia="zh-CN"/>
+              </w:rPr>
+              <w:t xml:space="preserve">The software development lifecycle is </w:t>
+            </w:r>
+            <w:r>
+              <w:rPr>
+                <w:rFonts w:ascii="Calibri" w:eastAsia="DengXian" w:hAnsi="Calibri" w:cs="Arial"/>
+                <w:sz w:val="22"/>
+                <w:lang w:eastAsia="zh-CN"/>
+              </w:rPr>
+              <w:t xml:space="preserve">process </w:t>
+            </w:r>
+            <w:r>
+              <w:rPr>
+                <w:rFonts w:ascii="Calibri" w:eastAsia="DengXian" w:hAnsi="Calibri" w:cs="Arial"/>
+                <w:sz w:val="22"/>
+                <w:lang w:eastAsia="zh-CN"/>
+              </w:rPr>
+              <w:t>use to design and build high</w:t>
+            </w:r>
+            <w:r>
+              <w:rPr>
+                <w:rFonts w:ascii="Calibri" w:eastAsia="DengXian" w:hAnsi="Calibri" w:cs="Arial"/>
+                <w:sz w:val="22"/>
+                <w:lang w:eastAsia="zh-CN"/>
+              </w:rPr>
+              <w:t xml:space="preserve"> </w:t>
+            </w:r>
+            <w:r>
+              <w:rPr>
+                <w:rFonts w:ascii="Calibri" w:eastAsia="DengXian" w:hAnsi="Calibri" w:cs="Arial"/>
+                <w:sz w:val="22"/>
+                <w:lang w:eastAsia="zh-CN"/>
+              </w:rPr>
+              <w:t>quality software</w:t>
+            </w:r>
+            <w:r>
+              <w:rPr>
+                <w:rFonts w:ascii="Calibri" w:eastAsia="DengXian" w:hAnsi="Calibri" w:cs="Arial"/>
+                <w:sz w:val="22"/>
+                <w:lang w:eastAsia="zh-CN"/>
+              </w:rPr>
+              <w:t xml:space="preserve"> and ensuring not only effective cost but also effective time</w:t>
+            </w:r>
+            <w:r>
+              <w:rPr>
+                <w:rFonts w:ascii="Calibri" w:eastAsia="DengXian" w:hAnsi="Calibri" w:cs="Arial"/>
+                <w:sz w:val="22"/>
+                <w:lang w:eastAsia="zh-CN"/>
+              </w:rPr>
+              <w:t xml:space="preserve">. </w:t>
+            </w:r>
+          </w:p>
+          <w:p>
+            <w:pPr>
+              <w:spacing w:after="160" w:line="259" w:lineRule="auto"/>
+              <w:rPr>
+                <w:rFonts w:ascii="Calibri" w:eastAsia="DengXian" w:hAnsi="Calibri" w:cs="Arial"/>
+                <w:sz w:val="22"/>
+                <w:lang w:eastAsia="zh-CN"/>
+              </w:rPr>
+            </w:pPr>
+            <w:r>
+              <w:rPr>
+                <w:rFonts w:ascii="Calibri" w:eastAsia="DengXian" w:hAnsi="Calibri" w:cs="Arial"/>
+                <w:sz w:val="22"/>
+                <w:lang w:eastAsia="zh-CN"/>
+              </w:rPr>
+              <w:t>The software development lifecycle process</w:t>
+            </w:r>
+            <w:r>
+              <w:rPr>
+                <w:rFonts w:ascii="Calibri" w:eastAsia="DengXian" w:hAnsi="Calibri" w:cs="Arial"/>
+                <w:sz w:val="22"/>
+                <w:lang w:eastAsia="zh-CN"/>
+              </w:rPr>
+              <w:t>:</w:t>
+            </w:r>
+          </w:p>
+          <w:p>
+            <w:pPr>
+              <w:pStyle w:val="ListParagraph"/>
+              <w:numPr>
+                <w:ilvl w:val="0"/>
+                <w:numId w:val="17"/>
+              </w:numPr>
+              <w:spacing w:after="160" w:line="259" w:lineRule="auto"/>
+              <w:rPr>
+                <w:rFonts w:ascii="Calibri" w:eastAsia="DengXian" w:hAnsi="Calibri" w:cs="Arial"/>
+                <w:sz w:val="22"/>
+                <w:lang w:eastAsia="zh-CN"/>
+              </w:rPr>
+            </w:pPr>
+            <w:r>
+              <w:rPr>
+                <w:rFonts w:ascii="Calibri" w:eastAsia="DengXian" w:hAnsi="Calibri" w:cs="Arial"/>
+                <w:sz w:val="22"/>
+                <w:lang w:eastAsia="zh-CN"/>
+              </w:rPr>
+              <w:t>Plan: Define project goals and requirements.</w:t>
+            </w:r>
+          </w:p>
+          <w:p>
+            <w:pPr>
+              <w:pStyle w:val="ListParagraph"/>
+              <w:numPr>
+                <w:ilvl w:val="0"/>
+                <w:numId w:val="17"/>
+              </w:numPr>
+              <w:spacing w:after="160" w:line="259" w:lineRule="auto"/>
+              <w:rPr>
+                <w:rFonts w:ascii="Calibri" w:eastAsia="DengXian" w:hAnsi="Calibri" w:cs="Arial"/>
+                <w:sz w:val="22"/>
+                <w:lang w:eastAsia="zh-CN"/>
+              </w:rPr>
+            </w:pPr>
+            <w:r>
+              <w:rPr>
+                <w:rFonts w:ascii="Calibri" w:eastAsia="DengXian" w:hAnsi="Calibri" w:cs="Arial"/>
+                <w:sz w:val="22"/>
+                <w:lang w:eastAsia="zh-CN"/>
+              </w:rPr>
+              <w:t>Design: Architect the system’s structure and user interface.</w:t>
+            </w:r>
+          </w:p>
+          <w:p>
+            <w:pPr>
+              <w:pStyle w:val="ListParagraph"/>
+              <w:numPr>
+                <w:ilvl w:val="0"/>
+                <w:numId w:val="17"/>
+              </w:numPr>
+              <w:spacing w:after="160" w:line="259" w:lineRule="auto"/>
+              <w:rPr>
+                <w:rFonts w:ascii="Calibri" w:eastAsia="DengXian" w:hAnsi="Calibri" w:cs="Arial"/>
+                <w:sz w:val="22"/>
+                <w:lang w:eastAsia="zh-CN"/>
+              </w:rPr>
+            </w:pPr>
+            <w:r>
+              <w:rPr>
+                <w:rFonts w:ascii="Calibri" w:eastAsia="DengXian" w:hAnsi="Calibri" w:cs="Arial"/>
+                <w:sz w:val="22"/>
+                <w:lang w:eastAsia="zh-CN"/>
+              </w:rPr>
+              <w:t>Implement: Write and develop the code.</w:t>
+            </w:r>
+          </w:p>
+          <w:p>
+            <w:pPr>
+              <w:pStyle w:val="ListParagraph"/>
+              <w:numPr>
+                <w:ilvl w:val="0"/>
+                <w:numId w:val="17"/>
+              </w:numPr>
+              <w:spacing w:after="160" w:line="259" w:lineRule="auto"/>
+              <w:rPr>
+                <w:rFonts w:ascii="Calibri" w:eastAsia="DengXian" w:hAnsi="Calibri" w:cs="Arial"/>
+                <w:sz w:val="22"/>
+                <w:lang w:eastAsia="zh-CN"/>
+              </w:rPr>
+            </w:pPr>
+            <w:r>
+              <w:rPr>
+                <w:rFonts w:ascii="Calibri" w:eastAsia="DengXian" w:hAnsi="Calibri" w:cs="Arial"/>
+                <w:sz w:val="22"/>
+                <w:lang w:eastAsia="zh-CN"/>
+              </w:rPr>
+              <w:t>Test: Validate that the system works as intended.</w:t>
+            </w:r>
+          </w:p>
+          <w:p>
+            <w:pPr>
+              <w:pStyle w:val="ListParagraph"/>
+              <w:numPr>
+                <w:ilvl w:val="0"/>
+                <w:numId w:val="17"/>
+              </w:numPr>
+              <w:spacing w:after="160" w:line="259" w:lineRule="auto"/>
+              <w:rPr>
+                <w:rFonts w:ascii="Calibri" w:eastAsia="DengXian" w:hAnsi="Calibri" w:cs="Arial"/>
+                <w:sz w:val="22"/>
+                <w:lang w:eastAsia="zh-CN"/>
+              </w:rPr>
+            </w:pPr>
+            <w:r>
+              <w:rPr>
+                <w:rFonts w:ascii="Calibri" w:eastAsia="DengXian" w:hAnsi="Calibri" w:cs="Arial"/>
+                <w:sz w:val="22"/>
+                <w:lang w:eastAsia="zh-CN"/>
+              </w:rPr>
+              <w:t>Deploy: Release the software to the production environment.</w:t>
+            </w:r>
+          </w:p>
+          <w:p>
+            <w:pPr>
+              <w:pStyle w:val="ListParagraph"/>
+              <w:numPr>
+                <w:ilvl w:val="0"/>
+                <w:numId w:val="17"/>
+              </w:numPr>
+              <w:spacing w:after="160" w:line="259" w:lineRule="auto"/>
+              <w:rPr>
+                <w:rFonts w:ascii="Calibri" w:eastAsia="DengXian" w:hAnsi="Calibri" w:cs="Arial"/>
+                <w:sz w:val="22"/>
+                <w:lang w:eastAsia="zh-CN"/>
+              </w:rPr>
+            </w:pPr>
+            <w:r>
+              <w:rPr>
+                <w:rFonts w:ascii="Calibri" w:eastAsia="DengXian" w:hAnsi="Calibri" w:cs="Arial"/>
+                <w:sz w:val="22"/>
+                <w:lang w:eastAsia="zh-CN"/>
+              </w:rPr>
+              <w:t>Maintain: Monitor and improve the software post-deployment.</w:t>
+            </w:r>
+          </w:p>
+          <w:p>
+            <w:pPr>
+              <w:spacing w:after="160" w:line="259" w:lineRule="auto"/>
+              <w:rPr>
+                <w:rFonts w:ascii="Calibri" w:eastAsia="DengXian" w:hAnsi="Calibri" w:cs="Arial"/>
+                <w:sz w:val="22"/>
+                <w:lang w:eastAsia="zh-CN"/>
+              </w:rPr>
+            </w:pPr>
+            <w:r>
+              <w:rPr>
+                <w:rFonts w:ascii="Calibri" w:eastAsia="DengXian" w:hAnsi="Calibri" w:cs="Arial"/>
+                <w:sz w:val="22"/>
+                <w:lang w:eastAsia="zh-CN"/>
+              </w:rPr>
+              <w:t xml:space="preserve">The software development lifecycle </w:t>
+            </w:r>
+            <w:r>
+              <w:rPr>
+                <w:rFonts w:ascii="Calibri" w:eastAsia="DengXian" w:hAnsi="Calibri" w:cs="Arial"/>
+                <w:sz w:val="22"/>
+                <w:lang w:eastAsia="zh-CN"/>
+              </w:rPr>
+              <w:t>models:</w:t>
+            </w:r>
+          </w:p>
+          <w:p>
+            <w:pPr>
+              <w:pStyle w:val="ListParagraph"/>
+              <w:numPr>
+                <w:ilvl w:val="0"/>
+                <w:numId w:val="17"/>
+              </w:numPr>
+              <w:spacing w:after="160" w:line="259" w:lineRule="auto"/>
+              <w:rPr>
+                <w:rFonts w:ascii="Calibri" w:eastAsia="DengXian" w:hAnsi="Calibri" w:cs="Arial"/>
+                <w:sz w:val="22"/>
+                <w:lang w:eastAsia="zh-CN"/>
+              </w:rPr>
+            </w:pPr>
+            <w:r>
+              <w:rPr>
+                <w:rFonts w:ascii="Calibri" w:eastAsia="DengXian" w:hAnsi="Calibri" w:cs="Arial"/>
+                <w:sz w:val="22"/>
+                <w:lang w:eastAsia="zh-CN"/>
+              </w:rPr>
+              <w:t xml:space="preserve">Waterfall: A sequential model </w:t>
+            </w:r>
+            <w:r>
+              <w:rPr>
+                <w:rFonts w:ascii="Calibri" w:eastAsia="DengXian" w:hAnsi="Calibri" w:cs="Arial"/>
+                <w:sz w:val="22"/>
+                <w:lang w:eastAsia="zh-CN"/>
+              </w:rPr>
+              <w:t xml:space="preserve">which </w:t>
+            </w:r>
+            <w:r>
+              <w:rPr>
+                <w:rFonts w:ascii="Calibri" w:eastAsia="DengXian" w:hAnsi="Calibri" w:cs="Arial"/>
+                <w:sz w:val="22"/>
+                <w:lang w:eastAsia="zh-CN"/>
+              </w:rPr>
+              <w:t>each phase is completed before moving to the next</w:t>
+            </w:r>
+            <w:r>
+              <w:rPr>
+                <w:rFonts w:ascii="Calibri" w:eastAsia="DengXian" w:hAnsi="Calibri" w:cs="Arial"/>
+                <w:sz w:val="22"/>
+                <w:lang w:eastAsia="zh-CN"/>
+              </w:rPr>
+              <w:t xml:space="preserve"> one</w:t>
+            </w:r>
+            <w:r>
+              <w:rPr>
+                <w:rFonts w:ascii="Calibri" w:eastAsia="DengXian" w:hAnsi="Calibri" w:cs="Arial"/>
+                <w:sz w:val="22"/>
+                <w:lang w:eastAsia="zh-CN"/>
+              </w:rPr>
+              <w:t>.</w:t>
+            </w:r>
+          </w:p>
+          <w:p>
+            <w:pPr>
+              <w:pStyle w:val="ListParagraph"/>
+              <w:numPr>
+                <w:ilvl w:val="0"/>
+                <w:numId w:val="17"/>
+              </w:numPr>
+              <w:spacing w:after="160" w:line="259" w:lineRule="auto"/>
+              <w:rPr>
+                <w:rFonts w:ascii="Calibri" w:eastAsia="DengXian" w:hAnsi="Calibri" w:cs="Arial"/>
+                <w:sz w:val="22"/>
+                <w:lang w:eastAsia="zh-CN"/>
+              </w:rPr>
+            </w:pPr>
+            <w:r>
+              <w:rPr>
+                <w:rFonts w:ascii="Calibri" w:eastAsia="DengXian" w:hAnsi="Calibri" w:cs="Arial"/>
+                <w:sz w:val="22"/>
+                <w:lang w:eastAsia="zh-CN"/>
+              </w:rPr>
+              <w:t xml:space="preserve">Iterative: </w:t>
+            </w:r>
+            <w:r>
+              <w:rPr>
+                <w:rFonts w:ascii="Calibri" w:eastAsia="DengXian" w:hAnsi="Calibri" w:cs="Arial"/>
+                <w:sz w:val="22"/>
+                <w:lang w:eastAsia="zh-CN"/>
+              </w:rPr>
+              <w:t>It b</w:t>
+            </w:r>
+            <w:r>
+              <w:rPr>
+                <w:rFonts w:ascii="Calibri" w:eastAsia="DengXian" w:hAnsi="Calibri" w:cs="Arial"/>
+                <w:sz w:val="22"/>
+                <w:lang w:eastAsia="zh-CN"/>
+              </w:rPr>
+              <w:t>egin</w:t>
+            </w:r>
+            <w:r>
+              <w:rPr>
+                <w:rFonts w:ascii="Calibri" w:eastAsia="DengXian" w:hAnsi="Calibri" w:cs="Arial"/>
+                <w:sz w:val="22"/>
+                <w:lang w:eastAsia="zh-CN"/>
+              </w:rPr>
+              <w:t>s</w:t>
+            </w:r>
+            <w:r>
+              <w:rPr>
+                <w:rFonts w:ascii="Calibri" w:eastAsia="DengXian" w:hAnsi="Calibri" w:cs="Arial"/>
+                <w:sz w:val="22"/>
+                <w:lang w:eastAsia="zh-CN"/>
+              </w:rPr>
+              <w:t xml:space="preserve"> software development with a small subset of requirements</w:t>
+            </w:r>
+            <w:r>
+              <w:rPr>
+                <w:rFonts w:ascii="Calibri" w:eastAsia="DengXian" w:hAnsi="Calibri" w:cs="Arial"/>
+                <w:sz w:val="22"/>
+                <w:lang w:eastAsia="zh-CN"/>
+              </w:rPr>
+              <w:t xml:space="preserve"> and then </w:t>
+            </w:r>
+            <w:r>
+              <w:rPr>
+                <w:rFonts w:ascii="Calibri" w:eastAsia="DengXian" w:hAnsi="Calibri" w:cs="Arial"/>
+                <w:sz w:val="22"/>
+                <w:lang w:eastAsia="zh-CN"/>
+              </w:rPr>
+              <w:t>they iteratively enhance versions over time until the complete software is ready for production</w:t>
+            </w:r>
+            <w:r>
+              <w:rPr>
+                <w:rFonts w:ascii="Calibri" w:eastAsia="DengXian" w:hAnsi="Calibri" w:cs="Arial"/>
+                <w:sz w:val="22"/>
+                <w:lang w:eastAsia="zh-CN"/>
+              </w:rPr>
+              <w:t>.</w:t>
+            </w:r>
+          </w:p>
+          <w:p>
+            <w:pPr>
+              <w:pStyle w:val="ListParagraph"/>
+              <w:numPr>
+                <w:ilvl w:val="0"/>
+                <w:numId w:val="17"/>
+              </w:numPr>
+              <w:spacing w:after="160" w:line="259" w:lineRule="auto"/>
+              <w:rPr>
+                <w:rFonts w:ascii="Calibri" w:eastAsia="DengXian" w:hAnsi="Calibri" w:cs="Arial"/>
+                <w:sz w:val="22"/>
+                <w:lang w:eastAsia="zh-CN"/>
+              </w:rPr>
+            </w:pPr>
+            <w:r>
+              <w:rPr>
+                <w:rFonts w:ascii="Calibri" w:eastAsia="DengXian" w:hAnsi="Calibri" w:cs="Arial"/>
+                <w:sz w:val="22"/>
+                <w:lang w:eastAsia="zh-CN"/>
+              </w:rPr>
+              <w:t xml:space="preserve">Spiral: </w:t>
+            </w:r>
+            <w:r>
+              <w:rPr>
+                <w:rFonts w:ascii="Calibri" w:eastAsia="DengXian" w:hAnsi="Calibri" w:cs="Arial"/>
+                <w:sz w:val="22"/>
+                <w:lang w:eastAsia="zh-CN"/>
+              </w:rPr>
+              <w:t>It is a process that c</w:t>
+            </w:r>
+            <w:r>
+              <w:rPr>
+                <w:rFonts w:ascii="Calibri" w:eastAsia="DengXian" w:hAnsi="Calibri" w:cs="Arial"/>
+                <w:sz w:val="22"/>
+                <w:lang w:eastAsia="zh-CN"/>
+              </w:rPr>
+              <w:t xml:space="preserve">ombines </w:t>
+            </w:r>
+            <w:r>
+              <w:rPr>
+                <w:rFonts w:ascii="Calibri" w:eastAsia="DengXian" w:hAnsi="Calibri" w:cs="Arial"/>
+                <w:sz w:val="22"/>
+                <w:lang w:eastAsia="zh-CN"/>
+              </w:rPr>
+              <w:t xml:space="preserve">between </w:t>
+            </w:r>
+            <w:r>
+              <w:rPr>
+                <w:rFonts w:ascii="Calibri" w:eastAsia="DengXian" w:hAnsi="Calibri" w:cs="Arial"/>
+                <w:sz w:val="22"/>
+                <w:lang w:eastAsia="zh-CN"/>
+              </w:rPr>
+              <w:t>iterative development with risk analysis</w:t>
+            </w:r>
+            <w:r>
+              <w:rPr>
+                <w:rFonts w:ascii="Calibri" w:eastAsia="DengXian" w:hAnsi="Calibri" w:cs="Arial"/>
+                <w:sz w:val="22"/>
+                <w:lang w:eastAsia="zh-CN"/>
+              </w:rPr>
+              <w:t xml:space="preserve"> to </w:t>
+            </w:r>
+            <w:r>
+              <w:rPr>
+                <w:rFonts w:ascii="Calibri" w:eastAsia="DengXian" w:hAnsi="Calibri" w:cs="Arial"/>
+                <w:sz w:val="22"/>
+                <w:lang w:eastAsia="zh-CN"/>
+              </w:rPr>
+              <w:t>reduc</w:t>
+            </w:r>
+            <w:r>
+              <w:rPr>
+                <w:rFonts w:ascii="Calibri" w:eastAsia="DengXian" w:hAnsi="Calibri" w:cs="Arial"/>
+                <w:sz w:val="22"/>
+                <w:lang w:eastAsia="zh-CN"/>
+              </w:rPr>
+              <w:t>es</w:t>
+            </w:r>
+            <w:r>
+              <w:rPr>
+                <w:rFonts w:ascii="Calibri" w:eastAsia="DengXian" w:hAnsi="Calibri" w:cs="Arial"/>
+                <w:sz w:val="22"/>
+                <w:lang w:eastAsia="zh-CN"/>
+              </w:rPr>
+              <w:t xml:space="preserve"> </w:t>
+            </w:r>
+            <w:r>
+              <w:rPr>
+                <w:rFonts w:ascii="Calibri" w:eastAsia="DengXian" w:hAnsi="Calibri" w:cs="Arial"/>
+                <w:sz w:val="22"/>
+                <w:lang w:eastAsia="zh-CN"/>
+              </w:rPr>
+              <w:t>potential issues.</w:t>
+            </w:r>
+          </w:p>
+          <w:p>
+            <w:pPr>
+              <w:pStyle w:val="ListParagraph"/>
+              <w:numPr>
+                <w:ilvl w:val="0"/>
+                <w:numId w:val="17"/>
+              </w:numPr>
+              <w:spacing w:after="160" w:line="259" w:lineRule="auto"/>
+              <w:rPr>
+                <w:rFonts w:ascii="Calibri" w:eastAsia="DengXian" w:hAnsi="Calibri" w:cs="Arial"/>
+                <w:sz w:val="22"/>
+                <w:lang w:eastAsia="zh-CN"/>
+              </w:rPr>
+            </w:pPr>
+            <w:r>
+              <w:rPr>
+                <w:rFonts w:ascii="Calibri" w:eastAsia="DengXian" w:hAnsi="Calibri" w:cs="Arial"/>
+                <w:sz w:val="22"/>
+                <w:lang w:eastAsia="zh-CN"/>
+              </w:rPr>
+              <w:t xml:space="preserve">Agile: </w:t>
+            </w:r>
+            <w:r>
+              <w:rPr>
+                <w:rFonts w:ascii="Calibri" w:eastAsia="DengXian" w:hAnsi="Calibri" w:cs="Arial"/>
+                <w:sz w:val="22"/>
+                <w:lang w:eastAsia="zh-CN"/>
+              </w:rPr>
+              <w:t>It f</w:t>
+            </w:r>
+            <w:r>
+              <w:rPr>
+                <w:rFonts w:ascii="Calibri" w:eastAsia="DengXian" w:hAnsi="Calibri" w:cs="Arial"/>
+                <w:sz w:val="22"/>
+                <w:lang w:eastAsia="zh-CN"/>
+              </w:rPr>
+              <w:t>ocuses on</w:t>
+            </w:r>
+            <w:r>
+              <w:rPr>
+                <w:rFonts w:ascii="Calibri" w:eastAsia="DengXian" w:hAnsi="Calibri" w:cs="Arial"/>
+                <w:sz w:val="22"/>
+                <w:lang w:eastAsia="zh-CN"/>
+              </w:rPr>
+              <w:t xml:space="preserve"> quickness</w:t>
+            </w:r>
+            <w:r>
+              <w:rPr>
+                <w:rFonts w:ascii="Calibri" w:eastAsia="DengXian" w:hAnsi="Calibri" w:cs="Arial"/>
+                <w:sz w:val="22"/>
+                <w:lang w:eastAsia="zh-CN"/>
+              </w:rPr>
+              <w:t>, flexible development through iterative progress and collaboration with stakeholders.</w:t>
+            </w:r>
           </w:p>
         </w:tc>
       </w:tr>
@@ -1024,6 +2960,315 @@
                 <w:lang w:eastAsia="zh-CN"/>
               </w:rPr>
             </w:pPr>
+            <w:r>
+              <w:rPr>
+                <w:rFonts w:ascii="Calibri" w:eastAsia="DengXian" w:hAnsi="Calibri" w:cs="Arial"/>
+                <w:sz w:val="22"/>
+                <w:lang w:eastAsia="zh-CN"/>
+              </w:rPr>
+              <w:t xml:space="preserve">Document types commonly created during the software lifecycle include: </w:t>
+            </w:r>
+          </w:p>
+          <w:p>
+            <w:pPr>
+              <w:pStyle w:val="ListParagraph"/>
+              <w:numPr>
+                <w:ilvl w:val="0"/>
+                <w:numId w:val="17"/>
+              </w:numPr>
+              <w:spacing w:after="160" w:line="259" w:lineRule="auto"/>
+              <w:rPr>
+                <w:rFonts w:ascii="Calibri" w:eastAsia="DengXian" w:hAnsi="Calibri" w:cs="Arial"/>
+                <w:sz w:val="22"/>
+                <w:lang w:eastAsia="zh-CN"/>
+              </w:rPr>
+            </w:pPr>
+            <w:r>
+              <w:rPr>
+                <w:rFonts w:ascii="Calibri" w:eastAsia="DengXian" w:hAnsi="Calibri" w:cs="Arial"/>
+                <w:b/>
+                <w:bCs/>
+                <w:sz w:val="22"/>
+                <w:lang w:eastAsia="zh-CN"/>
+              </w:rPr>
+              <w:t>Project Charter</w:t>
+            </w:r>
+            <w:r>
+              <w:rPr>
+                <w:rFonts w:ascii="Calibri" w:eastAsia="DengXian" w:hAnsi="Calibri" w:cs="Arial"/>
+                <w:b/>
+                <w:bCs/>
+                <w:sz w:val="22"/>
+                <w:lang w:eastAsia="zh-CN"/>
+              </w:rPr>
+              <w:t xml:space="preserve"> Documents</w:t>
+            </w:r>
+            <w:r>
+              <w:rPr>
+                <w:rFonts w:ascii="Calibri" w:eastAsia="DengXian" w:hAnsi="Calibri" w:cs="Arial"/>
+                <w:sz w:val="22"/>
+                <w:lang w:eastAsia="zh-CN"/>
+              </w:rPr>
+              <w:t>: Outlines project vision, scope, and stakeholders.</w:t>
+            </w:r>
+          </w:p>
+          <w:p>
+            <w:pPr>
+              <w:pStyle w:val="ListParagraph"/>
+              <w:numPr>
+                <w:ilvl w:val="0"/>
+                <w:numId w:val="17"/>
+              </w:numPr>
+              <w:spacing w:after="160" w:line="259" w:lineRule="auto"/>
+              <w:rPr>
+                <w:rFonts w:ascii="Calibri" w:eastAsia="DengXian" w:hAnsi="Calibri" w:cs="Arial"/>
+                <w:sz w:val="22"/>
+                <w:lang w:eastAsia="zh-CN"/>
+              </w:rPr>
+            </w:pPr>
+            <w:r>
+              <w:rPr>
+                <w:rFonts w:ascii="Calibri" w:eastAsia="DengXian" w:hAnsi="Calibri" w:cs="Arial"/>
+                <w:b/>
+                <w:bCs/>
+                <w:sz w:val="22"/>
+                <w:lang w:eastAsia="zh-CN"/>
+              </w:rPr>
+              <w:t>Requirements Documents</w:t>
+            </w:r>
+            <w:r>
+              <w:rPr>
+                <w:rFonts w:ascii="Calibri" w:eastAsia="DengXian" w:hAnsi="Calibri" w:cs="Arial"/>
+                <w:sz w:val="22"/>
+                <w:lang w:eastAsia="zh-CN"/>
+              </w:rPr>
+              <w:t xml:space="preserve">: </w:t>
+            </w:r>
+            <w:r>
+              <w:rPr>
+                <w:rFonts w:ascii="Calibri" w:eastAsia="DengXian" w:hAnsi="Calibri" w:cs="Arial"/>
+                <w:sz w:val="22"/>
+                <w:lang w:eastAsia="zh-CN"/>
+              </w:rPr>
+              <w:t xml:space="preserve">Outline the business and user needs the software must meet. They are created during planning and inform all downstream processes. </w:t>
+            </w:r>
+          </w:p>
+          <w:p>
+            <w:pPr>
+              <w:pStyle w:val="ListParagraph"/>
+              <w:numPr>
+                <w:ilvl w:val="0"/>
+                <w:numId w:val="17"/>
+              </w:numPr>
+              <w:spacing w:after="160" w:line="259" w:lineRule="auto"/>
+              <w:rPr>
+                <w:rFonts w:ascii="Calibri" w:eastAsia="DengXian" w:hAnsi="Calibri" w:cs="Arial"/>
+                <w:sz w:val="22"/>
+                <w:lang w:eastAsia="zh-CN"/>
+              </w:rPr>
+            </w:pPr>
+            <w:r>
+              <w:rPr>
+                <w:rFonts w:ascii="Calibri" w:eastAsia="DengXian" w:hAnsi="Calibri" w:cs="Arial"/>
+                <w:b/>
+                <w:bCs/>
+                <w:sz w:val="22"/>
+                <w:lang w:eastAsia="zh-CN"/>
+              </w:rPr>
+              <w:t>Technical Specifications</w:t>
+            </w:r>
+            <w:r>
+              <w:rPr>
+                <w:rFonts w:ascii="Calibri" w:eastAsia="DengXian" w:hAnsi="Calibri" w:cs="Arial"/>
+                <w:sz w:val="22"/>
+                <w:lang w:eastAsia="zh-CN"/>
+              </w:rPr>
+              <w:t xml:space="preserve">: </w:t>
+            </w:r>
+            <w:r>
+              <w:rPr>
+                <w:rFonts w:ascii="Calibri" w:eastAsia="DengXian" w:hAnsi="Calibri" w:cs="Arial"/>
+                <w:sz w:val="22"/>
+                <w:lang w:eastAsia="zh-CN"/>
+              </w:rPr>
+              <w:t xml:space="preserve">Provide technical implementation details for designers and developers. Specs evolve throughout the lifecycle as the software takes shape. </w:t>
+            </w:r>
+          </w:p>
+          <w:p>
+            <w:pPr>
+              <w:pStyle w:val="ListParagraph"/>
+              <w:numPr>
+                <w:ilvl w:val="0"/>
+                <w:numId w:val="17"/>
+              </w:numPr>
+              <w:spacing w:after="160" w:line="259" w:lineRule="auto"/>
+              <w:rPr>
+                <w:rFonts w:ascii="Calibri" w:eastAsia="DengXian" w:hAnsi="Calibri" w:cs="Arial"/>
+                <w:sz w:val="22"/>
+                <w:lang w:eastAsia="zh-CN"/>
+              </w:rPr>
+            </w:pPr>
+            <w:r>
+              <w:rPr>
+                <w:rFonts w:ascii="Calibri" w:eastAsia="DengXian" w:hAnsi="Calibri" w:cs="Arial"/>
+                <w:b/>
+                <w:bCs/>
+                <w:sz w:val="22"/>
+                <w:lang w:eastAsia="zh-CN"/>
+              </w:rPr>
+              <w:t>Test Plans</w:t>
+            </w:r>
+            <w:r>
+              <w:rPr>
+                <w:rFonts w:ascii="Calibri" w:eastAsia="DengXian" w:hAnsi="Calibri" w:cs="Arial"/>
+                <w:sz w:val="22"/>
+                <w:lang w:eastAsia="zh-CN"/>
+              </w:rPr>
+              <w:t xml:space="preserve"> (Test Documents):</w:t>
+            </w:r>
+            <w:r>
+              <w:rPr>
+                <w:rFonts w:ascii="Calibri" w:eastAsia="DengXian" w:hAnsi="Calibri" w:cs="Arial"/>
+                <w:sz w:val="22"/>
+                <w:lang w:eastAsia="zh-CN"/>
+              </w:rPr>
+              <w:t xml:space="preserve"> Define the testing scope, scenarios, cases, and expected results. Rigorous test documentation contributes to software stability and security. </w:t>
+            </w:r>
+          </w:p>
+          <w:p>
+            <w:pPr>
+              <w:pStyle w:val="ListParagraph"/>
+              <w:numPr>
+                <w:ilvl w:val="0"/>
+                <w:numId w:val="17"/>
+              </w:numPr>
+              <w:spacing w:after="160" w:line="259" w:lineRule="auto"/>
+              <w:rPr>
+                <w:rFonts w:ascii="Calibri" w:eastAsia="DengXian" w:hAnsi="Calibri" w:cs="Arial"/>
+                <w:sz w:val="22"/>
+                <w:lang w:eastAsia="zh-CN"/>
+              </w:rPr>
+            </w:pPr>
+            <w:r>
+              <w:rPr>
+                <w:rFonts w:ascii="Calibri" w:eastAsia="DengXian" w:hAnsi="Calibri" w:cs="Arial"/>
+                <w:b/>
+                <w:bCs/>
+                <w:sz w:val="22"/>
+                <w:lang w:eastAsia="zh-CN"/>
+              </w:rPr>
+              <w:t>User Manuals</w:t>
+            </w:r>
+            <w:r>
+              <w:rPr>
+                <w:rFonts w:ascii="Calibri" w:eastAsia="DengXian" w:hAnsi="Calibri" w:cs="Arial"/>
+                <w:b/>
+                <w:bCs/>
+                <w:sz w:val="22"/>
+                <w:lang w:eastAsia="zh-CN"/>
+              </w:rPr>
+              <w:t>:</w:t>
+            </w:r>
+            <w:r>
+              <w:rPr>
+                <w:rFonts w:ascii="Calibri" w:eastAsia="DengXian" w:hAnsi="Calibri" w:cs="Arial"/>
+                <w:sz w:val="22"/>
+                <w:lang w:eastAsia="zh-CN"/>
+              </w:rPr>
+              <w:t xml:space="preserve"> Explain how end </w:t>
+            </w:r>
+            <w:r>
+              <w:rPr>
+                <w:rFonts w:ascii="Calibri" w:eastAsia="DengXian" w:hAnsi="Calibri" w:cs="Arial"/>
+                <w:sz w:val="22"/>
+                <w:lang w:eastAsia="zh-CN"/>
+              </w:rPr>
+              <w:t>user’s</w:t>
+            </w:r>
+            <w:r>
+              <w:rPr>
+                <w:rFonts w:ascii="Calibri" w:eastAsia="DengXian" w:hAnsi="Calibri" w:cs="Arial"/>
+                <w:sz w:val="22"/>
+                <w:lang w:eastAsia="zh-CN"/>
+              </w:rPr>
+              <w:t xml:space="preserve"> complete tasks with the software. Well-written manuals improve the customer experience. </w:t>
+            </w:r>
+          </w:p>
+          <w:p>
+            <w:pPr>
+              <w:pStyle w:val="ListParagraph"/>
+              <w:numPr>
+                <w:ilvl w:val="0"/>
+                <w:numId w:val="17"/>
+              </w:numPr>
+              <w:spacing w:after="160" w:line="259" w:lineRule="auto"/>
+              <w:rPr>
+                <w:rFonts w:ascii="Calibri" w:eastAsia="DengXian" w:hAnsi="Calibri" w:cs="Arial"/>
+                <w:sz w:val="22"/>
+                <w:lang w:eastAsia="zh-CN"/>
+              </w:rPr>
+            </w:pPr>
+            <w:r>
+              <w:rPr>
+                <w:rFonts w:ascii="Calibri" w:eastAsia="DengXian" w:hAnsi="Calibri" w:cs="Arial"/>
+                <w:b/>
+                <w:bCs/>
+                <w:sz w:val="22"/>
+                <w:lang w:eastAsia="zh-CN"/>
+              </w:rPr>
+              <w:t>Project Management Documents:</w:t>
+            </w:r>
+            <w:r>
+              <w:rPr>
+                <w:rFonts w:ascii="Calibri" w:eastAsia="DengXian" w:hAnsi="Calibri" w:cs="Arial"/>
+                <w:sz w:val="22"/>
+                <w:lang w:eastAsia="zh-CN"/>
+              </w:rPr>
+              <w:t xml:space="preserve"> Contains schedules, risk logs, and status reports for project oversight.</w:t>
+            </w:r>
+          </w:p>
+          <w:p>
+            <w:pPr>
+              <w:pStyle w:val="ListParagraph"/>
+              <w:numPr>
+                <w:ilvl w:val="0"/>
+                <w:numId w:val="17"/>
+              </w:numPr>
+              <w:spacing w:after="160" w:line="259" w:lineRule="auto"/>
+              <w:rPr>
+                <w:rFonts w:ascii="Calibri" w:eastAsia="DengXian" w:hAnsi="Calibri" w:cs="Arial"/>
+                <w:sz w:val="22"/>
+                <w:lang w:eastAsia="zh-CN"/>
+              </w:rPr>
+            </w:pPr>
+            <w:r>
+              <w:rPr>
+                <w:rFonts w:ascii="Calibri" w:eastAsia="DengXian" w:hAnsi="Calibri" w:cs="Arial"/>
+                <w:b/>
+                <w:bCs/>
+                <w:sz w:val="22"/>
+                <w:lang w:eastAsia="zh-CN"/>
+              </w:rPr>
+              <w:t>Maintenance Plans</w:t>
+            </w:r>
+            <w:r>
+              <w:rPr>
+                <w:rFonts w:ascii="Calibri" w:eastAsia="DengXian" w:hAnsi="Calibri" w:cs="Arial"/>
+                <w:b/>
+                <w:bCs/>
+                <w:sz w:val="22"/>
+                <w:lang w:eastAsia="zh-CN"/>
+              </w:rPr>
+              <w:t>:</w:t>
+            </w:r>
+            <w:r>
+              <w:rPr>
+                <w:rFonts w:ascii="Calibri" w:eastAsia="DengXian" w:hAnsi="Calibri" w:cs="Arial"/>
+                <w:sz w:val="22"/>
+                <w:lang w:eastAsia="zh-CN"/>
+              </w:rPr>
+              <w:t xml:space="preserve"> Help sustain software after deployment. They guide change management and new feature development.</w:t>
+            </w:r>
           </w:p>
         </w:tc>
       </w:tr>
@@ -1054,6 +3299,7 @@
                 <w:sz w:val="22"/>
                 <w:lang w:eastAsia="zh-CN"/>
               </w:rPr>
+              <w:lastRenderedPageBreak/>
               <w:t xml:space="preserve">9. </w:t>
             </w:r>
             <w:r>
@@ -1063,6 +3309,14 @@
                 <w:lang w:eastAsia="zh-CN"/>
               </w:rPr>
               <w:t>Discuss small-size application development processes</w:t>
+            </w:r>
+            <w:r>
+              <w:rPr>
+                <w:rFonts w:ascii="Calibri" w:eastAsia="DengXian" w:hAnsi="Calibri" w:cs="Arial"/>
+                <w:sz w:val="22"/>
+                <w:lang w:eastAsia="zh-CN"/>
+              </w:rPr>
+              <w:t>.</w:t>
             </w:r>
           </w:p>
         </w:tc>
@@ -1081,19 +3335,420 @@
               <w:spacing w:after="160" w:line="259" w:lineRule="auto"/>
               <w:rPr>
                 <w:rFonts w:ascii="Calibri" w:eastAsia="DengXian" w:hAnsi="Calibri" w:cs="Arial"/>
-                <w:sz w:val="22"/>
-                <w:lang w:eastAsia="zh-CN"/>
-              </w:rPr>
-            </w:pPr>
-            <w:r>
-              <w:rPr>
-                <w:rFonts w:ascii="Calibri" w:eastAsia="DengXian" w:hAnsi="Calibri" w:cs="Arial"/>
                 <w:b/>
                 <w:bCs/>
                 <w:sz w:val="22"/>
                 <w:lang w:eastAsia="zh-CN"/>
               </w:rPr>
+            </w:pPr>
+            <w:r>
+              <w:rPr>
+                <w:rFonts w:ascii="Calibri" w:eastAsia="DengXian" w:hAnsi="Calibri" w:cs="Arial"/>
+                <w:b/>
+                <w:bCs/>
+                <w:sz w:val="22"/>
+                <w:lang w:eastAsia="zh-CN"/>
+              </w:rPr>
               <w:t>Answer:</w:t>
+            </w:r>
+          </w:p>
+          <w:p>
+            <w:pPr>
+              <w:spacing w:after="160" w:line="259" w:lineRule="auto"/>
+              <w:rPr>
+                <w:rFonts w:ascii="Calibri" w:eastAsia="DengXian" w:hAnsi="Calibri" w:cs="Arial"/>
+                <w:sz w:val="22"/>
+                <w:lang w:eastAsia="zh-CN"/>
+              </w:rPr>
+            </w:pPr>
+            <w:r>
+              <w:rPr>
+                <w:rFonts w:ascii="Calibri" w:eastAsia="DengXian" w:hAnsi="Calibri" w:cs="Arial"/>
+                <w:sz w:val="22"/>
+                <w:lang w:eastAsia="zh-CN"/>
+              </w:rPr>
+              <w:t xml:space="preserve">Small-size application development processes </w:t>
+            </w:r>
+            <w:r>
+              <w:rPr>
+                <w:rFonts w:ascii="Calibri" w:eastAsia="DengXian" w:hAnsi="Calibri" w:cs="Arial"/>
+                <w:sz w:val="22"/>
+                <w:lang w:eastAsia="zh-CN"/>
+              </w:rPr>
+              <w:t xml:space="preserve">follow by the </w:t>
+            </w:r>
+            <w:r>
+              <w:rPr>
+                <w:rFonts w:ascii="Calibri" w:eastAsia="DengXian" w:hAnsi="Calibri" w:cs="Arial"/>
+                <w:sz w:val="22"/>
+                <w:lang w:eastAsia="zh-CN"/>
+              </w:rPr>
+              <w:t>agile</w:t>
+            </w:r>
+            <w:r>
+              <w:rPr>
+                <w:rFonts w:ascii="Calibri" w:eastAsia="DengXian" w:hAnsi="Calibri" w:cs="Arial"/>
+                <w:sz w:val="22"/>
+                <w:lang w:eastAsia="zh-CN"/>
+              </w:rPr>
+              <w:t xml:space="preserve"> model in Software Development Life Cycle</w:t>
+            </w:r>
+            <w:r>
+              <w:rPr>
+                <w:rFonts w:ascii="Calibri" w:eastAsia="DengXian" w:hAnsi="Calibri" w:cs="Arial"/>
+                <w:sz w:val="22"/>
+                <w:lang w:eastAsia="zh-CN"/>
+              </w:rPr>
+              <w:t xml:space="preserve"> </w:t>
+            </w:r>
+            <w:r>
+              <w:rPr>
+                <w:rFonts w:ascii="Calibri" w:eastAsia="DengXian" w:hAnsi="Calibri" w:cs="Arial"/>
+                <w:sz w:val="22"/>
+                <w:lang w:eastAsia="zh-CN"/>
+              </w:rPr>
+              <w:t>t</w:t>
+            </w:r>
+            <w:r>
+              <w:rPr>
+                <w:rFonts w:ascii="Calibri" w:eastAsia="DengXian" w:hAnsi="Calibri" w:cs="Arial"/>
+                <w:sz w:val="22"/>
+                <w:lang w:eastAsia="zh-CN"/>
+              </w:rPr>
+              <w:t xml:space="preserve">hat focuses on </w:t>
+            </w:r>
+            <w:r>
+              <w:rPr>
+                <w:rFonts w:ascii="Calibri" w:eastAsia="DengXian" w:hAnsi="Calibri" w:cs="Arial"/>
+                <w:sz w:val="22"/>
+                <w:lang w:eastAsia="zh-CN"/>
+              </w:rPr>
+              <w:t xml:space="preserve">quickness </w:t>
+            </w:r>
+            <w:r>
+              <w:rPr>
+                <w:rFonts w:ascii="Calibri" w:eastAsia="DengXian" w:hAnsi="Calibri" w:cs="Arial"/>
+                <w:sz w:val="22"/>
+                <w:lang w:eastAsia="zh-CN"/>
+              </w:rPr>
+              <w:t xml:space="preserve">and flexibility. </w:t>
+            </w:r>
+          </w:p>
+          <w:p>
+            <w:pPr>
+              <w:spacing w:after="160" w:line="259" w:lineRule="auto"/>
+              <w:rPr>
+                <w:rFonts w:ascii="Calibri" w:eastAsia="DengXian" w:hAnsi="Calibri" w:cs="Arial"/>
+                <w:sz w:val="22"/>
+                <w:lang w:eastAsia="zh-CN"/>
+              </w:rPr>
+            </w:pPr>
+            <w:r>
+              <w:rPr>
+                <w:rFonts w:ascii="Calibri" w:eastAsia="DengXian" w:hAnsi="Calibri" w:cs="Arial"/>
+                <w:sz w:val="22"/>
+                <w:lang w:eastAsia="zh-CN"/>
+              </w:rPr>
+              <w:t>Key points include:</w:t>
+            </w:r>
+          </w:p>
+          <w:p>
+            <w:pPr>
+              <w:pStyle w:val="ListParagraph"/>
+              <w:numPr>
+                <w:ilvl w:val="0"/>
+                <w:numId w:val="17"/>
+              </w:numPr>
+              <w:spacing w:after="160" w:line="259" w:lineRule="auto"/>
+              <w:rPr>
+                <w:rFonts w:ascii="Calibri" w:eastAsia="DengXian" w:hAnsi="Calibri" w:cs="Arial"/>
+                <w:sz w:val="22"/>
+                <w:lang w:eastAsia="zh-CN"/>
+              </w:rPr>
+            </w:pPr>
+            <w:r>
+              <w:rPr>
+                <w:rFonts w:ascii="Calibri" w:eastAsia="DengXian" w:hAnsi="Calibri" w:cs="Arial"/>
+                <w:sz w:val="22"/>
+                <w:lang w:eastAsia="zh-CN"/>
+              </w:rPr>
+              <w:t xml:space="preserve">Simplified Phases: </w:t>
+            </w:r>
+            <w:r>
+              <w:rPr>
+                <w:rFonts w:ascii="Calibri" w:eastAsia="DengXian" w:hAnsi="Calibri" w:cs="Arial"/>
+                <w:sz w:val="22"/>
+                <w:lang w:eastAsia="zh-CN"/>
+              </w:rPr>
+              <w:t>P</w:t>
+            </w:r>
+            <w:r>
+              <w:rPr>
+                <w:rFonts w:ascii="Calibri" w:eastAsia="DengXian" w:hAnsi="Calibri" w:cs="Arial"/>
+                <w:sz w:val="22"/>
+                <w:lang w:eastAsia="zh-CN"/>
+              </w:rPr>
+              <w:t xml:space="preserve">lanning, </w:t>
+            </w:r>
+            <w:r>
+              <w:rPr>
+                <w:rFonts w:ascii="Calibri" w:eastAsia="DengXian" w:hAnsi="Calibri" w:cs="Arial"/>
+                <w:sz w:val="22"/>
+                <w:lang w:eastAsia="zh-CN"/>
+              </w:rPr>
+              <w:t>D</w:t>
+            </w:r>
+            <w:r>
+              <w:rPr>
+                <w:rFonts w:ascii="Calibri" w:eastAsia="DengXian" w:hAnsi="Calibri" w:cs="Arial"/>
+                <w:sz w:val="22"/>
+                <w:lang w:eastAsia="zh-CN"/>
+              </w:rPr>
+              <w:t xml:space="preserve">esign, </w:t>
+            </w:r>
+            <w:r>
+              <w:rPr>
+                <w:rFonts w:ascii="Calibri" w:eastAsia="DengXian" w:hAnsi="Calibri" w:cs="Arial"/>
+                <w:sz w:val="22"/>
+                <w:lang w:eastAsia="zh-CN"/>
+              </w:rPr>
+              <w:t>Coding</w:t>
+            </w:r>
+            <w:r>
+              <w:rPr>
+                <w:rFonts w:ascii="Calibri" w:eastAsia="DengXian" w:hAnsi="Calibri" w:cs="Arial"/>
+                <w:sz w:val="22"/>
+                <w:lang w:eastAsia="zh-CN"/>
+              </w:rPr>
+              <w:t xml:space="preserve">, </w:t>
+            </w:r>
+            <w:r>
+              <w:rPr>
+                <w:rFonts w:ascii="Calibri" w:eastAsia="DengXian" w:hAnsi="Calibri" w:cs="Arial"/>
+                <w:sz w:val="22"/>
+                <w:lang w:eastAsia="zh-CN"/>
+              </w:rPr>
+              <w:t>T</w:t>
+            </w:r>
+            <w:r>
+              <w:rPr>
+                <w:rFonts w:ascii="Calibri" w:eastAsia="DengXian" w:hAnsi="Calibri" w:cs="Arial"/>
+                <w:sz w:val="22"/>
+                <w:lang w:eastAsia="zh-CN"/>
+              </w:rPr>
+              <w:t xml:space="preserve">esting, </w:t>
+            </w:r>
+            <w:r>
+              <w:rPr>
+                <w:rFonts w:ascii="Calibri" w:eastAsia="DengXian" w:hAnsi="Calibri" w:cs="Arial"/>
+                <w:sz w:val="22"/>
+                <w:lang w:eastAsia="zh-CN"/>
+              </w:rPr>
+              <w:t>D</w:t>
+            </w:r>
+            <w:r>
+              <w:rPr>
+                <w:rFonts w:ascii="Calibri" w:eastAsia="DengXian" w:hAnsi="Calibri" w:cs="Arial"/>
+                <w:sz w:val="22"/>
+                <w:lang w:eastAsia="zh-CN"/>
+              </w:rPr>
+              <w:t xml:space="preserve">eployment, and </w:t>
+            </w:r>
+            <w:r>
+              <w:rPr>
+                <w:rFonts w:ascii="Calibri" w:eastAsia="DengXian" w:hAnsi="Calibri" w:cs="Arial"/>
+                <w:sz w:val="22"/>
+                <w:lang w:eastAsia="zh-CN"/>
+              </w:rPr>
+              <w:t>M</w:t>
+            </w:r>
+            <w:r>
+              <w:rPr>
+                <w:rFonts w:ascii="Calibri" w:eastAsia="DengXian" w:hAnsi="Calibri" w:cs="Arial"/>
+                <w:sz w:val="22"/>
+                <w:lang w:eastAsia="zh-CN"/>
+              </w:rPr>
+              <w:t>aintenance.</w:t>
+            </w:r>
+          </w:p>
+          <w:p>
+            <w:pPr>
+              <w:pStyle w:val="ListParagraph"/>
+              <w:numPr>
+                <w:ilvl w:val="0"/>
+                <w:numId w:val="17"/>
+              </w:numPr>
+              <w:spacing w:after="160" w:line="259" w:lineRule="auto"/>
+              <w:rPr>
+                <w:rFonts w:ascii="Calibri" w:eastAsia="DengXian" w:hAnsi="Calibri" w:cs="Arial"/>
+                <w:sz w:val="22"/>
+                <w:lang w:eastAsia="zh-CN"/>
+              </w:rPr>
+            </w:pPr>
+            <w:r>
+              <w:rPr>
+                <w:rFonts w:ascii="Calibri" w:eastAsia="DengXian" w:hAnsi="Calibri" w:cs="Arial"/>
+                <w:sz w:val="22"/>
+                <w:lang w:eastAsia="zh-CN"/>
+              </w:rPr>
+              <w:t>Agile Methods: It focuses on quickness, flexible development through iterative progress</w:t>
+            </w:r>
+            <w:r>
+              <w:rPr>
+                <w:rFonts w:ascii="Calibri" w:eastAsia="DengXian" w:hAnsi="Calibri" w:cs="Arial"/>
+                <w:sz w:val="22"/>
+                <w:lang w:eastAsia="zh-CN"/>
+              </w:rPr>
+              <w:t>,</w:t>
+            </w:r>
+            <w:r>
+              <w:rPr>
+                <w:rFonts w:ascii="Calibri" w:eastAsia="DengXian" w:hAnsi="Calibri" w:cs="Arial"/>
+                <w:sz w:val="22"/>
+                <w:lang w:eastAsia="zh-CN"/>
+              </w:rPr>
+              <w:t xml:space="preserve"> </w:t>
+            </w:r>
+            <w:r>
+              <w:rPr>
+                <w:rFonts w:ascii="Calibri" w:eastAsia="DengXian" w:hAnsi="Calibri" w:cs="Arial"/>
+                <w:sz w:val="22"/>
+                <w:lang w:eastAsia="zh-CN"/>
+              </w:rPr>
+              <w:t>collaboration with stakeholders</w:t>
+            </w:r>
+            <w:r>
+              <w:rPr>
+                <w:rFonts w:ascii="Calibri" w:eastAsia="DengXian" w:hAnsi="Calibri" w:cs="Arial"/>
+                <w:sz w:val="22"/>
+                <w:lang w:eastAsia="zh-CN"/>
+              </w:rPr>
+              <w:t xml:space="preserve"> to </w:t>
+            </w:r>
+            <w:r>
+              <w:rPr>
+                <w:rFonts w:ascii="Calibri" w:eastAsia="DengXian" w:hAnsi="Calibri" w:cs="Arial"/>
+                <w:sz w:val="22"/>
+                <w:lang w:eastAsia="zh-CN"/>
+              </w:rPr>
+              <w:t>rapid feedback</w:t>
+            </w:r>
+            <w:r>
+              <w:rPr>
+                <w:rFonts w:ascii="Calibri" w:eastAsia="DengXian" w:hAnsi="Calibri" w:cs="Arial"/>
+                <w:sz w:val="22"/>
+                <w:lang w:eastAsia="zh-CN"/>
+              </w:rPr>
+              <w:t xml:space="preserve"> </w:t>
+            </w:r>
+            <w:r>
+              <w:rPr>
+                <w:rFonts w:ascii="Calibri" w:eastAsia="DengXian" w:hAnsi="Calibri" w:cs="Arial"/>
+                <w:sz w:val="22"/>
+                <w:lang w:eastAsia="zh-CN"/>
+              </w:rPr>
+              <w:t>and quick delivery of a working product</w:t>
+            </w:r>
+            <w:r>
+              <w:rPr>
+                <w:rFonts w:ascii="Calibri" w:eastAsia="DengXian" w:hAnsi="Calibri" w:cs="Arial"/>
+                <w:sz w:val="22"/>
+                <w:lang w:eastAsia="zh-CN"/>
+              </w:rPr>
+              <w:t>.</w:t>
+            </w:r>
+          </w:p>
+        </w:tc>
+      </w:tr>
+      <w:tr>
+        <w:trPr>
+          <w:trHeight w:val="256"/>
+        </w:trPr>
+        <w:tc>
+          <w:tcPr>
+            <w:tcW w:w="10768" w:type="dxa"/>
+            <w:shd w:val="clear" w:color="auto" w:fill="FFEDF5"/>
+            <w:tcMar>
+              <w:top w:w="57" w:type="dxa"/>
+              <w:bottom w:w="57" w:type="dxa"/>
+            </w:tcMar>
+            <w:vAlign w:val="center"/>
+          </w:tcPr>
+          <w:p>
+            <w:pPr>
+              <w:spacing w:after="160" w:line="259" w:lineRule="auto"/>
+              <w:rPr>
+                <w:rFonts w:ascii="Calibri" w:eastAsia="DengXian" w:hAnsi="Calibri" w:cs="Arial"/>
+                <w:sz w:val="22"/>
+                <w:lang w:eastAsia="zh-CN"/>
+              </w:rPr>
+            </w:pPr>
+            <w:r>
+              <w:rPr>
+                <w:rFonts w:ascii="Calibri" w:eastAsia="DengXian" w:hAnsi="Calibri" w:cs="Arial"/>
+                <w:b/>
+                <w:bCs/>
+                <w:sz w:val="22"/>
+                <w:lang w:eastAsia="zh-CN"/>
+              </w:rPr>
+              <w:t xml:space="preserve">10. </w:t>
+            </w:r>
+            <w:r>
+              <w:rPr>
+                <w:rFonts w:ascii="Calibri" w:eastAsia="DengXian" w:hAnsi="Calibri" w:cs="Arial"/>
+                <w:sz w:val="22"/>
+                <w:lang w:eastAsia="zh-CN"/>
+              </w:rPr>
+              <w:t>Discuss the processes, tools and techniques for testing small-size applications</w:t>
+            </w:r>
+            <w:r>
+              <w:rPr>
+                <w:rFonts w:ascii="Calibri" w:eastAsia="DengXian" w:hAnsi="Calibri" w:cs="Arial"/>
+                <w:sz w:val="22"/>
+                <w:lang w:eastAsia="zh-CN"/>
+              </w:rPr>
+              <w:t>.</w:t>
+            </w:r>
+          </w:p>
+        </w:tc>
+      </w:tr>
+      <w:tr>
+        <w:tc>
+          <w:tcPr>
+            <w:tcW w:w="10768" w:type="dxa"/>
+            <w:tcMar>
+              <w:top w:w="57" w:type="dxa"/>
+              <w:bottom w:w="57" w:type="dxa"/>
+            </w:tcMar>
+          </w:tcPr>
+          <w:p>
+            <w:pPr>
+              <w:spacing w:after="160" w:line="259" w:lineRule="auto"/>
+              <w:rPr>
+                <w:rFonts w:ascii="Calibri" w:eastAsia="DengXian" w:hAnsi="Calibri" w:cs="Arial"/>
+                <w:sz w:val="22"/>
+                <w:lang w:eastAsia="zh-CN"/>
+              </w:rPr>
+            </w:pPr>
+            <w:r>
+              <w:rPr>
+                <w:rFonts w:ascii="Calibri" w:eastAsia="DengXian" w:hAnsi="Calibri" w:cs="Arial"/>
+                <w:b/>
+                <w:bCs/>
+                <w:sz w:val="22"/>
+                <w:lang w:eastAsia="zh-CN"/>
+              </w:rPr>
+              <w:t>Answer:</w:t>
+            </w:r>
+            <w:r>
+              <w:rPr>
+                <w:rFonts w:ascii="Calibri" w:eastAsia="DengXian" w:hAnsi="Calibri" w:cs="Arial"/>
+                <w:b/>
+                <w:bCs/>
+                <w:sz w:val="22"/>
+                <w:lang w:eastAsia="zh-CN"/>
+              </w:rPr>
+              <w:t xml:space="preserve"> </w:t>
             </w:r>
           </w:p>
           <w:p>
@@ -1135,87 +3790,6 @@
                 <w:sz w:val="22"/>
                 <w:lang w:eastAsia="zh-CN"/>
               </w:rPr>
-              <w:t xml:space="preserve">10. </w:t>
-            </w:r>
-            <w:r>
-              <w:rPr>
-                <w:rFonts w:ascii="Calibri" w:eastAsia="DengXian" w:hAnsi="Calibri" w:cs="Arial"/>
-                <w:sz w:val="22"/>
-                <w:lang w:eastAsia="zh-CN"/>
-              </w:rPr>
-              <w:t>Discuss the processes, tools and techniques for testing small-size applications</w:t>
-            </w:r>
-          </w:p>
-        </w:tc>
-      </w:tr>
-      <w:tr>
-        <w:tc>
-          <w:tcPr>
-            <w:tcW w:w="10768" w:type="dxa"/>
-            <w:tcMar>
-              <w:top w:w="57" w:type="dxa"/>
-              <w:bottom w:w="57" w:type="dxa"/>
-            </w:tcMar>
-          </w:tcPr>
-          <w:p>
-            <w:pPr>
-              <w:spacing w:after="160" w:line="259" w:lineRule="auto"/>
-              <w:rPr>
-                <w:rFonts w:ascii="Calibri" w:eastAsia="DengXian" w:hAnsi="Calibri" w:cs="Arial"/>
-                <w:sz w:val="22"/>
-                <w:lang w:eastAsia="zh-CN"/>
-              </w:rPr>
-            </w:pPr>
-            <w:r>
-              <w:rPr>
-                <w:rFonts w:ascii="Calibri" w:eastAsia="DengXian" w:hAnsi="Calibri" w:cs="Arial"/>
-                <w:b/>
-                <w:bCs/>
-                <w:sz w:val="22"/>
-                <w:lang w:eastAsia="zh-CN"/>
-              </w:rPr>
-              <w:t>Answer:</w:t>
-            </w:r>
-          </w:p>
-          <w:p>
-            <w:pPr>
-              <w:spacing w:after="160" w:line="259" w:lineRule="auto"/>
-              <w:rPr>
-                <w:rFonts w:ascii="Calibri" w:eastAsia="DengXian" w:hAnsi="Calibri" w:cs="Arial"/>
-                <w:sz w:val="22"/>
-                <w:lang w:eastAsia="zh-CN"/>
-              </w:rPr>
-            </w:pPr>
-          </w:p>
-        </w:tc>
-      </w:tr>
-      <w:tr>
-        <w:tc>
-          <w:tcPr>
-            <w:tcW w:w="10768" w:type="dxa"/>
-            <w:shd w:val="clear" w:color="auto" w:fill="FFEDF5"/>
-            <w:tcMar>
-              <w:top w:w="57" w:type="dxa"/>
-              <w:bottom w:w="57" w:type="dxa"/>
-            </w:tcMar>
-          </w:tcPr>
-          <w:p>
-            <w:pPr>
-              <w:spacing w:after="160" w:line="259" w:lineRule="auto"/>
-              <w:rPr>
-                <w:rFonts w:ascii="Calibri" w:eastAsia="DengXian" w:hAnsi="Calibri" w:cs="Arial"/>
-                <w:sz w:val="22"/>
-                <w:lang w:eastAsia="zh-CN"/>
-              </w:rPr>
-            </w:pPr>
-            <w:r>
-              <w:rPr>
-                <w:rFonts w:ascii="Calibri" w:eastAsia="DengXian" w:hAnsi="Calibri" w:cs="Arial"/>
-                <w:b/>
-                <w:bCs/>
-                <w:sz w:val="22"/>
-                <w:lang w:eastAsia="zh-CN"/>
-              </w:rPr>
               <w:t xml:space="preserve">11.  </w:t>
             </w:r>
             <w:r>
@@ -1286,6 +3860,9 @@
               <w:gridCol w:w="6688"/>
             </w:tblGrid>
             <w:tr>
+              <w:trPr>
+                <w:trHeight w:val="566"/>
+              </w:trPr>
               <w:tc>
                 <w:tcPr>
                   <w:tcW w:w="1303" w:type="dxa"/>
@@ -1295,6 +3872,7 @@
                     <w:bottom w:val="single" w:sz="4" w:space="0" w:color="auto"/>
                     <w:right w:val="single" w:sz="4" w:space="0" w:color="auto"/>
                   </w:tcBorders>
+                  <w:vAlign w:val="center"/>
                 </w:tcPr>
                 <w:p>
                   <w:pPr>
@@ -1330,10 +3908,12 @@
                     <w:bottom w:val="single" w:sz="4" w:space="0" w:color="auto"/>
                     <w:right w:val="single" w:sz="4" w:space="0" w:color="auto"/>
                   </w:tcBorders>
+                  <w:vAlign w:val="center"/>
                 </w:tcPr>
                 <w:p>
                   <w:pPr>
                     <w:spacing w:after="160" w:line="259" w:lineRule="auto"/>
+                    <w:jc w:val="center"/>
                     <w:rPr>
                       <w:rFonts w:ascii="Calibri" w:eastAsia="DengXian" w:hAnsi="Calibri" w:cs="Arial"/>
                       <w:b/>
@@ -1365,6 +3945,7 @@
                     <w:bottom w:val="single" w:sz="4" w:space="0" w:color="auto"/>
                     <w:right w:val="single" w:sz="4" w:space="0" w:color="auto"/>
                   </w:tcBorders>
+                  <w:vAlign w:val="center"/>
                 </w:tcPr>
                 <w:p>
                   <w:pPr>
@@ -1505,7 +4086,6 @@
                       <w:sz w:val="22"/>
                       <w:lang w:eastAsia="zh-CN"/>
                     </w:rPr>
-                    <w:lastRenderedPageBreak/>
                     <w:t>Python</w:t>
                   </w:r>
                 </w:p>
@@ -1687,7 +4267,6 @@
                 <w:sz w:val="22"/>
                 <w:lang w:eastAsia="zh-CN"/>
               </w:rPr>
-              <w:lastRenderedPageBreak/>
               <w:t xml:space="preserve">12. </w:t>
             </w:r>
             <w:r>
@@ -1821,6 +4400,7 @@
                 <w:sz w:val="22"/>
                 <w:lang w:eastAsia="zh-CN"/>
               </w:rPr>
+              <w:lastRenderedPageBreak/>
               <w:t>Answer:</w:t>
             </w:r>
           </w:p>
@@ -2125,7 +4705,6 @@
                 <w:sz w:val="22"/>
                 <w:lang w:eastAsia="zh-CN"/>
               </w:rPr>
-              <w:lastRenderedPageBreak/>
               <w:t xml:space="preserve">You may use any </w:t>
             </w:r>
             <w:r>
@@ -2217,7 +4796,6 @@
                 <w:sz w:val="22"/>
                 <w:lang w:eastAsia="zh-CN"/>
               </w:rPr>
-              <w:lastRenderedPageBreak/>
               <w:t>Answer:</w:t>
             </w:r>
           </w:p>
@@ -2361,6 +4939,7 @@
                 <w:sz w:val="22"/>
                 <w:lang w:eastAsia="zh-CN"/>
               </w:rPr>
+              <w:lastRenderedPageBreak/>
               <w:t xml:space="preserve">18. </w:t>
             </w:r>
             <w:r>
@@ -2643,10 +5222,10 @@
     </w:tbl>
     <w:p/>
     <w:sectPr>
-      <w:headerReference w:type="default" r:id="rId15"/>
-      <w:footerReference w:type="even" r:id="rId16"/>
-      <w:footerReference w:type="default" r:id="rId17"/>
-      <w:footerReference w:type="first" r:id="rId18"/>
+      <w:headerReference w:type="default" r:id="rId16"/>
+      <w:footerReference w:type="even" r:id="rId17"/>
+      <w:footerReference w:type="default" r:id="rId18"/>
+      <w:footerReference w:type="first" r:id="rId19"/>
       <w:pgSz w:w="12240" w:h="15840"/>
       <w:pgMar w:top="1418" w:right="709" w:bottom="1440" w:left="709" w:header="709" w:footer="709" w:gutter="0"/>
       <w:cols w:space="708"/>
@@ -2657,7 +5236,7 @@
 </file>
 
 <file path=word/endnotes.xml><?xml version="1.0" encoding="utf-8"?>
-<w:endnotes xmlns:wpc="http://schemas.microsoft.com/office/word/2010/wordprocessingCanvas" xmlns:cx="http://schemas.microsoft.com/office/drawing/2014/chartex" xmlns:cx1="http://schemas.microsoft.com/office/drawing/2015/9/8/chartex" xmlns:cx2="http://schemas.microsoft.com/office/drawing/2015/10/21/chartex" xmlns:cx3="http://schemas.microsoft.com/office/drawing/2016/5/9/chartex" xmlns:cx4="http://schemas.microsoft.com/office/drawing/2016/5/10/chartex" xmlns:cx5="http://schemas.microsoft.com/office/drawing/2016/5/11/chartex" xmlns:cx6="http://schemas.microsoft.com/office/drawing/2016/5/12/chartex" xmlns:cx7="http://schemas.microsoft.com/office/drawing/2016/5/13/chartex" xmlns:cx8="http://schemas.microsoft.com/office/drawing/2016/5/14/chartex" xmlns:mc="http://schemas.openxmlformats.org/markup-compatibility/2006" xmlns:aink="http://schemas.microsoft.com/office/drawing/2016/ink" xmlns:am3d="http://schemas.microsoft.com/office/drawing/2017/model3d" xmlns:o="urn:schemas-microsoft-com:office:office" xmlns:r="http://schemas.openxmlformats.org/officeDocument/2006/relationships" xmlns:m="http://schemas.openxmlformats.org/officeDocument/2006/math" xmlns:v="urn:schemas-microsoft-com:vml" xmlns:wp14="http://schemas.microsoft.com/office/word/2010/wordprocessingDrawing" xmlns:wp="http://schemas.openxmlformats.org/drawingml/2006/wordprocessingDrawing" xmlns:w10="urn:schemas-microsoft-com:office:word" xmlns:w="http://schemas.openxmlformats.org/wordprocessingml/2006/main" xmlns:w14="http://schemas.microsoft.com/office/word/2010/wordml" xmlns:w15="http://schemas.microsoft.com/office/word/2012/wordml" xmlns:w16cid="http://schemas.microsoft.com/office/word/2016/wordml/cid" xmlns:w16se="http://schemas.microsoft.com/office/word/2015/wordml/symex" xmlns:wpg="http://schemas.microsoft.com/office/word/2010/wordprocessingGroup" xmlns:wpi="http://schemas.microsoft.com/office/word/2010/wordprocessingInk" xmlns:wne="http://schemas.microsoft.com/office/word/2006/wordml" xmlns:wps="http://schemas.microsoft.com/office/word/2010/wordprocessingShape" mc:Ignorable="w14 w15 w16se w16cid wp14">
+<w:endnotes xmlns:wpc="http://schemas.microsoft.com/office/word/2010/wordprocessingCanvas" xmlns:cx="http://schemas.microsoft.com/office/drawing/2014/chartex" xmlns:cx1="http://schemas.microsoft.com/office/drawing/2015/9/8/chartex" xmlns:cx2="http://schemas.microsoft.com/office/drawing/2015/10/21/chartex" xmlns:cx3="http://schemas.microsoft.com/office/drawing/2016/5/9/chartex" xmlns:cx4="http://schemas.microsoft.com/office/drawing/2016/5/10/chartex" xmlns:cx5="http://schemas.microsoft.com/office/drawing/2016/5/11/chartex" xmlns:cx6="http://schemas.microsoft.com/office/drawing/2016/5/12/chartex" xmlns:cx7="http://schemas.microsoft.com/office/drawing/2016/5/13/chartex" xmlns:cx8="http://schemas.microsoft.com/office/drawing/2016/5/14/chartex" xmlns:mc="http://schemas.openxmlformats.org/markup-compatibility/2006" xmlns:aink="http://schemas.microsoft.com/office/drawing/2016/ink" xmlns:am3d="http://schemas.microsoft.com/office/drawing/2017/model3d" xmlns:o="urn:schemas-microsoft-com:office:office" xmlns:oel="http://schemas.microsoft.com/office/2019/extlst" xmlns:r="http://schemas.openxmlformats.org/officeDocument/2006/relationships" xmlns:m="http://schemas.openxmlformats.org/officeDocument/2006/math" xmlns:v="urn:schemas-microsoft-com:vml" xmlns:wp14="http://schemas.microsoft.com/office/word/2010/wordprocessingDrawing" xmlns:wp="http://schemas.openxmlformats.org/drawingml/2006/wordprocessingDrawing" xmlns:w10="urn:schemas-microsoft-com:office:word" xmlns:w="http://schemas.openxmlformats.org/wordprocessingml/2006/main" xmlns:w14="http://schemas.microsoft.com/office/word/2010/wordml" xmlns:w15="http://schemas.microsoft.com/office/word/2012/wordml" xmlns:w16cex="http://schemas.microsoft.com/office/word/2018/wordml/cex" xmlns:w16cid="http://schemas.microsoft.com/office/word/2016/wordml/cid" xmlns:w16="http://schemas.microsoft.com/office/word/2018/wordml" xmlns:w16du="http://schemas.microsoft.com/office/word/2023/wordml/word16du" xmlns:w16sdtdh="http://schemas.microsoft.com/office/word/2020/wordml/sdtdatahash" xmlns:w16sdtfl="http://schemas.microsoft.com/office/word/2024/wordml/sdtformatlock" xmlns:w16se="http://schemas.microsoft.com/office/word/2015/wordml/symex" xmlns:wpg="http://schemas.microsoft.com/office/word/2010/wordprocessingGroup" xmlns:wpi="http://schemas.microsoft.com/office/word/2010/wordprocessingInk" xmlns:wne="http://schemas.microsoft.com/office/word/2006/wordml" xmlns:wps="http://schemas.microsoft.com/office/word/2010/wordprocessingShape" mc:Ignorable="w14 w15 w16se w16cid w16 w16cex w16sdtdh w16sdtfl w16du wp14">
   <w:endnote w:type="separator" w:id="-1">
     <w:p>
       <w:r>
@@ -2676,7 +5255,7 @@
 </file>
 
 <file path=word/footer1.xml><?xml version="1.0" encoding="utf-8"?>
-<w:ftr xmlns:wpc="http://schemas.microsoft.com/office/word/2010/wordprocessingCanvas" xmlns:cx="http://schemas.microsoft.com/office/drawing/2014/chartex" xmlns:cx1="http://schemas.microsoft.com/office/drawing/2015/9/8/chartex" xmlns:cx2="http://schemas.microsoft.com/office/drawing/2015/10/21/chartex" xmlns:cx3="http://schemas.microsoft.com/office/drawing/2016/5/9/chartex" xmlns:cx4="http://schemas.microsoft.com/office/drawing/2016/5/10/chartex" xmlns:cx5="http://schemas.microsoft.com/office/drawing/2016/5/11/chartex" xmlns:cx6="http://schemas.microsoft.com/office/drawing/2016/5/12/chartex" xmlns:cx7="http://schemas.microsoft.com/office/drawing/2016/5/13/chartex" xmlns:cx8="http://schemas.microsoft.com/office/drawing/2016/5/14/chartex" xmlns:mc="http://schemas.openxmlformats.org/markup-compatibility/2006" xmlns:aink="http://schemas.microsoft.com/office/drawing/2016/ink" xmlns:am3d="http://schemas.microsoft.com/office/drawing/2017/model3d" xmlns:o="urn:schemas-microsoft-com:office:office" xmlns:r="http://schemas.openxmlformats.org/officeDocument/2006/relationships" xmlns:m="http://schemas.openxmlformats.org/officeDocument/2006/math" xmlns:v="urn:schemas-microsoft-com:vml" xmlns:wp14="http://schemas.microsoft.com/office/word/2010/wordprocessingDrawing" xmlns:wp="http://schemas.openxmlformats.org/drawingml/2006/wordprocessingDrawing" xmlns:w10="urn:schemas-microsoft-com:office:word" xmlns:w="http://schemas.openxmlformats.org/wordprocessingml/2006/main" xmlns:w14="http://schemas.microsoft.com/office/word/2010/wordml" xmlns:w15="http://schemas.microsoft.com/office/word/2012/wordml" xmlns:w16cid="http://schemas.microsoft.com/office/word/2016/wordml/cid" xmlns:w16se="http://schemas.microsoft.com/office/word/2015/wordml/symex" xmlns:wpg="http://schemas.microsoft.com/office/word/2010/wordprocessingGroup" xmlns:wpi="http://schemas.microsoft.com/office/word/2010/wordprocessingInk" xmlns:wne="http://schemas.microsoft.com/office/word/2006/wordml" xmlns:wps="http://schemas.microsoft.com/office/word/2010/wordprocessingShape" mc:Ignorable="w14 w15 w16se w16cid wp14">
+<w:ftr xmlns:wpc="http://schemas.microsoft.com/office/word/2010/wordprocessingCanvas" xmlns:cx="http://schemas.microsoft.com/office/drawing/2014/chartex" xmlns:cx1="http://schemas.microsoft.com/office/drawing/2015/9/8/chartex" xmlns:cx2="http://schemas.microsoft.com/office/drawing/2015/10/21/chartex" xmlns:cx3="http://schemas.microsoft.com/office/drawing/2016/5/9/chartex" xmlns:cx4="http://schemas.microsoft.com/office/drawing/2016/5/10/chartex" xmlns:cx5="http://schemas.microsoft.com/office/drawing/2016/5/11/chartex" xmlns:cx6="http://schemas.microsoft.com/office/drawing/2016/5/12/chartex" xmlns:cx7="http://schemas.microsoft.com/office/drawing/2016/5/13/chartex" xmlns:cx8="http://schemas.microsoft.com/office/drawing/2016/5/14/chartex" xmlns:mc="http://schemas.openxmlformats.org/markup-compatibility/2006" xmlns:aink="http://schemas.microsoft.com/office/drawing/2016/ink" xmlns:am3d="http://schemas.microsoft.com/office/drawing/2017/model3d" xmlns:o="urn:schemas-microsoft-com:office:office" xmlns:oel="http://schemas.microsoft.com/office/2019/extlst" xmlns:r="http://schemas.openxmlformats.org/officeDocument/2006/relationships" xmlns:m="http://schemas.openxmlformats.org/officeDocument/2006/math" xmlns:v="urn:schemas-microsoft-com:vml" xmlns:wp14="http://schemas.microsoft.com/office/word/2010/wordprocessingDrawing" xmlns:wp="http://schemas.openxmlformats.org/drawingml/2006/wordprocessingDrawing" xmlns:w10="urn:schemas-microsoft-com:office:word" xmlns:w="http://schemas.openxmlformats.org/wordprocessingml/2006/main" xmlns:w14="http://schemas.microsoft.com/office/word/2010/wordml" xmlns:w15="http://schemas.microsoft.com/office/word/2012/wordml" xmlns:w16cex="http://schemas.microsoft.com/office/word/2018/wordml/cex" xmlns:w16cid="http://schemas.microsoft.com/office/word/2016/wordml/cid" xmlns:w16="http://schemas.microsoft.com/office/word/2018/wordml" xmlns:w16du="http://schemas.microsoft.com/office/word/2023/wordml/word16du" xmlns:w16sdtdh="http://schemas.microsoft.com/office/word/2020/wordml/sdtdatahash" xmlns:w16sdtfl="http://schemas.microsoft.com/office/word/2024/wordml/sdtformatlock" xmlns:w16se="http://schemas.microsoft.com/office/word/2015/wordml/symex" xmlns:wpg="http://schemas.microsoft.com/office/word/2010/wordprocessingGroup" xmlns:wpi="http://schemas.microsoft.com/office/word/2010/wordprocessingInk" xmlns:wne="http://schemas.microsoft.com/office/word/2006/wordml" xmlns:wps="http://schemas.microsoft.com/office/word/2010/wordprocessingShape" mc:Ignorable="w14 w15 w16se w16cid w16 w16cex w16sdtdh w16sdtfl w16du wp14">
   <w:p>
     <w:pPr>
       <w:pStyle w:val="Footer"/>
@@ -2702,7 +5281,7 @@
               <wp:docPr id="34" name="Text Box 34" descr="OFFICIAL">
                 <a:extLst xmlns:a="http://schemas.openxmlformats.org/drawingml/2006/main">
                   <a:ext uri="{5AE41FA2-C0FF-4470-9BD4-5FADCA87CBE2}">
-                    <aclsh:classification xmlns:aclsh="http://schemas.microsoft.com/office/drawing/2020/classificationShape" xmlns:w16sdtfl="http://schemas.microsoft.com/office/word/2024/wordml/sdtformatlock" xmlns:w16sdtdh="http://schemas.microsoft.com/office/word/2020/wordml/sdtdatahash" xmlns:w16du="http://schemas.microsoft.com/office/word/2023/wordml/word16du" xmlns:w16="http://schemas.microsoft.com/office/word/2018/wordml" xmlns:w16cex="http://schemas.microsoft.com/office/word/2018/wordml/cex" xmlns:w="http://schemas.openxmlformats.org/wordprocessingml/2006/main" xmlns:w10="urn:schemas-microsoft-com:office:word" xmlns:v="urn:schemas-microsoft-com:vml" xmlns:oel="http://schemas.microsoft.com/office/2019/extlst" xmlns:o="urn:schemas-microsoft-com:office:office" xmlns="" classificationOutcomeType="ftr"/>
+                    <aclsh:classification xmlns:aclsh="http://schemas.microsoft.com/office/drawing/2020/classificationShape" classificationOutcomeType="ftr"/>
                   </a:ext>
                 </a:extLst>
               </wp:docPr>
@@ -2765,7 +5344,7 @@
               <v:stroke joinstyle="miter"/>
               <v:path gradientshapeok="t" o:connecttype="rect"/>
             </v:shapetype>
-            <v:shape id="Text Box 34" o:spid="_x0000_s1027" type="#_x0000_t202" alt="OFFICIAL" style="position:absolute;margin-left:0;margin-top:0;width:34.95pt;height:34.95pt;z-index:251662336;visibility:visible;mso-wrap-style:none;mso-wrap-distance-left:0;mso-wrap-distance-top:0;mso-wrap-distance-right:0;mso-wrap-distance-bottom:0;mso-position-horizontal:center;mso-position-horizontal-relative:page;mso-position-vertical:bottom;mso-position-vertical-relative:page;v-text-anchor:bottom" o:gfxdata="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" filled="f" stroked="f">
+            <v:shape id="Text Box 34" o:spid="_x0000_s1027" type="#_x0000_t202" alt="OFFICIAL" style="position:absolute;margin-left:0;margin-top:0;width:34.95pt;height:34.95pt;z-index:251662336;visibility:visible;mso-wrap-style:none;mso-wrap-distance-left:0;mso-wrap-distance-top:0;mso-wrap-distance-right:0;mso-wrap-distance-bottom:0;mso-position-horizontal:center;mso-position-horizontal-relative:page;mso-position-vertical:bottom;mso-position-vertical-relative:page;v-text-anchor:bottom" o:gfxdata="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" filled="f" stroked="f">
               <v:textbox style="mso-fit-shape-to-text:t" inset="0,0,0,15pt">
                 <w:txbxContent>
                   <w:p>
@@ -2800,7 +5379,7 @@
 </file>
 
 <file path=word/footer2.xml><?xml version="1.0" encoding="utf-8"?>
-<w:ftr xmlns:wpc="http://schemas.microsoft.com/office/word/2010/wordprocessingCanvas" xmlns:cx="http://schemas.microsoft.com/office/drawing/2014/chartex" xmlns:cx1="http://schemas.microsoft.com/office/drawing/2015/9/8/chartex" xmlns:cx2="http://schemas.microsoft.com/office/drawing/2015/10/21/chartex" xmlns:cx3="http://schemas.microsoft.com/office/drawing/2016/5/9/chartex" xmlns:cx4="http://schemas.microsoft.com/office/drawing/2016/5/10/chartex" xmlns:cx5="http://schemas.microsoft.com/office/drawing/2016/5/11/chartex" xmlns:cx6="http://schemas.microsoft.com/office/drawing/2016/5/12/chartex" xmlns:cx7="http://schemas.microsoft.com/office/drawing/2016/5/13/chartex" xmlns:cx8="http://schemas.microsoft.com/office/drawing/2016/5/14/chartex" xmlns:mc="http://schemas.openxmlformats.org/markup-compatibility/2006" xmlns:aink="http://schemas.microsoft.com/office/drawing/2016/ink" xmlns:am3d="http://schemas.microsoft.com/office/drawing/2017/model3d" xmlns:o="urn:schemas-microsoft-com:office:office" xmlns:r="http://schemas.openxmlformats.org/officeDocument/2006/relationships" xmlns:m="http://schemas.openxmlformats.org/officeDocument/2006/math" xmlns:v="urn:schemas-microsoft-com:vml" xmlns:wp14="http://schemas.microsoft.com/office/word/2010/wordprocessingDrawing" xmlns:wp="http://schemas.openxmlformats.org/drawingml/2006/wordprocessingDrawing" xmlns:w10="urn:schemas-microsoft-com:office:word" xmlns:w="http://schemas.openxmlformats.org/wordprocessingml/2006/main" xmlns:w14="http://schemas.microsoft.com/office/word/2010/wordml" xmlns:w15="http://schemas.microsoft.com/office/word/2012/wordml" xmlns:w16cid="http://schemas.microsoft.com/office/word/2016/wordml/cid" xmlns:w16se="http://schemas.microsoft.com/office/word/2015/wordml/symex" xmlns:wpg="http://schemas.microsoft.com/office/word/2010/wordprocessingGroup" xmlns:wpi="http://schemas.microsoft.com/office/word/2010/wordprocessingInk" xmlns:wne="http://schemas.microsoft.com/office/word/2006/wordml" xmlns:wps="http://schemas.microsoft.com/office/word/2010/wordprocessingShape" mc:Ignorable="w14 w15 w16se w16cid wp14">
+<w:ftr xmlns:wpc="http://schemas.microsoft.com/office/word/2010/wordprocessingCanvas" xmlns:cx="http://schemas.microsoft.com/office/drawing/2014/chartex" xmlns:cx1="http://schemas.microsoft.com/office/drawing/2015/9/8/chartex" xmlns:cx2="http://schemas.microsoft.com/office/drawing/2015/10/21/chartex" xmlns:cx3="http://schemas.microsoft.com/office/drawing/2016/5/9/chartex" xmlns:cx4="http://schemas.microsoft.com/office/drawing/2016/5/10/chartex" xmlns:cx5="http://schemas.microsoft.com/office/drawing/2016/5/11/chartex" xmlns:cx6="http://schemas.microsoft.com/office/drawing/2016/5/12/chartex" xmlns:cx7="http://schemas.microsoft.com/office/drawing/2016/5/13/chartex" xmlns:cx8="http://schemas.microsoft.com/office/drawing/2016/5/14/chartex" xmlns:mc="http://schemas.openxmlformats.org/markup-compatibility/2006" xmlns:aink="http://schemas.microsoft.com/office/drawing/2016/ink" xmlns:am3d="http://schemas.microsoft.com/office/drawing/2017/model3d" xmlns:o="urn:schemas-microsoft-com:office:office" xmlns:oel="http://schemas.microsoft.com/office/2019/extlst" xmlns:r="http://schemas.openxmlformats.org/officeDocument/2006/relationships" xmlns:m="http://schemas.openxmlformats.org/officeDocument/2006/math" xmlns:v="urn:schemas-microsoft-com:vml" xmlns:wp14="http://schemas.microsoft.com/office/word/2010/wordprocessingDrawing" xmlns:wp="http://schemas.openxmlformats.org/drawingml/2006/wordprocessingDrawing" xmlns:w10="urn:schemas-microsoft-com:office:word" xmlns:w="http://schemas.openxmlformats.org/wordprocessingml/2006/main" xmlns:w14="http://schemas.microsoft.com/office/word/2010/wordml" xmlns:w15="http://schemas.microsoft.com/office/word/2012/wordml" xmlns:w16cex="http://schemas.microsoft.com/office/word/2018/wordml/cex" xmlns:w16cid="http://schemas.microsoft.com/office/word/2016/wordml/cid" xmlns:w16="http://schemas.microsoft.com/office/word/2018/wordml" xmlns:w16du="http://schemas.microsoft.com/office/word/2023/wordml/word16du" xmlns:w16sdtdh="http://schemas.microsoft.com/office/word/2020/wordml/sdtdatahash" xmlns:w16sdtfl="http://schemas.microsoft.com/office/word/2024/wordml/sdtformatlock" xmlns:w16se="http://schemas.microsoft.com/office/word/2015/wordml/symex" xmlns:wpg="http://schemas.microsoft.com/office/word/2010/wordprocessingGroup" xmlns:wpi="http://schemas.microsoft.com/office/word/2010/wordprocessingInk" xmlns:wne="http://schemas.microsoft.com/office/word/2006/wordml" xmlns:wps="http://schemas.microsoft.com/office/word/2010/wordprocessingShape" mc:Ignorable="w14 w15 w16se w16cid w16 w16cex w16sdtdh w16sdtfl w16du wp14">
   <w:p>
     <w:pPr>
       <w:rPr>
@@ -2833,7 +5412,7 @@
               <wp:docPr id="36" name="Text Box 36" descr="OFFICIAL">
                 <a:extLst xmlns:a="http://schemas.openxmlformats.org/drawingml/2006/main">
                   <a:ext uri="{5AE41FA2-C0FF-4470-9BD4-5FADCA87CBE2}">
-                    <aclsh:classification xmlns:aclsh="http://schemas.microsoft.com/office/drawing/2020/classificationShape" xmlns:w16sdtfl="http://schemas.microsoft.com/office/word/2024/wordml/sdtformatlock" xmlns:w16sdtdh="http://schemas.microsoft.com/office/word/2020/wordml/sdtdatahash" xmlns:w16du="http://schemas.microsoft.com/office/word/2023/wordml/word16du" xmlns:w16="http://schemas.microsoft.com/office/word/2018/wordml" xmlns:w16cex="http://schemas.microsoft.com/office/word/2018/wordml/cex" xmlns:w="http://schemas.openxmlformats.org/wordprocessingml/2006/main" xmlns:w10="urn:schemas-microsoft-com:office:word" xmlns:v="urn:schemas-microsoft-com:vml" xmlns:oel="http://schemas.microsoft.com/office/2019/extlst" xmlns:o="urn:schemas-microsoft-com:office:office" xmlns="" classificationOutcomeType="ftr"/>
+                    <aclsh:classification xmlns:aclsh="http://schemas.microsoft.com/office/drawing/2020/classificationShape" classificationOutcomeType="ftr"/>
                   </a:ext>
                 </a:extLst>
               </wp:docPr>
@@ -2896,7 +5475,7 @@
               <v:stroke joinstyle="miter"/>
               <v:path gradientshapeok="t" o:connecttype="rect"/>
             </v:shapetype>
-            <v:shape id="Text Box 36" o:spid="_x0000_s1028" type="#_x0000_t202" alt="OFFICIAL" style="position:absolute;margin-left:0;margin-top:0;width:34.95pt;height:34.95pt;z-index:251663360;visibility:visible;mso-wrap-style:none;mso-wrap-distance-left:0;mso-wrap-distance-top:0;mso-wrap-distance-right:0;mso-wrap-distance-bottom:0;mso-position-horizontal:center;mso-position-horizontal-relative:page;mso-position-vertical:bottom;mso-position-vertical-relative:page;v-text-anchor:bottom" o:gfxdata="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" filled="f" stroked="f">
+            <v:shape id="Text Box 36" o:spid="_x0000_s1028" type="#_x0000_t202" alt="OFFICIAL" style="position:absolute;margin-left:0;margin-top:0;width:34.95pt;height:34.95pt;z-index:251663360;visibility:visible;mso-wrap-style:none;mso-wrap-distance-left:0;mso-wrap-distance-top:0;mso-wrap-distance-right:0;mso-wrap-distance-bottom:0;mso-position-horizontal:center;mso-position-horizontal-relative:page;mso-position-vertical:bottom;mso-position-vertical-relative:page;v-text-anchor:bottom" o:gfxdata="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" filled="f" stroked="f">
               <v:textbox style="mso-fit-shape-to-text:t" inset="0,0,0,15pt">
                 <w:txbxContent>
                   <w:p>
@@ -2931,7 +5510,7 @@
 </file>
 
 <file path=word/footer3.xml><?xml version="1.0" encoding="utf-8"?>
-<w:ftr xmlns:wpc="http://schemas.microsoft.com/office/word/2010/wordprocessingCanvas" xmlns:cx="http://schemas.microsoft.com/office/drawing/2014/chartex" xmlns:cx1="http://schemas.microsoft.com/office/drawing/2015/9/8/chartex" xmlns:cx2="http://schemas.microsoft.com/office/drawing/2015/10/21/chartex" xmlns:cx3="http://schemas.microsoft.com/office/drawing/2016/5/9/chartex" xmlns:cx4="http://schemas.microsoft.com/office/drawing/2016/5/10/chartex" xmlns:cx5="http://schemas.microsoft.com/office/drawing/2016/5/11/chartex" xmlns:cx6="http://schemas.microsoft.com/office/drawing/2016/5/12/chartex" xmlns:cx7="http://schemas.microsoft.com/office/drawing/2016/5/13/chartex" xmlns:cx8="http://schemas.microsoft.com/office/drawing/2016/5/14/chartex" xmlns:mc="http://schemas.openxmlformats.org/markup-compatibility/2006" xmlns:aink="http://schemas.microsoft.com/office/drawing/2016/ink" xmlns:am3d="http://schemas.microsoft.com/office/drawing/2017/model3d" xmlns:o="urn:schemas-microsoft-com:office:office" xmlns:r="http://schemas.openxmlformats.org/officeDocument/2006/relationships" xmlns:m="http://schemas.openxmlformats.org/officeDocument/2006/math" xmlns:v="urn:schemas-microsoft-com:vml" xmlns:wp14="http://schemas.microsoft.com/office/word/2010/wordprocessingDrawing" xmlns:wp="http://schemas.openxmlformats.org/drawingml/2006/wordprocessingDrawing" xmlns:w10="urn:schemas-microsoft-com:office:word" xmlns:w="http://schemas.openxmlformats.org/wordprocessingml/2006/main" xmlns:w14="http://schemas.microsoft.com/office/word/2010/wordml" xmlns:w15="http://schemas.microsoft.com/office/word/2012/wordml" xmlns:w16cid="http://schemas.microsoft.com/office/word/2016/wordml/cid" xmlns:w16se="http://schemas.microsoft.com/office/word/2015/wordml/symex" xmlns:wpg="http://schemas.microsoft.com/office/word/2010/wordprocessingGroup" xmlns:wpi="http://schemas.microsoft.com/office/word/2010/wordprocessingInk" xmlns:wne="http://schemas.microsoft.com/office/word/2006/wordml" xmlns:wps="http://schemas.microsoft.com/office/word/2010/wordprocessingShape" mc:Ignorable="w14 w15 w16se w16cid wp14">
+<w:ftr xmlns:wpc="http://schemas.microsoft.com/office/word/2010/wordprocessingCanvas" xmlns:cx="http://schemas.microsoft.com/office/drawing/2014/chartex" xmlns:cx1="http://schemas.microsoft.com/office/drawing/2015/9/8/chartex" xmlns:cx2="http://schemas.microsoft.com/office/drawing/2015/10/21/chartex" xmlns:cx3="http://schemas.microsoft.com/office/drawing/2016/5/9/chartex" xmlns:cx4="http://schemas.microsoft.com/office/drawing/2016/5/10/chartex" xmlns:cx5="http://schemas.microsoft.com/office/drawing/2016/5/11/chartex" xmlns:cx6="http://schemas.microsoft.com/office/drawing/2016/5/12/chartex" xmlns:cx7="http://schemas.microsoft.com/office/drawing/2016/5/13/chartex" xmlns:cx8="http://schemas.microsoft.com/office/drawing/2016/5/14/chartex" xmlns:mc="http://schemas.openxmlformats.org/markup-compatibility/2006" xmlns:aink="http://schemas.microsoft.com/office/drawing/2016/ink" xmlns:am3d="http://schemas.microsoft.com/office/drawing/2017/model3d" xmlns:o="urn:schemas-microsoft-com:office:office" xmlns:oel="http://schemas.microsoft.com/office/2019/extlst" xmlns:r="http://schemas.openxmlformats.org/officeDocument/2006/relationships" xmlns:m="http://schemas.openxmlformats.org/officeDocument/2006/math" xmlns:v="urn:schemas-microsoft-com:vml" xmlns:wp14="http://schemas.microsoft.com/office/word/2010/wordprocessingDrawing" xmlns:wp="http://schemas.openxmlformats.org/drawingml/2006/wordprocessingDrawing" xmlns:w10="urn:schemas-microsoft-com:office:word" xmlns:w="http://schemas.openxmlformats.org/wordprocessingml/2006/main" xmlns:w14="http://schemas.microsoft.com/office/word/2010/wordml" xmlns:w15="http://schemas.microsoft.com/office/word/2012/wordml" xmlns:w16cex="http://schemas.microsoft.com/office/word/2018/wordml/cex" xmlns:w16cid="http://schemas.microsoft.com/office/word/2016/wordml/cid" xmlns:w16="http://schemas.microsoft.com/office/word/2018/wordml" xmlns:w16du="http://schemas.microsoft.com/office/word/2023/wordml/word16du" xmlns:w16sdtdh="http://schemas.microsoft.com/office/word/2020/wordml/sdtdatahash" xmlns:w16sdtfl="http://schemas.microsoft.com/office/word/2024/wordml/sdtformatlock" xmlns:w16se="http://schemas.microsoft.com/office/word/2015/wordml/symex" xmlns:wpg="http://schemas.microsoft.com/office/word/2010/wordprocessingGroup" xmlns:wpi="http://schemas.microsoft.com/office/word/2010/wordprocessingInk" xmlns:wne="http://schemas.microsoft.com/office/word/2006/wordml" xmlns:wps="http://schemas.microsoft.com/office/word/2010/wordprocessingShape" mc:Ignorable="w14 w15 w16se w16cid w16 w16cex w16sdtdh w16sdtfl w16du wp14">
   <w:p>
     <w:pPr>
       <w:pStyle w:val="Footer"/>
@@ -2957,7 +5536,7 @@
               <wp:docPr id="26" name="Text Box 26" descr="OFFICIAL">
                 <a:extLst xmlns:a="http://schemas.openxmlformats.org/drawingml/2006/main">
                   <a:ext uri="{5AE41FA2-C0FF-4470-9BD4-5FADCA87CBE2}">
-                    <aclsh:classification xmlns:aclsh="http://schemas.microsoft.com/office/drawing/2020/classificationShape" xmlns:w16sdtfl="http://schemas.microsoft.com/office/word/2024/wordml/sdtformatlock" xmlns:w16sdtdh="http://schemas.microsoft.com/office/word/2020/wordml/sdtdatahash" xmlns:w16du="http://schemas.microsoft.com/office/word/2023/wordml/word16du" xmlns:w16="http://schemas.microsoft.com/office/word/2018/wordml" xmlns:w16cex="http://schemas.microsoft.com/office/word/2018/wordml/cex" xmlns:w="http://schemas.openxmlformats.org/wordprocessingml/2006/main" xmlns:w10="urn:schemas-microsoft-com:office:word" xmlns:v="urn:schemas-microsoft-com:vml" xmlns:oel="http://schemas.microsoft.com/office/2019/extlst" xmlns:o="urn:schemas-microsoft-com:office:office" xmlns="" classificationOutcomeType="ftr"/>
+                    <aclsh:classification xmlns:aclsh="http://schemas.microsoft.com/office/drawing/2020/classificationShape" classificationOutcomeType="ftr"/>
                   </a:ext>
                 </a:extLst>
               </wp:docPr>
@@ -3020,7 +5599,7 @@
               <v:stroke joinstyle="miter"/>
               <v:path gradientshapeok="t" o:connecttype="rect"/>
             </v:shapetype>
-            <v:shape id="Text Box 26" o:spid="_x0000_s1029" type="#_x0000_t202" alt="OFFICIAL" style="position:absolute;margin-left:0;margin-top:0;width:34.95pt;height:34.95pt;z-index:251661312;visibility:visible;mso-wrap-style:none;mso-wrap-distance-left:0;mso-wrap-distance-top:0;mso-wrap-distance-right:0;mso-wrap-distance-bottom:0;mso-position-horizontal:center;mso-position-horizontal-relative:page;mso-position-vertical:bottom;mso-position-vertical-relative:page;v-text-anchor:bottom" o:gfxdata="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" filled="f" stroked="f">
+            <v:shape id="Text Box 26" o:spid="_x0000_s1029" type="#_x0000_t202" alt="OFFICIAL" style="position:absolute;margin-left:0;margin-top:0;width:34.95pt;height:34.95pt;z-index:251661312;visibility:visible;mso-wrap-style:none;mso-wrap-distance-left:0;mso-wrap-distance-top:0;mso-wrap-distance-right:0;mso-wrap-distance-bottom:0;mso-position-horizontal:center;mso-position-horizontal-relative:page;mso-position-vertical:bottom;mso-position-vertical-relative:page;v-text-anchor:bottom" o:gfxdata="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" filled="f" stroked="f">
               <v:textbox style="mso-fit-shape-to-text:t" inset="0,0,0,15pt">
                 <w:txbxContent>
                   <w:p>
@@ -3055,7 +5634,7 @@
 </file>
 
 <file path=word/footnotes.xml><?xml version="1.0" encoding="utf-8"?>
-<w:footnotes xmlns:wpc="http://schemas.microsoft.com/office/word/2010/wordprocessingCanvas" xmlns:cx="http://schemas.microsoft.com/office/drawing/2014/chartex" xmlns:cx1="http://schemas.microsoft.com/office/drawing/2015/9/8/chartex" xmlns:cx2="http://schemas.microsoft.com/office/drawing/2015/10/21/chartex" xmlns:cx3="http://schemas.microsoft.com/office/drawing/2016/5/9/chartex" xmlns:cx4="http://schemas.microsoft.com/office/drawing/2016/5/10/chartex" xmlns:cx5="http://schemas.microsoft.com/office/drawing/2016/5/11/chartex" xmlns:cx6="http://schemas.microsoft.com/office/drawing/2016/5/12/chartex" xmlns:cx7="http://schemas.microsoft.com/office/drawing/2016/5/13/chartex" xmlns:cx8="http://schemas.microsoft.com/office/drawing/2016/5/14/chartex" xmlns:mc="http://schemas.openxmlformats.org/markup-compatibility/2006" xmlns:aink="http://schemas.microsoft.com/office/drawing/2016/ink" xmlns:am3d="http://schemas.microsoft.com/office/drawing/2017/model3d" xmlns:o="urn:schemas-microsoft-com:office:office" xmlns:r="http://schemas.openxmlformats.org/officeDocument/2006/relationships" xmlns:m="http://schemas.openxmlformats.org/officeDocument/2006/math" xmlns:v="urn:schemas-microsoft-com:vml" xmlns:wp14="http://schemas.microsoft.com/office/word/2010/wordprocessingDrawing" xmlns:wp="http://schemas.openxmlformats.org/drawingml/2006/wordprocessingDrawing" xmlns:w10="urn:schemas-microsoft-com:office:word" xmlns:w="http://schemas.openxmlformats.org/wordprocessingml/2006/main" xmlns:w14="http://schemas.microsoft.com/office/word/2010/wordml" xmlns:w15="http://schemas.microsoft.com/office/word/2012/wordml" xmlns:w16cid="http://schemas.microsoft.com/office/word/2016/wordml/cid" xmlns:w16se="http://schemas.microsoft.com/office/word/2015/wordml/symex" xmlns:wpg="http://schemas.microsoft.com/office/word/2010/wordprocessingGroup" xmlns:wpi="http://schemas.microsoft.com/office/word/2010/wordprocessingInk" xmlns:wne="http://schemas.microsoft.com/office/word/2006/wordml" xmlns:wps="http://schemas.microsoft.com/office/word/2010/wordprocessingShape" mc:Ignorable="w14 w15 w16se w16cid wp14">
+<w:footnotes xmlns:wpc="http://schemas.microsoft.com/office/word/2010/wordprocessingCanvas" xmlns:cx="http://schemas.microsoft.com/office/drawing/2014/chartex" xmlns:cx1="http://schemas.microsoft.com/office/drawing/2015/9/8/chartex" xmlns:cx2="http://schemas.microsoft.com/office/drawing/2015/10/21/chartex" xmlns:cx3="http://schemas.microsoft.com/office/drawing/2016/5/9/chartex" xmlns:cx4="http://schemas.microsoft.com/office/drawing/2016/5/10/chartex" xmlns:cx5="http://schemas.microsoft.com/office/drawing/2016/5/11/chartex" xmlns:cx6="http://schemas.microsoft.com/office/drawing/2016/5/12/chartex" xmlns:cx7="http://schemas.microsoft.com/office/drawing/2016/5/13/chartex" xmlns:cx8="http://schemas.microsoft.com/office/drawing/2016/5/14/chartex" xmlns:mc="http://schemas.openxmlformats.org/markup-compatibility/2006" xmlns:aink="http://schemas.microsoft.com/office/drawing/2016/ink" xmlns:am3d="http://schemas.microsoft.com/office/drawing/2017/model3d" xmlns:o="urn:schemas-microsoft-com:office:office" xmlns:oel="http://schemas.microsoft.com/office/2019/extlst" xmlns:r="http://schemas.openxmlformats.org/officeDocument/2006/relationships" xmlns:m="http://schemas.openxmlformats.org/officeDocument/2006/math" xmlns:v="urn:schemas-microsoft-com:vml" xmlns:wp14="http://schemas.microsoft.com/office/word/2010/wordprocessingDrawing" xmlns:wp="http://schemas.openxmlformats.org/drawingml/2006/wordprocessingDrawing" xmlns:w10="urn:schemas-microsoft-com:office:word" xmlns:w="http://schemas.openxmlformats.org/wordprocessingml/2006/main" xmlns:w14="http://schemas.microsoft.com/office/word/2010/wordml" xmlns:w15="http://schemas.microsoft.com/office/word/2012/wordml" xmlns:w16cex="http://schemas.microsoft.com/office/word/2018/wordml/cex" xmlns:w16cid="http://schemas.microsoft.com/office/word/2016/wordml/cid" xmlns:w16="http://schemas.microsoft.com/office/word/2018/wordml" xmlns:w16du="http://schemas.microsoft.com/office/word/2023/wordml/word16du" xmlns:w16sdtdh="http://schemas.microsoft.com/office/word/2020/wordml/sdtdatahash" xmlns:w16sdtfl="http://schemas.microsoft.com/office/word/2024/wordml/sdtformatlock" xmlns:w16se="http://schemas.microsoft.com/office/word/2015/wordml/symex" xmlns:wpg="http://schemas.microsoft.com/office/word/2010/wordprocessingGroup" xmlns:wpi="http://schemas.microsoft.com/office/word/2010/wordprocessingInk" xmlns:wne="http://schemas.microsoft.com/office/word/2006/wordml" xmlns:wps="http://schemas.microsoft.com/office/word/2010/wordprocessingShape" mc:Ignorable="w14 w15 w16se w16cid w16 w16cex w16sdtdh w16sdtfl w16du wp14">
   <w:footnote w:type="separator" w:id="-1">
     <w:p>
       <w:r>
@@ -3074,7 +5653,7 @@
 </file>
 
 <file path=word/header1.xml><?xml version="1.0" encoding="utf-8"?>
-<w:hdr xmlns:wpc="http://schemas.microsoft.com/office/word/2010/wordprocessingCanvas" xmlns:cx="http://schemas.microsoft.com/office/drawing/2014/chartex" xmlns:cx1="http://schemas.microsoft.com/office/drawing/2015/9/8/chartex" xmlns:cx2="http://schemas.microsoft.com/office/drawing/2015/10/21/chartex" xmlns:cx3="http://schemas.microsoft.com/office/drawing/2016/5/9/chartex" xmlns:cx4="http://schemas.microsoft.com/office/drawing/2016/5/10/chartex" xmlns:cx5="http://schemas.microsoft.com/office/drawing/2016/5/11/chartex" xmlns:cx6="http://schemas.microsoft.com/office/drawing/2016/5/12/chartex" xmlns:cx7="http://schemas.microsoft.com/office/drawing/2016/5/13/chartex" xmlns:cx8="http://schemas.microsoft.com/office/drawing/2016/5/14/chartex" xmlns:mc="http://schemas.openxmlformats.org/markup-compatibility/2006" xmlns:aink="http://schemas.microsoft.com/office/drawing/2016/ink" xmlns:am3d="http://schemas.microsoft.com/office/drawing/2017/model3d" xmlns:o="urn:schemas-microsoft-com:office:office" xmlns:r="http://schemas.openxmlformats.org/officeDocument/2006/relationships" xmlns:m="http://schemas.openxmlformats.org/officeDocument/2006/math" xmlns:v="urn:schemas-microsoft-com:vml" xmlns:wp14="http://schemas.microsoft.com/office/word/2010/wordprocessingDrawing" xmlns:wp="http://schemas.openxmlformats.org/drawingml/2006/wordprocessingDrawing" xmlns:w10="urn:schemas-microsoft-com:office:word" xmlns:w="http://schemas.openxmlformats.org/wordprocessingml/2006/main" xmlns:w14="http://schemas.microsoft.com/office/word/2010/wordml" xmlns:w15="http://schemas.microsoft.com/office/word/2012/wordml" xmlns:w16cid="http://schemas.microsoft.com/office/word/2016/wordml/cid" xmlns:w16se="http://schemas.microsoft.com/office/word/2015/wordml/symex" xmlns:wpg="http://schemas.microsoft.com/office/word/2010/wordprocessingGroup" xmlns:wpi="http://schemas.microsoft.com/office/word/2010/wordprocessingInk" xmlns:wne="http://schemas.microsoft.com/office/word/2006/wordml" xmlns:wps="http://schemas.microsoft.com/office/word/2010/wordprocessingShape" mc:Ignorable="w14 w15 w16se w16cid wp14">
+<w:hdr xmlns:wpc="http://schemas.microsoft.com/office/word/2010/wordprocessingCanvas" xmlns:cx="http://schemas.microsoft.com/office/drawing/2014/chartex" xmlns:cx1="http://schemas.microsoft.com/office/drawing/2015/9/8/chartex" xmlns:cx2="http://schemas.microsoft.com/office/drawing/2015/10/21/chartex" xmlns:cx3="http://schemas.microsoft.com/office/drawing/2016/5/9/chartex" xmlns:cx4="http://schemas.microsoft.com/office/drawing/2016/5/10/chartex" xmlns:cx5="http://schemas.microsoft.com/office/drawing/2016/5/11/chartex" xmlns:cx6="http://schemas.microsoft.com/office/drawing/2016/5/12/chartex" xmlns:cx7="http://schemas.microsoft.com/office/drawing/2016/5/13/chartex" xmlns:cx8="http://schemas.microsoft.com/office/drawing/2016/5/14/chartex" xmlns:mc="http://schemas.openxmlformats.org/markup-compatibility/2006" xmlns:aink="http://schemas.microsoft.com/office/drawing/2016/ink" xmlns:am3d="http://schemas.microsoft.com/office/drawing/2017/model3d" xmlns:o="urn:schemas-microsoft-com:office:office" xmlns:oel="http://schemas.microsoft.com/office/2019/extlst" xmlns:r="http://schemas.openxmlformats.org/officeDocument/2006/relationships" xmlns:m="http://schemas.openxmlformats.org/officeDocument/2006/math" xmlns:v="urn:schemas-microsoft-com:vml" xmlns:wp14="http://schemas.microsoft.com/office/word/2010/wordprocessingDrawing" xmlns:wp="http://schemas.openxmlformats.org/drawingml/2006/wordprocessingDrawing" xmlns:w10="urn:schemas-microsoft-com:office:word" xmlns:w="http://schemas.openxmlformats.org/wordprocessingml/2006/main" xmlns:w14="http://schemas.microsoft.com/office/word/2010/wordml" xmlns:w15="http://schemas.microsoft.com/office/word/2012/wordml" xmlns:w16cex="http://schemas.microsoft.com/office/word/2018/wordml/cex" xmlns:w16cid="http://schemas.microsoft.com/office/word/2016/wordml/cid" xmlns:w16="http://schemas.microsoft.com/office/word/2018/wordml" xmlns:w16du="http://schemas.microsoft.com/office/word/2023/wordml/word16du" xmlns:w16sdtdh="http://schemas.microsoft.com/office/word/2020/wordml/sdtdatahash" xmlns:w16sdtfl="http://schemas.microsoft.com/office/word/2024/wordml/sdtformatlock" xmlns:w16se="http://schemas.microsoft.com/office/word/2015/wordml/symex" xmlns:wpg="http://schemas.microsoft.com/office/word/2010/wordprocessingGroup" xmlns:wpi="http://schemas.microsoft.com/office/word/2010/wordprocessingInk" xmlns:wne="http://schemas.microsoft.com/office/word/2006/wordml" xmlns:wps="http://schemas.microsoft.com/office/word/2010/wordprocessingShape" mc:Ignorable="w14 w15 w16se w16cid w16 w16cex w16sdtdh w16sdtfl w16du wp14">
   <w:p>
     <w:r>
       <w:rPr>
@@ -3290,7 +5869,7 @@
               <v:stroke joinstyle="miter"/>
               <v:path gradientshapeok="t" o:connecttype="rect"/>
             </v:shapetype>
-            <v:shape id="Text Box 2" o:spid="_x0000_s1026" type="#_x0000_t202" style="position:absolute;margin-left:0;margin-top:.85pt;width:79.5pt;height:55.65pt;z-index:251659264;visibility:visible;mso-wrap-style:square;mso-width-percent:0;mso-height-percent:0;mso-wrap-distance-left:9pt;mso-wrap-distance-top:0;mso-wrap-distance-right:9pt;mso-wrap-distance-bottom:0;mso-position-horizontal:left;mso-position-horizontal-relative:margin;mso-position-vertical:absolute;mso-position-vertical-relative:text;mso-width-percent:0;mso-height-percent:0;mso-width-relative:page;mso-height-relative:page;v-text-anchor:top" o:gfxdata="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" filled="f" stroked="f">
+            <v:shape id="Text Box 2" o:spid="_x0000_s1026" type="#_x0000_t202" style="position:absolute;margin-left:0;margin-top:.85pt;width:79.5pt;height:55.65pt;z-index:251659264;visibility:visible;mso-wrap-style:square;mso-width-percent:0;mso-height-percent:0;mso-wrap-distance-left:9pt;mso-wrap-distance-top:0;mso-wrap-distance-right:9pt;mso-wrap-distance-bottom:0;mso-position-horizontal:left;mso-position-horizontal-relative:margin;mso-position-vertical:absolute;mso-position-vertical-relative:text;mso-width-percent:0;mso-height-percent:0;mso-width-relative:page;mso-height-relative:page;v-text-anchor:top" o:gfxdata="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" filled="f" stroked="f">
               <v:textbox>
                 <w:txbxContent>
                   <w:p>
@@ -3549,7 +6128,6 @@
         </w:rPr>
         <w:id w:val="1982649043"/>
       </w:sdtPr>
-      <w:sdtEndPr/>
       <w:sdtContent>
         <w:r>
           <w:rPr>
@@ -3581,7 +6159,6 @@
         </w:rPr>
         <w:id w:val="1450979425"/>
       </w:sdtPr>
-      <w:sdtEndPr/>
       <w:sdtContent>
         <w:r>
           <w:rPr>
@@ -3613,7 +6190,7 @@
 </file>
 
 <file path=word/numbering.xml><?xml version="1.0" encoding="utf-8"?>
-<w:numbering xmlns:wpc="http://schemas.microsoft.com/office/word/2010/wordprocessingCanvas" xmlns:cx="http://schemas.microsoft.com/office/drawing/2014/chartex" xmlns:cx1="http://schemas.microsoft.com/office/drawing/2015/9/8/chartex" xmlns:cx2="http://schemas.microsoft.com/office/drawing/2015/10/21/chartex" xmlns:cx3="http://schemas.microsoft.com/office/drawing/2016/5/9/chartex" xmlns:cx4="http://schemas.microsoft.com/office/drawing/2016/5/10/chartex" xmlns:cx5="http://schemas.microsoft.com/office/drawing/2016/5/11/chartex" xmlns:cx6="http://schemas.microsoft.com/office/drawing/2016/5/12/chartex" xmlns:cx7="http://schemas.microsoft.com/office/drawing/2016/5/13/chartex" xmlns:cx8="http://schemas.microsoft.com/office/drawing/2016/5/14/chartex" xmlns:mc="http://schemas.openxmlformats.org/markup-compatibility/2006" xmlns:aink="http://schemas.microsoft.com/office/drawing/2016/ink" xmlns:am3d="http://schemas.microsoft.com/office/drawing/2017/model3d" xmlns:o="urn:schemas-microsoft-com:office:office" xmlns:r="http://schemas.openxmlformats.org/officeDocument/2006/relationships" xmlns:m="http://schemas.openxmlformats.org/officeDocument/2006/math" xmlns:v="urn:schemas-microsoft-com:vml" xmlns:wp14="http://schemas.microsoft.com/office/word/2010/wordprocessingDrawing" xmlns:wp="http://schemas.openxmlformats.org/drawingml/2006/wordprocessingDrawing" xmlns:w10="urn:schemas-microsoft-com:office:word" xmlns:w="http://schemas.openxmlformats.org/wordprocessingml/2006/main" xmlns:w14="http://schemas.microsoft.com/office/word/2010/wordml" xmlns:w15="http://schemas.microsoft.com/office/word/2012/wordml" xmlns:w16cid="http://schemas.microsoft.com/office/word/2016/wordml/cid" xmlns:w16se="http://schemas.microsoft.com/office/word/2015/wordml/symex" xmlns:wpg="http://schemas.microsoft.com/office/word/2010/wordprocessingGroup" xmlns:wpi="http://schemas.microsoft.com/office/word/2010/wordprocessingInk" xmlns:wne="http://schemas.microsoft.com/office/word/2006/wordml" xmlns:wps="http://schemas.microsoft.com/office/word/2010/wordprocessingShape" mc:Ignorable="w14 w15 w16se w16cid wp14">
+<w:numbering xmlns:wpc="http://schemas.microsoft.com/office/word/2010/wordprocessingCanvas" xmlns:cx="http://schemas.microsoft.com/office/drawing/2014/chartex" xmlns:cx1="http://schemas.microsoft.com/office/drawing/2015/9/8/chartex" xmlns:cx2="http://schemas.microsoft.com/office/drawing/2015/10/21/chartex" xmlns:cx3="http://schemas.microsoft.com/office/drawing/2016/5/9/chartex" xmlns:cx4="http://schemas.microsoft.com/office/drawing/2016/5/10/chartex" xmlns:cx5="http://schemas.microsoft.com/office/drawing/2016/5/11/chartex" xmlns:cx6="http://schemas.microsoft.com/office/drawing/2016/5/12/chartex" xmlns:cx7="http://schemas.microsoft.com/office/drawing/2016/5/13/chartex" xmlns:cx8="http://schemas.microsoft.com/office/drawing/2016/5/14/chartex" xmlns:mc="http://schemas.openxmlformats.org/markup-compatibility/2006" xmlns:aink="http://schemas.microsoft.com/office/drawing/2016/ink" xmlns:am3d="http://schemas.microsoft.com/office/drawing/2017/model3d" xmlns:o="urn:schemas-microsoft-com:office:office" xmlns:oel="http://schemas.microsoft.com/office/2019/extlst" xmlns:r="http://schemas.openxmlformats.org/officeDocument/2006/relationships" xmlns:m="http://schemas.openxmlformats.org/officeDocument/2006/math" xmlns:v="urn:schemas-microsoft-com:vml" xmlns:wp14="http://schemas.microsoft.com/office/word/2010/wordprocessingDrawing" xmlns:wp="http://schemas.openxmlformats.org/drawingml/2006/wordprocessingDrawing" xmlns:w10="urn:schemas-microsoft-com:office:word" xmlns:w="http://schemas.openxmlformats.org/wordprocessingml/2006/main" xmlns:w14="http://schemas.microsoft.com/office/word/2010/wordml" xmlns:w15="http://schemas.microsoft.com/office/word/2012/wordml" xmlns:w16cex="http://schemas.microsoft.com/office/word/2018/wordml/cex" xmlns:w16cid="http://schemas.microsoft.com/office/word/2016/wordml/cid" xmlns:w16="http://schemas.microsoft.com/office/word/2018/wordml" xmlns:w16du="http://schemas.microsoft.com/office/word/2023/wordml/word16du" xmlns:w16sdtdh="http://schemas.microsoft.com/office/word/2020/wordml/sdtdatahash" xmlns:w16sdtfl="http://schemas.microsoft.com/office/word/2024/wordml/sdtformatlock" xmlns:w16se="http://schemas.microsoft.com/office/word/2015/wordml/symex" xmlns:wpg="http://schemas.microsoft.com/office/word/2010/wordprocessingGroup" xmlns:wpi="http://schemas.microsoft.com/office/word/2010/wordprocessingInk" xmlns:wne="http://schemas.microsoft.com/office/word/2006/wordml" xmlns:wps="http://schemas.microsoft.com/office/word/2010/wordprocessingShape" mc:Ignorable="w14 w15 w16se w16cid w16 w16cex w16sdtdh w16sdtfl w16du wp14">
   <w:abstractNum w:abstractNumId="0" w15:restartNumberingAfterBreak="0">
     <w:nsid w:val="05E002ED"/>
     <w:multiLevelType w:val="hybridMultilevel"/>
@@ -4608,6 +7185,119 @@
     </w:lvl>
   </w:abstractNum>
   <w:abstractNum w:abstractNumId="9" w15:restartNumberingAfterBreak="0">
+    <w:nsid w:val="46317DA9"/>
+    <w:multiLevelType w:val="hybridMultilevel"/>
+    <w:tmpl w:val="7A06990C"/>
+    <w:lvl w:ilvl="0" w:tplc="E55A4188">
+      <w:start w:val="1"/>
+      <w:numFmt w:val="bullet"/>
+      <w:lvlText w:val="-"/>
+      <w:lvlJc w:val="left"/>
+      <w:pPr>
+        <w:ind w:left="720" w:hanging="360"/>
+      </w:pPr>
+      <w:rPr>
+        <w:rFonts w:ascii="Calibri" w:eastAsia="DengXian" w:hAnsi="Calibri" w:cs="Calibri" w:hint="default"/>
+      </w:rPr>
+    </w:lvl>
+    <w:lvl w:ilvl="1" w:tplc="04090003" w:tentative="1">
+      <w:start w:val="1"/>
+      <w:numFmt w:val="bullet"/>
+      <w:lvlText w:val="o"/>
+      <w:lvlJc w:val="left"/>
+      <w:pPr>
+        <w:ind w:left="1440" w:hanging="360"/>
+      </w:pPr>
+      <w:rPr>
+        <w:rFonts w:ascii="Courier New" w:hAnsi="Courier New" w:cs="Courier New" w:hint="default"/>
+      </w:rPr>
+    </w:lvl>
+    <w:lvl w:ilvl="2" w:tplc="04090005" w:tentative="1">
+      <w:start w:val="1"/>
+      <w:numFmt w:val="bullet"/>
+      <w:lvlText w:val=""/>
+      <w:lvlJc w:val="left"/>
+      <w:pPr>
+        <w:ind w:left="2160" w:hanging="360"/>
+      </w:pPr>
+      <w:rPr>
+        <w:rFonts w:ascii="Wingdings" w:hAnsi="Wingdings" w:hint="default"/>
+      </w:rPr>
+    </w:lvl>
+    <w:lvl w:ilvl="3" w:tplc="04090001" w:tentative="1">
+      <w:start w:val="1"/>
+      <w:numFmt w:val="bullet"/>
+      <w:lvlText w:val=""/>
+      <w:lvlJc w:val="left"/>
+      <w:pPr>
+        <w:ind w:left="2880" w:hanging="360"/>
+      </w:pPr>
+      <w:rPr>
+        <w:rFonts w:ascii="Symbol" w:hAnsi="Symbol" w:hint="default"/>
+      </w:rPr>
+    </w:lvl>
+    <w:lvl w:ilvl="4" w:tplc="04090003" w:tentative="1">
+      <w:start w:val="1"/>
+      <w:numFmt w:val="bullet"/>
+      <w:lvlText w:val="o"/>
+      <w:lvlJc w:val="left"/>
+      <w:pPr>
+        <w:ind w:left="3600" w:hanging="360"/>
+      </w:pPr>
+      <w:rPr>
+        <w:rFonts w:ascii="Courier New" w:hAnsi="Courier New" w:cs="Courier New" w:hint="default"/>
+      </w:rPr>
+    </w:lvl>
+    <w:lvl w:ilvl="5" w:tplc="04090005" w:tentative="1">
+      <w:start w:val="1"/>
+      <w:numFmt w:val="bullet"/>
+      <w:lvlText w:val=""/>
+      <w:lvlJc w:val="left"/>
+      <w:pPr>
+        <w:ind w:left="4320" w:hanging="360"/>
+      </w:pPr>
+      <w:rPr>
+        <w:rFonts w:ascii="Wingdings" w:hAnsi="Wingdings" w:hint="default"/>
+      </w:rPr>
+    </w:lvl>
+    <w:lvl w:ilvl="6" w:tplc="04090001" w:tentative="1">
+      <w:start w:val="1"/>
+      <w:numFmt w:val="bullet"/>
+      <w:lvlText w:val=""/>
+      <w:lvlJc w:val="left"/>
+      <w:pPr>
+        <w:ind w:left="5040" w:hanging="360"/>
+      </w:pPr>
+      <w:rPr>
+        <w:rFonts w:ascii="Symbol" w:hAnsi="Symbol" w:hint="default"/>
+      </w:rPr>
+    </w:lvl>
+    <w:lvl w:ilvl="7" w:tplc="04090003" w:tentative="1">
+      <w:start w:val="1"/>
+      <w:numFmt w:val="bullet"/>
+      <w:lvlText w:val="o"/>
+      <w:lvlJc w:val="left"/>
+      <w:pPr>
+        <w:ind w:left="5760" w:hanging="360"/>
+      </w:pPr>
+      <w:rPr>
+        <w:rFonts w:ascii="Courier New" w:hAnsi="Courier New" w:cs="Courier New" w:hint="default"/>
+      </w:rPr>
+    </w:lvl>
+    <w:lvl w:ilvl="8" w:tplc="04090005" w:tentative="1">
+      <w:start w:val="1"/>
+      <w:numFmt w:val="bullet"/>
+      <w:lvlText w:val=""/>
+      <w:lvlJc w:val="left"/>
+      <w:pPr>
+        <w:ind w:left="6480" w:hanging="360"/>
+      </w:pPr>
+      <w:rPr>
+        <w:rFonts w:ascii="Wingdings" w:hAnsi="Wingdings" w:hint="default"/>
+      </w:rPr>
+    </w:lvl>
+  </w:abstractNum>
+  <w:abstractNum w:abstractNumId="10" w15:restartNumberingAfterBreak="0">
     <w:nsid w:val="49D24EE0"/>
     <w:multiLevelType w:val="hybridMultilevel"/>
     <w:tmpl w:val="6D747F0A"/>
@@ -4720,7 +7410,7 @@
       </w:rPr>
     </w:lvl>
   </w:abstractNum>
-  <w:abstractNum w:abstractNumId="10" w15:restartNumberingAfterBreak="0">
+  <w:abstractNum w:abstractNumId="11" w15:restartNumberingAfterBreak="0">
     <w:nsid w:val="4AD92797"/>
     <w:multiLevelType w:val="hybridMultilevel"/>
     <w:tmpl w:val="289891D0"/>
@@ -4832,7 +7522,7 @@
       </w:rPr>
     </w:lvl>
   </w:abstractNum>
-  <w:abstractNum w:abstractNumId="11" w15:restartNumberingAfterBreak="0">
+  <w:abstractNum w:abstractNumId="12" w15:restartNumberingAfterBreak="0">
     <w:nsid w:val="632A0681"/>
     <w:multiLevelType w:val="hybridMultilevel"/>
     <w:tmpl w:val="3FBEA960"/>
@@ -4921,7 +7611,7 @@
       </w:pPr>
     </w:lvl>
   </w:abstractNum>
-  <w:abstractNum w:abstractNumId="12" w15:restartNumberingAfterBreak="0">
+  <w:abstractNum w:abstractNumId="13" w15:restartNumberingAfterBreak="0">
     <w:nsid w:val="663831A6"/>
     <w:multiLevelType w:val="hybridMultilevel"/>
     <w:tmpl w:val="F6CE0124"/>
@@ -5010,7 +7700,7 @@
       </w:pPr>
     </w:lvl>
   </w:abstractNum>
-  <w:abstractNum w:abstractNumId="13" w15:restartNumberingAfterBreak="0">
+  <w:abstractNum w:abstractNumId="14" w15:restartNumberingAfterBreak="0">
     <w:nsid w:val="6E796970"/>
     <w:multiLevelType w:val="hybridMultilevel"/>
     <w:tmpl w:val="6122DC30"/>
@@ -5123,7 +7813,7 @@
       </w:rPr>
     </w:lvl>
   </w:abstractNum>
-  <w:abstractNum w:abstractNumId="14" w15:restartNumberingAfterBreak="0">
+  <w:abstractNum w:abstractNumId="15" w15:restartNumberingAfterBreak="0">
     <w:nsid w:val="79103937"/>
     <w:multiLevelType w:val="hybridMultilevel"/>
     <w:tmpl w:val="E782E7CC"/>
@@ -5236,32 +7926,32 @@
       </w:rPr>
     </w:lvl>
   </w:abstractNum>
-  <w:num w:numId="1">
+  <w:num w:numId="1" w16cid:durableId="1001851225">
+    <w:abstractNumId w:val="11"/>
+  </w:num>
+  <w:num w:numId="2" w16cid:durableId="1400131029">
+    <w:abstractNumId w:val="6"/>
+  </w:num>
+  <w:num w:numId="3" w16cid:durableId="2085637143">
+    <w:abstractNumId w:val="4"/>
+  </w:num>
+  <w:num w:numId="4" w16cid:durableId="1547327939">
+    <w:abstractNumId w:val="8"/>
+  </w:num>
+  <w:num w:numId="5" w16cid:durableId="1140223335">
+    <w:abstractNumId w:val="2"/>
+  </w:num>
+  <w:num w:numId="6" w16cid:durableId="1421103290">
+    <w:abstractNumId w:val="7"/>
+  </w:num>
+  <w:num w:numId="7" w16cid:durableId="2132630224">
+    <w:abstractNumId w:val="3"/>
+  </w:num>
+  <w:num w:numId="8" w16cid:durableId="1051807515">
     <w:abstractNumId w:val="10"/>
   </w:num>
-  <w:num w:numId="2">
-    <w:abstractNumId w:val="6"/>
-  </w:num>
-  <w:num w:numId="3">
-    <w:abstractNumId w:val="4"/>
-  </w:num>
-  <w:num w:numId="4">
-    <w:abstractNumId w:val="8"/>
-  </w:num>
-  <w:num w:numId="5">
-    <w:abstractNumId w:val="2"/>
-  </w:num>
-  <w:num w:numId="6">
-    <w:abstractNumId w:val="7"/>
-  </w:num>
-  <w:num w:numId="7">
-    <w:abstractNumId w:val="3"/>
-  </w:num>
-  <w:num w:numId="8">
-    <w:abstractNumId w:val="9"/>
-  </w:num>
-  <w:num w:numId="9">
-    <w:abstractNumId w:val="11"/>
+  <w:num w:numId="9" w16cid:durableId="1306007011">
+    <w:abstractNumId w:val="12"/>
     <w:lvlOverride w:ilvl="0"/>
     <w:lvlOverride w:ilvl="1">
       <w:startOverride w:val="1"/>
@@ -5288,7 +7978,7 @@
       <w:startOverride w:val="1"/>
     </w:lvlOverride>
   </w:num>
-  <w:num w:numId="10">
+  <w:num w:numId="10" w16cid:durableId="1057968576">
     <w:abstractNumId w:val="0"/>
     <w:lvlOverride w:ilvl="0"/>
     <w:lvlOverride w:ilvl="1">
@@ -5316,8 +8006,8 @@
       <w:startOverride w:val="1"/>
     </w:lvlOverride>
   </w:num>
-  <w:num w:numId="11">
-    <w:abstractNumId w:val="12"/>
+  <w:num w:numId="11" w16cid:durableId="809635210">
+    <w:abstractNumId w:val="13"/>
     <w:lvlOverride w:ilvl="0"/>
     <w:lvlOverride w:ilvl="1">
       <w:startOverride w:val="1"/>
@@ -5344,27 +8034,30 @@
       <w:startOverride w:val="1"/>
     </w:lvlOverride>
   </w:num>
-  <w:num w:numId="12">
+  <w:num w:numId="12" w16cid:durableId="1729111954">
     <w:abstractNumId w:val="0"/>
   </w:num>
-  <w:num w:numId="13">
+  <w:num w:numId="13" w16cid:durableId="941494053">
+    <w:abstractNumId w:val="15"/>
+  </w:num>
+  <w:num w:numId="14" w16cid:durableId="914897466">
+    <w:abstractNumId w:val="1"/>
+  </w:num>
+  <w:num w:numId="15" w16cid:durableId="965699858">
+    <w:abstractNumId w:val="5"/>
+  </w:num>
+  <w:num w:numId="16" w16cid:durableId="882249452">
     <w:abstractNumId w:val="14"/>
   </w:num>
-  <w:num w:numId="14">
-    <w:abstractNumId w:val="1"/>
-  </w:num>
-  <w:num w:numId="15">
-    <w:abstractNumId w:val="5"/>
-  </w:num>
-  <w:num w:numId="16">
-    <w:abstractNumId w:val="13"/>
+  <w:num w:numId="17" w16cid:durableId="1172258966">
+    <w:abstractNumId w:val="9"/>
   </w:num>
   <w:numIdMacAtCleanup w:val="8"/>
 </w:numbering>
 </file>
 
 <file path=word/styles.xml><?xml version="1.0" encoding="utf-8"?>
-<w:styles xmlns:mc="http://schemas.openxmlformats.org/markup-compatibility/2006" xmlns:r="http://schemas.openxmlformats.org/officeDocument/2006/relationships" xmlns:w="http://schemas.openxmlformats.org/wordprocessingml/2006/main" xmlns:w14="http://schemas.microsoft.com/office/word/2010/wordml" xmlns:w15="http://schemas.microsoft.com/office/word/2012/wordml" xmlns:w16cid="http://schemas.microsoft.com/office/word/2016/wordml/cid" xmlns:w16se="http://schemas.microsoft.com/office/word/2015/wordml/symex" mc:Ignorable="w14 w15 w16se w16cid">
+<w:styles xmlns:mc="http://schemas.openxmlformats.org/markup-compatibility/2006" xmlns:r="http://schemas.openxmlformats.org/officeDocument/2006/relationships" xmlns:w="http://schemas.openxmlformats.org/wordprocessingml/2006/main" xmlns:w14="http://schemas.microsoft.com/office/word/2010/wordml" xmlns:w15="http://schemas.microsoft.com/office/word/2012/wordml" xmlns:w16cex="http://schemas.microsoft.com/office/word/2018/wordml/cex" xmlns:w16cid="http://schemas.microsoft.com/office/word/2016/wordml/cid" xmlns:w16="http://schemas.microsoft.com/office/word/2018/wordml" xmlns:w16du="http://schemas.microsoft.com/office/word/2023/wordml/word16du" xmlns:w16sdtdh="http://schemas.microsoft.com/office/word/2020/wordml/sdtdatahash" xmlns:w16sdtfl="http://schemas.microsoft.com/office/word/2024/wordml/sdtformatlock" xmlns:w16se="http://schemas.microsoft.com/office/word/2015/wordml/symex" mc:Ignorable="w14 w15 w16se w16cid w16 w16cex w16sdtdh w16sdtfl w16du">
   <w:docDefaults>
     <w:rPrDefault>
       <w:rPr>
@@ -5374,7 +8067,7 @@
     </w:rPrDefault>
     <w:pPrDefault/>
   </w:docDefaults>
-  <w:latentStyles w:defLockedState="0" w:defUIPriority="99" w:defSemiHidden="0" w:defUnhideWhenUsed="0" w:defQFormat="0" w:count="375">
+  <w:latentStyles w:defLockedState="0" w:defUIPriority="99" w:defSemiHidden="0" w:defUnhideWhenUsed="0" w:defQFormat="0" w:count="376">
     <w:lsdException w:name="Normal" w:uiPriority="0" w:qFormat="1"/>
     <w:lsdException w:name="heading 1" w:uiPriority="9"/>
     <w:lsdException w:name="heading 2" w:uiPriority="9"/>
@@ -5750,6 +8443,7 @@
     <w:lsdException w:name="Smart Hyperlink" w:semiHidden="1" w:unhideWhenUsed="1"/>
     <w:lsdException w:name="Hashtag" w:semiHidden="1" w:unhideWhenUsed="1"/>
     <w:lsdException w:name="Unresolved Mention" w:semiHidden="1" w:unhideWhenUsed="1"/>
+    <w:lsdException w:name="Smart Link" w:semiHidden="1" w:unhideWhenUsed="1"/>
   </w:latentStyles>
   <w:style w:type="paragraph" w:default="1" w:styleId="Normal">
     <w:name w:val="Normal"/>
@@ -5886,7 +8580,6 @@
   <w:style w:type="character" w:default="1" w:styleId="DefaultParagraphFont">
     <w:name w:val="Default Paragraph Font"/>
     <w:uiPriority w:val="1"/>
-    <w:semiHidden/>
     <w:unhideWhenUsed/>
   </w:style>
   <w:style w:type="table" w:default="1" w:styleId="TableNormal">
@@ -6636,12 +9329,35 @@
 </file>
 
 <file path=customXml/item3.xml><?xml version="1.0" encoding="utf-8"?>
+<Fcrs180_1XMLNode xmlns="CRS180_1">
+  <OthBox/>
+</Fcrs180_1XMLNode>
+</file>
+
+<file path=customXml/item4.xml><?xml version="1.0" encoding="utf-8"?>
 <Fcrs180_5XMLNode xmlns="CRS180_5">
   <AssessTypeR>Portfolio</AssessTypeR>
 </Fcrs180_5XMLNode>
 </file>
 
-<file path=customXml/item4.xml><?xml version="1.0" encoding="utf-8"?>
+<file path=customXml/item5.xml><?xml version="1.0" encoding="utf-8"?>
+<Fcrs180_4XMLNode xmlns="CRS180_4">
+  <DeptName>BDIT, Computer and Information Technology</DeptName>
+</Fcrs180_4XMLNode>
+</file>
+
+<file path=customXml/item6.xml><?xml version="1.0" encoding="utf-8"?>
+<b:Sources xmlns:b="http://schemas.openxmlformats.org/officeDocument/2006/bibliography" xmlns="http://schemas.openxmlformats.org/officeDocument/2006/bibliography" SelectedStyle="\APASixthEditionOfficeOnline.xsl" StyleName="APA" Version="6"/>
+</file>
+
+<file path=customXml/item7.xml><?xml version="1.0" encoding="utf-8"?>
+<Fcrs180_3XMLNode xmlns="CRS180_3">
+  <StName/>
+  <StID/>
+</Fcrs180_3XMLNode>
+</file>
+
+<file path=customXml/item8.xml><?xml version="1.0" encoding="utf-8"?>
 <Fcrs180XMLNode xmlns="CRS180">
   <SName/>
   <SID/>
@@ -6655,29 +9371,6 @@
   <SInstruct/>
   <AssessCon/>
 </Fcrs180XMLNode>
-</file>
-
-<file path=customXml/item5.xml><?xml version="1.0" encoding="utf-8"?>
-<Fcrs180_4XMLNode xmlns="CRS180_4">
-  <DeptName>BDIT, Computer and Information Technology</DeptName>
-</Fcrs180_4XMLNode>
-</file>
-
-<file path=customXml/item6.xml><?xml version="1.0" encoding="utf-8"?>
-<Fcrs180_3XMLNode xmlns="CRS180_3">
-  <StName/>
-  <StID/>
-</Fcrs180_3XMLNode>
-</file>
-
-<file path=customXml/item7.xml><?xml version="1.0" encoding="utf-8"?>
-<Fcrs180_1XMLNode xmlns="CRS180_1">
-  <OthBox/>
-</Fcrs180_1XMLNode>
-</file>
-
-<file path=customXml/item8.xml><?xml version="1.0" encoding="utf-8"?>
-<b:Sources xmlns:b="http://schemas.openxmlformats.org/officeDocument/2006/bibliography" xmlns="http://schemas.openxmlformats.org/officeDocument/2006/bibliography" SelectedStyle="\APASixthEditionOfficeOnline.xsl" StyleName="APA" Version="6"/>
 </file>
 
 <file path=customXml/itemProps1.xml><?xml version="1.0" encoding="utf-8"?>
@@ -6697,17 +9390,17 @@
 </file>
 
 <file path=customXml/itemProps3.xml><?xml version="1.0" encoding="utf-8"?>
-<ds:datastoreItem xmlns:ds="http://schemas.openxmlformats.org/officeDocument/2006/customXml" ds:itemID="{8EEE6C64-7878-4D06-B4F9-6A63DFC5E605}">
+<ds:datastoreItem xmlns:ds="http://schemas.openxmlformats.org/officeDocument/2006/customXml" ds:itemID="{93E8A757-17F0-4CC7-B32F-5C21CEC8E169}">
   <ds:schemaRefs>
-    <ds:schemaRef ds:uri="CRS180_5"/>
+    <ds:schemaRef ds:uri="CRS180_1"/>
   </ds:schemaRefs>
 </ds:datastoreItem>
 </file>
 
 <file path=customXml/itemProps4.xml><?xml version="1.0" encoding="utf-8"?>
-<ds:datastoreItem xmlns:ds="http://schemas.openxmlformats.org/officeDocument/2006/customXml" ds:itemID="{AEAA7968-AA76-4AEA-864E-618A3CDCDA91}">
+<ds:datastoreItem xmlns:ds="http://schemas.openxmlformats.org/officeDocument/2006/customXml" ds:itemID="{8EEE6C64-7878-4D06-B4F9-6A63DFC5E605}">
   <ds:schemaRefs>
-    <ds:schemaRef ds:uri="CRS180"/>
+    <ds:schemaRef ds:uri="CRS180_5"/>
   </ds:schemaRefs>
 </ds:datastoreItem>
 </file>
@@ -6721,6 +9414,14 @@
 </file>
 
 <file path=customXml/itemProps6.xml><?xml version="1.0" encoding="utf-8"?>
+<ds:datastoreItem xmlns:ds="http://schemas.openxmlformats.org/officeDocument/2006/customXml" ds:itemID="{392E2E1B-4130-4A3D-95D1-D081C7832F04}">
+  <ds:schemaRefs>
+    <ds:schemaRef ds:uri="http://schemas.openxmlformats.org/officeDocument/2006/bibliography"/>
+  </ds:schemaRefs>
+</ds:datastoreItem>
+</file>
+
+<file path=customXml/itemProps7.xml><?xml version="1.0" encoding="utf-8"?>
 <ds:datastoreItem xmlns:ds="http://schemas.openxmlformats.org/officeDocument/2006/customXml" ds:itemID="{EADE9EF3-1304-43E5-9865-7510817D635D}">
   <ds:schemaRefs>
     <ds:schemaRef ds:uri="CRS180_3"/>
@@ -6728,18 +9429,10 @@
 </ds:datastoreItem>
 </file>
 
-<file path=customXml/itemProps7.xml><?xml version="1.0" encoding="utf-8"?>
-<ds:datastoreItem xmlns:ds="http://schemas.openxmlformats.org/officeDocument/2006/customXml" ds:itemID="{93E8A757-17F0-4CC7-B32F-5C21CEC8E169}">
+<file path=customXml/itemProps8.xml><?xml version="1.0" encoding="utf-8"?>
+<ds:datastoreItem xmlns:ds="http://schemas.openxmlformats.org/officeDocument/2006/customXml" ds:itemID="{AEAA7968-AA76-4AEA-864E-618A3CDCDA91}">
   <ds:schemaRefs>
-    <ds:schemaRef ds:uri="CRS180_1"/>
-  </ds:schemaRefs>
-</ds:datastoreItem>
-</file>
-
-<file path=customXml/itemProps8.xml><?xml version="1.0" encoding="utf-8"?>
-<ds:datastoreItem xmlns:ds="http://schemas.openxmlformats.org/officeDocument/2006/customXml" ds:itemID="{392E2E1B-4130-4A3D-95D1-D081C7832F04}">
-  <ds:schemaRefs>
-    <ds:schemaRef ds:uri="http://schemas.openxmlformats.org/officeDocument/2006/bibliography"/>
+    <ds:schemaRef ds:uri="CRS180"/>
   </ds:schemaRefs>
 </ds:datastoreItem>
 </file>
</xml_diff>

<commit_message>
Update Assessment 2 C#
</commit_message>
<xml_diff>
--- a/C#/Assessment2/Data_Driven_Programming_AT2of2_Part1of3.docx
+++ b/C#/Assessment2/Data_Driven_Programming_AT2of2_Part1of3.docx
@@ -456,7 +456,7 @@
               </w:rPr>
               <w:lastRenderedPageBreak/>
               <w:drawing>
-                <wp:inline distT="0" distB="0" distL="0" distR="0" wp14:anchorId="719D2E6E" wp14:editId="2BC75081">
+                <wp:inline distT="0" distB="0" distL="0" distR="0" wp14:anchorId="719D2E6E" wp14:editId="501D24EF">
                   <wp:extent cx="5376301" cy="7349319"/>
                   <wp:effectExtent l="0" t="0" r="0" b="4445"/>
                   <wp:docPr id="1945363187" name="Picture 6"/>
@@ -2450,9 +2450,17 @@
               <w:rPr>
                 <w:rFonts w:ascii="Calibri" w:eastAsia="DengXian" w:hAnsi="Calibri" w:cs="Arial"/>
                 <w:sz w:val="22"/>
-                <w:lang w:eastAsia="zh-CN"/>
-              </w:rPr>
-              <w:t>Plan: Define project goals and requirements.</w:t>
+                <w:lang w:val="en-US" w:eastAsia="zh-CN"/>
+              </w:rPr>
+              <w:t>Planning</w:t>
+            </w:r>
+            <w:r>
+              <w:rPr>
+                <w:rFonts w:ascii="Calibri" w:eastAsia="DengXian" w:hAnsi="Calibri" w:cs="Arial"/>
+                <w:sz w:val="22"/>
+                <w:lang w:eastAsia="zh-CN"/>
+              </w:rPr>
+              <w:t>: Define project goals and requirements.</w:t>
             </w:r>
           </w:p>
           <w:p>
@@ -2473,9 +2481,17 @@
               <w:rPr>
                 <w:rFonts w:ascii="Calibri" w:eastAsia="DengXian" w:hAnsi="Calibri" w:cs="Arial"/>
                 <w:sz w:val="22"/>
-                <w:lang w:eastAsia="zh-CN"/>
-              </w:rPr>
-              <w:t>Design: Architect the system’s structure and user interface.</w:t>
+                <w:lang w:val="en-US" w:eastAsia="zh-CN"/>
+              </w:rPr>
+              <w:t>Design</w:t>
+            </w:r>
+            <w:r>
+              <w:rPr>
+                <w:rFonts w:ascii="Calibri" w:eastAsia="DengXian" w:hAnsi="Calibri" w:cs="Arial"/>
+                <w:sz w:val="22"/>
+                <w:lang w:eastAsia="zh-CN"/>
+              </w:rPr>
+              <w:t>: Architect the system’s structure and user interface.</w:t>
             </w:r>
           </w:p>
           <w:p>
@@ -2496,9 +2512,17 @@
               <w:rPr>
                 <w:rFonts w:ascii="Calibri" w:eastAsia="DengXian" w:hAnsi="Calibri" w:cs="Arial"/>
                 <w:sz w:val="22"/>
-                <w:lang w:eastAsia="zh-CN"/>
-              </w:rPr>
-              <w:t>Implement: Write and develop the code.</w:t>
+                <w:lang w:val="en-US" w:eastAsia="zh-CN"/>
+              </w:rPr>
+              <w:t>Coding</w:t>
+            </w:r>
+            <w:r>
+              <w:rPr>
+                <w:rFonts w:ascii="Calibri" w:eastAsia="DengXian" w:hAnsi="Calibri" w:cs="Arial"/>
+                <w:sz w:val="22"/>
+                <w:lang w:eastAsia="zh-CN"/>
+              </w:rPr>
+              <w:t>: Write and develop the code.</w:t>
             </w:r>
           </w:p>
           <w:p>
@@ -2519,9 +2543,17 @@
               <w:rPr>
                 <w:rFonts w:ascii="Calibri" w:eastAsia="DengXian" w:hAnsi="Calibri" w:cs="Arial"/>
                 <w:sz w:val="22"/>
-                <w:lang w:eastAsia="zh-CN"/>
-              </w:rPr>
-              <w:t>Test: Validate that the system works as intended.</w:t>
+                <w:lang w:val="en-US" w:eastAsia="zh-CN"/>
+              </w:rPr>
+              <w:t>Testing</w:t>
+            </w:r>
+            <w:r>
+              <w:rPr>
+                <w:rFonts w:ascii="Calibri" w:eastAsia="DengXian" w:hAnsi="Calibri" w:cs="Arial"/>
+                <w:sz w:val="22"/>
+                <w:lang w:eastAsia="zh-CN"/>
+              </w:rPr>
+              <w:t>: Validate that the system works as intended.</w:t>
             </w:r>
           </w:p>
           <w:p>
@@ -2542,9 +2574,17 @@
               <w:rPr>
                 <w:rFonts w:ascii="Calibri" w:eastAsia="DengXian" w:hAnsi="Calibri" w:cs="Arial"/>
                 <w:sz w:val="22"/>
-                <w:lang w:eastAsia="zh-CN"/>
-              </w:rPr>
-              <w:t>Deploy: Release the software to the production environment.</w:t>
+                <w:lang w:val="en-US" w:eastAsia="zh-CN"/>
+              </w:rPr>
+              <w:t>Deployment</w:t>
+            </w:r>
+            <w:r>
+              <w:rPr>
+                <w:rFonts w:ascii="Calibri" w:eastAsia="DengXian" w:hAnsi="Calibri" w:cs="Arial"/>
+                <w:sz w:val="22"/>
+                <w:lang w:eastAsia="zh-CN"/>
+              </w:rPr>
+              <w:t>: Release the software to the production environment.</w:t>
             </w:r>
           </w:p>
           <w:p>
@@ -2565,9 +2605,17 @@
               <w:rPr>
                 <w:rFonts w:ascii="Calibri" w:eastAsia="DengXian" w:hAnsi="Calibri" w:cs="Arial"/>
                 <w:sz w:val="22"/>
-                <w:lang w:eastAsia="zh-CN"/>
-              </w:rPr>
-              <w:t>Maintain: Monitor and improve the software post-deployment.</w:t>
+                <w:lang w:val="en-US" w:eastAsia="zh-CN"/>
+              </w:rPr>
+              <w:t>Maintenance</w:t>
+            </w:r>
+            <w:r>
+              <w:rPr>
+                <w:rFonts w:ascii="Calibri" w:eastAsia="DengXian" w:hAnsi="Calibri" w:cs="Arial"/>
+                <w:sz w:val="22"/>
+                <w:lang w:eastAsia="zh-CN"/>
+              </w:rPr>
+              <w:t>: Monitor and improve the software post-deployment.</w:t>
             </w:r>
           </w:p>
           <w:p>
@@ -3042,15 +3090,7 @@
                 <w:sz w:val="22"/>
                 <w:lang w:eastAsia="zh-CN"/>
               </w:rPr>
-              <w:t xml:space="preserve">: </w:t>
-            </w:r>
-            <w:r>
-              <w:rPr>
-                <w:rFonts w:ascii="Calibri" w:eastAsia="DengXian" w:hAnsi="Calibri" w:cs="Arial"/>
-                <w:sz w:val="22"/>
-                <w:lang w:eastAsia="zh-CN"/>
-              </w:rPr>
-              <w:t xml:space="preserve">Outline the business and user needs the software must meet. They are created during planning and inform all downstream processes. </w:t>
+              <w:t xml:space="preserve">: Outline the business and user needs the software must meet. They are created during planning and inform all downstream processes. </w:t>
             </w:r>
           </w:p>
           <w:p>
@@ -3083,15 +3123,7 @@
                 <w:sz w:val="22"/>
                 <w:lang w:eastAsia="zh-CN"/>
               </w:rPr>
-              <w:t xml:space="preserve">: </w:t>
-            </w:r>
-            <w:r>
-              <w:rPr>
-                <w:rFonts w:ascii="Calibri" w:eastAsia="DengXian" w:hAnsi="Calibri" w:cs="Arial"/>
-                <w:sz w:val="22"/>
-                <w:lang w:eastAsia="zh-CN"/>
-              </w:rPr>
-              <w:t xml:space="preserve">Provide technical implementation details for designers and developers. Specs evolve throughout the lifecycle as the software takes shape. </w:t>
+              <w:t xml:space="preserve">: Provide technical implementation details for designers and developers. Specs evolve throughout the lifecycle as the software takes shape. </w:t>
             </w:r>
           </w:p>
           <w:p>
@@ -3124,15 +3156,7 @@
                 <w:sz w:val="22"/>
                 <w:lang w:eastAsia="zh-CN"/>
               </w:rPr>
-              <w:t xml:space="preserve"> (Test Documents):</w:t>
-            </w:r>
-            <w:r>
-              <w:rPr>
-                <w:rFonts w:ascii="Calibri" w:eastAsia="DengXian" w:hAnsi="Calibri" w:cs="Arial"/>
-                <w:sz w:val="22"/>
-                <w:lang w:eastAsia="zh-CN"/>
-              </w:rPr>
-              <w:t xml:space="preserve"> Define the testing scope, scenarios, cases, and expected results. Rigorous test documentation contributes to software stability and security. </w:t>
+              <w:t xml:space="preserve"> (Test Documents): Define the testing scope, scenarios, cases, and expected results. Rigorous test documentation contributes to software stability and security. </w:t>
             </w:r>
           </w:p>
           <w:p>
@@ -3157,41 +3181,15 @@
                 <w:sz w:val="22"/>
                 <w:lang w:eastAsia="zh-CN"/>
               </w:rPr>
-              <w:t>User Manuals</w:t>
-            </w:r>
-            <w:r>
-              <w:rPr>
-                <w:rFonts w:ascii="Calibri" w:eastAsia="DengXian" w:hAnsi="Calibri" w:cs="Arial"/>
-                <w:b/>
-                <w:bCs/>
-                <w:sz w:val="22"/>
-                <w:lang w:eastAsia="zh-CN"/>
-              </w:rPr>
-              <w:t>:</w:t>
-            </w:r>
-            <w:r>
-              <w:rPr>
-                <w:rFonts w:ascii="Calibri" w:eastAsia="DengXian" w:hAnsi="Calibri" w:cs="Arial"/>
-                <w:sz w:val="22"/>
-                <w:lang w:eastAsia="zh-CN"/>
-              </w:rPr>
-              <w:t xml:space="preserve"> Explain how end </w:t>
-            </w:r>
-            <w:r>
-              <w:rPr>
-                <w:rFonts w:ascii="Calibri" w:eastAsia="DengXian" w:hAnsi="Calibri" w:cs="Arial"/>
-                <w:sz w:val="22"/>
-                <w:lang w:eastAsia="zh-CN"/>
-              </w:rPr>
-              <w:t>user’s</w:t>
-            </w:r>
-            <w:r>
-              <w:rPr>
-                <w:rFonts w:ascii="Calibri" w:eastAsia="DengXian" w:hAnsi="Calibri" w:cs="Arial"/>
-                <w:sz w:val="22"/>
-                <w:lang w:eastAsia="zh-CN"/>
-              </w:rPr>
-              <w:t xml:space="preserve"> complete tasks with the software. Well-written manuals improve the customer experience. </w:t>
+              <w:t>User Manuals:</w:t>
+            </w:r>
+            <w:r>
+              <w:rPr>
+                <w:rFonts w:ascii="Calibri" w:eastAsia="DengXian" w:hAnsi="Calibri" w:cs="Arial"/>
+                <w:sz w:val="22"/>
+                <w:lang w:eastAsia="zh-CN"/>
+              </w:rPr>
+              <w:t xml:space="preserve"> Explain how end user’s complete tasks with the software. Well-written manuals improve the customer experience. </w:t>
             </w:r>
           </w:p>
           <w:p>
@@ -3249,17 +3247,7 @@
                 <w:sz w:val="22"/>
                 <w:lang w:eastAsia="zh-CN"/>
               </w:rPr>
-              <w:t>Maintenance Plans</w:t>
-            </w:r>
-            <w:r>
-              <w:rPr>
-                <w:rFonts w:ascii="Calibri" w:eastAsia="DengXian" w:hAnsi="Calibri" w:cs="Arial"/>
-                <w:b/>
-                <w:bCs/>
-                <w:sz w:val="22"/>
-                <w:lang w:eastAsia="zh-CN"/>
-              </w:rPr>
-              <w:t>:</w:t>
+              <w:t>Maintenance Plans:</w:t>
             </w:r>
             <w:r>
               <w:rPr>
@@ -3375,15 +3363,23 @@
                 <w:sz w:val="22"/>
                 <w:lang w:eastAsia="zh-CN"/>
               </w:rPr>
-              <w:t xml:space="preserve">follow by the </w:t>
-            </w:r>
-            <w:r>
-              <w:rPr>
-                <w:rFonts w:ascii="Calibri" w:eastAsia="DengXian" w:hAnsi="Calibri" w:cs="Arial"/>
-                <w:sz w:val="22"/>
-                <w:lang w:eastAsia="zh-CN"/>
-              </w:rPr>
-              <w:t>agile</w:t>
+              <w:t xml:space="preserve">follow the </w:t>
+            </w:r>
+            <w:r>
+              <w:rPr>
+                <w:rFonts w:ascii="Calibri" w:eastAsia="DengXian" w:hAnsi="Calibri" w:cs="Arial"/>
+                <w:sz w:val="22"/>
+                <w:lang w:eastAsia="zh-CN"/>
+              </w:rPr>
+              <w:t>A</w:t>
+            </w:r>
+            <w:r>
+              <w:rPr>
+                <w:rFonts w:ascii="Calibri" w:eastAsia="DengXian" w:hAnsi="Calibri" w:cs="Arial"/>
+                <w:sz w:val="22"/>
+                <w:lang w:eastAsia="zh-CN"/>
+              </w:rPr>
+              <w:t>gile</w:t>
             </w:r>
             <w:r>
               <w:rPr>
@@ -3423,7 +3419,15 @@
                 <w:sz w:val="22"/>
                 <w:lang w:eastAsia="zh-CN"/>
               </w:rPr>
-              <w:t xml:space="preserve">quickness </w:t>
+              <w:t>rapid</w:t>
+            </w:r>
+            <w:r>
+              <w:rPr>
+                <w:rFonts w:ascii="Calibri" w:eastAsia="DengXian" w:hAnsi="Calibri" w:cs="Arial"/>
+                <w:sz w:val="22"/>
+                <w:lang w:eastAsia="zh-CN"/>
+              </w:rPr>
+              <w:t xml:space="preserve"> </w:t>
             </w:r>
             <w:r>
               <w:rPr>
@@ -3449,7 +3453,23 @@
                 <w:sz w:val="22"/>
                 <w:lang w:eastAsia="zh-CN"/>
               </w:rPr>
-              <w:t>Key points include:</w:t>
+              <w:t xml:space="preserve">The Software Development Life Cycle </w:t>
+            </w:r>
+            <w:r>
+              <w:rPr>
+                <w:rFonts w:ascii="Calibri" w:eastAsia="DengXian" w:hAnsi="Calibri" w:cs="Arial"/>
+                <w:sz w:val="22"/>
+                <w:lang w:eastAsia="zh-CN"/>
+              </w:rPr>
+              <w:t>p</w:t>
+            </w:r>
+            <w:r>
+              <w:rPr>
+                <w:rFonts w:ascii="Calibri" w:eastAsia="DengXian" w:hAnsi="Calibri" w:cs="Arial"/>
+                <w:sz w:val="22"/>
+                <w:lang w:eastAsia="zh-CN"/>
+              </w:rPr>
+              <w:t>rocess:</w:t>
             </w:r>
           </w:p>
           <w:p>
@@ -3457,7 +3477,7 @@
               <w:pStyle w:val="ListParagraph"/>
               <w:numPr>
                 <w:ilvl w:val="0"/>
-                <w:numId w:val="17"/>
+                <w:numId w:val="18"/>
               </w:numPr>
               <w:spacing w:after="160" w:line="259" w:lineRule="auto"/>
               <w:rPr>
@@ -3472,103 +3492,95 @@
                 <w:sz w:val="22"/>
                 <w:lang w:eastAsia="zh-CN"/>
               </w:rPr>
-              <w:t xml:space="preserve">Simplified Phases: </w:t>
-            </w:r>
-            <w:r>
-              <w:rPr>
-                <w:rFonts w:ascii="Calibri" w:eastAsia="DengXian" w:hAnsi="Calibri" w:cs="Arial"/>
-                <w:sz w:val="22"/>
-                <w:lang w:eastAsia="zh-CN"/>
-              </w:rPr>
-              <w:t>P</w:t>
-            </w:r>
-            <w:r>
-              <w:rPr>
-                <w:rFonts w:ascii="Calibri" w:eastAsia="DengXian" w:hAnsi="Calibri" w:cs="Arial"/>
-                <w:sz w:val="22"/>
-                <w:lang w:eastAsia="zh-CN"/>
-              </w:rPr>
-              <w:t xml:space="preserve">lanning, </w:t>
-            </w:r>
-            <w:r>
-              <w:rPr>
-                <w:rFonts w:ascii="Calibri" w:eastAsia="DengXian" w:hAnsi="Calibri" w:cs="Arial"/>
-                <w:sz w:val="22"/>
-                <w:lang w:eastAsia="zh-CN"/>
-              </w:rPr>
-              <w:t>D</w:t>
-            </w:r>
-            <w:r>
-              <w:rPr>
-                <w:rFonts w:ascii="Calibri" w:eastAsia="DengXian" w:hAnsi="Calibri" w:cs="Arial"/>
-                <w:sz w:val="22"/>
-                <w:lang w:eastAsia="zh-CN"/>
-              </w:rPr>
-              <w:t xml:space="preserve">esign, </w:t>
-            </w:r>
-            <w:r>
-              <w:rPr>
-                <w:rFonts w:ascii="Calibri" w:eastAsia="DengXian" w:hAnsi="Calibri" w:cs="Arial"/>
-                <w:sz w:val="22"/>
-                <w:lang w:eastAsia="zh-CN"/>
-              </w:rPr>
-              <w:t>Coding</w:t>
-            </w:r>
-            <w:r>
-              <w:rPr>
-                <w:rFonts w:ascii="Calibri" w:eastAsia="DengXian" w:hAnsi="Calibri" w:cs="Arial"/>
-                <w:sz w:val="22"/>
-                <w:lang w:eastAsia="zh-CN"/>
-              </w:rPr>
-              <w:t xml:space="preserve">, </w:t>
-            </w:r>
-            <w:r>
-              <w:rPr>
-                <w:rFonts w:ascii="Calibri" w:eastAsia="DengXian" w:hAnsi="Calibri" w:cs="Arial"/>
-                <w:sz w:val="22"/>
-                <w:lang w:eastAsia="zh-CN"/>
-              </w:rPr>
-              <w:t>T</w:t>
-            </w:r>
-            <w:r>
-              <w:rPr>
-                <w:rFonts w:ascii="Calibri" w:eastAsia="DengXian" w:hAnsi="Calibri" w:cs="Arial"/>
-                <w:sz w:val="22"/>
-                <w:lang w:eastAsia="zh-CN"/>
-              </w:rPr>
-              <w:t xml:space="preserve">esting, </w:t>
-            </w:r>
-            <w:r>
-              <w:rPr>
-                <w:rFonts w:ascii="Calibri" w:eastAsia="DengXian" w:hAnsi="Calibri" w:cs="Arial"/>
-                <w:sz w:val="22"/>
-                <w:lang w:eastAsia="zh-CN"/>
-              </w:rPr>
-              <w:t>D</w:t>
-            </w:r>
-            <w:r>
-              <w:rPr>
-                <w:rFonts w:ascii="Calibri" w:eastAsia="DengXian" w:hAnsi="Calibri" w:cs="Arial"/>
-                <w:sz w:val="22"/>
-                <w:lang w:eastAsia="zh-CN"/>
-              </w:rPr>
-              <w:t xml:space="preserve">eployment, and </w:t>
-            </w:r>
-            <w:r>
-              <w:rPr>
-                <w:rFonts w:ascii="Calibri" w:eastAsia="DengXian" w:hAnsi="Calibri" w:cs="Arial"/>
-                <w:sz w:val="22"/>
-                <w:lang w:eastAsia="zh-CN"/>
-              </w:rPr>
-              <w:t>M</w:t>
-            </w:r>
-            <w:r>
-              <w:rPr>
-                <w:rFonts w:ascii="Calibri" w:eastAsia="DengXian" w:hAnsi="Calibri" w:cs="Arial"/>
-                <w:sz w:val="22"/>
-                <w:lang w:eastAsia="zh-CN"/>
-              </w:rPr>
-              <w:t>aintenance.</w:t>
+              <w:t>Planning:</w:t>
+            </w:r>
+            <w:r>
+              <w:rPr>
+                <w:rFonts w:ascii="Calibri" w:eastAsia="DengXian" w:hAnsi="Calibri" w:cs="Arial"/>
+                <w:sz w:val="22"/>
+                <w:lang w:eastAsia="zh-CN"/>
+              </w:rPr>
+              <w:t xml:space="preserve"> Determines the goal</w:t>
+            </w:r>
+            <w:r>
+              <w:rPr>
+                <w:rFonts w:ascii="Calibri" w:eastAsia="DengXian" w:hAnsi="Calibri" w:cs="Arial"/>
+                <w:sz w:val="22"/>
+                <w:lang w:eastAsia="zh-CN"/>
+              </w:rPr>
+              <w:t>s</w:t>
+            </w:r>
+            <w:r>
+              <w:rPr>
+                <w:rFonts w:ascii="Calibri" w:eastAsia="DengXian" w:hAnsi="Calibri" w:cs="Arial"/>
+                <w:sz w:val="22"/>
+                <w:lang w:eastAsia="zh-CN"/>
+              </w:rPr>
+              <w:t xml:space="preserve"> of </w:t>
+            </w:r>
+            <w:r>
+              <w:rPr>
+                <w:rFonts w:ascii="Calibri" w:eastAsia="DengXian" w:hAnsi="Calibri" w:cs="Arial"/>
+                <w:sz w:val="22"/>
+                <w:lang w:eastAsia="zh-CN"/>
+              </w:rPr>
+              <w:t xml:space="preserve">the </w:t>
+            </w:r>
+            <w:r>
+              <w:rPr>
+                <w:rFonts w:ascii="Calibri" w:eastAsia="DengXian" w:hAnsi="Calibri" w:cs="Arial"/>
+                <w:sz w:val="22"/>
+                <w:lang w:eastAsia="zh-CN"/>
+              </w:rPr>
+              <w:t>small-size project</w:t>
+            </w:r>
+            <w:r>
+              <w:rPr>
+                <w:rFonts w:ascii="Calibri" w:eastAsia="DengXian" w:hAnsi="Calibri" w:cs="Arial"/>
+                <w:sz w:val="22"/>
+                <w:lang w:eastAsia="zh-CN"/>
+              </w:rPr>
+              <w:t xml:space="preserve"> and create </w:t>
+            </w:r>
+            <w:r>
+              <w:rPr>
+                <w:rFonts w:ascii="Calibri" w:eastAsia="DengXian" w:hAnsi="Calibri" w:cs="Arial"/>
+                <w:sz w:val="22"/>
+                <w:lang w:eastAsia="zh-CN"/>
+              </w:rPr>
+              <w:t>a</w:t>
+            </w:r>
+            <w:r>
+              <w:rPr>
+                <w:rFonts w:ascii="Calibri" w:eastAsia="DengXian" w:hAnsi="Calibri" w:cs="Arial"/>
+                <w:sz w:val="22"/>
+                <w:lang w:eastAsia="zh-CN"/>
+              </w:rPr>
+              <w:t xml:space="preserve"> product backlog (</w:t>
+            </w:r>
+            <w:r>
+              <w:rPr>
+                <w:rFonts w:ascii="Calibri" w:eastAsia="DengXian" w:hAnsi="Calibri" w:cs="Arial"/>
+                <w:sz w:val="22"/>
+                <w:lang w:eastAsia="zh-CN"/>
+              </w:rPr>
+              <w:t xml:space="preserve">a </w:t>
+            </w:r>
+            <w:r>
+              <w:rPr>
+                <w:rFonts w:ascii="Calibri" w:eastAsia="DengXian" w:hAnsi="Calibri" w:cs="Arial"/>
+                <w:sz w:val="22"/>
+                <w:lang w:eastAsia="zh-CN"/>
+              </w:rPr>
+              <w:t>prioritised list of tasks)</w:t>
+            </w:r>
+            <w:r>
+              <w:rPr>
+                <w:rFonts w:ascii="Calibri" w:eastAsia="DengXian" w:hAnsi="Calibri" w:cs="Arial"/>
+                <w:sz w:val="22"/>
+                <w:lang w:eastAsia="zh-CN"/>
+              </w:rPr>
+              <w:t>.</w:t>
             </w:r>
           </w:p>
           <w:p>
@@ -3576,7 +3588,7 @@
               <w:pStyle w:val="ListParagraph"/>
               <w:numPr>
                 <w:ilvl w:val="0"/>
-                <w:numId w:val="17"/>
+                <w:numId w:val="18"/>
               </w:numPr>
               <w:spacing w:after="160" w:line="259" w:lineRule="auto"/>
               <w:rPr>
@@ -3591,15 +3603,55 @@
                 <w:sz w:val="22"/>
                 <w:lang w:eastAsia="zh-CN"/>
               </w:rPr>
-              <w:t>Agile Methods: It focuses on quickness, flexible development through iterative progress</w:t>
-            </w:r>
-            <w:r>
-              <w:rPr>
-                <w:rFonts w:ascii="Calibri" w:eastAsia="DengXian" w:hAnsi="Calibri" w:cs="Arial"/>
-                <w:sz w:val="22"/>
-                <w:lang w:eastAsia="zh-CN"/>
-              </w:rPr>
-              <w:t>,</w:t>
+              <w:t xml:space="preserve">Design: Creates </w:t>
+            </w:r>
+            <w:r>
+              <w:rPr>
+                <w:rFonts w:ascii="Calibri" w:eastAsia="DengXian" w:hAnsi="Calibri" w:cs="Arial"/>
+                <w:sz w:val="22"/>
+                <w:lang w:eastAsia="zh-CN"/>
+              </w:rPr>
+              <w:t xml:space="preserve">a </w:t>
+            </w:r>
+            <w:r>
+              <w:rPr>
+                <w:rFonts w:ascii="Calibri" w:eastAsia="DengXian" w:hAnsi="Calibri" w:cs="Arial"/>
+                <w:sz w:val="22"/>
+                <w:lang w:eastAsia="zh-CN"/>
+              </w:rPr>
+              <w:t>simple and flexible design</w:t>
+            </w:r>
+            <w:r>
+              <w:rPr>
+                <w:rFonts w:ascii="Calibri" w:eastAsia="DengXian" w:hAnsi="Calibri" w:cs="Arial"/>
+                <w:sz w:val="22"/>
+                <w:lang w:eastAsia="zh-CN"/>
+              </w:rPr>
+              <w:t xml:space="preserve"> and break</w:t>
+            </w:r>
+            <w:r>
+              <w:rPr>
+                <w:rFonts w:ascii="Calibri" w:eastAsia="DengXian" w:hAnsi="Calibri" w:cs="Arial"/>
+                <w:sz w:val="22"/>
+                <w:lang w:eastAsia="zh-CN"/>
+              </w:rPr>
+              <w:t>ing</w:t>
+            </w:r>
+            <w:r>
+              <w:rPr>
+                <w:rFonts w:ascii="Calibri" w:eastAsia="DengXian" w:hAnsi="Calibri" w:cs="Arial"/>
+                <w:sz w:val="22"/>
+                <w:lang w:eastAsia="zh-CN"/>
+              </w:rPr>
+              <w:t xml:space="preserve"> down</w:t>
+            </w:r>
+            <w:r>
+              <w:rPr>
+                <w:rFonts w:ascii="Calibri" w:eastAsia="DengXian" w:hAnsi="Calibri" w:cs="Arial"/>
+                <w:sz w:val="22"/>
+                <w:lang w:eastAsia="zh-CN"/>
+              </w:rPr>
+              <w:t xml:space="preserve"> features</w:t>
             </w:r>
             <w:r>
               <w:rPr>
@@ -3615,39 +3667,101 @@
                 <w:sz w:val="22"/>
                 <w:lang w:eastAsia="zh-CN"/>
               </w:rPr>
-              <w:t>collaboration with stakeholders</w:t>
-            </w:r>
-            <w:r>
-              <w:rPr>
-                <w:rFonts w:ascii="Calibri" w:eastAsia="DengXian" w:hAnsi="Calibri" w:cs="Arial"/>
-                <w:sz w:val="22"/>
-                <w:lang w:eastAsia="zh-CN"/>
-              </w:rPr>
-              <w:t xml:space="preserve"> to </w:t>
-            </w:r>
-            <w:r>
-              <w:rPr>
-                <w:rFonts w:ascii="Calibri" w:eastAsia="DengXian" w:hAnsi="Calibri" w:cs="Arial"/>
-                <w:sz w:val="22"/>
-                <w:lang w:eastAsia="zh-CN"/>
-              </w:rPr>
-              <w:t>rapid feedback</w:t>
-            </w:r>
-            <w:r>
-              <w:rPr>
-                <w:rFonts w:ascii="Calibri" w:eastAsia="DengXian" w:hAnsi="Calibri" w:cs="Arial"/>
-                <w:sz w:val="22"/>
-                <w:lang w:eastAsia="zh-CN"/>
-              </w:rPr>
-              <w:t xml:space="preserve"> </w:t>
-            </w:r>
-            <w:r>
-              <w:rPr>
-                <w:rFonts w:ascii="Calibri" w:eastAsia="DengXian" w:hAnsi="Calibri" w:cs="Arial"/>
-                <w:sz w:val="22"/>
-                <w:lang w:eastAsia="zh-CN"/>
-              </w:rPr>
-              <w:t>and quick delivery of a working product</w:t>
+              <w:t>in</w:t>
+            </w:r>
+            <w:r>
+              <w:rPr>
+                <w:rFonts w:ascii="Calibri" w:eastAsia="DengXian" w:hAnsi="Calibri" w:cs="Arial"/>
+                <w:sz w:val="22"/>
+                <w:lang w:eastAsia="zh-CN"/>
+              </w:rPr>
+              <w:t>to small task.</w:t>
+            </w:r>
+          </w:p>
+          <w:p>
+            <w:pPr>
+              <w:pStyle w:val="ListParagraph"/>
+              <w:numPr>
+                <w:ilvl w:val="0"/>
+                <w:numId w:val="18"/>
+              </w:numPr>
+              <w:spacing w:after="160" w:line="259" w:lineRule="auto"/>
+              <w:rPr>
+                <w:rFonts w:ascii="Calibri" w:eastAsia="DengXian" w:hAnsi="Calibri" w:cs="Arial"/>
+                <w:sz w:val="22"/>
+                <w:lang w:eastAsia="zh-CN"/>
+              </w:rPr>
+            </w:pPr>
+            <w:r>
+              <w:rPr>
+                <w:rFonts w:ascii="Calibri" w:eastAsia="DengXian" w:hAnsi="Calibri" w:cs="Arial"/>
+                <w:sz w:val="22"/>
+                <w:lang w:eastAsia="zh-CN"/>
+              </w:rPr>
+              <w:t>Coding: Building features combin</w:t>
+            </w:r>
+            <w:r>
+              <w:rPr>
+                <w:rFonts w:ascii="Calibri" w:eastAsia="DengXian" w:hAnsi="Calibri" w:cs="Arial"/>
+                <w:sz w:val="22"/>
+                <w:lang w:eastAsia="zh-CN"/>
+              </w:rPr>
+              <w:t>ing</w:t>
+            </w:r>
+            <w:r>
+              <w:rPr>
+                <w:rFonts w:ascii="Calibri" w:eastAsia="DengXian" w:hAnsi="Calibri" w:cs="Arial"/>
+                <w:sz w:val="22"/>
+                <w:lang w:eastAsia="zh-CN"/>
+              </w:rPr>
+              <w:t xml:space="preserve"> with testing small task.</w:t>
+            </w:r>
+          </w:p>
+          <w:p>
+            <w:pPr>
+              <w:pStyle w:val="ListParagraph"/>
+              <w:numPr>
+                <w:ilvl w:val="0"/>
+                <w:numId w:val="18"/>
+              </w:numPr>
+              <w:spacing w:after="160" w:line="259" w:lineRule="auto"/>
+              <w:rPr>
+                <w:rFonts w:ascii="Calibri" w:eastAsia="DengXian" w:hAnsi="Calibri" w:cs="Arial"/>
+                <w:sz w:val="22"/>
+                <w:lang w:eastAsia="zh-CN"/>
+              </w:rPr>
+            </w:pPr>
+            <w:r>
+              <w:rPr>
+                <w:rFonts w:ascii="Calibri" w:eastAsia="DengXian" w:hAnsi="Calibri" w:cs="Arial"/>
+                <w:sz w:val="22"/>
+                <w:lang w:eastAsia="zh-CN"/>
+              </w:rPr>
+              <w:t xml:space="preserve">Testing: </w:t>
+            </w:r>
+            <w:r>
+              <w:rPr>
+                <w:rFonts w:ascii="Calibri" w:eastAsia="DengXian" w:hAnsi="Calibri" w:cs="Arial"/>
+                <w:sz w:val="22"/>
+                <w:lang w:eastAsia="zh-CN"/>
+              </w:rPr>
+              <w:t>Perform</w:t>
+            </w:r>
+            <w:r>
+              <w:rPr>
+                <w:rFonts w:ascii="Calibri" w:eastAsia="DengXian" w:hAnsi="Calibri" w:cs="Arial"/>
+                <w:sz w:val="22"/>
+                <w:lang w:eastAsia="zh-CN"/>
+              </w:rPr>
+              <w:t xml:space="preserve"> unit testing and integration testing</w:t>
+            </w:r>
+            <w:r>
+              <w:rPr>
+                <w:rFonts w:ascii="Calibri" w:eastAsia="DengXian" w:hAnsi="Calibri" w:cs="Arial"/>
+                <w:sz w:val="22"/>
+                <w:lang w:eastAsia="zh-CN"/>
+              </w:rPr>
+              <w:t xml:space="preserve"> during development</w:t>
             </w:r>
             <w:r>
               <w:rPr>
@@ -3657,6 +3771,112 @@
               </w:rPr>
               <w:t>.</w:t>
             </w:r>
+          </w:p>
+          <w:p>
+            <w:pPr>
+              <w:pStyle w:val="ListParagraph"/>
+              <w:numPr>
+                <w:ilvl w:val="0"/>
+                <w:numId w:val="18"/>
+              </w:numPr>
+              <w:spacing w:after="160" w:line="259" w:lineRule="auto"/>
+              <w:rPr>
+                <w:rFonts w:ascii="Calibri" w:eastAsia="DengXian" w:hAnsi="Calibri" w:cs="Arial"/>
+                <w:sz w:val="22"/>
+                <w:lang w:eastAsia="zh-CN"/>
+              </w:rPr>
+            </w:pPr>
+            <w:r>
+              <w:rPr>
+                <w:rFonts w:ascii="Calibri" w:eastAsia="DengXian" w:hAnsi="Calibri" w:cs="Arial"/>
+                <w:sz w:val="22"/>
+                <w:lang w:eastAsia="zh-CN"/>
+              </w:rPr>
+              <w:t xml:space="preserve">Deployment: </w:t>
+            </w:r>
+            <w:r>
+              <w:rPr>
+                <w:rFonts w:ascii="Calibri" w:eastAsia="DengXian" w:hAnsi="Calibri" w:cs="Arial"/>
+                <w:sz w:val="22"/>
+                <w:lang w:eastAsia="zh-CN"/>
+              </w:rPr>
+              <w:t>Frequently release working versions and continuous</w:t>
+            </w:r>
+            <w:r>
+              <w:rPr>
+                <w:rFonts w:ascii="Calibri" w:eastAsia="DengXian" w:hAnsi="Calibri" w:cs="Arial"/>
+                <w:sz w:val="22"/>
+                <w:lang w:eastAsia="zh-CN"/>
+              </w:rPr>
+              <w:t>ly</w:t>
+            </w:r>
+            <w:r>
+              <w:rPr>
+                <w:rFonts w:ascii="Calibri" w:eastAsia="DengXian" w:hAnsi="Calibri" w:cs="Arial"/>
+                <w:sz w:val="22"/>
+                <w:lang w:eastAsia="zh-CN"/>
+              </w:rPr>
+              <w:t xml:space="preserve"> get feedback from users.</w:t>
+            </w:r>
+          </w:p>
+          <w:p>
+            <w:pPr>
+              <w:pStyle w:val="ListParagraph"/>
+              <w:numPr>
+                <w:ilvl w:val="0"/>
+                <w:numId w:val="18"/>
+              </w:numPr>
+              <w:spacing w:after="160" w:line="259" w:lineRule="auto"/>
+              <w:rPr>
+                <w:rFonts w:ascii="Calibri" w:eastAsia="DengXian" w:hAnsi="Calibri" w:cs="Arial"/>
+                <w:sz w:val="22"/>
+                <w:lang w:eastAsia="zh-CN"/>
+              </w:rPr>
+            </w:pPr>
+            <w:r>
+              <w:rPr>
+                <w:rFonts w:ascii="Calibri" w:eastAsia="DengXian" w:hAnsi="Calibri" w:cs="Arial"/>
+                <w:sz w:val="22"/>
+                <w:lang w:eastAsia="zh-CN"/>
+              </w:rPr>
+              <w:t xml:space="preserve">Maintenance: </w:t>
+            </w:r>
+            <w:r>
+              <w:rPr>
+                <w:rFonts w:ascii="Calibri" w:eastAsia="DengXian" w:hAnsi="Calibri" w:cs="Arial"/>
+                <w:sz w:val="22"/>
+                <w:lang w:eastAsia="zh-CN"/>
+              </w:rPr>
+              <w:t xml:space="preserve">Continuously </w:t>
+            </w:r>
+            <w:r>
+              <w:rPr>
+                <w:rFonts w:ascii="Calibri" w:eastAsia="DengXian" w:hAnsi="Calibri" w:cs="Arial"/>
+                <w:sz w:val="22"/>
+                <w:lang w:eastAsia="zh-CN"/>
+              </w:rPr>
+              <w:t>receive feedback and fix bugs during development</w:t>
+            </w:r>
+            <w:r>
+              <w:rPr>
+                <w:rFonts w:ascii="Calibri" w:eastAsia="DengXian" w:hAnsi="Calibri" w:cs="Arial"/>
+                <w:sz w:val="22"/>
+                <w:lang w:eastAsia="zh-CN"/>
+              </w:rPr>
+              <w:t>.</w:t>
+            </w:r>
+          </w:p>
+          <w:p>
+            <w:pPr>
+              <w:pStyle w:val="ListParagraph"/>
+              <w:spacing w:after="160" w:line="259" w:lineRule="auto"/>
+              <w:ind w:left="720"/>
+              <w:rPr>
+                <w:rFonts w:ascii="Calibri" w:eastAsia="DengXian" w:hAnsi="Calibri" w:cs="Arial"/>
+                <w:sz w:val="22"/>
+                <w:lang w:eastAsia="zh-CN"/>
+              </w:rPr>
+            </w:pPr>
           </w:p>
         </w:tc>
       </w:tr>
@@ -3726,20 +3946,12 @@
               <w:spacing w:after="160" w:line="259" w:lineRule="auto"/>
               <w:rPr>
                 <w:rFonts w:ascii="Calibri" w:eastAsia="DengXian" w:hAnsi="Calibri" w:cs="Arial"/>
-                <w:sz w:val="22"/>
-                <w:lang w:eastAsia="zh-CN"/>
-              </w:rPr>
-            </w:pPr>
-            <w:r>
-              <w:rPr>
-                <w:rFonts w:ascii="Calibri" w:eastAsia="DengXian" w:hAnsi="Calibri" w:cs="Arial"/>
                 <w:b/>
                 <w:bCs/>
                 <w:sz w:val="22"/>
                 <w:lang w:eastAsia="zh-CN"/>
               </w:rPr>
-              <w:t>Answer:</w:t>
-            </w:r>
+            </w:pPr>
             <w:r>
               <w:rPr>
                 <w:rFonts w:ascii="Calibri" w:eastAsia="DengXian" w:hAnsi="Calibri" w:cs="Arial"/>
@@ -3748,7 +3960,586 @@
                 <w:sz w:val="22"/>
                 <w:lang w:eastAsia="zh-CN"/>
               </w:rPr>
+              <w:t>Answer:</w:t>
+            </w:r>
+            <w:r>
+              <w:rPr>
+                <w:rFonts w:ascii="Calibri" w:eastAsia="DengXian" w:hAnsi="Calibri" w:cs="Arial"/>
+                <w:b/>
+                <w:bCs/>
+                <w:sz w:val="22"/>
+                <w:lang w:eastAsia="zh-CN"/>
+              </w:rPr>
               <w:t xml:space="preserve"> </w:t>
+            </w:r>
+          </w:p>
+          <w:p>
+            <w:pPr>
+              <w:pStyle w:val="ListParagraph"/>
+              <w:numPr>
+                <w:ilvl w:val="0"/>
+                <w:numId w:val="20"/>
+              </w:numPr>
+              <w:spacing w:after="160" w:line="259" w:lineRule="auto"/>
+              <w:rPr>
+                <w:rFonts w:ascii="Calibri" w:eastAsia="DengXian" w:hAnsi="Calibri" w:cs="Arial"/>
+                <w:sz w:val="22"/>
+                <w:lang w:eastAsia="zh-CN"/>
+              </w:rPr>
+            </w:pPr>
+            <w:r>
+              <w:rPr>
+                <w:rFonts w:ascii="Calibri" w:eastAsia="DengXian" w:hAnsi="Calibri" w:cs="Arial"/>
+                <w:sz w:val="22"/>
+                <w:lang w:eastAsia="zh-CN"/>
+              </w:rPr>
+              <w:t>Testing process for small-size applications:</w:t>
+            </w:r>
+          </w:p>
+          <w:p>
+            <w:pPr>
+              <w:pStyle w:val="ListParagraph"/>
+              <w:numPr>
+                <w:ilvl w:val="1"/>
+                <w:numId w:val="19"/>
+              </w:numPr>
+              <w:spacing w:after="160" w:line="259" w:lineRule="auto"/>
+              <w:rPr>
+                <w:rFonts w:ascii="Calibri" w:eastAsia="DengXian" w:hAnsi="Calibri" w:cs="Arial"/>
+                <w:sz w:val="22"/>
+                <w:lang w:eastAsia="zh-CN"/>
+              </w:rPr>
+            </w:pPr>
+            <w:r>
+              <w:rPr>
+                <w:rFonts w:ascii="Calibri" w:eastAsia="DengXian" w:hAnsi="Calibri" w:cs="Arial"/>
+                <w:sz w:val="22"/>
+                <w:lang w:eastAsia="zh-CN"/>
+              </w:rPr>
+              <w:t>Test Planning: Identify key features and test cases to test.</w:t>
+            </w:r>
+          </w:p>
+          <w:p>
+            <w:pPr>
+              <w:pStyle w:val="ListParagraph"/>
+              <w:numPr>
+                <w:ilvl w:val="1"/>
+                <w:numId w:val="19"/>
+              </w:numPr>
+              <w:spacing w:after="160" w:line="259" w:lineRule="auto"/>
+              <w:rPr>
+                <w:rFonts w:ascii="Calibri" w:eastAsia="DengXian" w:hAnsi="Calibri" w:cs="Arial"/>
+                <w:sz w:val="22"/>
+                <w:lang w:eastAsia="zh-CN"/>
+              </w:rPr>
+            </w:pPr>
+            <w:r>
+              <w:rPr>
+                <w:rFonts w:ascii="Calibri" w:eastAsia="DengXian" w:hAnsi="Calibri" w:cs="Arial"/>
+                <w:sz w:val="22"/>
+                <w:lang w:eastAsia="zh-CN"/>
+              </w:rPr>
+              <w:t>Testing: Continuously test during coding.</w:t>
+            </w:r>
+          </w:p>
+          <w:p>
+            <w:pPr>
+              <w:pStyle w:val="ListParagraph"/>
+              <w:numPr>
+                <w:ilvl w:val="1"/>
+                <w:numId w:val="19"/>
+              </w:numPr>
+              <w:spacing w:after="160" w:line="259" w:lineRule="auto"/>
+              <w:rPr>
+                <w:rFonts w:ascii="Calibri" w:eastAsia="DengXian" w:hAnsi="Calibri" w:cs="Arial"/>
+                <w:sz w:val="22"/>
+                <w:lang w:eastAsia="zh-CN"/>
+              </w:rPr>
+            </w:pPr>
+            <w:r>
+              <w:rPr>
+                <w:rFonts w:ascii="Calibri" w:eastAsia="DengXian" w:hAnsi="Calibri" w:cs="Arial"/>
+                <w:sz w:val="22"/>
+                <w:lang w:eastAsia="zh-CN"/>
+              </w:rPr>
+              <w:t>Test and Address bugs: Quickly test, get feedback and debugs within short cycles.</w:t>
+            </w:r>
+          </w:p>
+          <w:p>
+            <w:pPr>
+              <w:pStyle w:val="ListParagraph"/>
+              <w:numPr>
+                <w:ilvl w:val="0"/>
+                <w:numId w:val="19"/>
+              </w:numPr>
+              <w:spacing w:after="160" w:line="259" w:lineRule="auto"/>
+              <w:rPr>
+                <w:rFonts w:ascii="Calibri" w:eastAsia="DengXian" w:hAnsi="Calibri" w:cs="Arial"/>
+                <w:sz w:val="22"/>
+                <w:lang w:eastAsia="zh-CN"/>
+              </w:rPr>
+            </w:pPr>
+            <w:r>
+              <w:rPr>
+                <w:rFonts w:ascii="Calibri" w:eastAsia="DengXian" w:hAnsi="Calibri" w:cs="Arial"/>
+                <w:sz w:val="22"/>
+                <w:lang w:eastAsia="zh-CN"/>
+              </w:rPr>
+              <w:t>Tools:</w:t>
+            </w:r>
+          </w:p>
+          <w:p>
+            <w:pPr>
+              <w:pStyle w:val="ListParagraph"/>
+              <w:numPr>
+                <w:ilvl w:val="1"/>
+                <w:numId w:val="19"/>
+              </w:numPr>
+              <w:spacing w:after="160" w:line="259" w:lineRule="auto"/>
+              <w:rPr>
+                <w:rFonts w:ascii="Calibri" w:eastAsia="DengXian" w:hAnsi="Calibri" w:cs="Arial"/>
+                <w:sz w:val="22"/>
+                <w:lang w:eastAsia="zh-CN"/>
+              </w:rPr>
+            </w:pPr>
+            <w:r>
+              <w:rPr>
+                <w:rFonts w:ascii="Calibri" w:eastAsia="DengXian" w:hAnsi="Calibri" w:cs="Arial"/>
+                <w:sz w:val="22"/>
+                <w:lang w:eastAsia="zh-CN"/>
+              </w:rPr>
+              <w:t>Visual Studio Test Explorer</w:t>
+            </w:r>
+            <w:r>
+              <w:rPr>
+                <w:rFonts w:ascii="Calibri" w:eastAsia="DengXian" w:hAnsi="Calibri" w:cs="Arial"/>
+                <w:sz w:val="22"/>
+                <w:lang w:eastAsia="zh-CN"/>
+              </w:rPr>
+              <w:t>: It uses for</w:t>
+            </w:r>
+            <w:r>
+              <w:rPr>
+                <w:rFonts w:ascii="Calibri" w:eastAsia="DengXian" w:hAnsi="Calibri" w:cs="Arial"/>
+                <w:sz w:val="22"/>
+                <w:lang w:eastAsia="zh-CN"/>
+              </w:rPr>
+              <w:t xml:space="preserve"> unit testing in </w:t>
+            </w:r>
+            <w:r>
+              <w:rPr>
+                <w:rFonts w:ascii="Calibri" w:eastAsia="DengXian" w:hAnsi="Calibri" w:cs="Arial"/>
+                <w:sz w:val="22"/>
+                <w:lang w:eastAsia="zh-CN"/>
+              </w:rPr>
+              <w:t xml:space="preserve">.NET </w:t>
+            </w:r>
+            <w:r>
+              <w:rPr>
+                <w:rFonts w:ascii="Calibri" w:eastAsia="DengXian" w:hAnsi="Calibri" w:cs="Arial"/>
+                <w:sz w:val="22"/>
+                <w:lang w:eastAsia="zh-CN"/>
+              </w:rPr>
+              <w:t>projects.</w:t>
+            </w:r>
+          </w:p>
+          <w:p>
+            <w:pPr>
+              <w:pStyle w:val="ListParagraph"/>
+              <w:numPr>
+                <w:ilvl w:val="1"/>
+                <w:numId w:val="19"/>
+              </w:numPr>
+              <w:spacing w:after="160" w:line="259" w:lineRule="auto"/>
+              <w:rPr>
+                <w:rFonts w:ascii="Calibri" w:eastAsia="DengXian" w:hAnsi="Calibri" w:cs="Arial"/>
+                <w:sz w:val="22"/>
+                <w:lang w:eastAsia="zh-CN"/>
+              </w:rPr>
+            </w:pPr>
+            <w:r>
+              <w:rPr>
+                <w:rFonts w:ascii="Calibri" w:eastAsia="DengXian" w:hAnsi="Calibri" w:cs="Arial"/>
+                <w:sz w:val="22"/>
+                <w:lang w:eastAsia="zh-CN"/>
+              </w:rPr>
+              <w:t>Selenium</w:t>
+            </w:r>
+            <w:r>
+              <w:rPr>
+                <w:rFonts w:ascii="Calibri" w:eastAsia="DengXian" w:hAnsi="Calibri" w:cs="Arial"/>
+                <w:sz w:val="22"/>
+                <w:lang w:eastAsia="zh-CN"/>
+              </w:rPr>
+              <w:t>: It uses fo</w:t>
+            </w:r>
+            <w:r>
+              <w:rPr>
+                <w:rFonts w:ascii="Calibri" w:eastAsia="DengXian" w:hAnsi="Calibri" w:cs="Arial"/>
+                <w:sz w:val="22"/>
+                <w:lang w:eastAsia="zh-CN"/>
+              </w:rPr>
+              <w:t>r automating UI/browser tests.</w:t>
+            </w:r>
+          </w:p>
+          <w:p>
+            <w:pPr>
+              <w:pStyle w:val="ListParagraph"/>
+              <w:numPr>
+                <w:ilvl w:val="1"/>
+                <w:numId w:val="19"/>
+              </w:numPr>
+              <w:spacing w:after="160" w:line="259" w:lineRule="auto"/>
+              <w:rPr>
+                <w:rFonts w:ascii="Calibri" w:eastAsia="DengXian" w:hAnsi="Calibri" w:cs="Arial"/>
+                <w:sz w:val="22"/>
+                <w:lang w:eastAsia="zh-CN"/>
+              </w:rPr>
+            </w:pPr>
+            <w:r>
+              <w:rPr>
+                <w:rFonts w:ascii="Calibri" w:eastAsia="DengXian" w:hAnsi="Calibri" w:cs="Arial"/>
+                <w:sz w:val="22"/>
+                <w:lang w:eastAsia="zh-CN"/>
+              </w:rPr>
+              <w:t>Postman</w:t>
+            </w:r>
+            <w:r>
+              <w:rPr>
+                <w:rFonts w:ascii="Calibri" w:eastAsia="DengXian" w:hAnsi="Calibri" w:cs="Arial"/>
+                <w:sz w:val="22"/>
+                <w:lang w:eastAsia="zh-CN"/>
+              </w:rPr>
+              <w:t>: It uses f</w:t>
+            </w:r>
+            <w:r>
+              <w:rPr>
+                <w:rFonts w:ascii="Calibri" w:eastAsia="DengXian" w:hAnsi="Calibri" w:cs="Arial"/>
+                <w:sz w:val="22"/>
+                <w:lang w:eastAsia="zh-CN"/>
+              </w:rPr>
+              <w:t>or testing APIs.</w:t>
+            </w:r>
+          </w:p>
+          <w:p>
+            <w:pPr>
+              <w:pStyle w:val="ListParagraph"/>
+              <w:numPr>
+                <w:ilvl w:val="1"/>
+                <w:numId w:val="19"/>
+              </w:numPr>
+              <w:spacing w:after="160" w:line="259" w:lineRule="auto"/>
+              <w:rPr>
+                <w:rFonts w:ascii="Calibri" w:eastAsia="DengXian" w:hAnsi="Calibri" w:cs="Arial"/>
+                <w:sz w:val="22"/>
+                <w:lang w:eastAsia="zh-CN"/>
+              </w:rPr>
+            </w:pPr>
+            <w:r>
+              <w:rPr>
+                <w:rFonts w:ascii="Calibri" w:eastAsia="DengXian" w:hAnsi="Calibri" w:cs="Arial"/>
+                <w:sz w:val="22"/>
+                <w:lang w:eastAsia="zh-CN"/>
+              </w:rPr>
+              <w:t>Git + CI tools (e.g., GitHub Actions)</w:t>
+            </w:r>
+            <w:r>
+              <w:rPr>
+                <w:rFonts w:ascii="Calibri" w:eastAsia="DengXian" w:hAnsi="Calibri" w:cs="Arial"/>
+                <w:sz w:val="22"/>
+                <w:lang w:eastAsia="zh-CN"/>
+              </w:rPr>
+              <w:t>: It uses t</w:t>
+            </w:r>
+            <w:r>
+              <w:rPr>
+                <w:rFonts w:ascii="Calibri" w:eastAsia="DengXian" w:hAnsi="Calibri" w:cs="Arial"/>
+                <w:sz w:val="22"/>
+                <w:lang w:eastAsia="zh-CN"/>
+              </w:rPr>
+              <w:t>o automate testing on each commit.</w:t>
+            </w:r>
+          </w:p>
+          <w:p>
+            <w:pPr>
+              <w:pStyle w:val="ListParagraph"/>
+              <w:numPr>
+                <w:ilvl w:val="0"/>
+                <w:numId w:val="19"/>
+              </w:numPr>
+              <w:spacing w:after="160" w:line="259" w:lineRule="auto"/>
+              <w:rPr>
+                <w:rFonts w:ascii="Calibri" w:eastAsia="DengXian" w:hAnsi="Calibri" w:cs="Arial"/>
+                <w:sz w:val="22"/>
+                <w:lang w:eastAsia="zh-CN"/>
+              </w:rPr>
+            </w:pPr>
+            <w:r>
+              <w:rPr>
+                <w:rFonts w:ascii="Calibri" w:eastAsia="DengXian" w:hAnsi="Calibri" w:cs="Arial"/>
+                <w:sz w:val="22"/>
+                <w:lang w:eastAsia="zh-CN"/>
+              </w:rPr>
+              <w:t>Techniques:</w:t>
+            </w:r>
+          </w:p>
+          <w:p>
+            <w:pPr>
+              <w:pStyle w:val="ListParagraph"/>
+              <w:numPr>
+                <w:ilvl w:val="1"/>
+                <w:numId w:val="19"/>
+              </w:numPr>
+              <w:spacing w:after="160" w:line="259" w:lineRule="auto"/>
+              <w:rPr>
+                <w:rFonts w:ascii="Calibri" w:eastAsia="DengXian" w:hAnsi="Calibri" w:cs="Arial"/>
+                <w:sz w:val="22"/>
+                <w:lang w:eastAsia="zh-CN"/>
+              </w:rPr>
+            </w:pPr>
+            <w:r>
+              <w:rPr>
+                <w:rFonts w:ascii="Calibri" w:eastAsia="DengXian" w:hAnsi="Calibri" w:cs="Arial"/>
+                <w:sz w:val="22"/>
+                <w:lang w:eastAsia="zh-CN"/>
+              </w:rPr>
+              <w:t xml:space="preserve">Unit test: </w:t>
+            </w:r>
+            <w:r>
+              <w:rPr>
+                <w:rFonts w:ascii="Calibri" w:eastAsia="DengXian" w:hAnsi="Calibri" w:cs="Arial"/>
+                <w:sz w:val="22"/>
+                <w:lang w:eastAsia="zh-CN"/>
+              </w:rPr>
+              <w:t>It tests individual methods and functions</w:t>
+            </w:r>
+            <w:r>
+              <w:rPr>
+                <w:rFonts w:ascii="Calibri" w:eastAsia="DengXian" w:hAnsi="Calibri" w:cs="Arial"/>
+                <w:sz w:val="22"/>
+                <w:lang w:eastAsia="zh-CN"/>
+              </w:rPr>
+              <w:t xml:space="preserve">. It </w:t>
+            </w:r>
+            <w:r>
+              <w:rPr>
+                <w:rFonts w:ascii="Calibri" w:eastAsia="DengXian" w:hAnsi="Calibri" w:cs="Arial"/>
+                <w:sz w:val="22"/>
+                <w:lang w:eastAsia="zh-CN"/>
+              </w:rPr>
+              <w:t>ensure</w:t>
+            </w:r>
+            <w:r>
+              <w:rPr>
+                <w:rFonts w:ascii="Calibri" w:eastAsia="DengXian" w:hAnsi="Calibri" w:cs="Arial"/>
+                <w:sz w:val="22"/>
+                <w:lang w:eastAsia="zh-CN"/>
+              </w:rPr>
+              <w:t>s</w:t>
+            </w:r>
+            <w:r>
+              <w:rPr>
+                <w:rFonts w:ascii="Calibri" w:eastAsia="DengXian" w:hAnsi="Calibri" w:cs="Arial"/>
+                <w:sz w:val="22"/>
+                <w:lang w:eastAsia="zh-CN"/>
+              </w:rPr>
+              <w:t xml:space="preserve"> they are working properly.</w:t>
+            </w:r>
+          </w:p>
+          <w:p>
+            <w:pPr>
+              <w:pStyle w:val="ListParagraph"/>
+              <w:numPr>
+                <w:ilvl w:val="1"/>
+                <w:numId w:val="19"/>
+              </w:numPr>
+              <w:spacing w:after="160" w:line="259" w:lineRule="auto"/>
+              <w:rPr>
+                <w:rFonts w:ascii="Calibri" w:eastAsia="DengXian" w:hAnsi="Calibri" w:cs="Arial"/>
+                <w:sz w:val="22"/>
+                <w:lang w:eastAsia="zh-CN"/>
+              </w:rPr>
+            </w:pPr>
+            <w:r>
+              <w:rPr>
+                <w:rFonts w:ascii="Calibri" w:eastAsia="DengXian" w:hAnsi="Calibri" w:cs="Arial"/>
+                <w:sz w:val="22"/>
+                <w:lang w:eastAsia="zh-CN"/>
+              </w:rPr>
+              <w:t xml:space="preserve">Integration Testing: </w:t>
+            </w:r>
+            <w:r>
+              <w:rPr>
+                <w:rFonts w:ascii="Calibri" w:eastAsia="DengXian" w:hAnsi="Calibri" w:cs="Arial"/>
+                <w:sz w:val="22"/>
+                <w:lang w:eastAsia="zh-CN"/>
+              </w:rPr>
+              <w:t>It tests how components work together</w:t>
+            </w:r>
+            <w:r>
+              <w:rPr>
+                <w:rFonts w:ascii="Calibri" w:eastAsia="DengXian" w:hAnsi="Calibri" w:cs="Arial"/>
+                <w:sz w:val="22"/>
+                <w:lang w:eastAsia="zh-CN"/>
+              </w:rPr>
+              <w:t xml:space="preserve">. It </w:t>
+            </w:r>
+            <w:r>
+              <w:rPr>
+                <w:rFonts w:ascii="Calibri" w:eastAsia="DengXian" w:hAnsi="Calibri" w:cs="Arial"/>
+                <w:sz w:val="22"/>
+                <w:lang w:eastAsia="zh-CN"/>
+              </w:rPr>
+              <w:t>ensure</w:t>
+            </w:r>
+            <w:r>
+              <w:rPr>
+                <w:rFonts w:ascii="Calibri" w:eastAsia="DengXian" w:hAnsi="Calibri" w:cs="Arial"/>
+                <w:sz w:val="22"/>
+                <w:lang w:eastAsia="zh-CN"/>
+              </w:rPr>
+              <w:t>s</w:t>
+            </w:r>
+            <w:r>
+              <w:rPr>
+                <w:rFonts w:ascii="Calibri" w:eastAsia="DengXian" w:hAnsi="Calibri" w:cs="Arial"/>
+                <w:sz w:val="22"/>
+                <w:lang w:eastAsia="zh-CN"/>
+              </w:rPr>
+              <w:t xml:space="preserve"> they don't conflict with each other.</w:t>
+            </w:r>
+          </w:p>
+          <w:p>
+            <w:pPr>
+              <w:pStyle w:val="ListParagraph"/>
+              <w:numPr>
+                <w:ilvl w:val="1"/>
+                <w:numId w:val="19"/>
+              </w:numPr>
+              <w:spacing w:after="160" w:line="259" w:lineRule="auto"/>
+              <w:rPr>
+                <w:rFonts w:ascii="Calibri" w:eastAsia="DengXian" w:hAnsi="Calibri" w:cs="Arial"/>
+                <w:sz w:val="22"/>
+                <w:lang w:eastAsia="zh-CN"/>
+              </w:rPr>
+            </w:pPr>
+            <w:r>
+              <w:rPr>
+                <w:rFonts w:ascii="Calibri" w:eastAsia="DengXian" w:hAnsi="Calibri" w:cs="Arial"/>
+                <w:sz w:val="22"/>
+                <w:lang w:eastAsia="zh-CN"/>
+              </w:rPr>
+              <w:t>E</w:t>
+            </w:r>
+            <w:r>
+              <w:rPr>
+                <w:rFonts w:ascii="Calibri" w:eastAsia="DengXian" w:hAnsi="Calibri" w:cs="Arial"/>
+                <w:sz w:val="22"/>
+                <w:lang w:eastAsia="zh-CN"/>
+              </w:rPr>
+              <w:t xml:space="preserve">xploratory Testing: </w:t>
+            </w:r>
+            <w:r>
+              <w:rPr>
+                <w:rFonts w:ascii="Calibri" w:eastAsia="DengXian" w:hAnsi="Calibri" w:cs="Arial"/>
+                <w:sz w:val="22"/>
+                <w:lang w:eastAsia="zh-CN"/>
+              </w:rPr>
+              <w:t>It is a m</w:t>
+            </w:r>
+            <w:r>
+              <w:rPr>
+                <w:rFonts w:ascii="Calibri" w:eastAsia="DengXian" w:hAnsi="Calibri" w:cs="Arial"/>
+                <w:sz w:val="22"/>
+                <w:lang w:eastAsia="zh-CN"/>
+              </w:rPr>
+              <w:t>anually test to find unexpected bugs</w:t>
+            </w:r>
+            <w:r>
+              <w:rPr>
+                <w:rFonts w:ascii="Calibri" w:eastAsia="DengXian" w:hAnsi="Calibri" w:cs="Arial"/>
+                <w:sz w:val="22"/>
+                <w:lang w:eastAsia="zh-CN"/>
+              </w:rPr>
+              <w:t xml:space="preserve">. It </w:t>
+            </w:r>
+            <w:r>
+              <w:rPr>
+                <w:rFonts w:ascii="Calibri" w:eastAsia="DengXian" w:hAnsi="Calibri" w:cs="Arial"/>
+                <w:sz w:val="22"/>
+                <w:lang w:eastAsia="zh-CN"/>
+              </w:rPr>
+              <w:t>tests without following a predefined plan.</w:t>
+            </w:r>
+          </w:p>
+          <w:p>
+            <w:pPr>
+              <w:pStyle w:val="ListParagraph"/>
+              <w:numPr>
+                <w:ilvl w:val="1"/>
+                <w:numId w:val="19"/>
+              </w:numPr>
+              <w:spacing w:after="160" w:line="259" w:lineRule="auto"/>
+              <w:rPr>
+                <w:rFonts w:ascii="Calibri" w:eastAsia="DengXian" w:hAnsi="Calibri" w:cs="Arial"/>
+                <w:sz w:val="22"/>
+                <w:lang w:eastAsia="zh-CN"/>
+              </w:rPr>
+            </w:pPr>
+            <w:r>
+              <w:rPr>
+                <w:rFonts w:ascii="Calibri" w:eastAsia="DengXian" w:hAnsi="Calibri" w:cs="Arial"/>
+                <w:sz w:val="22"/>
+                <w:lang w:eastAsia="zh-CN"/>
+              </w:rPr>
+              <w:t>Error Guessing</w:t>
+            </w:r>
+            <w:r>
+              <w:rPr>
+                <w:rFonts w:ascii="Calibri" w:eastAsia="DengXian" w:hAnsi="Calibri" w:cs="Arial"/>
+                <w:sz w:val="22"/>
+                <w:lang w:eastAsia="zh-CN"/>
+              </w:rPr>
+              <w:t>: It tests based on experience of tester. It predicts where bugs may occur.</w:t>
+            </w:r>
+          </w:p>
+          <w:p>
+            <w:pPr>
+              <w:pStyle w:val="ListParagraph"/>
+              <w:numPr>
+                <w:ilvl w:val="1"/>
+                <w:numId w:val="19"/>
+              </w:numPr>
+              <w:spacing w:after="160" w:line="259" w:lineRule="auto"/>
+              <w:rPr>
+                <w:rFonts w:ascii="Calibri" w:eastAsia="DengXian" w:hAnsi="Calibri" w:cs="Arial"/>
+                <w:sz w:val="22"/>
+                <w:lang w:eastAsia="zh-CN"/>
+              </w:rPr>
+            </w:pPr>
+            <w:r>
+              <w:rPr>
+                <w:rFonts w:ascii="Calibri" w:eastAsia="DengXian" w:hAnsi="Calibri" w:cs="Arial"/>
+                <w:sz w:val="22"/>
+                <w:lang w:eastAsia="zh-CN"/>
+              </w:rPr>
+              <w:t>Boundary Value Analysis (BVA)</w:t>
+            </w:r>
+            <w:r>
+              <w:rPr>
+                <w:rFonts w:ascii="Calibri" w:eastAsia="DengXian" w:hAnsi="Calibri" w:cs="Arial"/>
+                <w:sz w:val="22"/>
+                <w:lang w:eastAsia="zh-CN"/>
+              </w:rPr>
+              <w:t xml:space="preserve">:  </w:t>
+            </w:r>
+            <w:r>
+              <w:rPr>
+                <w:rFonts w:ascii="Calibri" w:eastAsia="DengXian" w:hAnsi="Calibri" w:cs="Arial"/>
+                <w:sz w:val="22"/>
+                <w:lang w:eastAsia="zh-CN"/>
+              </w:rPr>
+              <w:t>It tests the edge of valid input ranges where bugs are likely to occur.</w:t>
             </w:r>
           </w:p>
           <w:p>
@@ -3845,6 +4636,7 @@
                 <w:sz w:val="22"/>
                 <w:lang w:eastAsia="zh-CN"/>
               </w:rPr>
+              <w:lastRenderedPageBreak/>
               <w:t>Answer:</w:t>
             </w:r>
           </w:p>
@@ -3876,7 +4668,7 @@
                 </w:tcPr>
                 <w:p>
                   <w:pPr>
-                    <w:spacing w:after="160" w:line="259" w:lineRule="auto"/>
+                    <w:spacing w:after="120" w:line="259" w:lineRule="auto"/>
                     <w:rPr>
                       <w:rFonts w:ascii="Calibri" w:eastAsia="DengXian" w:hAnsi="Calibri" w:cs="Arial"/>
                       <w:b/>
@@ -3912,8 +4704,7 @@
                 </w:tcPr>
                 <w:p>
                   <w:pPr>
-                    <w:spacing w:after="160" w:line="259" w:lineRule="auto"/>
-                    <w:jc w:val="center"/>
+                    <w:spacing w:after="120" w:line="259" w:lineRule="auto"/>
                     <w:rPr>
                       <w:rFonts w:ascii="Calibri" w:eastAsia="DengXian" w:hAnsi="Calibri" w:cs="Arial"/>
                       <w:b/>
@@ -3949,7 +4740,7 @@
                 </w:tcPr>
                 <w:p>
                   <w:pPr>
-                    <w:spacing w:after="160" w:line="259" w:lineRule="auto"/>
+                    <w:spacing w:after="120" w:line="259" w:lineRule="auto"/>
                     <w:rPr>
                       <w:rFonts w:ascii="Calibri" w:eastAsia="DengXian" w:hAnsi="Calibri" w:cs="Arial"/>
                       <w:b/>
@@ -3974,6 +4765,9 @@
               </w:tc>
             </w:tr>
             <w:tr>
+              <w:trPr>
+                <w:trHeight w:val="505"/>
+              </w:trPr>
               <w:tc>
                 <w:tcPr>
                   <w:tcW w:w="1303" w:type="dxa"/>
@@ -3983,10 +4777,11 @@
                     <w:bottom w:val="single" w:sz="4" w:space="0" w:color="auto"/>
                     <w:right w:val="single" w:sz="4" w:space="0" w:color="auto"/>
                   </w:tcBorders>
+                  <w:vAlign w:val="center"/>
                 </w:tcPr>
                 <w:p>
                   <w:pPr>
-                    <w:spacing w:after="160" w:line="259" w:lineRule="auto"/>
+                    <w:spacing w:after="120" w:line="259" w:lineRule="auto"/>
                     <w:rPr>
                       <w:rFonts w:ascii="Calibri" w:eastAsia="DengXian" w:hAnsi="Calibri" w:cs="Arial"/>
                       <w:b/>
@@ -4018,10 +4813,11 @@
                     <w:bottom w:val="single" w:sz="4" w:space="0" w:color="auto"/>
                     <w:right w:val="single" w:sz="4" w:space="0" w:color="auto"/>
                   </w:tcBorders>
+                  <w:vAlign w:val="center"/>
                 </w:tcPr>
                 <w:p>
                   <w:pPr>
-                    <w:spacing w:after="160" w:line="259" w:lineRule="auto"/>
+                    <w:spacing w:after="120" w:line="259" w:lineRule="auto"/>
                     <w:rPr>
                       <w:rFonts w:ascii="Calibri" w:eastAsia="DengXian" w:hAnsi="Calibri" w:cs="Arial"/>
                       <w:color w:val="000000"/>
@@ -4029,6 +4825,17 @@
                       <w:lang w:eastAsia="zh-CN"/>
                     </w:rPr>
                   </w:pPr>
+                  <w:proofErr w:type="spellStart"/>
+                  <w:r>
+                    <w:rPr>
+                      <w:rFonts w:ascii="Calibri" w:eastAsia="DengXian" w:hAnsi="Calibri" w:cs="Arial"/>
+                      <w:color w:val="000000"/>
+                      <w:sz w:val="22"/>
+                      <w:lang w:eastAsia="zh-CN"/>
+                    </w:rPr>
+                    <w:t>MSTest</w:t>
+                  </w:r>
+                  <w:proofErr w:type="spellEnd"/>
                 </w:p>
               </w:tc>
               <w:tc>
@@ -4040,10 +4847,50 @@
                     <w:bottom w:val="single" w:sz="4" w:space="0" w:color="auto"/>
                     <w:right w:val="single" w:sz="4" w:space="0" w:color="auto"/>
                   </w:tcBorders>
+                  <w:vAlign w:val="center"/>
                 </w:tcPr>
+                <w:tbl>
+                  <w:tblPr>
+                    <w:tblW w:w="0" w:type="auto"/>
+                    <w:tblCellSpacing w:w="15" w:type="dxa"/>
+                    <w:tblCellMar>
+                      <w:top w:w="15" w:type="dxa"/>
+                      <w:left w:w="15" w:type="dxa"/>
+                      <w:bottom w:w="15" w:type="dxa"/>
+                      <w:right w:w="15" w:type="dxa"/>
+                    </w:tblCellMar>
+                    <w:tblLook w:val="04A0" w:firstRow="1" w:lastRow="0" w:firstColumn="1" w:lastColumn="0" w:noHBand="0" w:noVBand="1"/>
+                  </w:tblPr>
+                  <w:tblGrid>
+                    <w:gridCol w:w="96"/>
+                  </w:tblGrid>
+                  <w:tr>
+                    <w:trPr>
+                      <w:tblCellSpacing w:w="15" w:type="dxa"/>
+                    </w:trPr>
+                    <w:tc>
+                      <w:tcPr>
+                        <w:tcW w:w="0" w:type="auto"/>
+                        <w:vAlign w:val="center"/>
+                        <w:hideMark/>
+                      </w:tcPr>
+                      <w:p>
+                        <w:pPr>
+                          <w:spacing w:after="120" w:line="259" w:lineRule="auto"/>
+                          <w:rPr>
+                            <w:rFonts w:ascii="Calibri" w:eastAsia="DengXian" w:hAnsi="Calibri" w:cs="Arial"/>
+                            <w:color w:val="000000"/>
+                            <w:sz w:val="22"/>
+                            <w:lang w:val="en-US" w:eastAsia="zh-CN"/>
+                          </w:rPr>
+                        </w:pPr>
+                      </w:p>
+                    </w:tc>
+                  </w:tr>
+                </w:tbl>
                 <w:p>
                   <w:pPr>
-                    <w:spacing w:after="160" w:line="259" w:lineRule="auto"/>
+                    <w:spacing w:after="120" w:line="259" w:lineRule="auto"/>
                     <w:rPr>
                       <w:rFonts w:ascii="Calibri" w:eastAsia="DengXian" w:hAnsi="Calibri" w:cs="Arial"/>
                       <w:color w:val="000000"/>
@@ -4051,6 +4898,17 @@
                       <w:lang w:eastAsia="zh-CN"/>
                     </w:rPr>
                   </w:pPr>
+                  <w:hyperlink r:id="rId16" w:history="1">
+                    <w:r>
+                      <w:rPr>
+                        <w:rStyle w:val="Hyperlink"/>
+                        <w:rFonts w:ascii="Calibri" w:eastAsia="DengXian" w:hAnsi="Calibri" w:cs="Arial"/>
+                        <w:sz w:val="22"/>
+                        <w:lang w:val="en-US" w:eastAsia="zh-CN"/>
+                      </w:rPr>
+                      <w:t>https://learn.microsoft.com/en-us/dotnet/core/testing/unit-testing-mstest-intro</w:t>
+                    </w:r>
+                  </w:hyperlink>
                 </w:p>
               </w:tc>
             </w:tr>
@@ -4064,10 +4922,199 @@
                     <w:bottom w:val="single" w:sz="4" w:space="0" w:color="auto"/>
                     <w:right w:val="single" w:sz="4" w:space="0" w:color="auto"/>
                   </w:tcBorders>
+                  <w:vAlign w:val="center"/>
                 </w:tcPr>
                 <w:p>
                   <w:pPr>
-                    <w:spacing w:after="160" w:line="259" w:lineRule="auto"/>
+                    <w:spacing w:after="120" w:line="259" w:lineRule="auto"/>
+                    <w:rPr>
+                      <w:rFonts w:ascii="Calibri" w:eastAsia="DengXian" w:hAnsi="Calibri" w:cs="Arial"/>
+                      <w:b/>
+                      <w:bCs/>
+                      <w:color w:val="000000"/>
+                      <w:sz w:val="22"/>
+                      <w:lang w:eastAsia="zh-CN"/>
+                    </w:rPr>
+                  </w:pPr>
+                </w:p>
+              </w:tc>
+              <w:tc>
+                <w:tcPr>
+                  <w:tcW w:w="2551" w:type="dxa"/>
+                  <w:tcBorders>
+                    <w:top w:val="single" w:sz="4" w:space="0" w:color="auto"/>
+                    <w:left w:val="single" w:sz="4" w:space="0" w:color="auto"/>
+                    <w:bottom w:val="single" w:sz="4" w:space="0" w:color="auto"/>
+                    <w:right w:val="single" w:sz="4" w:space="0" w:color="auto"/>
+                  </w:tcBorders>
+                  <w:vAlign w:val="center"/>
+                </w:tcPr>
+                <w:p>
+                  <w:pPr>
+                    <w:spacing w:after="120" w:line="259" w:lineRule="auto"/>
+                    <w:rPr>
+                      <w:rFonts w:ascii="Calibri" w:eastAsia="DengXian" w:hAnsi="Calibri" w:cs="Arial"/>
+                      <w:color w:val="000000"/>
+                      <w:sz w:val="22"/>
+                      <w:lang w:eastAsia="zh-CN"/>
+                    </w:rPr>
+                  </w:pPr>
+                  <w:r>
+                    <w:rPr>
+                      <w:rFonts w:ascii="Calibri" w:eastAsia="DengXian" w:hAnsi="Calibri" w:cs="Arial"/>
+                      <w:color w:val="000000"/>
+                      <w:sz w:val="22"/>
+                      <w:lang w:eastAsia="zh-CN"/>
+                    </w:rPr>
+                    <w:t>xUnit.net</w:t>
+                  </w:r>
+                </w:p>
+              </w:tc>
+              <w:tc>
+                <w:tcPr>
+                  <w:tcW w:w="6688" w:type="dxa"/>
+                  <w:tcBorders>
+                    <w:top w:val="single" w:sz="4" w:space="0" w:color="auto"/>
+                    <w:left w:val="single" w:sz="4" w:space="0" w:color="auto"/>
+                    <w:bottom w:val="single" w:sz="4" w:space="0" w:color="auto"/>
+                    <w:right w:val="single" w:sz="4" w:space="0" w:color="auto"/>
+                  </w:tcBorders>
+                  <w:vAlign w:val="center"/>
+                </w:tcPr>
+                <w:p>
+                  <w:pPr>
+                    <w:spacing w:after="120" w:line="259" w:lineRule="auto"/>
+                    <w:rPr>
+                      <w:rFonts w:ascii="Calibri" w:eastAsia="DengXian" w:hAnsi="Calibri" w:cs="Arial"/>
+                      <w:color w:val="000000"/>
+                      <w:sz w:val="22"/>
+                      <w:lang w:eastAsia="zh-CN"/>
+                    </w:rPr>
+                  </w:pPr>
+                  <w:hyperlink r:id="rId17" w:history="1">
+                    <w:r>
+                      <w:rPr>
+                        <w:rStyle w:val="Hyperlink"/>
+                        <w:rFonts w:ascii="Calibri" w:eastAsia="DengXian" w:hAnsi="Calibri" w:cs="Arial"/>
+                        <w:sz w:val="22"/>
+                        <w:lang w:eastAsia="zh-CN"/>
+                      </w:rPr>
+                      <w:t>https://xunit.net/</w:t>
+                    </w:r>
+                  </w:hyperlink>
+                </w:p>
+              </w:tc>
+            </w:tr>
+            <w:tr>
+              <w:tc>
+                <w:tcPr>
+                  <w:tcW w:w="1303" w:type="dxa"/>
+                  <w:tcBorders>
+                    <w:top w:val="single" w:sz="4" w:space="0" w:color="auto"/>
+                    <w:left w:val="single" w:sz="4" w:space="0" w:color="auto"/>
+                    <w:bottom w:val="single" w:sz="4" w:space="0" w:color="auto"/>
+                    <w:right w:val="single" w:sz="4" w:space="0" w:color="auto"/>
+                  </w:tcBorders>
+                  <w:vAlign w:val="center"/>
+                </w:tcPr>
+                <w:p>
+                  <w:pPr>
+                    <w:spacing w:after="120" w:line="259" w:lineRule="auto"/>
+                    <w:rPr>
+                      <w:rFonts w:ascii="Calibri" w:eastAsia="DengXian" w:hAnsi="Calibri" w:cs="Arial"/>
+                      <w:b/>
+                      <w:bCs/>
+                      <w:color w:val="000000"/>
+                      <w:sz w:val="22"/>
+                      <w:lang w:eastAsia="zh-CN"/>
+                    </w:rPr>
+                  </w:pPr>
+                </w:p>
+              </w:tc>
+              <w:tc>
+                <w:tcPr>
+                  <w:tcW w:w="2551" w:type="dxa"/>
+                  <w:tcBorders>
+                    <w:top w:val="single" w:sz="4" w:space="0" w:color="auto"/>
+                    <w:left w:val="single" w:sz="4" w:space="0" w:color="auto"/>
+                    <w:bottom w:val="single" w:sz="4" w:space="0" w:color="auto"/>
+                    <w:right w:val="single" w:sz="4" w:space="0" w:color="auto"/>
+                  </w:tcBorders>
+                  <w:vAlign w:val="center"/>
+                </w:tcPr>
+                <w:p>
+                  <w:pPr>
+                    <w:spacing w:after="120" w:line="259" w:lineRule="auto"/>
+                    <w:rPr>
+                      <w:rFonts w:ascii="Calibri" w:eastAsia="DengXian" w:hAnsi="Calibri" w:cs="Arial"/>
+                      <w:color w:val="000000"/>
+                      <w:sz w:val="22"/>
+                      <w:lang w:eastAsia="zh-CN"/>
+                    </w:rPr>
+                  </w:pPr>
+                  <w:proofErr w:type="spellStart"/>
+                  <w:r>
+                    <w:rPr>
+                      <w:rFonts w:ascii="Calibri" w:eastAsia="DengXian" w:hAnsi="Calibri" w:cs="Arial"/>
+                      <w:color w:val="000000"/>
+                      <w:sz w:val="22"/>
+                      <w:lang w:eastAsia="zh-CN"/>
+                    </w:rPr>
+                    <w:t>NUnit</w:t>
+                  </w:r>
+                  <w:proofErr w:type="spellEnd"/>
+                </w:p>
+              </w:tc>
+              <w:tc>
+                <w:tcPr>
+                  <w:tcW w:w="6688" w:type="dxa"/>
+                  <w:tcBorders>
+                    <w:top w:val="single" w:sz="4" w:space="0" w:color="auto"/>
+                    <w:left w:val="single" w:sz="4" w:space="0" w:color="auto"/>
+                    <w:bottom w:val="single" w:sz="4" w:space="0" w:color="auto"/>
+                    <w:right w:val="single" w:sz="4" w:space="0" w:color="auto"/>
+                  </w:tcBorders>
+                  <w:vAlign w:val="center"/>
+                </w:tcPr>
+                <w:p>
+                  <w:pPr>
+                    <w:spacing w:after="120" w:line="259" w:lineRule="auto"/>
+                    <w:rPr>
+                      <w:rFonts w:ascii="Calibri" w:eastAsia="DengXian" w:hAnsi="Calibri" w:cs="Arial"/>
+                      <w:color w:val="000000"/>
+                      <w:sz w:val="22"/>
+                      <w:lang w:eastAsia="zh-CN"/>
+                    </w:rPr>
+                  </w:pPr>
+                  <w:hyperlink r:id="rId18" w:history="1">
+                    <w:r>
+                      <w:rPr>
+                        <w:rStyle w:val="Hyperlink"/>
+                        <w:rFonts w:ascii="Calibri" w:eastAsia="DengXian" w:hAnsi="Calibri" w:cs="Arial"/>
+                        <w:sz w:val="22"/>
+                        <w:lang w:eastAsia="zh-CN"/>
+                      </w:rPr>
+                      <w:t>https://nunit.org/</w:t>
+                    </w:r>
+                  </w:hyperlink>
+                </w:p>
+              </w:tc>
+            </w:tr>
+            <w:tr>
+              <w:tc>
+                <w:tcPr>
+                  <w:tcW w:w="1303" w:type="dxa"/>
+                  <w:tcBorders>
+                    <w:top w:val="single" w:sz="4" w:space="0" w:color="auto"/>
+                    <w:left w:val="single" w:sz="4" w:space="0" w:color="auto"/>
+                    <w:bottom w:val="single" w:sz="4" w:space="0" w:color="auto"/>
+                    <w:right w:val="single" w:sz="4" w:space="0" w:color="auto"/>
+                  </w:tcBorders>
+                  <w:vAlign w:val="center"/>
+                </w:tcPr>
+                <w:p>
+                  <w:pPr>
+                    <w:spacing w:after="120" w:line="259" w:lineRule="auto"/>
                     <w:rPr>
                       <w:rFonts w:ascii="Calibri" w:eastAsia="DengXian" w:hAnsi="Calibri" w:cs="Arial"/>
                       <w:b/>
@@ -4099,10 +5146,168 @@
                     <w:bottom w:val="single" w:sz="4" w:space="0" w:color="auto"/>
                     <w:right w:val="single" w:sz="4" w:space="0" w:color="auto"/>
                   </w:tcBorders>
+                  <w:vAlign w:val="center"/>
                 </w:tcPr>
                 <w:p>
                   <w:pPr>
-                    <w:spacing w:after="160" w:line="259" w:lineRule="auto"/>
+                    <w:spacing w:after="120" w:line="259" w:lineRule="auto"/>
+                    <w:rPr>
+                      <w:rFonts w:ascii="Calibri" w:eastAsia="DengXian" w:hAnsi="Calibri" w:cs="Arial"/>
+                      <w:color w:val="000000"/>
+                      <w:sz w:val="22"/>
+                      <w:lang w:eastAsia="zh-CN"/>
+                    </w:rPr>
+                  </w:pPr>
+                  <w:proofErr w:type="spellStart"/>
+                  <w:r>
+                    <w:rPr>
+                      <w:rFonts w:ascii="Calibri" w:eastAsia="DengXian" w:hAnsi="Calibri" w:cs="Arial"/>
+                      <w:color w:val="000000"/>
+                      <w:sz w:val="22"/>
+                      <w:lang w:eastAsia="zh-CN"/>
+                    </w:rPr>
+                    <w:t>unittest</w:t>
+                  </w:r>
+                  <w:proofErr w:type="spellEnd"/>
+                </w:p>
+              </w:tc>
+              <w:tc>
+                <w:tcPr>
+                  <w:tcW w:w="6688" w:type="dxa"/>
+                  <w:tcBorders>
+                    <w:top w:val="single" w:sz="4" w:space="0" w:color="auto"/>
+                    <w:left w:val="single" w:sz="4" w:space="0" w:color="auto"/>
+                    <w:bottom w:val="single" w:sz="4" w:space="0" w:color="auto"/>
+                    <w:right w:val="single" w:sz="4" w:space="0" w:color="auto"/>
+                  </w:tcBorders>
+                  <w:vAlign w:val="center"/>
+                </w:tcPr>
+                <w:p>
+                  <w:pPr>
+                    <w:spacing w:after="120" w:line="259" w:lineRule="auto"/>
+                    <w:rPr>
+                      <w:rFonts w:ascii="Calibri" w:eastAsia="DengXian" w:hAnsi="Calibri" w:cs="Arial"/>
+                      <w:color w:val="000000"/>
+                      <w:sz w:val="22"/>
+                      <w:lang w:eastAsia="zh-CN"/>
+                    </w:rPr>
+                  </w:pPr>
+                  <w:hyperlink r:id="rId19" w:history="1">
+                    <w:r>
+                      <w:rPr>
+                        <w:rStyle w:val="Hyperlink"/>
+                        <w:rFonts w:ascii="Calibri" w:eastAsia="DengXian" w:hAnsi="Calibri" w:cs="Arial"/>
+                        <w:sz w:val="22"/>
+                        <w:lang w:eastAsia="zh-CN"/>
+                      </w:rPr>
+                      <w:t>https://docs.python.org/3/library/unittest.html</w:t>
+                    </w:r>
+                  </w:hyperlink>
+                </w:p>
+              </w:tc>
+            </w:tr>
+            <w:tr>
+              <w:tc>
+                <w:tcPr>
+                  <w:tcW w:w="1303" w:type="dxa"/>
+                  <w:tcBorders>
+                    <w:top w:val="single" w:sz="4" w:space="0" w:color="auto"/>
+                    <w:left w:val="single" w:sz="4" w:space="0" w:color="auto"/>
+                    <w:bottom w:val="single" w:sz="4" w:space="0" w:color="auto"/>
+                    <w:right w:val="single" w:sz="4" w:space="0" w:color="auto"/>
+                  </w:tcBorders>
+                  <w:vAlign w:val="center"/>
+                </w:tcPr>
+                <w:p>
+                  <w:pPr>
+                    <w:spacing w:after="120" w:line="259" w:lineRule="auto"/>
+                    <w:rPr>
+                      <w:rFonts w:ascii="Calibri" w:eastAsia="DengXian" w:hAnsi="Calibri" w:cs="Arial"/>
+                      <w:b/>
+                      <w:bCs/>
+                      <w:color w:val="000000"/>
+                      <w:sz w:val="22"/>
+                      <w:lang w:eastAsia="zh-CN"/>
+                    </w:rPr>
+                  </w:pPr>
+                </w:p>
+              </w:tc>
+              <w:tc>
+                <w:tcPr>
+                  <w:tcW w:w="2551" w:type="dxa"/>
+                  <w:tcBorders>
+                    <w:top w:val="single" w:sz="4" w:space="0" w:color="auto"/>
+                    <w:left w:val="single" w:sz="4" w:space="0" w:color="auto"/>
+                    <w:bottom w:val="single" w:sz="4" w:space="0" w:color="auto"/>
+                    <w:right w:val="single" w:sz="4" w:space="0" w:color="auto"/>
+                  </w:tcBorders>
+                  <w:vAlign w:val="center"/>
+                </w:tcPr>
+                <w:tbl>
+                  <w:tblPr>
+                    <w:tblW w:w="0" w:type="auto"/>
+                    <w:tblCellSpacing w:w="15" w:type="dxa"/>
+                    <w:tblCellMar>
+                      <w:top w:w="15" w:type="dxa"/>
+                      <w:left w:w="15" w:type="dxa"/>
+                      <w:bottom w:w="15" w:type="dxa"/>
+                      <w:right w:w="15" w:type="dxa"/>
+                    </w:tblCellMar>
+                    <w:tblLook w:val="04A0" w:firstRow="1" w:lastRow="0" w:firstColumn="1" w:lastColumn="0" w:noHBand="0" w:noVBand="1"/>
+                  </w:tblPr>
+                  <w:tblGrid>
+                    <w:gridCol w:w="96"/>
+                  </w:tblGrid>
+                  <w:tr>
+                    <w:trPr>
+                      <w:tblCellSpacing w:w="15" w:type="dxa"/>
+                    </w:trPr>
+                    <w:tc>
+                      <w:tcPr>
+                        <w:tcW w:w="0" w:type="auto"/>
+                        <w:vAlign w:val="center"/>
+                        <w:hideMark/>
+                      </w:tcPr>
+                      <w:p>
+                        <w:pPr>
+                          <w:spacing w:after="120" w:line="259" w:lineRule="auto"/>
+                          <w:rPr>
+                            <w:rFonts w:ascii="Calibri" w:eastAsia="DengXian" w:hAnsi="Calibri" w:cs="Arial"/>
+                            <w:color w:val="000000"/>
+                            <w:sz w:val="22"/>
+                            <w:lang w:val="en-US" w:eastAsia="zh-CN"/>
+                          </w:rPr>
+                        </w:pPr>
+                      </w:p>
+                    </w:tc>
+                  </w:tr>
+                </w:tbl>
+                <w:p>
+                  <w:pPr>
+                    <w:spacing w:after="120" w:line="259" w:lineRule="auto"/>
+                    <w:rPr>
+                      <w:rFonts w:ascii="Calibri" w:eastAsia="DengXian" w:hAnsi="Calibri" w:cs="Arial"/>
+                      <w:vanish/>
+                      <w:color w:val="000000"/>
+                      <w:sz w:val="22"/>
+                      <w:lang w:val="en-US" w:eastAsia="zh-CN"/>
+                    </w:rPr>
+                  </w:pPr>
+                  <w:proofErr w:type="spellStart"/>
+                  <w:r>
+                    <w:rPr>
+                      <w:rFonts w:ascii="Calibri" w:eastAsia="DengXian" w:hAnsi="Calibri" w:cs="Arial"/>
+                      <w:color w:val="000000"/>
+                      <w:sz w:val="22"/>
+                      <w:lang w:val="en-US" w:eastAsia="zh-CN"/>
+                    </w:rPr>
+                    <w:t>pytest</w:t>
+                  </w:r>
+                  <w:proofErr w:type="spellEnd"/>
+                </w:p>
+                <w:p>
+                  <w:pPr>
+                    <w:spacing w:after="120" w:line="259" w:lineRule="auto"/>
                     <w:rPr>
                       <w:rFonts w:ascii="Calibri" w:eastAsia="DengXian" w:hAnsi="Calibri" w:cs="Arial"/>
                       <w:color w:val="000000"/>
@@ -4121,10 +5326,11 @@
                     <w:bottom w:val="single" w:sz="4" w:space="0" w:color="auto"/>
                     <w:right w:val="single" w:sz="4" w:space="0" w:color="auto"/>
                   </w:tcBorders>
+                  <w:vAlign w:val="center"/>
                 </w:tcPr>
                 <w:p>
                   <w:pPr>
-                    <w:spacing w:after="160" w:line="259" w:lineRule="auto"/>
+                    <w:spacing w:after="120" w:line="259" w:lineRule="auto"/>
                     <w:rPr>
                       <w:rFonts w:ascii="Calibri" w:eastAsia="DengXian" w:hAnsi="Calibri" w:cs="Arial"/>
                       <w:color w:val="000000"/>
@@ -4132,6 +5338,17 @@
                       <w:lang w:eastAsia="zh-CN"/>
                     </w:rPr>
                   </w:pPr>
+                  <w:hyperlink r:id="rId20" w:history="1">
+                    <w:r>
+                      <w:rPr>
+                        <w:rStyle w:val="Hyperlink"/>
+                        <w:rFonts w:ascii="Calibri" w:eastAsia="DengXian" w:hAnsi="Calibri" w:cs="Arial"/>
+                        <w:sz w:val="22"/>
+                        <w:lang w:eastAsia="zh-CN"/>
+                      </w:rPr>
+                      <w:t>https://docs.pytest.org/en/stable/</w:t>
+                    </w:r>
+                  </w:hyperlink>
                 </w:p>
               </w:tc>
             </w:tr>
@@ -4145,10 +5362,11 @@
                     <w:bottom w:val="single" w:sz="4" w:space="0" w:color="auto"/>
                     <w:right w:val="single" w:sz="4" w:space="0" w:color="auto"/>
                   </w:tcBorders>
+                  <w:vAlign w:val="center"/>
                 </w:tcPr>
                 <w:p>
                   <w:pPr>
-                    <w:spacing w:after="160" w:line="259" w:lineRule="auto"/>
+                    <w:spacing w:after="120" w:line="259" w:lineRule="auto"/>
                     <w:rPr>
                       <w:rFonts w:ascii="Calibri" w:eastAsia="DengXian" w:hAnsi="Calibri" w:cs="Arial"/>
                       <w:b/>
@@ -4180,10 +5398,11 @@
                     <w:bottom w:val="single" w:sz="4" w:space="0" w:color="auto"/>
                     <w:right w:val="single" w:sz="4" w:space="0" w:color="auto"/>
                   </w:tcBorders>
+                  <w:vAlign w:val="center"/>
                 </w:tcPr>
                 <w:p>
                   <w:pPr>
-                    <w:spacing w:after="160" w:line="259" w:lineRule="auto"/>
+                    <w:spacing w:after="120" w:line="259" w:lineRule="auto"/>
                     <w:rPr>
                       <w:rFonts w:ascii="Calibri" w:eastAsia="DengXian" w:hAnsi="Calibri" w:cs="Arial"/>
                       <w:color w:val="000000"/>
@@ -4191,6 +5410,15 @@
                       <w:lang w:eastAsia="zh-CN"/>
                     </w:rPr>
                   </w:pPr>
+                  <w:r>
+                    <w:rPr>
+                      <w:rFonts w:ascii="Calibri" w:eastAsia="DengXian" w:hAnsi="Calibri" w:cs="Arial"/>
+                      <w:color w:val="000000"/>
+                      <w:sz w:val="22"/>
+                      <w:lang w:eastAsia="zh-CN"/>
+                    </w:rPr>
+                    <w:t>Jest</w:t>
+                  </w:r>
                 </w:p>
               </w:tc>
               <w:tc>
@@ -4202,10 +5430,11 @@
                     <w:bottom w:val="single" w:sz="4" w:space="0" w:color="auto"/>
                     <w:right w:val="single" w:sz="4" w:space="0" w:color="auto"/>
                   </w:tcBorders>
+                  <w:vAlign w:val="center"/>
                 </w:tcPr>
                 <w:p>
                   <w:pPr>
-                    <w:spacing w:after="160" w:line="259" w:lineRule="auto"/>
+                    <w:spacing w:after="120" w:line="259" w:lineRule="auto"/>
                     <w:rPr>
                       <w:rFonts w:ascii="Calibri" w:eastAsia="DengXian" w:hAnsi="Calibri" w:cs="Arial"/>
                       <w:color w:val="000000"/>
@@ -4213,21 +5442,258 @@
                       <w:lang w:eastAsia="zh-CN"/>
                     </w:rPr>
                   </w:pPr>
+                  <w:hyperlink r:id="rId21" w:history="1">
+                    <w:r>
+                      <w:rPr>
+                        <w:rStyle w:val="Hyperlink"/>
+                        <w:rFonts w:ascii="Calibri" w:eastAsia="DengXian" w:hAnsi="Calibri" w:cs="Arial"/>
+                        <w:sz w:val="22"/>
+                        <w:lang w:eastAsia="zh-CN"/>
+                      </w:rPr>
+                      <w:t>https://jestjs.io/</w:t>
+                    </w:r>
+                  </w:hyperlink>
+                </w:p>
+              </w:tc>
+            </w:tr>
+            <w:tr>
+              <w:tc>
+                <w:tcPr>
+                  <w:tcW w:w="1303" w:type="dxa"/>
+                  <w:tcBorders>
+                    <w:top w:val="single" w:sz="4" w:space="0" w:color="auto"/>
+                    <w:left w:val="single" w:sz="4" w:space="0" w:color="auto"/>
+                    <w:bottom w:val="single" w:sz="4" w:space="0" w:color="auto"/>
+                    <w:right w:val="single" w:sz="4" w:space="0" w:color="auto"/>
+                  </w:tcBorders>
+                  <w:vAlign w:val="center"/>
+                </w:tcPr>
+                <w:p>
+                  <w:pPr>
+                    <w:spacing w:after="120" w:line="259" w:lineRule="auto"/>
+                    <w:rPr>
+                      <w:rFonts w:ascii="Calibri" w:eastAsia="DengXian" w:hAnsi="Calibri" w:cs="Arial"/>
+                      <w:b/>
+                      <w:bCs/>
+                      <w:color w:val="000000"/>
+                      <w:sz w:val="22"/>
+                      <w:lang w:eastAsia="zh-CN"/>
+                    </w:rPr>
+                  </w:pPr>
+                </w:p>
+              </w:tc>
+              <w:tc>
+                <w:tcPr>
+                  <w:tcW w:w="2551" w:type="dxa"/>
+                  <w:tcBorders>
+                    <w:top w:val="single" w:sz="4" w:space="0" w:color="auto"/>
+                    <w:left w:val="single" w:sz="4" w:space="0" w:color="auto"/>
+                    <w:bottom w:val="single" w:sz="4" w:space="0" w:color="auto"/>
+                    <w:right w:val="single" w:sz="4" w:space="0" w:color="auto"/>
+                  </w:tcBorders>
+                  <w:vAlign w:val="center"/>
+                </w:tcPr>
+                <w:tbl>
+                  <w:tblPr>
+                    <w:tblW w:w="0" w:type="auto"/>
+                    <w:tblCellSpacing w:w="15" w:type="dxa"/>
+                    <w:tblCellMar>
+                      <w:top w:w="15" w:type="dxa"/>
+                      <w:left w:w="15" w:type="dxa"/>
+                      <w:bottom w:w="15" w:type="dxa"/>
+                      <w:right w:w="15" w:type="dxa"/>
+                    </w:tblCellMar>
+                    <w:tblLook w:val="04A0" w:firstRow="1" w:lastRow="0" w:firstColumn="1" w:lastColumn="0" w:noHBand="0" w:noVBand="1"/>
+                  </w:tblPr>
+                  <w:tblGrid>
+                    <w:gridCol w:w="96"/>
+                  </w:tblGrid>
+                  <w:tr>
+                    <w:trPr>
+                      <w:tblCellSpacing w:w="15" w:type="dxa"/>
+                    </w:trPr>
+                    <w:tc>
+                      <w:tcPr>
+                        <w:tcW w:w="0" w:type="auto"/>
+                        <w:vAlign w:val="center"/>
+                        <w:hideMark/>
+                      </w:tcPr>
+                      <w:p>
+                        <w:pPr>
+                          <w:spacing w:after="120" w:line="259" w:lineRule="auto"/>
+                          <w:rPr>
+                            <w:rFonts w:ascii="Calibri" w:eastAsia="DengXian" w:hAnsi="Calibri" w:cs="Arial"/>
+                            <w:color w:val="000000"/>
+                            <w:sz w:val="22"/>
+                            <w:lang w:val="en-US" w:eastAsia="zh-CN"/>
+                          </w:rPr>
+                        </w:pPr>
+                      </w:p>
+                    </w:tc>
+                  </w:tr>
+                </w:tbl>
+                <w:p>
+                  <w:pPr>
+                    <w:spacing w:after="120" w:line="259" w:lineRule="auto"/>
+                    <w:rPr>
+                      <w:rFonts w:ascii="Calibri" w:eastAsia="DengXian" w:hAnsi="Calibri" w:cs="Arial"/>
+                      <w:vanish/>
+                      <w:color w:val="000000"/>
+                      <w:sz w:val="22"/>
+                      <w:lang w:val="en-US" w:eastAsia="zh-CN"/>
+                    </w:rPr>
+                  </w:pPr>
+                </w:p>
+                <w:p>
+                  <w:pPr>
+                    <w:spacing w:after="120" w:line="259" w:lineRule="auto"/>
+                    <w:rPr>
+                      <w:rFonts w:ascii="Calibri" w:eastAsia="DengXian" w:hAnsi="Calibri" w:cs="Arial"/>
+                      <w:color w:val="000000"/>
+                      <w:sz w:val="22"/>
+                      <w:lang w:eastAsia="zh-CN"/>
+                    </w:rPr>
+                  </w:pPr>
+                  <w:r>
+                    <w:rPr>
+                      <w:rFonts w:ascii="Calibri" w:eastAsia="DengXian" w:hAnsi="Calibri" w:cs="Arial"/>
+                      <w:color w:val="000000"/>
+                      <w:sz w:val="22"/>
+                      <w:lang w:eastAsia="zh-CN"/>
+                    </w:rPr>
+                    <w:t>Mocha</w:t>
+                  </w:r>
+                </w:p>
+              </w:tc>
+              <w:tc>
+                <w:tcPr>
+                  <w:tcW w:w="6688" w:type="dxa"/>
+                  <w:tcBorders>
+                    <w:top w:val="single" w:sz="4" w:space="0" w:color="auto"/>
+                    <w:left w:val="single" w:sz="4" w:space="0" w:color="auto"/>
+                    <w:bottom w:val="single" w:sz="4" w:space="0" w:color="auto"/>
+                    <w:right w:val="single" w:sz="4" w:space="0" w:color="auto"/>
+                  </w:tcBorders>
+                  <w:vAlign w:val="center"/>
+                </w:tcPr>
+                <w:p>
+                  <w:pPr>
+                    <w:spacing w:after="120" w:line="259" w:lineRule="auto"/>
+                    <w:rPr>
+                      <w:rFonts w:ascii="Calibri" w:eastAsia="DengXian" w:hAnsi="Calibri" w:cs="Arial"/>
+                      <w:color w:val="000000"/>
+                      <w:sz w:val="22"/>
+                      <w:lang w:eastAsia="zh-CN"/>
+                    </w:rPr>
+                  </w:pPr>
+                  <w:hyperlink r:id="rId22" w:history="1">
+                    <w:r>
+                      <w:rPr>
+                        <w:rStyle w:val="Hyperlink"/>
+                        <w:rFonts w:ascii="Calibri" w:eastAsia="DengXian" w:hAnsi="Calibri" w:cs="Arial"/>
+                        <w:sz w:val="22"/>
+                        <w:lang w:eastAsia="zh-CN"/>
+                      </w:rPr>
+                      <w:t>https://mochajs.org/</w:t>
+                    </w:r>
+                  </w:hyperlink>
+                </w:p>
+              </w:tc>
+            </w:tr>
+            <w:tr>
+              <w:tc>
+                <w:tcPr>
+                  <w:tcW w:w="1303" w:type="dxa"/>
+                  <w:tcBorders>
+                    <w:top w:val="single" w:sz="4" w:space="0" w:color="auto"/>
+                    <w:left w:val="single" w:sz="4" w:space="0" w:color="auto"/>
+                    <w:bottom w:val="single" w:sz="4" w:space="0" w:color="auto"/>
+                    <w:right w:val="single" w:sz="4" w:space="0" w:color="auto"/>
+                  </w:tcBorders>
+                  <w:vAlign w:val="center"/>
+                </w:tcPr>
+                <w:p>
+                  <w:pPr>
+                    <w:spacing w:after="120" w:line="259" w:lineRule="auto"/>
+                    <w:rPr>
+                      <w:rFonts w:ascii="Calibri" w:eastAsia="DengXian" w:hAnsi="Calibri" w:cs="Arial"/>
+                      <w:b/>
+                      <w:bCs/>
+                      <w:color w:val="000000"/>
+                      <w:sz w:val="22"/>
+                      <w:lang w:eastAsia="zh-CN"/>
+                    </w:rPr>
+                  </w:pPr>
+                </w:p>
+              </w:tc>
+              <w:tc>
+                <w:tcPr>
+                  <w:tcW w:w="2551" w:type="dxa"/>
+                  <w:tcBorders>
+                    <w:top w:val="single" w:sz="4" w:space="0" w:color="auto"/>
+                    <w:left w:val="single" w:sz="4" w:space="0" w:color="auto"/>
+                    <w:bottom w:val="single" w:sz="4" w:space="0" w:color="auto"/>
+                    <w:right w:val="single" w:sz="4" w:space="0" w:color="auto"/>
+                  </w:tcBorders>
+                  <w:vAlign w:val="center"/>
+                </w:tcPr>
+                <w:p>
+                  <w:pPr>
+                    <w:spacing w:after="120" w:line="259" w:lineRule="auto"/>
+                    <w:rPr>
+                      <w:rFonts w:ascii="Calibri" w:eastAsia="DengXian" w:hAnsi="Calibri" w:cs="Arial"/>
+                      <w:color w:val="000000"/>
+                      <w:sz w:val="22"/>
+                      <w:lang w:val="en-US" w:eastAsia="zh-CN"/>
+                    </w:rPr>
+                  </w:pPr>
+                  <w:r>
+                    <w:rPr>
+                      <w:rFonts w:ascii="Calibri" w:eastAsia="DengXian" w:hAnsi="Calibri" w:cs="Arial"/>
+                      <w:color w:val="000000"/>
+                      <w:sz w:val="22"/>
+                      <w:lang w:val="en-US" w:eastAsia="zh-CN"/>
+                    </w:rPr>
+                    <w:t>Jasmine</w:t>
+                  </w:r>
+                </w:p>
+              </w:tc>
+              <w:tc>
+                <w:tcPr>
+                  <w:tcW w:w="6688" w:type="dxa"/>
+                  <w:tcBorders>
+                    <w:top w:val="single" w:sz="4" w:space="0" w:color="auto"/>
+                    <w:left w:val="single" w:sz="4" w:space="0" w:color="auto"/>
+                    <w:bottom w:val="single" w:sz="4" w:space="0" w:color="auto"/>
+                    <w:right w:val="single" w:sz="4" w:space="0" w:color="auto"/>
+                  </w:tcBorders>
+                  <w:vAlign w:val="center"/>
+                </w:tcPr>
+                <w:p>
+                  <w:pPr>
+                    <w:spacing w:after="120" w:line="259" w:lineRule="auto"/>
+                    <w:rPr>
+                      <w:rFonts w:ascii="Calibri" w:eastAsia="DengXian" w:hAnsi="Calibri" w:cs="Arial"/>
+                      <w:color w:val="000000"/>
+                      <w:sz w:val="22"/>
+                      <w:lang w:eastAsia="zh-CN"/>
+                    </w:rPr>
+                  </w:pPr>
+                  <w:hyperlink r:id="rId23" w:history="1">
+                    <w:r>
+                      <w:rPr>
+                        <w:rStyle w:val="Hyperlink"/>
+                        <w:rFonts w:ascii="Calibri" w:eastAsia="DengXian" w:hAnsi="Calibri" w:cs="Arial"/>
+                        <w:sz w:val="22"/>
+                        <w:lang w:eastAsia="zh-CN"/>
+                      </w:rPr>
+                      <w:t>https://jasmine.github.io/</w:t>
+                    </w:r>
+                  </w:hyperlink>
                 </w:p>
               </w:tc>
             </w:tr>
           </w:tbl>
-          <w:p>
-            <w:pPr>
-              <w:spacing w:after="160" w:line="259" w:lineRule="auto"/>
-              <w:rPr>
-                <w:rFonts w:ascii="Calibri" w:eastAsia="DengXian" w:hAnsi="Calibri" w:cs="Arial"/>
-                <w:color w:val="A6A6A6"/>
-                <w:sz w:val="22"/>
-                <w:lang w:eastAsia="zh-CN"/>
-              </w:rPr>
-            </w:pPr>
-          </w:p>
           <w:p>
             <w:pPr>
               <w:spacing w:after="160" w:line="259" w:lineRule="auto"/>
@@ -4321,16 +5787,195 @@
                 <w:lang w:eastAsia="zh-CN"/>
               </w:rPr>
             </w:pPr>
-          </w:p>
-          <w:p>
-            <w:pPr>
-              <w:spacing w:after="160" w:line="259" w:lineRule="auto"/>
-              <w:rPr>
-                <w:rFonts w:ascii="Calibri" w:eastAsia="DengXian" w:hAnsi="Calibri" w:cs="Arial"/>
-                <w:sz w:val="22"/>
-                <w:lang w:eastAsia="zh-CN"/>
-              </w:rPr>
-            </w:pPr>
+            <w:r>
+              <w:rPr>
+                <w:rFonts w:ascii="Calibri" w:eastAsia="DengXian" w:hAnsi="Calibri" w:cs="Arial"/>
+                <w:sz w:val="22"/>
+                <w:lang w:eastAsia="zh-CN"/>
+              </w:rPr>
+              <w:t xml:space="preserve">The IPO concept in software testing </w:t>
+            </w:r>
+            <w:r>
+              <w:rPr>
+                <w:rFonts w:ascii="Calibri" w:eastAsia="DengXian" w:hAnsi="Calibri" w:cs="Arial"/>
+                <w:sz w:val="22"/>
+                <w:lang w:eastAsia="zh-CN"/>
+              </w:rPr>
+              <w:t xml:space="preserve">is a model that </w:t>
+            </w:r>
+            <w:r>
+              <w:rPr>
+                <w:rFonts w:ascii="Calibri" w:eastAsia="DengXian" w:hAnsi="Calibri" w:cs="Arial"/>
+                <w:sz w:val="22"/>
+                <w:lang w:eastAsia="zh-CN"/>
+              </w:rPr>
+              <w:t xml:space="preserve">helps structure and evaluate a system's </w:t>
+            </w:r>
+            <w:r>
+              <w:rPr>
+                <w:rFonts w:ascii="Calibri" w:eastAsia="DengXian" w:hAnsi="Calibri" w:cs="Arial"/>
+                <w:sz w:val="22"/>
+                <w:lang w:eastAsia="zh-CN"/>
+              </w:rPr>
+              <w:t>behaviour</w:t>
+            </w:r>
+            <w:r>
+              <w:rPr>
+                <w:rFonts w:ascii="Calibri" w:eastAsia="DengXian" w:hAnsi="Calibri" w:cs="Arial"/>
+                <w:sz w:val="22"/>
+                <w:lang w:eastAsia="zh-CN"/>
+              </w:rPr>
+              <w:t>:</w:t>
+            </w:r>
+          </w:p>
+          <w:p>
+            <w:pPr>
+              <w:pStyle w:val="ListParagraph"/>
+              <w:numPr>
+                <w:ilvl w:val="0"/>
+                <w:numId w:val="21"/>
+              </w:numPr>
+              <w:spacing w:after="160" w:line="259" w:lineRule="auto"/>
+              <w:rPr>
+                <w:rFonts w:ascii="Calibri" w:eastAsia="DengXian" w:hAnsi="Calibri" w:cs="Arial"/>
+                <w:sz w:val="22"/>
+                <w:lang w:eastAsia="zh-CN"/>
+              </w:rPr>
+            </w:pPr>
+            <w:r>
+              <w:rPr>
+                <w:rFonts w:ascii="Calibri" w:eastAsia="DengXian" w:hAnsi="Calibri" w:cs="Arial"/>
+                <w:sz w:val="22"/>
+                <w:lang w:eastAsia="zh-CN"/>
+              </w:rPr>
+              <w:t xml:space="preserve">Inputs: </w:t>
+            </w:r>
+            <w:r>
+              <w:rPr>
+                <w:rFonts w:ascii="Calibri" w:eastAsia="DengXian" w:hAnsi="Calibri" w:cs="Arial"/>
+                <w:sz w:val="22"/>
+                <w:lang w:eastAsia="zh-CN"/>
+              </w:rPr>
+              <w:t>These are the data or conditions provided to the system or software for processing.</w:t>
+            </w:r>
+            <w:r>
+              <w:rPr>
+                <w:rFonts w:ascii="Calibri" w:eastAsia="DengXian" w:hAnsi="Calibri" w:cs="Arial"/>
+                <w:sz w:val="22"/>
+                <w:lang w:eastAsia="zh-CN"/>
+              </w:rPr>
+              <w:t xml:space="preserve"> </w:t>
+            </w:r>
+            <w:r>
+              <w:rPr>
+                <w:rFonts w:ascii="Calibri" w:eastAsia="DengXian" w:hAnsi="Calibri" w:cs="Arial"/>
+                <w:sz w:val="22"/>
+                <w:lang w:eastAsia="zh-CN"/>
+              </w:rPr>
+              <w:t>(e.g., user inputs, files).</w:t>
+            </w:r>
+          </w:p>
+          <w:p>
+            <w:pPr>
+              <w:pStyle w:val="ListParagraph"/>
+              <w:numPr>
+                <w:ilvl w:val="0"/>
+                <w:numId w:val="21"/>
+              </w:numPr>
+              <w:spacing w:after="160" w:line="259" w:lineRule="auto"/>
+              <w:rPr>
+                <w:rFonts w:ascii="Calibri" w:eastAsia="DengXian" w:hAnsi="Calibri" w:cs="Arial"/>
+                <w:sz w:val="22"/>
+                <w:lang w:eastAsia="zh-CN"/>
+              </w:rPr>
+            </w:pPr>
+            <w:r>
+              <w:rPr>
+                <w:rFonts w:ascii="Calibri" w:eastAsia="DengXian" w:hAnsi="Calibri" w:cs="Arial"/>
+                <w:sz w:val="22"/>
+                <w:lang w:eastAsia="zh-CN"/>
+              </w:rPr>
+              <w:t xml:space="preserve">Process: </w:t>
+            </w:r>
+            <w:r>
+              <w:rPr>
+                <w:rFonts w:ascii="Calibri" w:eastAsia="DengXian" w:hAnsi="Calibri" w:cs="Arial"/>
+                <w:sz w:val="22"/>
+                <w:lang w:eastAsia="zh-CN"/>
+              </w:rPr>
+              <w:t>The</w:t>
+            </w:r>
+            <w:r>
+              <w:rPr>
+                <w:rFonts w:ascii="Calibri" w:eastAsia="DengXian" w:hAnsi="Calibri" w:cs="Arial"/>
+                <w:sz w:val="22"/>
+                <w:lang w:eastAsia="zh-CN"/>
+              </w:rPr>
+              <w:t xml:space="preserve"> operations or actions perform on the inputs by the software to transform them into outputs. </w:t>
+            </w:r>
+            <w:r>
+              <w:rPr>
+                <w:rFonts w:ascii="Calibri" w:eastAsia="DengXian" w:hAnsi="Calibri" w:cs="Arial"/>
+                <w:sz w:val="22"/>
+                <w:lang w:eastAsia="zh-CN"/>
+              </w:rPr>
+              <w:t>(e.g., validation, calculations).</w:t>
+            </w:r>
+          </w:p>
+          <w:p>
+            <w:pPr>
+              <w:pStyle w:val="ListParagraph"/>
+              <w:numPr>
+                <w:ilvl w:val="0"/>
+                <w:numId w:val="21"/>
+              </w:numPr>
+              <w:spacing w:after="160" w:line="259" w:lineRule="auto"/>
+              <w:rPr>
+                <w:rFonts w:ascii="Calibri" w:eastAsia="DengXian" w:hAnsi="Calibri" w:cs="Arial"/>
+                <w:sz w:val="22"/>
+                <w:lang w:eastAsia="zh-CN"/>
+              </w:rPr>
+            </w:pPr>
+            <w:r>
+              <w:rPr>
+                <w:rFonts w:ascii="Calibri" w:eastAsia="DengXian" w:hAnsi="Calibri" w:cs="Arial"/>
+                <w:sz w:val="22"/>
+                <w:lang w:eastAsia="zh-CN"/>
+              </w:rPr>
+              <w:t xml:space="preserve">Outputs: </w:t>
+            </w:r>
+            <w:r>
+              <w:rPr>
+                <w:rFonts w:ascii="Calibri" w:eastAsia="DengXian" w:hAnsi="Calibri" w:cs="Arial"/>
+                <w:sz w:val="22"/>
+                <w:lang w:eastAsia="zh-CN"/>
+              </w:rPr>
+              <w:t>T</w:t>
+            </w:r>
+            <w:r>
+              <w:rPr>
+                <w:rFonts w:ascii="Calibri" w:eastAsia="DengXian" w:hAnsi="Calibri" w:cs="Arial"/>
+                <w:sz w:val="22"/>
+                <w:lang w:eastAsia="zh-CN"/>
+              </w:rPr>
+              <w:t>he results or outcomes produced by the software after processing the inputs</w:t>
+            </w:r>
+            <w:r>
+              <w:rPr>
+                <w:rFonts w:ascii="Calibri" w:eastAsia="DengXian" w:hAnsi="Calibri" w:cs="Arial"/>
+                <w:sz w:val="22"/>
+                <w:lang w:eastAsia="zh-CN"/>
+              </w:rPr>
+              <w:t xml:space="preserve"> </w:t>
+            </w:r>
+            <w:r>
+              <w:rPr>
+                <w:rFonts w:ascii="Calibri" w:eastAsia="DengXian" w:hAnsi="Calibri" w:cs="Arial"/>
+                <w:sz w:val="22"/>
+                <w:lang w:eastAsia="zh-CN"/>
+              </w:rPr>
+              <w:t>(e.g., success messages, errors).</w:t>
+            </w:r>
           </w:p>
         </w:tc>
       </w:tr>
@@ -4400,7 +6045,6 @@
                 <w:sz w:val="22"/>
                 <w:lang w:eastAsia="zh-CN"/>
               </w:rPr>
-              <w:lastRenderedPageBreak/>
               <w:t>Answer:</w:t>
             </w:r>
           </w:p>
@@ -4421,16 +6065,33 @@
               </w:rPr>
               <w:t>Array (or list):</w:t>
             </w:r>
-          </w:p>
-          <w:p>
-            <w:pPr>
-              <w:spacing w:after="160" w:line="259" w:lineRule="auto"/>
-              <w:rPr>
-                <w:rFonts w:ascii="Calibri" w:eastAsia="DengXian" w:hAnsi="Calibri" w:cs="Arial"/>
-                <w:sz w:val="22"/>
-                <w:lang w:eastAsia="zh-CN"/>
-              </w:rPr>
-            </w:pPr>
+            <w:r>
+              <w:t xml:space="preserve"> </w:t>
+            </w:r>
+            <w:r>
+              <w:rPr>
+                <w:rFonts w:ascii="Calibri" w:eastAsia="DengXian" w:hAnsi="Calibri" w:cs="Arial"/>
+                <w:sz w:val="22"/>
+                <w:lang w:eastAsia="zh-CN"/>
+              </w:rPr>
+              <w:t xml:space="preserve">An array is a collection of items stored in a </w:t>
+            </w:r>
+            <w:r>
+              <w:rPr>
+                <w:rFonts w:ascii="Calibri" w:eastAsia="DengXian" w:hAnsi="Calibri" w:cs="Arial"/>
+                <w:sz w:val="22"/>
+                <w:lang w:eastAsia="zh-CN"/>
+              </w:rPr>
+              <w:t>fixed size</w:t>
+            </w:r>
+            <w:r>
+              <w:rPr>
+                <w:rFonts w:ascii="Calibri" w:eastAsia="DengXian" w:hAnsi="Calibri" w:cs="Arial"/>
+                <w:sz w:val="22"/>
+                <w:lang w:eastAsia="zh-CN"/>
+              </w:rPr>
+              <w:t>, ordered sequence. Each item can be accessed directly using an index.</w:t>
+            </w:r>
           </w:p>
           <w:p>
             <w:pPr>
@@ -4448,6 +6109,89 @@
                 <w:lang w:eastAsia="zh-CN"/>
               </w:rPr>
               <w:t>Tree:</w:t>
+            </w:r>
+            <w:r>
+              <w:t xml:space="preserve"> </w:t>
+            </w:r>
+            <w:r>
+              <w:rPr>
+                <w:rFonts w:ascii="Calibri" w:eastAsia="DengXian" w:hAnsi="Calibri" w:cs="Arial"/>
+                <w:sz w:val="22"/>
+                <w:lang w:eastAsia="zh-CN"/>
+              </w:rPr>
+              <w:t xml:space="preserve">A tree is a </w:t>
+            </w:r>
+            <w:r>
+              <w:rPr>
+                <w:rFonts w:ascii="Calibri" w:eastAsia="DengXian" w:hAnsi="Calibri" w:cs="Arial"/>
+                <w:sz w:val="22"/>
+                <w:lang w:eastAsia="zh-CN"/>
+              </w:rPr>
+              <w:t>multi-levels</w:t>
+            </w:r>
+            <w:r>
+              <w:rPr>
+                <w:rFonts w:ascii="Calibri" w:eastAsia="DengXian" w:hAnsi="Calibri" w:cs="Arial"/>
+                <w:sz w:val="22"/>
+                <w:lang w:eastAsia="zh-CN"/>
+              </w:rPr>
+              <w:t xml:space="preserve"> data structure</w:t>
+            </w:r>
+            <w:r>
+              <w:rPr>
+                <w:rFonts w:ascii="Calibri" w:eastAsia="DengXian" w:hAnsi="Calibri" w:cs="Arial"/>
+                <w:sz w:val="22"/>
+                <w:lang w:eastAsia="zh-CN"/>
+              </w:rPr>
+              <w:t>. E</w:t>
+            </w:r>
+            <w:r>
+              <w:rPr>
+                <w:rFonts w:ascii="Calibri" w:eastAsia="DengXian" w:hAnsi="Calibri" w:cs="Arial"/>
+                <w:sz w:val="22"/>
+                <w:lang w:eastAsia="zh-CN"/>
+              </w:rPr>
+              <w:t xml:space="preserve">ach element node has a parent and </w:t>
+            </w:r>
+            <w:r>
+              <w:rPr>
+                <w:rFonts w:ascii="Calibri" w:eastAsia="DengXian" w:hAnsi="Calibri" w:cs="Arial"/>
+                <w:sz w:val="22"/>
+                <w:lang w:eastAsia="zh-CN"/>
+              </w:rPr>
+              <w:t xml:space="preserve">no one </w:t>
+            </w:r>
+            <w:r>
+              <w:rPr>
+                <w:rFonts w:ascii="Calibri" w:eastAsia="DengXian" w:hAnsi="Calibri" w:cs="Arial"/>
+                <w:sz w:val="22"/>
+                <w:lang w:eastAsia="zh-CN"/>
+              </w:rPr>
+              <w:t xml:space="preserve">or more child nodes. It starts with a root </w:t>
+            </w:r>
+            <w:r>
+              <w:rPr>
+                <w:rFonts w:ascii="Calibri" w:eastAsia="DengXian" w:hAnsi="Calibri" w:cs="Arial"/>
+                <w:sz w:val="22"/>
+                <w:lang w:eastAsia="zh-CN"/>
+              </w:rPr>
+              <w:t>node</w:t>
+            </w:r>
+            <w:r>
+              <w:rPr>
+                <w:rFonts w:ascii="Calibri" w:eastAsia="DengXian" w:hAnsi="Calibri" w:cs="Arial"/>
+                <w:sz w:val="22"/>
+                <w:lang w:eastAsia="zh-CN"/>
+              </w:rPr>
+              <w:t xml:space="preserve"> and it</w:t>
+            </w:r>
+            <w:r>
+              <w:rPr>
+                <w:rFonts w:ascii="Calibri" w:eastAsia="DengXian" w:hAnsi="Calibri" w:cs="Arial"/>
+                <w:sz w:val="22"/>
+                <w:lang w:eastAsia="zh-CN"/>
+              </w:rPr>
+              <w:t xml:space="preserve"> used to represent structured data like file systems or organization charts.</w:t>
             </w:r>
           </w:p>
           <w:p>
@@ -4489,6 +6233,7 @@
                 <w:sz w:val="22"/>
                 <w:lang w:eastAsia="zh-CN"/>
               </w:rPr>
+              <w:lastRenderedPageBreak/>
               <w:t xml:space="preserve">14. </w:t>
             </w:r>
             <w:r>
@@ -4533,23 +6278,374 @@
           </w:p>
           <w:p>
             <w:pPr>
-              <w:spacing w:after="160" w:line="259" w:lineRule="auto"/>
-              <w:rPr>
-                <w:rFonts w:ascii="Calibri" w:eastAsia="DengXian" w:hAnsi="Calibri" w:cs="Arial"/>
-                <w:sz w:val="22"/>
-                <w:lang w:eastAsia="zh-CN"/>
-              </w:rPr>
-            </w:pPr>
-          </w:p>
-          <w:p>
-            <w:pPr>
-              <w:spacing w:after="160" w:line="259" w:lineRule="auto"/>
-              <w:rPr>
-                <w:rFonts w:ascii="Calibri" w:eastAsia="DengXian" w:hAnsi="Calibri" w:cs="Arial"/>
-                <w:sz w:val="22"/>
-                <w:lang w:eastAsia="zh-CN"/>
-              </w:rPr>
-            </w:pPr>
+              <w:pStyle w:val="ListParagraph"/>
+              <w:numPr>
+                <w:ilvl w:val="0"/>
+                <w:numId w:val="22"/>
+              </w:numPr>
+              <w:spacing w:after="160" w:line="259" w:lineRule="auto"/>
+              <w:rPr>
+                <w:rFonts w:ascii="Calibri" w:eastAsia="DengXian" w:hAnsi="Calibri" w:cs="Arial"/>
+                <w:sz w:val="22"/>
+                <w:lang w:eastAsia="zh-CN"/>
+              </w:rPr>
+            </w:pPr>
+            <w:r>
+              <w:rPr>
+                <w:rFonts w:ascii="Calibri" w:eastAsia="DengXian" w:hAnsi="Calibri" w:cs="Arial"/>
+                <w:sz w:val="22"/>
+                <w:lang w:eastAsia="zh-CN"/>
+              </w:rPr>
+              <w:t>SDLC Guidelines:</w:t>
+            </w:r>
+            <w:r>
+              <w:rPr>
+                <w:rFonts w:ascii="Calibri" w:eastAsia="DengXian" w:hAnsi="Calibri" w:cs="Arial"/>
+                <w:sz w:val="22"/>
+                <w:lang w:eastAsia="zh-CN"/>
+              </w:rPr>
+              <w:t xml:space="preserve"> </w:t>
+            </w:r>
+            <w:r>
+              <w:rPr>
+                <w:rFonts w:ascii="Calibri" w:eastAsia="DengXian" w:hAnsi="Calibri" w:cs="Arial"/>
+                <w:sz w:val="22"/>
+                <w:lang w:eastAsia="zh-CN"/>
+              </w:rPr>
+              <w:t xml:space="preserve">The Software Development Life Cycle </w:t>
+            </w:r>
+            <w:r>
+              <w:rPr>
+                <w:rFonts w:ascii="Calibri" w:eastAsia="DengXian" w:hAnsi="Calibri" w:cs="Arial"/>
+                <w:sz w:val="22"/>
+                <w:lang w:eastAsia="zh-CN"/>
+              </w:rPr>
+              <w:t>process</w:t>
+            </w:r>
+            <w:r>
+              <w:rPr>
+                <w:rFonts w:ascii="Calibri" w:eastAsia="DengXian" w:hAnsi="Calibri" w:cs="Arial"/>
+                <w:sz w:val="22"/>
+                <w:lang w:eastAsia="zh-CN"/>
+              </w:rPr>
+              <w:t xml:space="preserve"> </w:t>
+            </w:r>
+            <w:r>
+              <w:rPr>
+                <w:rFonts w:ascii="Calibri" w:eastAsia="DengXian" w:hAnsi="Calibri" w:cs="Arial"/>
+                <w:sz w:val="22"/>
+                <w:lang w:eastAsia="zh-CN"/>
+              </w:rPr>
+              <w:t xml:space="preserve">includes </w:t>
+            </w:r>
+            <w:r>
+              <w:rPr>
+                <w:rFonts w:ascii="Calibri" w:eastAsia="DengXian" w:hAnsi="Calibri" w:cs="Arial"/>
+                <w:sz w:val="22"/>
+                <w:lang w:eastAsia="zh-CN"/>
+              </w:rPr>
+              <w:t>planning, design, coding, testing, and maintenance</w:t>
+            </w:r>
+            <w:r>
+              <w:rPr>
+                <w:rFonts w:ascii="Calibri" w:eastAsia="DengXian" w:hAnsi="Calibri" w:cs="Arial"/>
+                <w:sz w:val="22"/>
+                <w:lang w:eastAsia="zh-CN"/>
+              </w:rPr>
+              <w:t>.</w:t>
+            </w:r>
+          </w:p>
+          <w:p>
+            <w:pPr>
+              <w:pStyle w:val="ListParagraph"/>
+              <w:numPr>
+                <w:ilvl w:val="0"/>
+                <w:numId w:val="22"/>
+              </w:numPr>
+              <w:spacing w:after="160" w:line="259" w:lineRule="auto"/>
+              <w:rPr>
+                <w:rFonts w:ascii="Calibri" w:eastAsia="DengXian" w:hAnsi="Calibri" w:cs="Arial"/>
+                <w:sz w:val="22"/>
+                <w:lang w:eastAsia="zh-CN"/>
+              </w:rPr>
+            </w:pPr>
+            <w:r>
+              <w:rPr>
+                <w:rFonts w:ascii="Calibri" w:eastAsia="DengXian" w:hAnsi="Calibri" w:cs="Arial"/>
+                <w:sz w:val="22"/>
+                <w:lang w:eastAsia="zh-CN"/>
+              </w:rPr>
+              <w:t>Code Review and Quality Assurance</w:t>
+            </w:r>
+            <w:r>
+              <w:rPr>
+                <w:rFonts w:ascii="Calibri" w:eastAsia="DengXian" w:hAnsi="Calibri" w:cs="Arial"/>
+                <w:sz w:val="22"/>
+                <w:lang w:eastAsia="zh-CN"/>
+              </w:rPr>
+              <w:t xml:space="preserve">: </w:t>
+            </w:r>
+            <w:r>
+              <w:rPr>
+                <w:rFonts w:ascii="Calibri" w:eastAsia="DengXian" w:hAnsi="Calibri" w:cs="Arial"/>
+                <w:sz w:val="22"/>
+                <w:lang w:eastAsia="zh-CN"/>
+              </w:rPr>
+              <w:t xml:space="preserve">It uses tools to </w:t>
+            </w:r>
+            <w:r>
+              <w:rPr>
+                <w:rFonts w:ascii="Calibri" w:eastAsia="DengXian" w:hAnsi="Calibri" w:cs="Arial"/>
+                <w:sz w:val="22"/>
+                <w:lang w:eastAsia="zh-CN"/>
+              </w:rPr>
+              <w:t xml:space="preserve">identify </w:t>
+            </w:r>
+            <w:r>
+              <w:rPr>
+                <w:rFonts w:ascii="Calibri" w:eastAsia="DengXian" w:hAnsi="Calibri" w:cs="Arial"/>
+                <w:sz w:val="22"/>
+                <w:lang w:eastAsia="zh-CN"/>
+              </w:rPr>
+              <w:t xml:space="preserve">bugs and </w:t>
+            </w:r>
+            <w:r>
+              <w:rPr>
+                <w:rFonts w:ascii="Calibri" w:eastAsia="DengXian" w:hAnsi="Calibri" w:cs="Arial"/>
+                <w:sz w:val="22"/>
+                <w:lang w:eastAsia="zh-CN"/>
+              </w:rPr>
+              <w:t xml:space="preserve">ensure </w:t>
+            </w:r>
+            <w:r>
+              <w:rPr>
+                <w:rFonts w:ascii="Calibri" w:eastAsia="DengXian" w:hAnsi="Calibri" w:cs="Arial"/>
+                <w:sz w:val="22"/>
+                <w:lang w:eastAsia="zh-CN"/>
+              </w:rPr>
+              <w:t>code follows quality standards.</w:t>
+            </w:r>
+          </w:p>
+          <w:p>
+            <w:pPr>
+              <w:pStyle w:val="ListParagraph"/>
+              <w:numPr>
+                <w:ilvl w:val="0"/>
+                <w:numId w:val="22"/>
+              </w:numPr>
+              <w:spacing w:after="160" w:line="259" w:lineRule="auto"/>
+              <w:rPr>
+                <w:rFonts w:ascii="Calibri" w:eastAsia="DengXian" w:hAnsi="Calibri" w:cs="Arial"/>
+                <w:sz w:val="22"/>
+                <w:lang w:eastAsia="zh-CN"/>
+              </w:rPr>
+            </w:pPr>
+            <w:r>
+              <w:rPr>
+                <w:rFonts w:ascii="Calibri" w:eastAsia="DengXian" w:hAnsi="Calibri" w:cs="Arial"/>
+                <w:sz w:val="22"/>
+                <w:lang w:eastAsia="zh-CN"/>
+              </w:rPr>
+              <w:t>Testing Standards</w:t>
+            </w:r>
+            <w:r>
+              <w:rPr>
+                <w:rFonts w:ascii="Calibri" w:eastAsia="DengXian" w:hAnsi="Calibri" w:cs="Arial"/>
+                <w:sz w:val="22"/>
+                <w:lang w:eastAsia="zh-CN"/>
+              </w:rPr>
+              <w:t xml:space="preserve">: </w:t>
+            </w:r>
+            <w:r>
+              <w:rPr>
+                <w:rFonts w:ascii="Calibri" w:eastAsia="DengXian" w:hAnsi="Calibri" w:cs="Arial"/>
+                <w:sz w:val="22"/>
+                <w:lang w:eastAsia="zh-CN"/>
+              </w:rPr>
+              <w:t>The standards determine</w:t>
+            </w:r>
+            <w:r>
+              <w:rPr>
+                <w:rFonts w:ascii="Calibri" w:eastAsia="DengXian" w:hAnsi="Calibri" w:cs="Arial"/>
+                <w:sz w:val="22"/>
+                <w:lang w:eastAsia="zh-CN"/>
+              </w:rPr>
+              <w:t xml:space="preserve"> </w:t>
+            </w:r>
+            <w:r>
+              <w:rPr>
+                <w:rFonts w:ascii="Calibri" w:eastAsia="DengXian" w:hAnsi="Calibri" w:cs="Arial"/>
+                <w:sz w:val="22"/>
+                <w:lang w:eastAsia="zh-CN"/>
+              </w:rPr>
+              <w:t>procedures for unit testing, integration testing, system testing, and user acceptance testing (UAT)</w:t>
+            </w:r>
+            <w:r>
+              <w:rPr>
+                <w:rFonts w:ascii="Calibri" w:eastAsia="DengXian" w:hAnsi="Calibri" w:cs="Arial"/>
+                <w:sz w:val="22"/>
+                <w:lang w:eastAsia="zh-CN"/>
+              </w:rPr>
+              <w:t>. It</w:t>
+            </w:r>
+            <w:r>
+              <w:rPr>
+                <w:rFonts w:ascii="Calibri" w:eastAsia="DengXian" w:hAnsi="Calibri" w:cs="Arial"/>
+                <w:sz w:val="22"/>
+                <w:lang w:eastAsia="zh-CN"/>
+              </w:rPr>
+              <w:t xml:space="preserve"> ensure</w:t>
+            </w:r>
+            <w:r>
+              <w:rPr>
+                <w:rFonts w:ascii="Calibri" w:eastAsia="DengXian" w:hAnsi="Calibri" w:cs="Arial"/>
+                <w:sz w:val="22"/>
+                <w:lang w:eastAsia="zh-CN"/>
+              </w:rPr>
+              <w:t>s</w:t>
+            </w:r>
+            <w:r>
+              <w:rPr>
+                <w:rFonts w:ascii="Calibri" w:eastAsia="DengXian" w:hAnsi="Calibri" w:cs="Arial"/>
+                <w:sz w:val="22"/>
+                <w:lang w:eastAsia="zh-CN"/>
+              </w:rPr>
+              <w:t xml:space="preserve"> product quality.</w:t>
+            </w:r>
+          </w:p>
+          <w:p>
+            <w:pPr>
+              <w:pStyle w:val="ListParagraph"/>
+              <w:numPr>
+                <w:ilvl w:val="0"/>
+                <w:numId w:val="22"/>
+              </w:numPr>
+              <w:spacing w:after="160" w:line="259" w:lineRule="auto"/>
+              <w:rPr>
+                <w:rFonts w:ascii="Calibri" w:eastAsia="DengXian" w:hAnsi="Calibri" w:cs="Arial"/>
+                <w:sz w:val="22"/>
+                <w:lang w:eastAsia="zh-CN"/>
+              </w:rPr>
+            </w:pPr>
+            <w:r>
+              <w:rPr>
+                <w:rFonts w:ascii="Calibri" w:eastAsia="DengXian" w:hAnsi="Calibri" w:cs="Arial"/>
+                <w:sz w:val="22"/>
+                <w:lang w:eastAsia="zh-CN"/>
+              </w:rPr>
+              <w:t>Version Control and Change Management</w:t>
+            </w:r>
+            <w:r>
+              <w:rPr>
+                <w:rFonts w:ascii="Calibri" w:eastAsia="DengXian" w:hAnsi="Calibri" w:cs="Arial"/>
+                <w:sz w:val="22"/>
+                <w:lang w:eastAsia="zh-CN"/>
+              </w:rPr>
+              <w:t>:</w:t>
+            </w:r>
+            <w:r>
+              <w:rPr>
+                <w:rFonts w:ascii="Calibri" w:eastAsia="DengXian" w:hAnsi="Calibri" w:cs="Arial"/>
+                <w:sz w:val="22"/>
+                <w:lang w:eastAsia="zh-CN"/>
+              </w:rPr>
+              <w:t xml:space="preserve"> It a</w:t>
+            </w:r>
+            <w:r>
+              <w:rPr>
+                <w:rFonts w:ascii="Calibri" w:eastAsia="DengXian" w:hAnsi="Calibri" w:cs="Arial"/>
+                <w:sz w:val="22"/>
+                <w:lang w:eastAsia="zh-CN"/>
+              </w:rPr>
+              <w:t>ppl</w:t>
+            </w:r>
+            <w:r>
+              <w:rPr>
+                <w:rFonts w:ascii="Calibri" w:eastAsia="DengXian" w:hAnsi="Calibri" w:cs="Arial"/>
+                <w:sz w:val="22"/>
+                <w:lang w:eastAsia="zh-CN"/>
+              </w:rPr>
+              <w:t>ies</w:t>
+            </w:r>
+            <w:r>
+              <w:rPr>
+                <w:rFonts w:ascii="Calibri" w:eastAsia="DengXian" w:hAnsi="Calibri" w:cs="Arial"/>
+                <w:sz w:val="22"/>
+                <w:lang w:eastAsia="zh-CN"/>
+              </w:rPr>
+              <w:t xml:space="preserve"> tools for managing code changes</w:t>
+            </w:r>
+            <w:r>
+              <w:rPr>
+                <w:rFonts w:ascii="Calibri" w:eastAsia="DengXian" w:hAnsi="Calibri" w:cs="Arial"/>
+                <w:sz w:val="22"/>
+                <w:lang w:eastAsia="zh-CN"/>
+              </w:rPr>
+              <w:t>.</w:t>
+            </w:r>
+            <w:r>
+              <w:rPr>
+                <w:rFonts w:ascii="Calibri" w:eastAsia="DengXian" w:hAnsi="Calibri" w:cs="Arial"/>
+                <w:sz w:val="22"/>
+                <w:lang w:eastAsia="zh-CN"/>
+              </w:rPr>
+              <w:t xml:space="preserve"> </w:t>
+            </w:r>
+            <w:r>
+              <w:rPr>
+                <w:rFonts w:ascii="Calibri" w:eastAsia="DengXian" w:hAnsi="Calibri" w:cs="Arial"/>
+                <w:sz w:val="22"/>
+                <w:lang w:eastAsia="zh-CN"/>
+              </w:rPr>
+              <w:t>It uses</w:t>
+            </w:r>
+            <w:r>
+              <w:rPr>
+                <w:rFonts w:ascii="Calibri" w:eastAsia="DengXian" w:hAnsi="Calibri" w:cs="Arial"/>
+                <w:sz w:val="22"/>
+                <w:lang w:eastAsia="zh-CN"/>
+              </w:rPr>
+              <w:t xml:space="preserve"> branching strategies and CI/CD pipelines to support team collaboration and safe deployments.</w:t>
+            </w:r>
+          </w:p>
+          <w:p>
+            <w:pPr>
+              <w:pStyle w:val="ListParagraph"/>
+              <w:numPr>
+                <w:ilvl w:val="0"/>
+                <w:numId w:val="22"/>
+              </w:numPr>
+              <w:spacing w:after="160" w:line="259" w:lineRule="auto"/>
+              <w:rPr>
+                <w:rFonts w:ascii="Calibri" w:eastAsia="DengXian" w:hAnsi="Calibri" w:cs="Arial"/>
+                <w:sz w:val="22"/>
+                <w:lang w:eastAsia="zh-CN"/>
+              </w:rPr>
+            </w:pPr>
+            <w:r>
+              <w:rPr>
+                <w:rFonts w:ascii="Calibri" w:eastAsia="DengXian" w:hAnsi="Calibri" w:cs="Arial"/>
+                <w:sz w:val="22"/>
+                <w:lang w:eastAsia="zh-CN"/>
+              </w:rPr>
+              <w:t>Security and Compliance Policies</w:t>
+            </w:r>
+            <w:r>
+              <w:rPr>
+                <w:rFonts w:ascii="Calibri" w:eastAsia="DengXian" w:hAnsi="Calibri" w:cs="Arial"/>
+                <w:sz w:val="22"/>
+                <w:lang w:eastAsia="zh-CN"/>
+              </w:rPr>
+              <w:t>: It uses</w:t>
+            </w:r>
+            <w:r>
+              <w:rPr>
+                <w:rFonts w:ascii="Calibri" w:eastAsia="DengXian" w:hAnsi="Calibri" w:cs="Arial"/>
+                <w:sz w:val="22"/>
+                <w:lang w:eastAsia="zh-CN"/>
+              </w:rPr>
+              <w:t xml:space="preserve"> secure coding practices and comply with standards such as OWASP, GDPR, or ISO to protect user data and maintain trust.</w:t>
+            </w:r>
           </w:p>
         </w:tc>
       </w:tr>
@@ -4624,23 +6720,320 @@
           </w:p>
           <w:p>
             <w:pPr>
-              <w:spacing w:after="160" w:line="259" w:lineRule="auto"/>
-              <w:rPr>
-                <w:rFonts w:ascii="Calibri" w:eastAsia="DengXian" w:hAnsi="Calibri" w:cs="Arial"/>
-                <w:sz w:val="22"/>
-                <w:lang w:eastAsia="zh-CN"/>
-              </w:rPr>
-            </w:pPr>
-          </w:p>
-          <w:p>
-            <w:pPr>
-              <w:spacing w:after="160" w:line="259" w:lineRule="auto"/>
-              <w:rPr>
-                <w:rFonts w:ascii="Calibri" w:eastAsia="DengXian" w:hAnsi="Calibri" w:cs="Arial"/>
-                <w:sz w:val="22"/>
-                <w:lang w:eastAsia="zh-CN"/>
-              </w:rPr>
-            </w:pPr>
+              <w:pStyle w:val="ListParagraph"/>
+              <w:spacing w:after="160" w:line="259" w:lineRule="auto"/>
+              <w:ind w:left="720"/>
+              <w:rPr>
+                <w:rFonts w:ascii="Calibri" w:eastAsia="DengXian" w:hAnsi="Calibri" w:cs="Arial"/>
+                <w:sz w:val="22"/>
+                <w:lang w:eastAsia="zh-CN"/>
+              </w:rPr>
+            </w:pPr>
+            <w:r>
+              <w:rPr>
+                <w:rFonts w:ascii="Calibri" w:eastAsia="DengXian" w:hAnsi="Calibri" w:cs="Arial"/>
+                <w:sz w:val="22"/>
+                <w:lang w:eastAsia="zh-CN"/>
+              </w:rPr>
+              <w:t>Software Defect Management Process:</w:t>
+            </w:r>
+            <w:r>
+              <w:rPr>
+                <w:rFonts w:ascii="Calibri" w:eastAsia="DengXian" w:hAnsi="Calibri" w:cs="Arial"/>
+                <w:sz w:val="22"/>
+                <w:lang w:eastAsia="zh-CN"/>
+              </w:rPr>
+              <w:t xml:space="preserve"> </w:t>
+            </w:r>
+            <w:r>
+              <w:rPr>
+                <w:rFonts w:ascii="Calibri" w:eastAsia="DengXian" w:hAnsi="Calibri" w:cs="Arial"/>
+                <w:sz w:val="22"/>
+                <w:lang w:eastAsia="zh-CN"/>
+              </w:rPr>
+              <w:t xml:space="preserve">The software defect management process helps track, manage, and resolve bugs or issues found during development or testing. </w:t>
+            </w:r>
+          </w:p>
+          <w:p>
+            <w:pPr>
+              <w:pStyle w:val="ListParagraph"/>
+              <w:numPr>
+                <w:ilvl w:val="0"/>
+                <w:numId w:val="23"/>
+              </w:numPr>
+              <w:spacing w:after="160" w:line="259" w:lineRule="auto"/>
+              <w:rPr>
+                <w:rFonts w:ascii="Calibri" w:eastAsia="DengXian" w:hAnsi="Calibri" w:cs="Arial"/>
+                <w:sz w:val="22"/>
+                <w:lang w:eastAsia="zh-CN"/>
+              </w:rPr>
+            </w:pPr>
+            <w:r>
+              <w:rPr>
+                <w:rFonts w:ascii="Calibri" w:eastAsia="DengXian" w:hAnsi="Calibri" w:cs="Arial"/>
+                <w:sz w:val="22"/>
+                <w:lang w:eastAsia="zh-CN"/>
+              </w:rPr>
+              <w:t>Defect Detection</w:t>
+            </w:r>
+            <w:r>
+              <w:rPr>
+                <w:rFonts w:ascii="Calibri" w:eastAsia="DengXian" w:hAnsi="Calibri" w:cs="Arial"/>
+                <w:sz w:val="22"/>
+                <w:lang w:eastAsia="zh-CN"/>
+              </w:rPr>
+              <w:t xml:space="preserve">: </w:t>
+            </w:r>
+            <w:r>
+              <w:rPr>
+                <w:rFonts w:ascii="Calibri" w:eastAsia="DengXian" w:hAnsi="Calibri" w:cs="Arial"/>
+                <w:sz w:val="22"/>
+                <w:lang w:eastAsia="zh-CN"/>
+              </w:rPr>
+              <w:t>A tester or developer finds and reports a bug during development or testing.</w:t>
+            </w:r>
+          </w:p>
+          <w:p>
+            <w:pPr>
+              <w:pStyle w:val="ListParagraph"/>
+              <w:numPr>
+                <w:ilvl w:val="0"/>
+                <w:numId w:val="23"/>
+              </w:numPr>
+              <w:spacing w:after="160" w:line="259" w:lineRule="auto"/>
+              <w:rPr>
+                <w:rFonts w:ascii="Calibri" w:eastAsia="DengXian" w:hAnsi="Calibri" w:cs="Arial"/>
+                <w:sz w:val="22"/>
+                <w:lang w:eastAsia="zh-CN"/>
+              </w:rPr>
+            </w:pPr>
+            <w:r>
+              <w:rPr>
+                <w:rFonts w:ascii="Calibri" w:eastAsia="DengXian" w:hAnsi="Calibri" w:cs="Arial"/>
+                <w:sz w:val="22"/>
+                <w:lang w:eastAsia="zh-CN"/>
+              </w:rPr>
+              <w:t>Defect Logging</w:t>
+            </w:r>
+            <w:r>
+              <w:rPr>
+                <w:rFonts w:ascii="Calibri" w:eastAsia="DengXian" w:hAnsi="Calibri" w:cs="Arial"/>
+                <w:sz w:val="22"/>
+                <w:lang w:eastAsia="zh-CN"/>
+              </w:rPr>
+              <w:t xml:space="preserve">: </w:t>
+            </w:r>
+            <w:r>
+              <w:rPr>
+                <w:rFonts w:ascii="Calibri" w:eastAsia="DengXian" w:hAnsi="Calibri" w:cs="Arial"/>
+                <w:sz w:val="22"/>
+                <w:lang w:eastAsia="zh-CN"/>
+              </w:rPr>
+              <w:t>The bug is recorded in a defect tracking tool (e.g., JIRA, Bugzilla) with details like severity, steps to reproduce, and screenshots.</w:t>
+            </w:r>
+          </w:p>
+          <w:p>
+            <w:pPr>
+              <w:pStyle w:val="ListParagraph"/>
+              <w:numPr>
+                <w:ilvl w:val="0"/>
+                <w:numId w:val="23"/>
+              </w:numPr>
+              <w:spacing w:after="160" w:line="259" w:lineRule="auto"/>
+              <w:rPr>
+                <w:rFonts w:ascii="Calibri" w:eastAsia="DengXian" w:hAnsi="Calibri" w:cs="Arial"/>
+                <w:sz w:val="22"/>
+                <w:lang w:eastAsia="zh-CN"/>
+              </w:rPr>
+            </w:pPr>
+            <w:r>
+              <w:rPr>
+                <w:rFonts w:ascii="Calibri" w:eastAsia="DengXian" w:hAnsi="Calibri" w:cs="Arial"/>
+                <w:sz w:val="22"/>
+                <w:lang w:eastAsia="zh-CN"/>
+              </w:rPr>
+              <w:t>Defect Triage</w:t>
+            </w:r>
+            <w:r>
+              <w:rPr>
+                <w:rFonts w:ascii="Calibri" w:eastAsia="DengXian" w:hAnsi="Calibri" w:cs="Arial"/>
+                <w:sz w:val="22"/>
+                <w:lang w:eastAsia="zh-CN"/>
+              </w:rPr>
+              <w:t xml:space="preserve">: </w:t>
+            </w:r>
+            <w:r>
+              <w:rPr>
+                <w:rFonts w:ascii="Calibri" w:eastAsia="DengXian" w:hAnsi="Calibri" w:cs="Arial"/>
+                <w:sz w:val="22"/>
+                <w:lang w:eastAsia="zh-CN"/>
+              </w:rPr>
+              <w:t>The team reviews and prioritizes the defect based on impact and urgency.</w:t>
+            </w:r>
+          </w:p>
+          <w:p>
+            <w:pPr>
+              <w:pStyle w:val="ListParagraph"/>
+              <w:numPr>
+                <w:ilvl w:val="0"/>
+                <w:numId w:val="23"/>
+              </w:numPr>
+              <w:spacing w:after="160" w:line="259" w:lineRule="auto"/>
+              <w:rPr>
+                <w:rFonts w:ascii="Calibri" w:eastAsia="DengXian" w:hAnsi="Calibri" w:cs="Arial"/>
+                <w:sz w:val="22"/>
+                <w:lang w:eastAsia="zh-CN"/>
+              </w:rPr>
+            </w:pPr>
+            <w:r>
+              <w:rPr>
+                <w:rFonts w:ascii="Calibri" w:eastAsia="DengXian" w:hAnsi="Calibri" w:cs="Arial"/>
+                <w:sz w:val="22"/>
+                <w:lang w:eastAsia="zh-CN"/>
+              </w:rPr>
+              <w:t>Defect Assignment</w:t>
+            </w:r>
+            <w:r>
+              <w:rPr>
+                <w:rFonts w:ascii="Calibri" w:eastAsia="DengXian" w:hAnsi="Calibri" w:cs="Arial"/>
+                <w:sz w:val="22"/>
+                <w:lang w:eastAsia="zh-CN"/>
+              </w:rPr>
+              <w:t xml:space="preserve">: </w:t>
+            </w:r>
+            <w:r>
+              <w:rPr>
+                <w:rFonts w:ascii="Calibri" w:eastAsia="DengXian" w:hAnsi="Calibri" w:cs="Arial"/>
+                <w:sz w:val="22"/>
+                <w:lang w:eastAsia="zh-CN"/>
+              </w:rPr>
+              <w:t>The bug is assigned to a developer for fixing.</w:t>
+            </w:r>
+          </w:p>
+          <w:p>
+            <w:pPr>
+              <w:pStyle w:val="ListParagraph"/>
+              <w:numPr>
+                <w:ilvl w:val="0"/>
+                <w:numId w:val="23"/>
+              </w:numPr>
+              <w:spacing w:after="160" w:line="259" w:lineRule="auto"/>
+              <w:rPr>
+                <w:rFonts w:ascii="Calibri" w:eastAsia="DengXian" w:hAnsi="Calibri" w:cs="Arial"/>
+                <w:sz w:val="22"/>
+                <w:lang w:eastAsia="zh-CN"/>
+              </w:rPr>
+            </w:pPr>
+            <w:r>
+              <w:rPr>
+                <w:rFonts w:ascii="Calibri" w:eastAsia="DengXian" w:hAnsi="Calibri" w:cs="Arial"/>
+                <w:sz w:val="22"/>
+                <w:lang w:eastAsia="zh-CN"/>
+              </w:rPr>
+              <w:t>Defect Resolution</w:t>
+            </w:r>
+            <w:r>
+              <w:rPr>
+                <w:rFonts w:ascii="Calibri" w:eastAsia="DengXian" w:hAnsi="Calibri" w:cs="Arial"/>
+                <w:sz w:val="22"/>
+                <w:lang w:eastAsia="zh-CN"/>
+              </w:rPr>
+              <w:t xml:space="preserve">: </w:t>
+            </w:r>
+            <w:r>
+              <w:rPr>
+                <w:rFonts w:ascii="Calibri" w:eastAsia="DengXian" w:hAnsi="Calibri" w:cs="Arial"/>
+                <w:sz w:val="22"/>
+                <w:lang w:eastAsia="zh-CN"/>
+              </w:rPr>
+              <w:t>The developer fixes the issue and updates the status (e.g., resolved or fixed).</w:t>
+            </w:r>
+          </w:p>
+          <w:p>
+            <w:pPr>
+              <w:pStyle w:val="ListParagraph"/>
+              <w:numPr>
+                <w:ilvl w:val="0"/>
+                <w:numId w:val="23"/>
+              </w:numPr>
+              <w:spacing w:after="160" w:line="259" w:lineRule="auto"/>
+              <w:rPr>
+                <w:rFonts w:ascii="Calibri" w:eastAsia="DengXian" w:hAnsi="Calibri" w:cs="Arial"/>
+                <w:sz w:val="22"/>
+                <w:lang w:eastAsia="zh-CN"/>
+              </w:rPr>
+            </w:pPr>
+            <w:r>
+              <w:rPr>
+                <w:rFonts w:ascii="Calibri" w:eastAsia="DengXian" w:hAnsi="Calibri" w:cs="Arial"/>
+                <w:sz w:val="22"/>
+                <w:lang w:eastAsia="zh-CN"/>
+              </w:rPr>
+              <w:t>Defect Retesting</w:t>
+            </w:r>
+            <w:r>
+              <w:rPr>
+                <w:rFonts w:ascii="Calibri" w:eastAsia="DengXian" w:hAnsi="Calibri" w:cs="Arial"/>
+                <w:sz w:val="22"/>
+                <w:lang w:eastAsia="zh-CN"/>
+              </w:rPr>
+              <w:t xml:space="preserve">: </w:t>
+            </w:r>
+            <w:r>
+              <w:rPr>
+                <w:rFonts w:ascii="Calibri" w:eastAsia="DengXian" w:hAnsi="Calibri" w:cs="Arial"/>
+                <w:sz w:val="22"/>
+                <w:lang w:eastAsia="zh-CN"/>
+              </w:rPr>
+              <w:t>Testers verify the fix and ensure the issue is resolved without side effects.</w:t>
+            </w:r>
+          </w:p>
+          <w:p>
+            <w:pPr>
+              <w:pStyle w:val="ListParagraph"/>
+              <w:numPr>
+                <w:ilvl w:val="0"/>
+                <w:numId w:val="23"/>
+              </w:numPr>
+              <w:spacing w:after="160" w:line="259" w:lineRule="auto"/>
+              <w:rPr>
+                <w:rFonts w:ascii="Calibri" w:eastAsia="DengXian" w:hAnsi="Calibri" w:cs="Arial"/>
+                <w:sz w:val="22"/>
+                <w:lang w:eastAsia="zh-CN"/>
+              </w:rPr>
+            </w:pPr>
+            <w:r>
+              <w:rPr>
+                <w:rFonts w:ascii="Calibri" w:eastAsia="DengXian" w:hAnsi="Calibri" w:cs="Arial"/>
+                <w:sz w:val="22"/>
+                <w:lang w:eastAsia="zh-CN"/>
+              </w:rPr>
+              <w:t>Defect Closure</w:t>
+            </w:r>
+            <w:r>
+              <w:rPr>
+                <w:rFonts w:ascii="Calibri" w:eastAsia="DengXian" w:hAnsi="Calibri" w:cs="Arial"/>
+                <w:sz w:val="22"/>
+                <w:lang w:eastAsia="zh-CN"/>
+              </w:rPr>
+              <w:t xml:space="preserve">: </w:t>
+            </w:r>
+            <w:r>
+              <w:rPr>
+                <w:rFonts w:ascii="Calibri" w:eastAsia="DengXian" w:hAnsi="Calibri" w:cs="Arial"/>
+                <w:sz w:val="22"/>
+                <w:lang w:eastAsia="zh-CN"/>
+              </w:rPr>
+              <w:t>When</w:t>
+            </w:r>
+            <w:r>
+              <w:rPr>
+                <w:rFonts w:ascii="Calibri" w:eastAsia="DengXian" w:hAnsi="Calibri" w:cs="Arial"/>
+                <w:sz w:val="22"/>
+                <w:lang w:eastAsia="zh-CN"/>
+              </w:rPr>
+              <w:t xml:space="preserve"> the fix works correctly, the defect is marked as closed.</w:t>
+            </w:r>
           </w:p>
         </w:tc>
       </w:tr>
@@ -4887,6 +7280,7 @@
                 <w:sz w:val="22"/>
                 <w:lang w:eastAsia="zh-CN"/>
               </w:rPr>
+              <w:lastRenderedPageBreak/>
               <w:t>Answer:</w:t>
             </w:r>
           </w:p>
@@ -4939,7 +7333,6 @@
                 <w:sz w:val="22"/>
                 <w:lang w:eastAsia="zh-CN"/>
               </w:rPr>
-              <w:lastRenderedPageBreak/>
               <w:t xml:space="preserve">18. </w:t>
             </w:r>
             <w:r>
@@ -5222,10 +7615,10 @@
     </w:tbl>
     <w:p/>
     <w:sectPr>
-      <w:headerReference w:type="default" r:id="rId16"/>
-      <w:footerReference w:type="even" r:id="rId17"/>
-      <w:footerReference w:type="default" r:id="rId18"/>
-      <w:footerReference w:type="first" r:id="rId19"/>
+      <w:headerReference w:type="default" r:id="rId24"/>
+      <w:footerReference w:type="even" r:id="rId25"/>
+      <w:footerReference w:type="default" r:id="rId26"/>
+      <w:footerReference w:type="first" r:id="rId27"/>
       <w:pgSz w:w="12240" w:h="15840"/>
       <w:pgMar w:top="1418" w:right="709" w:bottom="1440" w:left="709" w:header="709" w:footer="709" w:gutter="0"/>
       <w:cols w:space="708"/>
@@ -6281,6 +8674,92 @@
     </w:lvl>
   </w:abstractNum>
   <w:abstractNum w:abstractNumId="1" w15:restartNumberingAfterBreak="0">
+    <w:nsid w:val="0B68457C"/>
+    <w:multiLevelType w:val="hybridMultilevel"/>
+    <w:tmpl w:val="D158BDB8"/>
+    <w:lvl w:ilvl="0" w:tplc="0409000F">
+      <w:start w:val="1"/>
+      <w:numFmt w:val="decimal"/>
+      <w:lvlText w:val="%1."/>
+      <w:lvlJc w:val="left"/>
+      <w:pPr>
+        <w:ind w:left="720" w:hanging="360"/>
+      </w:pPr>
+    </w:lvl>
+    <w:lvl w:ilvl="1" w:tplc="04090019" w:tentative="1">
+      <w:start w:val="1"/>
+      <w:numFmt w:val="lowerLetter"/>
+      <w:lvlText w:val="%2."/>
+      <w:lvlJc w:val="left"/>
+      <w:pPr>
+        <w:ind w:left="1440" w:hanging="360"/>
+      </w:pPr>
+    </w:lvl>
+    <w:lvl w:ilvl="2" w:tplc="0409001B" w:tentative="1">
+      <w:start w:val="1"/>
+      <w:numFmt w:val="lowerRoman"/>
+      <w:lvlText w:val="%3."/>
+      <w:lvlJc w:val="right"/>
+      <w:pPr>
+        <w:ind w:left="2160" w:hanging="180"/>
+      </w:pPr>
+    </w:lvl>
+    <w:lvl w:ilvl="3" w:tplc="0409000F" w:tentative="1">
+      <w:start w:val="1"/>
+      <w:numFmt w:val="decimal"/>
+      <w:lvlText w:val="%4."/>
+      <w:lvlJc w:val="left"/>
+      <w:pPr>
+        <w:ind w:left="2880" w:hanging="360"/>
+      </w:pPr>
+    </w:lvl>
+    <w:lvl w:ilvl="4" w:tplc="04090019" w:tentative="1">
+      <w:start w:val="1"/>
+      <w:numFmt w:val="lowerLetter"/>
+      <w:lvlText w:val="%5."/>
+      <w:lvlJc w:val="left"/>
+      <w:pPr>
+        <w:ind w:left="3600" w:hanging="360"/>
+      </w:pPr>
+    </w:lvl>
+    <w:lvl w:ilvl="5" w:tplc="0409001B" w:tentative="1">
+      <w:start w:val="1"/>
+      <w:numFmt w:val="lowerRoman"/>
+      <w:lvlText w:val="%6."/>
+      <w:lvlJc w:val="right"/>
+      <w:pPr>
+        <w:ind w:left="4320" w:hanging="180"/>
+      </w:pPr>
+    </w:lvl>
+    <w:lvl w:ilvl="6" w:tplc="0409000F" w:tentative="1">
+      <w:start w:val="1"/>
+      <w:numFmt w:val="decimal"/>
+      <w:lvlText w:val="%7."/>
+      <w:lvlJc w:val="left"/>
+      <w:pPr>
+        <w:ind w:left="5040" w:hanging="360"/>
+      </w:pPr>
+    </w:lvl>
+    <w:lvl w:ilvl="7" w:tplc="04090019" w:tentative="1">
+      <w:start w:val="1"/>
+      <w:numFmt w:val="lowerLetter"/>
+      <w:lvlText w:val="%8."/>
+      <w:lvlJc w:val="left"/>
+      <w:pPr>
+        <w:ind w:left="5760" w:hanging="360"/>
+      </w:pPr>
+    </w:lvl>
+    <w:lvl w:ilvl="8" w:tplc="0409001B" w:tentative="1">
+      <w:start w:val="1"/>
+      <w:numFmt w:val="lowerRoman"/>
+      <w:lvlText w:val="%9."/>
+      <w:lvlJc w:val="right"/>
+      <w:pPr>
+        <w:ind w:left="6480" w:hanging="180"/>
+      </w:pPr>
+    </w:lvl>
+  </w:abstractNum>
+  <w:abstractNum w:abstractNumId="2" w15:restartNumberingAfterBreak="0">
     <w:nsid w:val="16E6374C"/>
     <w:multiLevelType w:val="hybridMultilevel"/>
     <w:tmpl w:val="5E205F78"/>
@@ -6393,7 +8872,7 @@
       </w:rPr>
     </w:lvl>
   </w:abstractNum>
-  <w:abstractNum w:abstractNumId="2" w15:restartNumberingAfterBreak="0">
+  <w:abstractNum w:abstractNumId="3" w15:restartNumberingAfterBreak="0">
     <w:nsid w:val="18285D97"/>
     <w:multiLevelType w:val="hybridMultilevel"/>
     <w:tmpl w:val="45982F92"/>
@@ -6506,7 +8985,7 @@
       </w:rPr>
     </w:lvl>
   </w:abstractNum>
-  <w:abstractNum w:abstractNumId="3" w15:restartNumberingAfterBreak="0">
+  <w:abstractNum w:abstractNumId="4" w15:restartNumberingAfterBreak="0">
     <w:nsid w:val="1B6A5D8D"/>
     <w:multiLevelType w:val="hybridMultilevel"/>
     <w:tmpl w:val="6F8E14A8"/>
@@ -6619,7 +9098,7 @@
       </w:rPr>
     </w:lvl>
   </w:abstractNum>
-  <w:abstractNum w:abstractNumId="4" w15:restartNumberingAfterBreak="0">
+  <w:abstractNum w:abstractNumId="5" w15:restartNumberingAfterBreak="0">
     <w:nsid w:val="1CA76BF0"/>
     <w:multiLevelType w:val="hybridMultilevel"/>
     <w:tmpl w:val="44DC3FFE"/>
@@ -6732,7 +9211,7 @@
       </w:rPr>
     </w:lvl>
   </w:abstractNum>
-  <w:abstractNum w:abstractNumId="5" w15:restartNumberingAfterBreak="0">
+  <w:abstractNum w:abstractNumId="6" w15:restartNumberingAfterBreak="0">
     <w:nsid w:val="227D4999"/>
     <w:multiLevelType w:val="hybridMultilevel"/>
     <w:tmpl w:val="70560646"/>
@@ -6845,7 +9324,7 @@
       </w:rPr>
     </w:lvl>
   </w:abstractNum>
-  <w:abstractNum w:abstractNumId="6" w15:restartNumberingAfterBreak="0">
+  <w:abstractNum w:abstractNumId="7" w15:restartNumberingAfterBreak="0">
     <w:nsid w:val="35745F70"/>
     <w:multiLevelType w:val="hybridMultilevel"/>
     <w:tmpl w:val="4CC22BCE"/>
@@ -6958,7 +9437,7 @@
       </w:rPr>
     </w:lvl>
   </w:abstractNum>
-  <w:abstractNum w:abstractNumId="7" w15:restartNumberingAfterBreak="0">
+  <w:abstractNum w:abstractNumId="8" w15:restartNumberingAfterBreak="0">
     <w:nsid w:val="39EC5B5A"/>
     <w:multiLevelType w:val="hybridMultilevel"/>
     <w:tmpl w:val="8F068486"/>
@@ -7071,7 +9550,120 @@
       </w:rPr>
     </w:lvl>
   </w:abstractNum>
-  <w:abstractNum w:abstractNumId="8" w15:restartNumberingAfterBreak="0">
+  <w:abstractNum w:abstractNumId="9" w15:restartNumberingAfterBreak="0">
+    <w:nsid w:val="3C793255"/>
+    <w:multiLevelType w:val="hybridMultilevel"/>
+    <w:tmpl w:val="691A860A"/>
+    <w:lvl w:ilvl="0" w:tplc="04090001">
+      <w:start w:val="1"/>
+      <w:numFmt w:val="bullet"/>
+      <w:lvlText w:val=""/>
+      <w:lvlJc w:val="left"/>
+      <w:pPr>
+        <w:ind w:left="720" w:hanging="360"/>
+      </w:pPr>
+      <w:rPr>
+        <w:rFonts w:ascii="Symbol" w:hAnsi="Symbol" w:hint="default"/>
+      </w:rPr>
+    </w:lvl>
+    <w:lvl w:ilvl="1" w:tplc="04090003" w:tentative="1">
+      <w:start w:val="1"/>
+      <w:numFmt w:val="bullet"/>
+      <w:lvlText w:val="o"/>
+      <w:lvlJc w:val="left"/>
+      <w:pPr>
+        <w:ind w:left="1440" w:hanging="360"/>
+      </w:pPr>
+      <w:rPr>
+        <w:rFonts w:ascii="Courier New" w:hAnsi="Courier New" w:cs="Courier New" w:hint="default"/>
+      </w:rPr>
+    </w:lvl>
+    <w:lvl w:ilvl="2" w:tplc="04090005" w:tentative="1">
+      <w:start w:val="1"/>
+      <w:numFmt w:val="bullet"/>
+      <w:lvlText w:val=""/>
+      <w:lvlJc w:val="left"/>
+      <w:pPr>
+        <w:ind w:left="2160" w:hanging="360"/>
+      </w:pPr>
+      <w:rPr>
+        <w:rFonts w:ascii="Wingdings" w:hAnsi="Wingdings" w:hint="default"/>
+      </w:rPr>
+    </w:lvl>
+    <w:lvl w:ilvl="3" w:tplc="04090001" w:tentative="1">
+      <w:start w:val="1"/>
+      <w:numFmt w:val="bullet"/>
+      <w:lvlText w:val=""/>
+      <w:lvlJc w:val="left"/>
+      <w:pPr>
+        <w:ind w:left="2880" w:hanging="360"/>
+      </w:pPr>
+      <w:rPr>
+        <w:rFonts w:ascii="Symbol" w:hAnsi="Symbol" w:hint="default"/>
+      </w:rPr>
+    </w:lvl>
+    <w:lvl w:ilvl="4" w:tplc="04090003" w:tentative="1">
+      <w:start w:val="1"/>
+      <w:numFmt w:val="bullet"/>
+      <w:lvlText w:val="o"/>
+      <w:lvlJc w:val="left"/>
+      <w:pPr>
+        <w:ind w:left="3600" w:hanging="360"/>
+      </w:pPr>
+      <w:rPr>
+        <w:rFonts w:ascii="Courier New" w:hAnsi="Courier New" w:cs="Courier New" w:hint="default"/>
+      </w:rPr>
+    </w:lvl>
+    <w:lvl w:ilvl="5" w:tplc="04090005" w:tentative="1">
+      <w:start w:val="1"/>
+      <w:numFmt w:val="bullet"/>
+      <w:lvlText w:val=""/>
+      <w:lvlJc w:val="left"/>
+      <w:pPr>
+        <w:ind w:left="4320" w:hanging="360"/>
+      </w:pPr>
+      <w:rPr>
+        <w:rFonts w:ascii="Wingdings" w:hAnsi="Wingdings" w:hint="default"/>
+      </w:rPr>
+    </w:lvl>
+    <w:lvl w:ilvl="6" w:tplc="04090001" w:tentative="1">
+      <w:start w:val="1"/>
+      <w:numFmt w:val="bullet"/>
+      <w:lvlText w:val=""/>
+      <w:lvlJc w:val="left"/>
+      <w:pPr>
+        <w:ind w:left="5040" w:hanging="360"/>
+      </w:pPr>
+      <w:rPr>
+        <w:rFonts w:ascii="Symbol" w:hAnsi="Symbol" w:hint="default"/>
+      </w:rPr>
+    </w:lvl>
+    <w:lvl w:ilvl="7" w:tplc="04090003" w:tentative="1">
+      <w:start w:val="1"/>
+      <w:numFmt w:val="bullet"/>
+      <w:lvlText w:val="o"/>
+      <w:lvlJc w:val="left"/>
+      <w:pPr>
+        <w:ind w:left="5760" w:hanging="360"/>
+      </w:pPr>
+      <w:rPr>
+        <w:rFonts w:ascii="Courier New" w:hAnsi="Courier New" w:cs="Courier New" w:hint="default"/>
+      </w:rPr>
+    </w:lvl>
+    <w:lvl w:ilvl="8" w:tplc="04090005" w:tentative="1">
+      <w:start w:val="1"/>
+      <w:numFmt w:val="bullet"/>
+      <w:lvlText w:val=""/>
+      <w:lvlJc w:val="left"/>
+      <w:pPr>
+        <w:ind w:left="6480" w:hanging="360"/>
+      </w:pPr>
+      <w:rPr>
+        <w:rFonts w:ascii="Wingdings" w:hAnsi="Wingdings" w:hint="default"/>
+      </w:rPr>
+    </w:lvl>
+  </w:abstractNum>
+  <w:abstractNum w:abstractNumId="10" w15:restartNumberingAfterBreak="0">
     <w:nsid w:val="42DB08FF"/>
     <w:multiLevelType w:val="hybridMultilevel"/>
     <w:tmpl w:val="8F182F54"/>
@@ -7184,7 +9776,7 @@
       </w:rPr>
     </w:lvl>
   </w:abstractNum>
-  <w:abstractNum w:abstractNumId="9" w15:restartNumberingAfterBreak="0">
+  <w:abstractNum w:abstractNumId="11" w15:restartNumberingAfterBreak="0">
     <w:nsid w:val="46317DA9"/>
     <w:multiLevelType w:val="hybridMultilevel"/>
     <w:tmpl w:val="7A06990C"/>
@@ -7297,7 +9889,7 @@
       </w:rPr>
     </w:lvl>
   </w:abstractNum>
-  <w:abstractNum w:abstractNumId="10" w15:restartNumberingAfterBreak="0">
+  <w:abstractNum w:abstractNumId="12" w15:restartNumberingAfterBreak="0">
     <w:nsid w:val="49D24EE0"/>
     <w:multiLevelType w:val="hybridMultilevel"/>
     <w:tmpl w:val="6D747F0A"/>
@@ -7410,7 +10002,7 @@
       </w:rPr>
     </w:lvl>
   </w:abstractNum>
-  <w:abstractNum w:abstractNumId="11" w15:restartNumberingAfterBreak="0">
+  <w:abstractNum w:abstractNumId="13" w15:restartNumberingAfterBreak="0">
     <w:nsid w:val="4AD92797"/>
     <w:multiLevelType w:val="hybridMultilevel"/>
     <w:tmpl w:val="289891D0"/>
@@ -7522,7 +10114,179 @@
       </w:rPr>
     </w:lvl>
   </w:abstractNum>
-  <w:abstractNum w:abstractNumId="12" w15:restartNumberingAfterBreak="0">
+  <w:abstractNum w:abstractNumId="14" w15:restartNumberingAfterBreak="0">
+    <w:nsid w:val="59DE5AA2"/>
+    <w:multiLevelType w:val="hybridMultilevel"/>
+    <w:tmpl w:val="6BC4CFDC"/>
+    <w:lvl w:ilvl="0" w:tplc="0409000F">
+      <w:start w:val="1"/>
+      <w:numFmt w:val="decimal"/>
+      <w:lvlText w:val="%1."/>
+      <w:lvlJc w:val="left"/>
+      <w:pPr>
+        <w:ind w:left="720" w:hanging="360"/>
+      </w:pPr>
+    </w:lvl>
+    <w:lvl w:ilvl="1" w:tplc="04090019" w:tentative="1">
+      <w:start w:val="1"/>
+      <w:numFmt w:val="lowerLetter"/>
+      <w:lvlText w:val="%2."/>
+      <w:lvlJc w:val="left"/>
+      <w:pPr>
+        <w:ind w:left="1440" w:hanging="360"/>
+      </w:pPr>
+    </w:lvl>
+    <w:lvl w:ilvl="2" w:tplc="0409001B" w:tentative="1">
+      <w:start w:val="1"/>
+      <w:numFmt w:val="lowerRoman"/>
+      <w:lvlText w:val="%3."/>
+      <w:lvlJc w:val="right"/>
+      <w:pPr>
+        <w:ind w:left="2160" w:hanging="180"/>
+      </w:pPr>
+    </w:lvl>
+    <w:lvl w:ilvl="3" w:tplc="0409000F" w:tentative="1">
+      <w:start w:val="1"/>
+      <w:numFmt w:val="decimal"/>
+      <w:lvlText w:val="%4."/>
+      <w:lvlJc w:val="left"/>
+      <w:pPr>
+        <w:ind w:left="2880" w:hanging="360"/>
+      </w:pPr>
+    </w:lvl>
+    <w:lvl w:ilvl="4" w:tplc="04090019" w:tentative="1">
+      <w:start w:val="1"/>
+      <w:numFmt w:val="lowerLetter"/>
+      <w:lvlText w:val="%5."/>
+      <w:lvlJc w:val="left"/>
+      <w:pPr>
+        <w:ind w:left="3600" w:hanging="360"/>
+      </w:pPr>
+    </w:lvl>
+    <w:lvl w:ilvl="5" w:tplc="0409001B" w:tentative="1">
+      <w:start w:val="1"/>
+      <w:numFmt w:val="lowerRoman"/>
+      <w:lvlText w:val="%6."/>
+      <w:lvlJc w:val="right"/>
+      <w:pPr>
+        <w:ind w:left="4320" w:hanging="180"/>
+      </w:pPr>
+    </w:lvl>
+    <w:lvl w:ilvl="6" w:tplc="0409000F" w:tentative="1">
+      <w:start w:val="1"/>
+      <w:numFmt w:val="decimal"/>
+      <w:lvlText w:val="%7."/>
+      <w:lvlJc w:val="left"/>
+      <w:pPr>
+        <w:ind w:left="5040" w:hanging="360"/>
+      </w:pPr>
+    </w:lvl>
+    <w:lvl w:ilvl="7" w:tplc="04090019" w:tentative="1">
+      <w:start w:val="1"/>
+      <w:numFmt w:val="lowerLetter"/>
+      <w:lvlText w:val="%8."/>
+      <w:lvlJc w:val="left"/>
+      <w:pPr>
+        <w:ind w:left="5760" w:hanging="360"/>
+      </w:pPr>
+    </w:lvl>
+    <w:lvl w:ilvl="8" w:tplc="0409001B" w:tentative="1">
+      <w:start w:val="1"/>
+      <w:numFmt w:val="lowerRoman"/>
+      <w:lvlText w:val="%9."/>
+      <w:lvlJc w:val="right"/>
+      <w:pPr>
+        <w:ind w:left="6480" w:hanging="180"/>
+      </w:pPr>
+    </w:lvl>
+  </w:abstractNum>
+  <w:abstractNum w:abstractNumId="15" w15:restartNumberingAfterBreak="0">
+    <w:nsid w:val="5BCA2191"/>
+    <w:multiLevelType w:val="hybridMultilevel"/>
+    <w:tmpl w:val="019056BC"/>
+    <w:lvl w:ilvl="0" w:tplc="0409000F">
+      <w:start w:val="1"/>
+      <w:numFmt w:val="decimal"/>
+      <w:lvlText w:val="%1."/>
+      <w:lvlJc w:val="left"/>
+      <w:pPr>
+        <w:ind w:left="720" w:hanging="360"/>
+      </w:pPr>
+    </w:lvl>
+    <w:lvl w:ilvl="1" w:tplc="04090019" w:tentative="1">
+      <w:start w:val="1"/>
+      <w:numFmt w:val="lowerLetter"/>
+      <w:lvlText w:val="%2."/>
+      <w:lvlJc w:val="left"/>
+      <w:pPr>
+        <w:ind w:left="1440" w:hanging="360"/>
+      </w:pPr>
+    </w:lvl>
+    <w:lvl w:ilvl="2" w:tplc="0409001B" w:tentative="1">
+      <w:start w:val="1"/>
+      <w:numFmt w:val="lowerRoman"/>
+      <w:lvlText w:val="%3."/>
+      <w:lvlJc w:val="right"/>
+      <w:pPr>
+        <w:ind w:left="2160" w:hanging="180"/>
+      </w:pPr>
+    </w:lvl>
+    <w:lvl w:ilvl="3" w:tplc="0409000F" w:tentative="1">
+      <w:start w:val="1"/>
+      <w:numFmt w:val="decimal"/>
+      <w:lvlText w:val="%4."/>
+      <w:lvlJc w:val="left"/>
+      <w:pPr>
+        <w:ind w:left="2880" w:hanging="360"/>
+      </w:pPr>
+    </w:lvl>
+    <w:lvl w:ilvl="4" w:tplc="04090019" w:tentative="1">
+      <w:start w:val="1"/>
+      <w:numFmt w:val="lowerLetter"/>
+      <w:lvlText w:val="%5."/>
+      <w:lvlJc w:val="left"/>
+      <w:pPr>
+        <w:ind w:left="3600" w:hanging="360"/>
+      </w:pPr>
+    </w:lvl>
+    <w:lvl w:ilvl="5" w:tplc="0409001B" w:tentative="1">
+      <w:start w:val="1"/>
+      <w:numFmt w:val="lowerRoman"/>
+      <w:lvlText w:val="%6."/>
+      <w:lvlJc w:val="right"/>
+      <w:pPr>
+        <w:ind w:left="4320" w:hanging="180"/>
+      </w:pPr>
+    </w:lvl>
+    <w:lvl w:ilvl="6" w:tplc="0409000F" w:tentative="1">
+      <w:start w:val="1"/>
+      <w:numFmt w:val="decimal"/>
+      <w:lvlText w:val="%7."/>
+      <w:lvlJc w:val="left"/>
+      <w:pPr>
+        <w:ind w:left="5040" w:hanging="360"/>
+      </w:pPr>
+    </w:lvl>
+    <w:lvl w:ilvl="7" w:tplc="04090019" w:tentative="1">
+      <w:start w:val="1"/>
+      <w:numFmt w:val="lowerLetter"/>
+      <w:lvlText w:val="%8."/>
+      <w:lvlJc w:val="left"/>
+      <w:pPr>
+        <w:ind w:left="5760" w:hanging="360"/>
+      </w:pPr>
+    </w:lvl>
+    <w:lvl w:ilvl="8" w:tplc="0409001B" w:tentative="1">
+      <w:start w:val="1"/>
+      <w:numFmt w:val="lowerRoman"/>
+      <w:lvlText w:val="%9."/>
+      <w:lvlJc w:val="right"/>
+      <w:pPr>
+        <w:ind w:left="6480" w:hanging="180"/>
+      </w:pPr>
+    </w:lvl>
+  </w:abstractNum>
+  <w:abstractNum w:abstractNumId="16" w15:restartNumberingAfterBreak="0">
     <w:nsid w:val="632A0681"/>
     <w:multiLevelType w:val="hybridMultilevel"/>
     <w:tmpl w:val="3FBEA960"/>
@@ -7611,7 +10375,7 @@
       </w:pPr>
     </w:lvl>
   </w:abstractNum>
-  <w:abstractNum w:abstractNumId="13" w15:restartNumberingAfterBreak="0">
+  <w:abstractNum w:abstractNumId="17" w15:restartNumberingAfterBreak="0">
     <w:nsid w:val="663831A6"/>
     <w:multiLevelType w:val="hybridMultilevel"/>
     <w:tmpl w:val="F6CE0124"/>
@@ -7700,7 +10464,7 @@
       </w:pPr>
     </w:lvl>
   </w:abstractNum>
-  <w:abstractNum w:abstractNumId="14" w15:restartNumberingAfterBreak="0">
+  <w:abstractNum w:abstractNumId="18" w15:restartNumberingAfterBreak="0">
     <w:nsid w:val="6E796970"/>
     <w:multiLevelType w:val="hybridMultilevel"/>
     <w:tmpl w:val="6122DC30"/>
@@ -7813,7 +10577,179 @@
       </w:rPr>
     </w:lvl>
   </w:abstractNum>
-  <w:abstractNum w:abstractNumId="15" w15:restartNumberingAfterBreak="0">
+  <w:abstractNum w:abstractNumId="19" w15:restartNumberingAfterBreak="0">
+    <w:nsid w:val="73FB2BEB"/>
+    <w:multiLevelType w:val="hybridMultilevel"/>
+    <w:tmpl w:val="2238267E"/>
+    <w:lvl w:ilvl="0" w:tplc="0409000F">
+      <w:start w:val="1"/>
+      <w:numFmt w:val="decimal"/>
+      <w:lvlText w:val="%1."/>
+      <w:lvlJc w:val="left"/>
+      <w:pPr>
+        <w:ind w:left="720" w:hanging="360"/>
+      </w:pPr>
+    </w:lvl>
+    <w:lvl w:ilvl="1" w:tplc="04090019" w:tentative="1">
+      <w:start w:val="1"/>
+      <w:numFmt w:val="lowerLetter"/>
+      <w:lvlText w:val="%2."/>
+      <w:lvlJc w:val="left"/>
+      <w:pPr>
+        <w:ind w:left="1440" w:hanging="360"/>
+      </w:pPr>
+    </w:lvl>
+    <w:lvl w:ilvl="2" w:tplc="0409001B" w:tentative="1">
+      <w:start w:val="1"/>
+      <w:numFmt w:val="lowerRoman"/>
+      <w:lvlText w:val="%3."/>
+      <w:lvlJc w:val="right"/>
+      <w:pPr>
+        <w:ind w:left="2160" w:hanging="180"/>
+      </w:pPr>
+    </w:lvl>
+    <w:lvl w:ilvl="3" w:tplc="0409000F" w:tentative="1">
+      <w:start w:val="1"/>
+      <w:numFmt w:val="decimal"/>
+      <w:lvlText w:val="%4."/>
+      <w:lvlJc w:val="left"/>
+      <w:pPr>
+        <w:ind w:left="2880" w:hanging="360"/>
+      </w:pPr>
+    </w:lvl>
+    <w:lvl w:ilvl="4" w:tplc="04090019" w:tentative="1">
+      <w:start w:val="1"/>
+      <w:numFmt w:val="lowerLetter"/>
+      <w:lvlText w:val="%5."/>
+      <w:lvlJc w:val="left"/>
+      <w:pPr>
+        <w:ind w:left="3600" w:hanging="360"/>
+      </w:pPr>
+    </w:lvl>
+    <w:lvl w:ilvl="5" w:tplc="0409001B" w:tentative="1">
+      <w:start w:val="1"/>
+      <w:numFmt w:val="lowerRoman"/>
+      <w:lvlText w:val="%6."/>
+      <w:lvlJc w:val="right"/>
+      <w:pPr>
+        <w:ind w:left="4320" w:hanging="180"/>
+      </w:pPr>
+    </w:lvl>
+    <w:lvl w:ilvl="6" w:tplc="0409000F" w:tentative="1">
+      <w:start w:val="1"/>
+      <w:numFmt w:val="decimal"/>
+      <w:lvlText w:val="%7."/>
+      <w:lvlJc w:val="left"/>
+      <w:pPr>
+        <w:ind w:left="5040" w:hanging="360"/>
+      </w:pPr>
+    </w:lvl>
+    <w:lvl w:ilvl="7" w:tplc="04090019" w:tentative="1">
+      <w:start w:val="1"/>
+      <w:numFmt w:val="lowerLetter"/>
+      <w:lvlText w:val="%8."/>
+      <w:lvlJc w:val="left"/>
+      <w:pPr>
+        <w:ind w:left="5760" w:hanging="360"/>
+      </w:pPr>
+    </w:lvl>
+    <w:lvl w:ilvl="8" w:tplc="0409001B" w:tentative="1">
+      <w:start w:val="1"/>
+      <w:numFmt w:val="lowerRoman"/>
+      <w:lvlText w:val="%9."/>
+      <w:lvlJc w:val="right"/>
+      <w:pPr>
+        <w:ind w:left="6480" w:hanging="180"/>
+      </w:pPr>
+    </w:lvl>
+  </w:abstractNum>
+  <w:abstractNum w:abstractNumId="20" w15:restartNumberingAfterBreak="0">
+    <w:nsid w:val="75895CEC"/>
+    <w:multiLevelType w:val="hybridMultilevel"/>
+    <w:tmpl w:val="A8846CD0"/>
+    <w:lvl w:ilvl="0" w:tplc="0409000F">
+      <w:start w:val="1"/>
+      <w:numFmt w:val="decimal"/>
+      <w:lvlText w:val="%1."/>
+      <w:lvlJc w:val="left"/>
+      <w:pPr>
+        <w:ind w:left="720" w:hanging="360"/>
+      </w:pPr>
+    </w:lvl>
+    <w:lvl w:ilvl="1" w:tplc="04090019">
+      <w:start w:val="1"/>
+      <w:numFmt w:val="lowerLetter"/>
+      <w:lvlText w:val="%2."/>
+      <w:lvlJc w:val="left"/>
+      <w:pPr>
+        <w:ind w:left="1440" w:hanging="360"/>
+      </w:pPr>
+    </w:lvl>
+    <w:lvl w:ilvl="2" w:tplc="0409001B" w:tentative="1">
+      <w:start w:val="1"/>
+      <w:numFmt w:val="lowerRoman"/>
+      <w:lvlText w:val="%3."/>
+      <w:lvlJc w:val="right"/>
+      <w:pPr>
+        <w:ind w:left="2160" w:hanging="180"/>
+      </w:pPr>
+    </w:lvl>
+    <w:lvl w:ilvl="3" w:tplc="0409000F" w:tentative="1">
+      <w:start w:val="1"/>
+      <w:numFmt w:val="decimal"/>
+      <w:lvlText w:val="%4."/>
+      <w:lvlJc w:val="left"/>
+      <w:pPr>
+        <w:ind w:left="2880" w:hanging="360"/>
+      </w:pPr>
+    </w:lvl>
+    <w:lvl w:ilvl="4" w:tplc="04090019" w:tentative="1">
+      <w:start w:val="1"/>
+      <w:numFmt w:val="lowerLetter"/>
+      <w:lvlText w:val="%5."/>
+      <w:lvlJc w:val="left"/>
+      <w:pPr>
+        <w:ind w:left="3600" w:hanging="360"/>
+      </w:pPr>
+    </w:lvl>
+    <w:lvl w:ilvl="5" w:tplc="0409001B" w:tentative="1">
+      <w:start w:val="1"/>
+      <w:numFmt w:val="lowerRoman"/>
+      <w:lvlText w:val="%6."/>
+      <w:lvlJc w:val="right"/>
+      <w:pPr>
+        <w:ind w:left="4320" w:hanging="180"/>
+      </w:pPr>
+    </w:lvl>
+    <w:lvl w:ilvl="6" w:tplc="0409000F" w:tentative="1">
+      <w:start w:val="1"/>
+      <w:numFmt w:val="decimal"/>
+      <w:lvlText w:val="%7."/>
+      <w:lvlJc w:val="left"/>
+      <w:pPr>
+        <w:ind w:left="5040" w:hanging="360"/>
+      </w:pPr>
+    </w:lvl>
+    <w:lvl w:ilvl="7" w:tplc="04090019" w:tentative="1">
+      <w:start w:val="1"/>
+      <w:numFmt w:val="lowerLetter"/>
+      <w:lvlText w:val="%8."/>
+      <w:lvlJc w:val="left"/>
+      <w:pPr>
+        <w:ind w:left="5760" w:hanging="360"/>
+      </w:pPr>
+    </w:lvl>
+    <w:lvl w:ilvl="8" w:tplc="0409001B" w:tentative="1">
+      <w:start w:val="1"/>
+      <w:numFmt w:val="lowerRoman"/>
+      <w:lvlText w:val="%9."/>
+      <w:lvlJc w:val="right"/>
+      <w:pPr>
+        <w:ind w:left="6480" w:hanging="180"/>
+      </w:pPr>
+    </w:lvl>
+  </w:abstractNum>
+  <w:abstractNum w:abstractNumId="21" w15:restartNumberingAfterBreak="0">
     <w:nsid w:val="79103937"/>
     <w:multiLevelType w:val="hybridMultilevel"/>
     <w:tmpl w:val="E782E7CC"/>
@@ -7927,31 +10863,31 @@
     </w:lvl>
   </w:abstractNum>
   <w:num w:numId="1" w16cid:durableId="1001851225">
-    <w:abstractNumId w:val="11"/>
+    <w:abstractNumId w:val="13"/>
   </w:num>
   <w:num w:numId="2" w16cid:durableId="1400131029">
-    <w:abstractNumId w:val="6"/>
+    <w:abstractNumId w:val="7"/>
   </w:num>
   <w:num w:numId="3" w16cid:durableId="2085637143">
+    <w:abstractNumId w:val="5"/>
+  </w:num>
+  <w:num w:numId="4" w16cid:durableId="1547327939">
+    <w:abstractNumId w:val="10"/>
+  </w:num>
+  <w:num w:numId="5" w16cid:durableId="1140223335">
+    <w:abstractNumId w:val="3"/>
+  </w:num>
+  <w:num w:numId="6" w16cid:durableId="1421103290">
+    <w:abstractNumId w:val="8"/>
+  </w:num>
+  <w:num w:numId="7" w16cid:durableId="2132630224">
     <w:abstractNumId w:val="4"/>
   </w:num>
-  <w:num w:numId="4" w16cid:durableId="1547327939">
-    <w:abstractNumId w:val="8"/>
-  </w:num>
-  <w:num w:numId="5" w16cid:durableId="1140223335">
-    <w:abstractNumId w:val="2"/>
-  </w:num>
-  <w:num w:numId="6" w16cid:durableId="1421103290">
-    <w:abstractNumId w:val="7"/>
-  </w:num>
-  <w:num w:numId="7" w16cid:durableId="2132630224">
-    <w:abstractNumId w:val="3"/>
-  </w:num>
   <w:num w:numId="8" w16cid:durableId="1051807515">
-    <w:abstractNumId w:val="10"/>
+    <w:abstractNumId w:val="12"/>
   </w:num>
   <w:num w:numId="9" w16cid:durableId="1306007011">
-    <w:abstractNumId w:val="12"/>
+    <w:abstractNumId w:val="16"/>
     <w:lvlOverride w:ilvl="0"/>
     <w:lvlOverride w:ilvl="1">
       <w:startOverride w:val="1"/>
@@ -8007,7 +10943,7 @@
     </w:lvlOverride>
   </w:num>
   <w:num w:numId="11" w16cid:durableId="809635210">
-    <w:abstractNumId w:val="13"/>
+    <w:abstractNumId w:val="17"/>
     <w:lvlOverride w:ilvl="0"/>
     <w:lvlOverride w:ilvl="1">
       <w:startOverride w:val="1"/>
@@ -8038,19 +10974,37 @@
     <w:abstractNumId w:val="0"/>
   </w:num>
   <w:num w:numId="13" w16cid:durableId="941494053">
-    <w:abstractNumId w:val="15"/>
+    <w:abstractNumId w:val="21"/>
   </w:num>
   <w:num w:numId="14" w16cid:durableId="914897466">
+    <w:abstractNumId w:val="2"/>
+  </w:num>
+  <w:num w:numId="15" w16cid:durableId="965699858">
+    <w:abstractNumId w:val="6"/>
+  </w:num>
+  <w:num w:numId="16" w16cid:durableId="882249452">
+    <w:abstractNumId w:val="18"/>
+  </w:num>
+  <w:num w:numId="17" w16cid:durableId="1172258966">
+    <w:abstractNumId w:val="11"/>
+  </w:num>
+  <w:num w:numId="18" w16cid:durableId="695734454">
+    <w:abstractNumId w:val="14"/>
+  </w:num>
+  <w:num w:numId="19" w16cid:durableId="1778941636">
+    <w:abstractNumId w:val="20"/>
+  </w:num>
+  <w:num w:numId="20" w16cid:durableId="1419717093">
+    <w:abstractNumId w:val="19"/>
+  </w:num>
+  <w:num w:numId="21" w16cid:durableId="2010911052">
+    <w:abstractNumId w:val="9"/>
+  </w:num>
+  <w:num w:numId="22" w16cid:durableId="1226916147">
     <w:abstractNumId w:val="1"/>
   </w:num>
-  <w:num w:numId="15" w16cid:durableId="965699858">
-    <w:abstractNumId w:val="5"/>
-  </w:num>
-  <w:num w:numId="16" w16cid:durableId="882249452">
-    <w:abstractNumId w:val="14"/>
-  </w:num>
-  <w:num w:numId="17" w16cid:durableId="1172258966">
-    <w:abstractNumId w:val="9"/>
+  <w:num w:numId="23" w16cid:durableId="1017543753">
+    <w:abstractNumId w:val="15"/>
   </w:num>
   <w:numIdMacAtCleanup w:val="8"/>
 </w:numbering>
@@ -9329,35 +12283,22 @@
 </file>
 
 <file path=customXml/item3.xml><?xml version="1.0" encoding="utf-8"?>
-<Fcrs180_1XMLNode xmlns="CRS180_1">
-  <OthBox/>
-</Fcrs180_1XMLNode>
+<b:Sources xmlns:b="http://schemas.openxmlformats.org/officeDocument/2006/bibliography" xmlns="http://schemas.openxmlformats.org/officeDocument/2006/bibliography" SelectedStyle="\APASixthEditionOfficeOnline.xsl" StyleName="APA" Version="6"/>
 </file>
 
 <file path=customXml/item4.xml><?xml version="1.0" encoding="utf-8"?>
+<Fcrs180_4XMLNode xmlns="CRS180_4">
+  <DeptName>BDIT, Computer and Information Technology</DeptName>
+</Fcrs180_4XMLNode>
+</file>
+
+<file path=customXml/item5.xml><?xml version="1.0" encoding="utf-8"?>
 <Fcrs180_5XMLNode xmlns="CRS180_5">
   <AssessTypeR>Portfolio</AssessTypeR>
 </Fcrs180_5XMLNode>
 </file>
 
-<file path=customXml/item5.xml><?xml version="1.0" encoding="utf-8"?>
-<Fcrs180_4XMLNode xmlns="CRS180_4">
-  <DeptName>BDIT, Computer and Information Technology</DeptName>
-</Fcrs180_4XMLNode>
-</file>
-
 <file path=customXml/item6.xml><?xml version="1.0" encoding="utf-8"?>
-<b:Sources xmlns:b="http://schemas.openxmlformats.org/officeDocument/2006/bibliography" xmlns="http://schemas.openxmlformats.org/officeDocument/2006/bibliography" SelectedStyle="\APASixthEditionOfficeOnline.xsl" StyleName="APA" Version="6"/>
-</file>
-
-<file path=customXml/item7.xml><?xml version="1.0" encoding="utf-8"?>
-<Fcrs180_3XMLNode xmlns="CRS180_3">
-  <StName/>
-  <StID/>
-</Fcrs180_3XMLNode>
-</file>
-
-<file path=customXml/item8.xml><?xml version="1.0" encoding="utf-8"?>
 <Fcrs180XMLNode xmlns="CRS180">
   <SName/>
   <SID/>
@@ -9371,6 +12312,19 @@
   <SInstruct/>
   <AssessCon/>
 </Fcrs180XMLNode>
+</file>
+
+<file path=customXml/item7.xml><?xml version="1.0" encoding="utf-8"?>
+<Fcrs180_1XMLNode xmlns="CRS180_1">
+  <OthBox/>
+</Fcrs180_1XMLNode>
+</file>
+
+<file path=customXml/item8.xml><?xml version="1.0" encoding="utf-8"?>
+<Fcrs180_3XMLNode xmlns="CRS180_3">
+  <StName/>
+  <StID/>
+</Fcrs180_3XMLNode>
 </file>
 
 <file path=customXml/itemProps1.xml><?xml version="1.0" encoding="utf-8"?>
@@ -9390,6 +12344,38 @@
 </file>
 
 <file path=customXml/itemProps3.xml><?xml version="1.0" encoding="utf-8"?>
+<ds:datastoreItem xmlns:ds="http://schemas.openxmlformats.org/officeDocument/2006/customXml" ds:itemID="{392E2E1B-4130-4A3D-95D1-D081C7832F04}">
+  <ds:schemaRefs>
+    <ds:schemaRef ds:uri="http://schemas.openxmlformats.org/officeDocument/2006/bibliography"/>
+  </ds:schemaRefs>
+</ds:datastoreItem>
+</file>
+
+<file path=customXml/itemProps4.xml><?xml version="1.0" encoding="utf-8"?>
+<ds:datastoreItem xmlns:ds="http://schemas.openxmlformats.org/officeDocument/2006/customXml" ds:itemID="{BCCE98C7-93E3-46B4-9136-8583CF4B79F7}">
+  <ds:schemaRefs>
+    <ds:schemaRef ds:uri="CRS180_4"/>
+  </ds:schemaRefs>
+</ds:datastoreItem>
+</file>
+
+<file path=customXml/itemProps5.xml><?xml version="1.0" encoding="utf-8"?>
+<ds:datastoreItem xmlns:ds="http://schemas.openxmlformats.org/officeDocument/2006/customXml" ds:itemID="{8EEE6C64-7878-4D06-B4F9-6A63DFC5E605}">
+  <ds:schemaRefs>
+    <ds:schemaRef ds:uri="CRS180_5"/>
+  </ds:schemaRefs>
+</ds:datastoreItem>
+</file>
+
+<file path=customXml/itemProps6.xml><?xml version="1.0" encoding="utf-8"?>
+<ds:datastoreItem xmlns:ds="http://schemas.openxmlformats.org/officeDocument/2006/customXml" ds:itemID="{AEAA7968-AA76-4AEA-864E-618A3CDCDA91}">
+  <ds:schemaRefs>
+    <ds:schemaRef ds:uri="CRS180"/>
+  </ds:schemaRefs>
+</ds:datastoreItem>
+</file>
+
+<file path=customXml/itemProps7.xml><?xml version="1.0" encoding="utf-8"?>
 <ds:datastoreItem xmlns:ds="http://schemas.openxmlformats.org/officeDocument/2006/customXml" ds:itemID="{93E8A757-17F0-4CC7-B32F-5C21CEC8E169}">
   <ds:schemaRefs>
     <ds:schemaRef ds:uri="CRS180_1"/>
@@ -9397,42 +12383,10 @@
 </ds:datastoreItem>
 </file>
 
-<file path=customXml/itemProps4.xml><?xml version="1.0" encoding="utf-8"?>
-<ds:datastoreItem xmlns:ds="http://schemas.openxmlformats.org/officeDocument/2006/customXml" ds:itemID="{8EEE6C64-7878-4D06-B4F9-6A63DFC5E605}">
-  <ds:schemaRefs>
-    <ds:schemaRef ds:uri="CRS180_5"/>
-  </ds:schemaRefs>
-</ds:datastoreItem>
-</file>
-
-<file path=customXml/itemProps5.xml><?xml version="1.0" encoding="utf-8"?>
-<ds:datastoreItem xmlns:ds="http://schemas.openxmlformats.org/officeDocument/2006/customXml" ds:itemID="{BCCE98C7-93E3-46B4-9136-8583CF4B79F7}">
-  <ds:schemaRefs>
-    <ds:schemaRef ds:uri="CRS180_4"/>
-  </ds:schemaRefs>
-</ds:datastoreItem>
-</file>
-
-<file path=customXml/itemProps6.xml><?xml version="1.0" encoding="utf-8"?>
-<ds:datastoreItem xmlns:ds="http://schemas.openxmlformats.org/officeDocument/2006/customXml" ds:itemID="{392E2E1B-4130-4A3D-95D1-D081C7832F04}">
-  <ds:schemaRefs>
-    <ds:schemaRef ds:uri="http://schemas.openxmlformats.org/officeDocument/2006/bibliography"/>
-  </ds:schemaRefs>
-</ds:datastoreItem>
-</file>
-
-<file path=customXml/itemProps7.xml><?xml version="1.0" encoding="utf-8"?>
+<file path=customXml/itemProps8.xml><?xml version="1.0" encoding="utf-8"?>
 <ds:datastoreItem xmlns:ds="http://schemas.openxmlformats.org/officeDocument/2006/customXml" ds:itemID="{EADE9EF3-1304-43E5-9865-7510817D635D}">
   <ds:schemaRefs>
     <ds:schemaRef ds:uri="CRS180_3"/>
   </ds:schemaRefs>
 </ds:datastoreItem>
-</file>
-
-<file path=customXml/itemProps8.xml><?xml version="1.0" encoding="utf-8"?>
-<ds:datastoreItem xmlns:ds="http://schemas.openxmlformats.org/officeDocument/2006/customXml" ds:itemID="{AEAA7968-AA76-4AEA-864E-618A3CDCDA91}">
-  <ds:schemaRefs>
-    <ds:schemaRef ds:uri="CRS180"/>
-  </ds:schemaRefs>
-</ds:datastoreItem>
 </file>
</xml_diff>